<commit_message>
Full TDS GEO quotation: scope, timeline, pricing, payment options, bilingual terms
</commit_message>
<xml_diff>
--- a/doc/quotation/TDS-GEO-Quotation.docx
+++ b/doc/quotation/TDS-GEO-Quotation.docx
@@ -77,7 +77,7 @@
               <w:rPr>
                 <w:b/>
                 <w:color w:val="171414"/>
-                <w:sz w:val="36"/>
+                <w:sz w:val="40"/>
               </w:rPr>
               <w:t>TDS GEO</w:t>
             </w:r>
@@ -99,7 +99,7 @@
                 <w:color w:val="838081"/>
                 <w:sz w:val="16"/>
               </w:rPr>
-              <w:t>Commercial Registration: XXXXX | Tax ID: XXXXX</w:t>
+              <w:t>Commercial Reg: XXXXX  |  Tax ID: XXXXX</w:t>
               <w:br/>
             </w:r>
             <w:r>
@@ -107,7 +107,7 @@
                 <w:color w:val="838081"/>
                 <w:sz w:val="16"/>
               </w:rPr>
-              <w:t>hello@tdsgeo.com | tdsgeo.com</w:t>
+              <w:t>hello@tdsgeo.com  |  tdsgeo.com</w:t>
             </w:r>
           </w:p>
         </w:tc>
@@ -115,15 +115,15 @@
     </w:tbl>
     <w:p>
       <w:pPr>
-        <w:jc w:val="left"/>
+        <w:spacing w:before="80" w:after="80"/>
         <w:pBdr>
-          <w:bottom w:val="single" w:sz="24" w:space="1" w:color="FCB900"/>
+          <w:bottom w:val="single" w:sz="20" w:space="1" w:color="FCB900"/>
         </w:pBdr>
       </w:pPr>
     </w:p>
     <w:p>
       <w:pPr>
-        <w:spacing w:before="360" w:after="80"/>
+        <w:spacing w:before="400" w:after="40"/>
         <w:jc w:val="center"/>
       </w:pPr>
       <w:r>
@@ -131,27 +131,27 @@
           <w:rFonts w:ascii="Calibri Light" w:hAnsi="Calibri Light"/>
           <w:b/>
           <w:color w:val="171414"/>
-          <w:sz w:val="56"/>
+          <w:sz w:val="52"/>
         </w:rPr>
-        <w:t>QUOTATION</w:t>
+        <w:t>PROFESSIONAL SERVICES QUOTATION</w:t>
       </w:r>
     </w:p>
     <w:p>
       <w:pPr>
-        <w:spacing w:after="120"/>
+        <w:spacing w:after="80"/>
         <w:jc w:val="center"/>
       </w:pPr>
       <w:r>
         <w:rPr>
           <w:color w:val="838081"/>
-          <w:sz w:val="32"/>
+          <w:sz w:val="28"/>
         </w:rPr>
-        <w:t>عرض سعر</w:t>
+        <w:t>عرض خدمات احترافي</w:t>
       </w:r>
     </w:p>
     <w:p>
       <w:pPr>
-        <w:spacing w:after="240"/>
+        <w:spacing w:after="160"/>
         <w:jc w:val="center"/>
       </w:pPr>
       <w:r>
@@ -159,14 +159,14 @@
           <w:color w:val="838081"/>
           <w:sz w:val="18"/>
         </w:rPr>
-        <w:t>QUO-{NUMBER}  •  Issued: {DATE}  •  Valid: {VALID_UNTIL}</w:t>
+        <w:t>Quotation No: QUO-{NUMBER}     |     Issued: {ISSUE_DATE}     |     Valid Until: {VALID_UNTIL}</w:t>
       </w:r>
     </w:p>
     <w:p>
       <w:pPr>
-        <w:jc w:val="left"/>
+        <w:spacing w:before="80" w:after="80"/>
         <w:pBdr>
-          <w:bottom w:val="single" w:sz="16" w:space="1" w:color="FCB900"/>
+          <w:bottom w:val="single" w:sz="14" w:space="1" w:color="FCB900"/>
         </w:pBdr>
       </w:pPr>
     </w:p>
@@ -201,21 +201,56 @@
               <w:rPr>
                 <w:b/>
                 <w:color w:val="FCB900"/>
-                <w:sz w:val="16"/>
+                <w:sz w:val="15"/>
               </w:rPr>
-              <w:t>PREPARED FOR</w:t>
+              <w:t>PREPARED FOR / معدة لـ</w:t>
             </w:r>
           </w:p>
           <w:p>
+            <w:pPr>
+              <w:spacing w:after="20"/>
+            </w:pPr>
             <w:r>
               <w:rPr>
                 <w:color w:val="171414"/>
                 <w:sz w:val="20"/>
               </w:rPr>
               <w:t>{CLIENT_NAME}</w:t>
-              <w:br/>
+            </w:r>
+          </w:p>
+          <w:p>
+            <w:pPr>
+              <w:spacing w:after="20"/>
+            </w:pPr>
+            <w:r>
+              <w:rPr>
+                <w:color w:val="171414"/>
+                <w:sz w:val="20"/>
+              </w:rPr>
+              <w:t>{CLIENT_ADDRESS}</w:t>
+            </w:r>
+          </w:p>
+          <w:p>
+            <w:pPr>
+              <w:spacing w:after="20"/>
+            </w:pPr>
+            <w:r>
+              <w:rPr>
+                <w:color w:val="171414"/>
+                <w:sz w:val="20"/>
+              </w:rPr>
               <w:t>{CLIENT_CONTACT}</w:t>
-              <w:br/>
+            </w:r>
+          </w:p>
+          <w:p>
+            <w:pPr>
+              <w:spacing w:after="20"/>
+            </w:pPr>
+            <w:r>
+              <w:rPr>
+                <w:color w:val="171414"/>
+                <w:sz w:val="20"/>
+              </w:rPr>
               <w:t>{CLIENT_EMAIL}</w:t>
             </w:r>
           </w:p>
@@ -232,20 +267,45 @@
               <w:rPr>
                 <w:b/>
                 <w:color w:val="FCB900"/>
-                <w:sz w:val="16"/>
+                <w:sz w:val="15"/>
               </w:rPr>
-              <w:t>PROJECT</w:t>
+              <w:t>BILLING DETAILS / تفاصيل الفوترة</w:t>
             </w:r>
           </w:p>
           <w:p>
+            <w:pPr>
+              <w:spacing w:after="20"/>
+            </w:pPr>
             <w:r>
               <w:rPr>
                 <w:color w:val="171414"/>
                 <w:sz w:val="20"/>
               </w:rPr>
-              <w:t>{PROJECT_NAME}</w:t>
-              <w:br/>
-              <w:t>{PROJECT_TYPE}</w:t>
+              <w:t>Currency: {CURRENCY}</w:t>
+            </w:r>
+          </w:p>
+          <w:p>
+            <w:pPr>
+              <w:spacing w:after="20"/>
+            </w:pPr>
+            <w:r>
+              <w:rPr>
+                <w:color w:val="171414"/>
+                <w:sz w:val="20"/>
+              </w:rPr>
+              <w:t>Payment Terms: {PAYMENT_TERMS}</w:t>
+            </w:r>
+          </w:p>
+          <w:p>
+            <w:pPr>
+              <w:spacing w:after="20"/>
+            </w:pPr>
+            <w:r>
+              <w:rPr>
+                <w:color w:val="171414"/>
+                <w:sz w:val="20"/>
+              </w:rPr>
+              <w:t>Tax Treatment: {TAX_TREATMENT}</w:t>
             </w:r>
           </w:p>
         </w:tc>
@@ -263,18 +323,57 @@
               <w:rPr>
                 <w:b/>
                 <w:color w:val="FCB900"/>
-                <w:sz w:val="16"/>
+                <w:sz w:val="15"/>
               </w:rPr>
-              <w:t>PAYMENT TERMS</w:t>
+              <w:t>PROJECT / المشروع</w:t>
             </w:r>
           </w:p>
           <w:p>
+            <w:pPr>
+              <w:spacing w:after="20"/>
+            </w:pPr>
             <w:r>
               <w:rPr>
                 <w:color w:val="171414"/>
                 <w:sz w:val="20"/>
               </w:rPr>
-              <w:t>{PAYMENT_TERMS}</w:t>
+              <w:t>{PROJECT_NAME}</w:t>
+            </w:r>
+          </w:p>
+          <w:p>
+            <w:pPr>
+              <w:spacing w:after="20"/>
+            </w:pPr>
+            <w:r>
+              <w:rPr>
+                <w:color w:val="171414"/>
+                <w:sz w:val="20"/>
+              </w:rPr>
+              <w:t>{PROJECT_DESCRIPTION}</w:t>
+            </w:r>
+          </w:p>
+          <w:p>
+            <w:pPr>
+              <w:spacing w:after="20"/>
+            </w:pPr>
+            <w:r>
+              <w:rPr>
+                <w:color w:val="171414"/>
+                <w:sz w:val="20"/>
+              </w:rPr>
+              <w:t>Start Date: {START_DATE}</w:t>
+            </w:r>
+          </w:p>
+          <w:p>
+            <w:pPr>
+              <w:spacing w:after="20"/>
+            </w:pPr>
+            <w:r>
+              <w:rPr>
+                <w:color w:val="171414"/>
+                <w:sz w:val="20"/>
+              </w:rPr>
+              <w:t>Duration: {DURATION}</w:t>
             </w:r>
           </w:p>
         </w:tc>
@@ -290,27 +389,84 @@
               <w:rPr>
                 <w:b/>
                 <w:color w:val="FCB900"/>
-                <w:sz w:val="16"/>
+                <w:sz w:val="15"/>
               </w:rPr>
-              <w:t>CURRENCY</w:t>
+              <w:t>DELIVERY / التسليم</w:t>
             </w:r>
           </w:p>
           <w:p>
+            <w:pPr>
+              <w:spacing w:after="20"/>
+            </w:pPr>
             <w:r>
               <w:rPr>
                 <w:color w:val="171414"/>
                 <w:sz w:val="20"/>
               </w:rPr>
-              <w:t>{CURRENCY}</w:t>
+              <w:t>Format: {DELIVERY_FORMAT}</w:t>
+            </w:r>
+          </w:p>
+          <w:p>
+            <w:pPr>
+              <w:spacing w:after="20"/>
+            </w:pPr>
+            <w:r>
+              <w:rPr>
+                <w:color w:val="171414"/>
+                <w:sz w:val="20"/>
+              </w:rPr>
+              <w:t>Schedule: {DELIVERY_SCHEDULE}</w:t>
+            </w:r>
+          </w:p>
+          <w:p>
+            <w:pPr>
+              <w:spacing w:after="20"/>
+            </w:pPr>
+            <w:r>
+              <w:rPr>
+                <w:color w:val="171414"/>
+                <w:sz w:val="20"/>
+              </w:rPr>
+              <w:t>Handover: {HANDOVER_METHOD}</w:t>
             </w:r>
           </w:p>
         </w:tc>
       </w:tr>
     </w:tbl>
-    <w:p/>
     <w:p>
       <w:pPr>
-        <w:jc w:val="left"/>
+        <w:spacing w:before="80" w:after="80"/>
+        <w:pBdr>
+          <w:bottom w:val="single" w:sz="10" w:space="1" w:color="FCB900"/>
+        </w:pBdr>
+      </w:pPr>
+    </w:p>
+    <w:p>
+      <w:pPr>
+        <w:spacing w:before="320" w:after="120"/>
+      </w:pPr>
+      <w:r>
+        <w:rPr>
+          <w:rFonts w:ascii="Calibri Light" w:hAnsi="Calibri Light"/>
+          <w:b/>
+          <w:color w:val="142444"/>
+          <w:sz w:val="26"/>
+        </w:rPr>
+        <w:t>1.  PROJECT OVERVIEW</w:t>
+      </w:r>
+      <w:r>
+        <w:rPr>
+          <w:i/>
+          <w:color w:val="838081"/>
+          <w:sz w:val="18"/>
+        </w:rPr>
+        <w:br/>
+        <w:t>نظرة عامة على المشروع</w:t>
+      </w:r>
+    </w:p>
+    <w:p>
+      <w:pPr>
+        <w:spacing w:before="80" w:after="80"/>
         <w:pBdr>
           <w:bottom w:val="single" w:sz="8" w:space="1" w:color="FCB900"/>
         </w:pBdr>
@@ -318,17 +474,800 @@
     </w:p>
     <w:p>
       <w:pPr>
-        <w:spacing w:before="200" w:after="80"/>
+        <w:spacing w:after="120" w:line="276" w:lineRule="auto"/>
+      </w:pPr>
+      <w:r>
+        <w:rPr>
+          <w:b w:val="0"/>
+          <w:i w:val="0"/>
+          <w:color w:val="3D3B3B"/>
+          <w:sz w:val="20"/>
+        </w:rPr>
+        <w:t>{PROJECT_OVERVIEW_TEXT}</w:t>
+      </w:r>
+    </w:p>
+    <w:p>
+      <w:pPr>
+        <w:spacing w:after="80"/>
+      </w:pPr>
+      <w:r>
+        <w:rPr>
+          <w:b/>
+          <w:color w:val="142444"/>
+          <w:sz w:val="19"/>
+        </w:rPr>
+        <w:t>Objectives / الأهداف:</w:t>
+      </w:r>
+    </w:p>
+    <w:p>
+      <w:pPr>
+        <w:spacing w:after="40" w:line="276" w:lineRule="auto"/>
+        <w:ind w:left="283"/>
+      </w:pPr>
+      <w:r>
+        <w:rPr>
+          <w:color w:val="3D3B3B"/>
+          <w:sz w:val="19"/>
+        </w:rPr>
+        <w:t xml:space="preserve">  •  {OBJECTIVE_1}</w:t>
+      </w:r>
+    </w:p>
+    <w:p>
+      <w:pPr>
+        <w:spacing w:after="40" w:line="276" w:lineRule="auto"/>
+        <w:ind w:left="283"/>
+      </w:pPr>
+      <w:r>
+        <w:rPr>
+          <w:color w:val="3D3B3B"/>
+          <w:sz w:val="19"/>
+        </w:rPr>
+        <w:t xml:space="preserve">  •  {OBJECTIVE_2}</w:t>
+      </w:r>
+    </w:p>
+    <w:p>
+      <w:pPr>
+        <w:spacing w:after="40" w:line="276" w:lineRule="auto"/>
+        <w:ind w:left="283"/>
+      </w:pPr>
+      <w:r>
+        <w:rPr>
+          <w:color w:val="3D3B3B"/>
+          <w:sz w:val="19"/>
+        </w:rPr>
+        <w:t xml:space="preserve">  •  {OBJECTIVE_3}</w:t>
+      </w:r>
+    </w:p>
+    <w:p>
+      <w:pPr>
+        <w:spacing w:before="320" w:after="120"/>
       </w:pPr>
       <w:r>
         <w:rPr>
           <w:rFonts w:ascii="Calibri Light" w:hAnsi="Calibri Light"/>
           <w:b/>
           <w:color w:val="142444"/>
+          <w:sz w:val="26"/>
+        </w:rPr>
+        <w:t>2.  SCOPE OF SERVICES</w:t>
+      </w:r>
+      <w:r>
+        <w:rPr>
+          <w:i/>
+          <w:color w:val="838081"/>
+          <w:sz w:val="18"/>
+        </w:rPr>
+        <w:br/>
+        <w:t>نطاق الخدمات</w:t>
+      </w:r>
+    </w:p>
+    <w:p>
+      <w:pPr>
+        <w:spacing w:before="80" w:after="80"/>
+        <w:pBdr>
+          <w:bottom w:val="single" w:sz="8" w:space="1" w:color="FCB900"/>
+        </w:pBdr>
+      </w:pPr>
+    </w:p>
+    <w:p>
+      <w:pPr>
+        <w:spacing w:after="120" w:line="276" w:lineRule="auto"/>
+      </w:pPr>
+      <w:r>
+        <w:rPr>
+          <w:b w:val="0"/>
+          <w:i w:val="0"/>
+          <w:color w:val="3D3B3B"/>
           <w:sz w:val="20"/>
         </w:rPr>
-        <w:t>SERVICES &amp; PRICING</w:t>
+        <w:t>We will deliver the following services as part of this engagement:</w:t>
       </w:r>
+    </w:p>
+    <w:p>
+      <w:pPr>
+        <w:spacing w:before="160" w:after="40"/>
+      </w:pPr>
+      <w:r>
+        <w:rPr>
+          <w:b/>
+          <w:color w:val="142444"/>
+          <w:sz w:val="20"/>
+        </w:rPr>
+        <w:t xml:space="preserve">  AI-Powered Content Generation</w:t>
+      </w:r>
+    </w:p>
+    <w:p>
+      <w:pPr>
+        <w:spacing w:after="120" w:line="276" w:lineRule="auto"/>
+      </w:pPr>
+      <w:r>
+        <w:rPr>
+          <w:b w:val="0"/>
+          <w:i w:val="0"/>
+          <w:color w:val="3D3B3B"/>
+          <w:sz w:val="19"/>
+        </w:rPr>
+        <w:t>Automated creation of SEO-optimized articles tailored to your brand voice, target keywords, and audience. Each article follows our EEAT Content Framework for quality and topical authority.</w:t>
+      </w:r>
+    </w:p>
+    <w:p>
+      <w:pPr>
+        <w:spacing w:after="80" w:line="276" w:lineRule="auto"/>
+      </w:pPr>
+      <w:r>
+        <w:rPr>
+          <w:b w:val="0"/>
+          <w:i/>
+          <w:color w:val="838081"/>
+          <w:sz w:val="18"/>
+        </w:rPr>
+        <w:t>توليد محتوى آلي بجودة احترافية محسّن لمحركات البحث ومتوافق مع صوت علامتك التجارية وجمهورك المستهدف.</w:t>
+      </w:r>
+    </w:p>
+    <w:p>
+      <w:pPr>
+        <w:spacing w:before="160" w:after="40"/>
+      </w:pPr>
+      <w:r>
+        <w:rPr>
+          <w:b/>
+          <w:color w:val="142444"/>
+          <w:sz w:val="20"/>
+        </w:rPr>
+        <w:t xml:space="preserve">  SEO Optimization Pipeline</w:t>
+      </w:r>
+    </w:p>
+    <w:p>
+      <w:pPr>
+        <w:spacing w:after="120" w:line="276" w:lineRule="auto"/>
+      </w:pPr>
+      <w:r>
+        <w:rPr>
+          <w:b w:val="0"/>
+          <w:i w:val="0"/>
+          <w:color w:val="3D3B3B"/>
+          <w:sz w:val="19"/>
+        </w:rPr>
+        <w:t>Full on-page SEO including meta tags, headings, keyword placement, internal linking, schema markup, and readability scoring.</w:t>
+      </w:r>
+    </w:p>
+    <w:p>
+      <w:pPr>
+        <w:spacing w:after="80" w:line="276" w:lineRule="auto"/>
+      </w:pPr>
+      <w:r>
+        <w:rPr>
+          <w:b w:val="0"/>
+          <w:i/>
+          <w:color w:val="838081"/>
+          <w:sz w:val="18"/>
+        </w:rPr>
+        <w:t>تحسين شامل لمحركات البحث يشمل البيانات الوصفية والعناوين والكلمات المفتاحية والربط الداخلي وترميز المخطط.</w:t>
+      </w:r>
+    </w:p>
+    <w:p>
+      <w:pPr>
+        <w:spacing w:before="160" w:after="40"/>
+      </w:pPr>
+      <w:r>
+        <w:rPr>
+          <w:b/>
+          <w:color w:val="142444"/>
+          <w:sz w:val="20"/>
+        </w:rPr>
+        <w:t xml:space="preserve">  Multi-Platform Publishing</w:t>
+      </w:r>
+    </w:p>
+    <w:p>
+      <w:pPr>
+        <w:spacing w:after="120" w:line="276" w:lineRule="auto"/>
+      </w:pPr>
+      <w:r>
+        <w:rPr>
+          <w:b w:val="0"/>
+          <w:i w:val="0"/>
+          <w:color w:val="3D3B3B"/>
+          <w:sz w:val="19"/>
+        </w:rPr>
+        <w:t>Direct publishing to Shopify, WordPress, Webflow, or Ghost via API integration. Scheduled publishing with approval workflow.</w:t>
+      </w:r>
+    </w:p>
+    <w:p>
+      <w:pPr>
+        <w:spacing w:after="80" w:line="276" w:lineRule="auto"/>
+      </w:pPr>
+      <w:r>
+        <w:rPr>
+          <w:b w:val="0"/>
+          <w:i/>
+          <w:color w:val="838081"/>
+          <w:sz w:val="18"/>
+        </w:rPr>
+        <w:t>نشر مباشر على منصات متعددة عبر واجهة API مع جدولة النشر وسير عمل الموافقة.</w:t>
+      </w:r>
+    </w:p>
+    <w:p>
+      <w:pPr>
+        <w:spacing w:before="160" w:after="40"/>
+      </w:pPr>
+      <w:r>
+        <w:rPr>
+          <w:b/>
+          <w:color w:val="142444"/>
+          <w:sz w:val="20"/>
+        </w:rPr>
+        <w:t xml:space="preserve">  Google Search Console Integration</w:t>
+      </w:r>
+    </w:p>
+    <w:p>
+      <w:pPr>
+        <w:spacing w:after="120" w:line="276" w:lineRule="auto"/>
+      </w:pPr>
+      <w:r>
+        <w:rPr>
+          <w:b w:val="0"/>
+          <w:i w:val="0"/>
+          <w:color w:val="3D3B3B"/>
+          <w:sz w:val="19"/>
+        </w:rPr>
+        <w:t>Performance tracking: impressions, clicks, CTR, and position data. Sync and analyze your search presence in real-time.</w:t>
+      </w:r>
+    </w:p>
+    <w:p>
+      <w:pPr>
+        <w:spacing w:after="80" w:line="276" w:lineRule="auto"/>
+      </w:pPr>
+      <w:r>
+        <w:rPr>
+          <w:b w:val="0"/>
+          <w:i/>
+          <w:color w:val="838081"/>
+          <w:sz w:val="18"/>
+        </w:rPr>
+        <w:t>تتبع أداء البحث: مرات الظهور والنقرات ونسبة النقر إلى الظهور والترتيب مع مزامنة وتحليل آني.</w:t>
+      </w:r>
+    </w:p>
+    <w:p>
+      <w:pPr>
+        <w:spacing w:before="160" w:after="40"/>
+      </w:pPr>
+      <w:r>
+        <w:rPr>
+          <w:b/>
+          <w:color w:val="142444"/>
+          <w:sz w:val="20"/>
+        </w:rPr>
+        <w:t xml:space="preserve">  Analytics Dashboard</w:t>
+      </w:r>
+    </w:p>
+    <w:p>
+      <w:pPr>
+        <w:spacing w:after="120" w:line="276" w:lineRule="auto"/>
+      </w:pPr>
+      <w:r>
+        <w:rPr>
+          <w:b w:val="0"/>
+          <w:i w:val="0"/>
+          <w:color w:val="3D3B3B"/>
+          <w:sz w:val="19"/>
+        </w:rPr>
+        <w:t>Real-time reporting dashboard with metric cards, charts, top queries table, and exportable reports.</w:t>
+      </w:r>
+    </w:p>
+    <w:p>
+      <w:pPr>
+        <w:spacing w:after="80" w:line="276" w:lineRule="auto"/>
+      </w:pPr>
+      <w:r>
+        <w:rPr>
+          <w:b w:val="0"/>
+          <w:i/>
+          <w:color w:val="838081"/>
+          <w:sz w:val="18"/>
+        </w:rPr>
+        <w:t>لوحة تحليلات آنية ببطاقات المقاييس والرسوم البيانية وجدول أفضل الاستعلامات وتقارير قابلة للتصدير.</w:t>
+      </w:r>
+    </w:p>
+    <w:p>
+      <w:pPr>
+        <w:spacing w:before="160" w:after="40"/>
+      </w:pPr>
+      <w:r>
+        <w:rPr>
+          <w:b/>
+          <w:color w:val="142444"/>
+          <w:sz w:val="20"/>
+        </w:rPr>
+        <w:t xml:space="preserve">  Multi-Language Support (Up to 13 Languages)</w:t>
+      </w:r>
+    </w:p>
+    <w:p>
+      <w:pPr>
+        <w:spacing w:after="120" w:line="276" w:lineRule="auto"/>
+      </w:pPr>
+      <w:r>
+        <w:rPr>
+          <w:b w:val="0"/>
+          <w:i w:val="0"/>
+          <w:color w:val="3D3B3B"/>
+          <w:sz w:val="19"/>
+        </w:rPr>
+        <w:t>Content generation and SEO optimization in Arabic, English, French, German, Spanish, Portuguese, Italian, Russian, Turkish, Japanese, Chinese, Korean, and Dutch.</w:t>
+      </w:r>
+    </w:p>
+    <w:p>
+      <w:pPr>
+        <w:spacing w:after="80" w:line="276" w:lineRule="auto"/>
+      </w:pPr>
+      <w:r>
+        <w:rPr>
+          <w:b w:val="0"/>
+          <w:i/>
+          <w:color w:val="838081"/>
+          <w:sz w:val="18"/>
+        </w:rPr>
+        <w:t>توليد المحتوى وتحسين محركات البحث بـ ١٣ لغة تشمل العربية والإنجليزية والفرنسية والألمانية واليابانية والصينية وغيرها.</w:t>
+      </w:r>
+    </w:p>
+    <w:p>
+      <w:pPr>
+        <w:spacing w:before="320" w:after="120"/>
+      </w:pPr>
+      <w:r>
+        <w:rPr>
+          <w:rFonts w:ascii="Calibri Light" w:hAnsi="Calibri Light"/>
+          <w:b/>
+          <w:color w:val="142444"/>
+          <w:sz w:val="26"/>
+        </w:rPr>
+        <w:t>3.  EXCLUSIONS</w:t>
+      </w:r>
+      <w:r>
+        <w:rPr>
+          <w:i/>
+          <w:color w:val="838081"/>
+          <w:sz w:val="18"/>
+        </w:rPr>
+        <w:br/>
+        <w:t>ما لا يشملہ العرض</w:t>
+      </w:r>
+    </w:p>
+    <w:p>
+      <w:pPr>
+        <w:spacing w:before="80" w:after="80"/>
+        <w:pBdr>
+          <w:bottom w:val="single" w:sz="8" w:space="1" w:color="FCB900"/>
+        </w:pBdr>
+      </w:pPr>
+    </w:p>
+    <w:p>
+      <w:pPr>
+        <w:spacing w:after="120" w:line="276" w:lineRule="auto"/>
+      </w:pPr>
+      <w:r>
+        <w:rPr>
+          <w:b w:val="0"/>
+          <w:i w:val="0"/>
+          <w:color w:val="3D3B3B"/>
+          <w:sz w:val="20"/>
+        </w:rPr>
+        <w:t>The following are explicitly NOT included unless separately agreed in writing:</w:t>
+      </w:r>
+    </w:p>
+    <w:p>
+      <w:pPr>
+        <w:spacing w:after="40" w:line="276" w:lineRule="auto"/>
+        <w:ind w:left="283"/>
+      </w:pPr>
+      <w:r>
+        <w:rPr>
+          <w:color w:val="3D3B3B"/>
+          <w:sz w:val="19"/>
+        </w:rPr>
+        <w:t xml:space="preserve">  •  Website design, development, or hosting</w:t>
+      </w:r>
+    </w:p>
+    <w:p>
+      <w:pPr>
+        <w:spacing w:after="40" w:line="276" w:lineRule="auto"/>
+        <w:ind w:left="283"/>
+      </w:pPr>
+      <w:r>
+        <w:rPr>
+          <w:color w:val="3D3B3B"/>
+          <w:sz w:val="19"/>
+        </w:rPr>
+        <w:t xml:space="preserve">  •  Graphic design or branding (except AI-generated article images)</w:t>
+      </w:r>
+    </w:p>
+    <w:p>
+      <w:pPr>
+        <w:spacing w:after="40" w:line="276" w:lineRule="auto"/>
+        <w:ind w:left="283"/>
+      </w:pPr>
+      <w:r>
+        <w:rPr>
+          <w:color w:val="3D3B3B"/>
+          <w:sz w:val="19"/>
+        </w:rPr>
+        <w:t xml:space="preserve">  •  Manual content writing, editing, or proofreading</w:t>
+      </w:r>
+    </w:p>
+    <w:p>
+      <w:pPr>
+        <w:spacing w:after="40" w:line="276" w:lineRule="auto"/>
+        <w:ind w:left="283"/>
+      </w:pPr>
+      <w:r>
+        <w:rPr>
+          <w:color w:val="3D3B3B"/>
+          <w:sz w:val="19"/>
+        </w:rPr>
+        <w:t xml:space="preserve">  •  Paid advertising management (Google Ads, Social Ads)</w:t>
+      </w:r>
+    </w:p>
+    <w:p>
+      <w:pPr>
+        <w:spacing w:after="40" w:line="276" w:lineRule="auto"/>
+        <w:ind w:left="283"/>
+      </w:pPr>
+      <w:r>
+        <w:rPr>
+          <w:color w:val="3D3B3B"/>
+          <w:sz w:val="19"/>
+        </w:rPr>
+        <w:t xml:space="preserve">  •  Domain registration or email hosting</w:t>
+      </w:r>
+    </w:p>
+    <w:p>
+      <w:pPr>
+        <w:spacing w:after="40" w:line="276" w:lineRule="auto"/>
+        <w:ind w:left="283"/>
+      </w:pPr>
+      <w:r>
+        <w:rPr>
+          <w:color w:val="3D3B3B"/>
+          <w:sz w:val="19"/>
+        </w:rPr>
+        <w:t xml:space="preserve">  •  Third-party software licenses or subscriptions</w:t>
+      </w:r>
+    </w:p>
+    <w:p>
+      <w:pPr>
+        <w:spacing w:after="40" w:line="276" w:lineRule="auto"/>
+        <w:ind w:left="283"/>
+      </w:pPr>
+      <w:r>
+        <w:rPr>
+          <w:color w:val="3D3B3B"/>
+          <w:sz w:val="19"/>
+        </w:rPr>
+        <w:t xml:space="preserve">  •  Video production or editing</w:t>
+      </w:r>
+    </w:p>
+    <w:p>
+      <w:pPr>
+        <w:spacing w:before="320" w:after="120"/>
+      </w:pPr>
+      <w:r>
+        <w:rPr>
+          <w:rFonts w:ascii="Calibri Light" w:hAnsi="Calibri Light"/>
+          <w:b/>
+          <w:color w:val="142444"/>
+          <w:sz w:val="26"/>
+        </w:rPr>
+        <w:t>4.  TIMELINE &amp; MILESTONES</w:t>
+      </w:r>
+      <w:r>
+        <w:rPr>
+          <w:i/>
+          <w:color w:val="838081"/>
+          <w:sz w:val="18"/>
+        </w:rPr>
+        <w:br/>
+        <w:t>الجدول الزمني والمراحل</w:t>
+      </w:r>
+    </w:p>
+    <w:p>
+      <w:pPr>
+        <w:spacing w:before="80" w:after="80"/>
+        <w:pBdr>
+          <w:bottom w:val="single" w:sz="8" w:space="1" w:color="FCB900"/>
+        </w:pBdr>
+      </w:pPr>
+    </w:p>
+    <w:p>
+      <w:pPr>
+        <w:spacing w:before="120" w:after="40"/>
+      </w:pPr>
+      <w:r>
+        <w:rPr>
+          <w:b/>
+          <w:color w:val="142444"/>
+          <w:sz w:val="20"/>
+        </w:rPr>
+        <w:t xml:space="preserve">  Phase 1: Setup &amp; Onboarding</w:t>
+      </w:r>
+      <w:r>
+        <w:rPr>
+          <w:b/>
+          <w:color w:val="FCB900"/>
+          <w:sz w:val="18"/>
+        </w:rPr>
+        <w:t xml:space="preserve">  —  Days 1-5</w:t>
+      </w:r>
+    </w:p>
+    <w:p>
+      <w:pPr>
+        <w:spacing w:after="80" w:line="276" w:lineRule="auto"/>
+      </w:pPr>
+      <w:r>
+        <w:rPr>
+          <w:b w:val="0"/>
+          <w:i w:val="0"/>
+          <w:color w:val="3D3B3B"/>
+          <w:sz w:val="19"/>
+        </w:rPr>
+        <w:t>Account creation, platform configuration, API integrations, brand profile setup, keyword research initialization.</w:t>
+      </w:r>
+    </w:p>
+    <w:p>
+      <w:pPr>
+        <w:spacing w:before="120" w:after="40"/>
+      </w:pPr>
+      <w:r>
+        <w:rPr>
+          <w:b/>
+          <w:color w:val="142444"/>
+          <w:sz w:val="20"/>
+        </w:rPr>
+        <w:t xml:space="preserve">  Phase 2: First Content Batch</w:t>
+      </w:r>
+      <w:r>
+        <w:rPr>
+          <w:b/>
+          <w:color w:val="FCB900"/>
+          <w:sz w:val="18"/>
+        </w:rPr>
+        <w:t xml:space="preserve">  —  Days 6-12</w:t>
+      </w:r>
+    </w:p>
+    <w:p>
+      <w:pPr>
+        <w:spacing w:after="80" w:line="276" w:lineRule="auto"/>
+      </w:pPr>
+      <w:r>
+        <w:rPr>
+          <w:b w:val="0"/>
+          <w:i w:val="0"/>
+          <w:color w:val="3D3B3B"/>
+          <w:sz w:val="19"/>
+        </w:rPr>
+        <w:t>Initial content generation (up to 5 articles), review &amp; revision cycle, publishing pipeline test.</w:t>
+      </w:r>
+    </w:p>
+    <w:p>
+      <w:pPr>
+        <w:spacing w:before="120" w:after="40"/>
+      </w:pPr>
+      <w:r>
+        <w:rPr>
+          <w:b/>
+          <w:color w:val="142444"/>
+          <w:sz w:val="20"/>
+        </w:rPr>
+        <w:t xml:space="preserve">  Phase 3: Ongoing Delivery</w:t>
+      </w:r>
+      <w:r>
+        <w:rPr>
+          <w:b/>
+          <w:color w:val="FCB900"/>
+          <w:sz w:val="18"/>
+        </w:rPr>
+        <w:t xml:space="preserve">  —  Weekly</w:t>
+      </w:r>
+    </w:p>
+    <w:p>
+      <w:pPr>
+        <w:spacing w:after="80" w:line="276" w:lineRule="auto"/>
+      </w:pPr>
+      <w:r>
+        <w:rPr>
+          <w:b w:val="0"/>
+          <w:i w:val="0"/>
+          <w:color w:val="3D3B3B"/>
+          <w:sz w:val="19"/>
+        </w:rPr>
+        <w:t>Scheduled content generation per agreed cadence, continuous optimization, monthly performance reports.</w:t>
+      </w:r>
+    </w:p>
+    <w:p>
+      <w:pPr>
+        <w:spacing w:after="120" w:line="276" w:lineRule="auto"/>
+      </w:pPr>
+      <w:r>
+        <w:rPr>
+          <w:b w:val="0"/>
+          <w:i/>
+          <w:color w:val="3D3B3B"/>
+          <w:sz w:val="19"/>
+        </w:rPr>
+        <w:t>Total estimated duration: {DURATION} from start date. Timeline may be adjusted based on client feedback cycles and scope changes.</w:t>
+      </w:r>
+    </w:p>
+    <w:p>
+      <w:pPr>
+        <w:spacing w:before="320" w:after="120"/>
+      </w:pPr>
+      <w:r>
+        <w:rPr>
+          <w:rFonts w:ascii="Calibri Light" w:hAnsi="Calibri Light"/>
+          <w:b/>
+          <w:color w:val="142444"/>
+          <w:sz w:val="26"/>
+        </w:rPr>
+        <w:t>5.  CLIENT RESPONSIBILITIES</w:t>
+      </w:r>
+      <w:r>
+        <w:rPr>
+          <w:i/>
+          <w:color w:val="838081"/>
+          <w:sz w:val="18"/>
+        </w:rPr>
+        <w:br/>
+        <w:t>مسؤوليات العميل</w:t>
+      </w:r>
+    </w:p>
+    <w:p>
+      <w:pPr>
+        <w:spacing w:before="80" w:after="80"/>
+        <w:pBdr>
+          <w:bottom w:val="single" w:sz="8" w:space="1" w:color="FCB900"/>
+        </w:pBdr>
+      </w:pPr>
+    </w:p>
+    <w:p>
+      <w:pPr>
+        <w:spacing w:after="120" w:line="276" w:lineRule="auto"/>
+      </w:pPr>
+      <w:r>
+        <w:rPr>
+          <w:b w:val="0"/>
+          <w:i w:val="0"/>
+          <w:color w:val="3D3B3B"/>
+          <w:sz w:val="20"/>
+        </w:rPr>
+        <w:t>To ensure successful delivery, the Client agrees to:</w:t>
+      </w:r>
+    </w:p>
+    <w:p>
+      <w:pPr>
+        <w:spacing w:after="40" w:line="276" w:lineRule="auto"/>
+        <w:ind w:left="283"/>
+      </w:pPr>
+      <w:r>
+        <w:rPr>
+          <w:color w:val="3D3B3B"/>
+          <w:sz w:val="19"/>
+        </w:rPr>
+        <w:t xml:space="preserve">  •  Provide API access to CMS platforms (Shopify, WordPress, etc.)</w:t>
+      </w:r>
+    </w:p>
+    <w:p>
+      <w:pPr>
+        <w:spacing w:after="40" w:line="276" w:lineRule="auto"/>
+        <w:ind w:left="283"/>
+      </w:pPr>
+      <w:r>
+        <w:rPr>
+          <w:color w:val="3D3B3B"/>
+          <w:sz w:val="19"/>
+        </w:rPr>
+        <w:t xml:space="preserve">  •  Share brand guidelines, target keywords, and content preferences</w:t>
+      </w:r>
+    </w:p>
+    <w:p>
+      <w:pPr>
+        <w:spacing w:after="40" w:line="276" w:lineRule="auto"/>
+        <w:ind w:left="283"/>
+      </w:pPr>
+      <w:r>
+        <w:rPr>
+          <w:color w:val="3D3B3B"/>
+          <w:sz w:val="19"/>
+        </w:rPr>
+        <w:t xml:space="preserve">  •  Review and approve generated content within 3 business days of delivery</w:t>
+      </w:r>
+    </w:p>
+    <w:p>
+      <w:pPr>
+        <w:spacing w:after="40" w:line="276" w:lineRule="auto"/>
+        <w:ind w:left="283"/>
+      </w:pPr>
+      <w:r>
+        <w:rPr>
+          <w:color w:val="3D3B3B"/>
+          <w:sz w:val="19"/>
+        </w:rPr>
+        <w:t xml:space="preserve">  •  Provide timely feedback on content quality and direction</w:t>
+      </w:r>
+    </w:p>
+    <w:p>
+      <w:pPr>
+        <w:spacing w:after="40" w:line="276" w:lineRule="auto"/>
+        <w:ind w:left="283"/>
+      </w:pPr>
+      <w:r>
+        <w:rPr>
+          <w:color w:val="3D3B3B"/>
+          <w:sz w:val="19"/>
+        </w:rPr>
+        <w:t xml:space="preserve">  •  Maintain a valid payment method and adhere to agreed payment terms</w:t>
+      </w:r>
+    </w:p>
+    <w:p>
+      <w:pPr>
+        <w:spacing w:after="40" w:line="276" w:lineRule="auto"/>
+        <w:ind w:left="283"/>
+      </w:pPr>
+      <w:r>
+        <w:rPr>
+          <w:color w:val="3D3B3B"/>
+          <w:sz w:val="19"/>
+        </w:rPr>
+        <w:t xml:space="preserve">  •  Designate a point of contact for day-to-day coordination</w:t>
+      </w:r>
+    </w:p>
+    <w:p>
+      <w:pPr>
+        <w:spacing w:before="320" w:after="120"/>
+      </w:pPr>
+      <w:r>
+        <w:rPr>
+          <w:rFonts w:ascii="Calibri Light" w:hAnsi="Calibri Light"/>
+          <w:b/>
+          <w:color w:val="142444"/>
+          <w:sz w:val="26"/>
+        </w:rPr>
+        <w:t>6.  INVESTMENT &amp; PRICING</w:t>
+      </w:r>
+      <w:r>
+        <w:rPr>
+          <w:i/>
+          <w:color w:val="838081"/>
+          <w:sz w:val="18"/>
+        </w:rPr>
+        <w:br/>
+        <w:t>الاستثمار والأسعار</w:t>
+      </w:r>
+    </w:p>
+    <w:p>
+      <w:pPr>
+        <w:spacing w:before="80" w:after="80"/>
+        <w:pBdr>
+          <w:bottom w:val="single" w:sz="8" w:space="1" w:color="FCB900"/>
+        </w:pBdr>
+      </w:pPr>
     </w:p>
     <w:tbl>
       <w:tblPr>
@@ -351,12 +1290,11 @@
           </w:tcPr>
           <w:p>
             <w:pPr>
-              <w:spacing w:before="60" w:after="60"/>
+              <w:spacing w:before="40" w:after="40"/>
               <w:jc w:val="center"/>
             </w:pPr>
             <w:r>
               <w:rPr>
-                <w:rFonts w:ascii="Calibri" w:hAnsi="Calibri"/>
                 <w:b/>
                 <w:color w:val="FFFFFF"/>
                 <w:sz w:val="16"/>
@@ -367,22 +1305,21 @@
         </w:tc>
         <w:tc>
           <w:tcPr>
-            <w:tcW w:type="dxa" w:w="5102"/>
+            <w:tcW w:type="dxa" w:w="4819"/>
             <w:shd w:fill="171414"/>
           </w:tcPr>
           <w:p>
             <w:pPr>
-              <w:spacing w:before="60" w:after="60"/>
+              <w:spacing w:before="40" w:after="40"/>
               <w:jc w:val="left"/>
             </w:pPr>
             <w:r>
               <w:rPr>
-                <w:rFonts w:ascii="Calibri" w:hAnsi="Calibri"/>
                 <w:b/>
                 <w:color w:val="FFFFFF"/>
                 <w:sz w:val="16"/>
               </w:rPr>
-              <w:t>DESCRIPTION / الوصف</w:t>
+              <w:t>SERVICE / الخدمة</w:t>
             </w:r>
           </w:p>
         </w:tc>
@@ -393,12 +1330,11 @@
           </w:tcPr>
           <w:p>
             <w:pPr>
-              <w:spacing w:before="60" w:after="60"/>
+              <w:spacing w:before="40" w:after="40"/>
               <w:jc w:val="center"/>
             </w:pPr>
             <w:r>
               <w:rPr>
-                <w:rFonts w:ascii="Calibri" w:hAnsi="Calibri"/>
                 <w:b/>
                 <w:color w:val="FFFFFF"/>
                 <w:sz w:val="16"/>
@@ -414,12 +1350,11 @@
           </w:tcPr>
           <w:p>
             <w:pPr>
-              <w:spacing w:before="60" w:after="60"/>
+              <w:spacing w:before="40" w:after="40"/>
               <w:jc w:val="center"/>
             </w:pPr>
             <w:r>
               <w:rPr>
-                <w:rFonts w:ascii="Calibri" w:hAnsi="Calibri"/>
                 <w:b/>
                 <w:color w:val="FFFFFF"/>
                 <w:sz w:val="16"/>
@@ -430,17 +1365,16 @@
         </w:tc>
         <w:tc>
           <w:tcPr>
-            <w:tcW w:type="dxa" w:w="1701"/>
+            <w:tcW w:type="dxa" w:w="1984"/>
             <w:shd w:fill="171414"/>
           </w:tcPr>
           <w:p>
             <w:pPr>
-              <w:spacing w:before="60" w:after="60"/>
+              <w:spacing w:before="40" w:after="40"/>
               <w:jc w:val="center"/>
             </w:pPr>
             <w:r>
               <w:rPr>
-                <w:rFonts w:ascii="Calibri" w:hAnsi="Calibri"/>
                 <w:b/>
                 <w:color w:val="FFFFFF"/>
                 <w:sz w:val="16"/>
@@ -457,13 +1391,13 @@
           </w:tcPr>
           <w:p>
             <w:pPr>
-              <w:spacing w:before="60" w:after="60"/>
+              <w:spacing w:before="40" w:after="40"/>
               <w:jc w:val="center"/>
             </w:pPr>
             <w:r>
               <w:rPr>
                 <w:color w:val="3D3B3B"/>
-                <w:sz w:val="18"/>
+                <w:sz w:val="17"/>
               </w:rPr>
               <w:t>1</w:t>
             </w:r>
@@ -471,21 +1405,21 @@
         </w:tc>
         <w:tc>
           <w:tcPr>
-            <w:tcW w:type="dxa" w:w="5102"/>
+            <w:tcW w:type="dxa" w:w="4819"/>
           </w:tcPr>
           <w:p>
             <w:pPr>
-              <w:spacing w:before="60" w:after="60"/>
+              <w:spacing w:before="40" w:after="40"/>
               <w:jc w:val="left"/>
             </w:pPr>
             <w:r>
               <w:rPr>
                 <w:color w:val="3D3B3B"/>
-                <w:sz w:val="18"/>
+                <w:sz w:val="17"/>
               </w:rPr>
-              <w:t>TDS GEO — Starter (Monthly)</w:t>
+              <w:t>TDS GEO — Setup &amp; Onboarding</w:t>
               <w:br/>
-              <w:t>اشتراك شهري — باقة المبتدئين</w:t>
+              <w:t>الإعداد والتشغيل الأولي</w:t>
             </w:r>
           </w:p>
         </w:tc>
@@ -495,13 +1429,13 @@
           </w:tcPr>
           <w:p>
             <w:pPr>
-              <w:spacing w:before="60" w:after="60"/>
+              <w:spacing w:before="40" w:after="40"/>
               <w:jc w:val="right"/>
             </w:pPr>
             <w:r>
               <w:rPr>
                 <w:color w:val="3D3B3B"/>
-                <w:sz w:val="18"/>
+                <w:sz w:val="17"/>
               </w:rPr>
               <w:t>1</w:t>
             </w:r>
@@ -513,34 +1447,33 @@
           </w:tcPr>
           <w:p>
             <w:pPr>
-              <w:spacing w:before="60" w:after="60"/>
+              <w:spacing w:before="40" w:after="40"/>
               <w:jc w:val="right"/>
             </w:pPr>
             <w:r>
               <w:rPr>
                 <w:color w:val="3D3B3B"/>
-                <w:sz w:val="18"/>
+                <w:sz w:val="17"/>
               </w:rPr>
-              <w:t>$29.00</w:t>
+              <w:t>{SETUP_PRICE}</w:t>
             </w:r>
           </w:p>
         </w:tc>
         <w:tc>
           <w:tcPr>
-            <w:tcW w:type="dxa" w:w="1701"/>
+            <w:tcW w:type="dxa" w:w="1984"/>
           </w:tcPr>
           <w:p>
             <w:pPr>
-              <w:spacing w:before="60" w:after="60"/>
+              <w:spacing w:before="40" w:after="40"/>
               <w:jc w:val="right"/>
             </w:pPr>
             <w:r>
               <w:rPr>
-                <w:b/>
                 <w:color w:val="171414"/>
-                <w:sz w:val="18"/>
+                <w:sz w:val="17"/>
               </w:rPr>
-              <w:t>$29.00</w:t>
+              <w:t>{SETUP_TOTAL}</w:t>
             </w:r>
           </w:p>
         </w:tc>
@@ -552,13 +1485,13 @@
           </w:tcPr>
           <w:p>
             <w:pPr>
-              <w:spacing w:before="60" w:after="60"/>
+              <w:spacing w:before="40" w:after="40"/>
               <w:jc w:val="center"/>
             </w:pPr>
             <w:r>
               <w:rPr>
                 <w:color w:val="3D3B3B"/>
-                <w:sz w:val="18"/>
+                <w:sz w:val="17"/>
               </w:rPr>
               <w:t>2</w:t>
             </w:r>
@@ -566,21 +1499,21 @@
         </w:tc>
         <w:tc>
           <w:tcPr>
-            <w:tcW w:type="dxa" w:w="5102"/>
+            <w:tcW w:type="dxa" w:w="4819"/>
           </w:tcPr>
           <w:p>
             <w:pPr>
-              <w:spacing w:before="60" w:after="60"/>
+              <w:spacing w:before="40" w:after="40"/>
               <w:jc w:val="left"/>
             </w:pPr>
             <w:r>
               <w:rPr>
                 <w:color w:val="3D3B3B"/>
-                <w:sz w:val="18"/>
+                <w:sz w:val="17"/>
               </w:rPr>
-              <w:t>TDS GEO — Professional (Monthly)</w:t>
+              <w:t>TDS GEO — {PLAN_NAME} ({BILLING_CYCLE})</w:t>
               <w:br/>
-              <w:t>اشتراك شهري — باقة الاحترافية</w:t>
+              <w:t>{PLAN_NAME_AR} — {BILLING_CYCLE_AR}</w:t>
             </w:r>
           </w:p>
         </w:tc>
@@ -590,15 +1523,15 @@
           </w:tcPr>
           <w:p>
             <w:pPr>
-              <w:spacing w:before="60" w:after="60"/>
+              <w:spacing w:before="40" w:after="40"/>
               <w:jc w:val="right"/>
             </w:pPr>
             <w:r>
               <w:rPr>
                 <w:color w:val="3D3B3B"/>
-                <w:sz w:val="18"/>
+                <w:sz w:val="17"/>
               </w:rPr>
-              <w:t>1</w:t>
+              <w:t>{PLAN_QTY}</w:t>
             </w:r>
           </w:p>
         </w:tc>
@@ -608,34 +1541,33 @@
           </w:tcPr>
           <w:p>
             <w:pPr>
-              <w:spacing w:before="60" w:after="60"/>
+              <w:spacing w:before="40" w:after="40"/>
               <w:jc w:val="right"/>
             </w:pPr>
             <w:r>
               <w:rPr>
                 <w:color w:val="3D3B3B"/>
-                <w:sz w:val="18"/>
+                <w:sz w:val="17"/>
               </w:rPr>
-              <w:t>$79.00</w:t>
+              <w:t>{PLAN_UNIT_PRICE}</w:t>
             </w:r>
           </w:p>
         </w:tc>
         <w:tc>
           <w:tcPr>
-            <w:tcW w:type="dxa" w:w="1701"/>
+            <w:tcW w:type="dxa" w:w="1984"/>
           </w:tcPr>
           <w:p>
             <w:pPr>
-              <w:spacing w:before="60" w:after="60"/>
+              <w:spacing w:before="40" w:after="40"/>
               <w:jc w:val="right"/>
             </w:pPr>
             <w:r>
               <w:rPr>
-                <w:b/>
                 <w:color w:val="171414"/>
-                <w:sz w:val="18"/>
+                <w:sz w:val="17"/>
               </w:rPr>
-              <w:t>$79.00</w:t>
+              <w:t>{PLAN_TOTAL}</w:t>
             </w:r>
           </w:p>
         </w:tc>
@@ -647,13 +1579,13 @@
           </w:tcPr>
           <w:p>
             <w:pPr>
-              <w:spacing w:before="60" w:after="60"/>
+              <w:spacing w:before="40" w:after="40"/>
               <w:jc w:val="center"/>
             </w:pPr>
             <w:r>
               <w:rPr>
                 <w:color w:val="3D3B3B"/>
-                <w:sz w:val="18"/>
+                <w:sz w:val="17"/>
               </w:rPr>
               <w:t>3</w:t>
             </w:r>
@@ -661,21 +1593,21 @@
         </w:tc>
         <w:tc>
           <w:tcPr>
-            <w:tcW w:type="dxa" w:w="5102"/>
+            <w:tcW w:type="dxa" w:w="4819"/>
           </w:tcPr>
           <w:p>
             <w:pPr>
-              <w:spacing w:before="60" w:after="60"/>
+              <w:spacing w:before="40" w:after="40"/>
               <w:jc w:val="left"/>
             </w:pPr>
             <w:r>
               <w:rPr>
                 <w:color w:val="3D3B3B"/>
-                <w:sz w:val="18"/>
+                <w:sz w:val="17"/>
               </w:rPr>
-              <w:t>Setup &amp; Onboarding</w:t>
+              <w:t>Content — Extra Article Pack (×{EXTRA_QTY})</w:t>
               <w:br/>
-              <w:t>الإعداد والتشغيل الأولي</w:t>
+              <w:t>حزمة مقالات إضافية</w:t>
             </w:r>
           </w:p>
         </w:tc>
@@ -685,15 +1617,15 @@
           </w:tcPr>
           <w:p>
             <w:pPr>
-              <w:spacing w:before="60" w:after="60"/>
+              <w:spacing w:before="40" w:after="40"/>
               <w:jc w:val="right"/>
             </w:pPr>
             <w:r>
               <w:rPr>
                 <w:color w:val="3D3B3B"/>
-                <w:sz w:val="18"/>
+                <w:sz w:val="17"/>
               </w:rPr>
-              <w:t>1</w:t>
+              <w:t>{EXTRA_QTY}</w:t>
             </w:r>
           </w:p>
         </w:tc>
@@ -703,34 +1635,33 @@
           </w:tcPr>
           <w:p>
             <w:pPr>
-              <w:spacing w:before="60" w:after="60"/>
+              <w:spacing w:before="40" w:after="40"/>
               <w:jc w:val="right"/>
             </w:pPr>
             <w:r>
               <w:rPr>
                 <w:color w:val="3D3B3B"/>
-                <w:sz w:val="18"/>
+                <w:sz w:val="17"/>
               </w:rPr>
-              <w:t>$1,000.00</w:t>
+              <w:t>{EXTRA_UNIT_PRICE}</w:t>
             </w:r>
           </w:p>
         </w:tc>
         <w:tc>
           <w:tcPr>
-            <w:tcW w:type="dxa" w:w="1701"/>
+            <w:tcW w:type="dxa" w:w="1984"/>
           </w:tcPr>
           <w:p>
             <w:pPr>
-              <w:spacing w:before="60" w:after="60"/>
+              <w:spacing w:before="40" w:after="40"/>
               <w:jc w:val="right"/>
             </w:pPr>
             <w:r>
               <w:rPr>
-                <w:b/>
                 <w:color w:val="171414"/>
-                <w:sz w:val="18"/>
+                <w:sz w:val="17"/>
               </w:rPr>
-              <w:t>$1,000.00</w:t>
+              <w:t>{EXTRA_TOTAL}</w:t>
             </w:r>
           </w:p>
         </w:tc>
@@ -742,13 +1673,13 @@
           </w:tcPr>
           <w:p>
             <w:pPr>
-              <w:spacing w:before="60" w:after="60"/>
+              <w:spacing w:before="40" w:after="40"/>
               <w:jc w:val="center"/>
             </w:pPr>
             <w:r>
               <w:rPr>
                 <w:color w:val="3D3B3B"/>
-                <w:sz w:val="18"/>
+                <w:sz w:val="17"/>
               </w:rPr>
               <w:t>4</w:t>
             </w:r>
@@ -756,21 +1687,21 @@
         </w:tc>
         <w:tc>
           <w:tcPr>
-            <w:tcW w:type="dxa" w:w="5102"/>
+            <w:tcW w:type="dxa" w:w="4819"/>
           </w:tcPr>
           <w:p>
             <w:pPr>
-              <w:spacing w:before="60" w:after="60"/>
+              <w:spacing w:before="40" w:after="40"/>
               <w:jc w:val="left"/>
             </w:pPr>
             <w:r>
               <w:rPr>
                 <w:color w:val="3D3B3B"/>
-                <w:sz w:val="18"/>
+                <w:sz w:val="17"/>
               </w:rPr>
-              <w:t>Content — Extra Articles (×5)</w:t>
+              <w:t>Consulting — Strategy Sessions ({CONSULT_HRS}h)</w:t>
               <w:br/>
-              <w:t>محتوى إضافي — مقالات</w:t>
+              <w:t>جلسات استشارية استراتيجية</w:t>
             </w:r>
           </w:p>
         </w:tc>
@@ -780,15 +1711,15 @@
           </w:tcPr>
           <w:p>
             <w:pPr>
-              <w:spacing w:before="60" w:after="60"/>
+              <w:spacing w:before="40" w:after="40"/>
               <w:jc w:val="right"/>
             </w:pPr>
             <w:r>
               <w:rPr>
                 <w:color w:val="3D3B3B"/>
-                <w:sz w:val="18"/>
+                <w:sz w:val="17"/>
               </w:rPr>
-              <w:t>5</w:t>
+              <w:t>{CONSULT_HRS}</w:t>
             </w:r>
           </w:p>
         </w:tc>
@@ -798,34 +1729,33 @@
           </w:tcPr>
           <w:p>
             <w:pPr>
-              <w:spacing w:before="60" w:after="60"/>
+              <w:spacing w:before="40" w:after="40"/>
               <w:jc w:val="right"/>
             </w:pPr>
             <w:r>
               <w:rPr>
                 <w:color w:val="3D3B3B"/>
-                <w:sz w:val="18"/>
+                <w:sz w:val="17"/>
               </w:rPr>
-              <w:t>$15.00</w:t>
+              <w:t>{CONSULT_RATE}</w:t>
             </w:r>
           </w:p>
         </w:tc>
         <w:tc>
           <w:tcPr>
-            <w:tcW w:type="dxa" w:w="1701"/>
+            <w:tcW w:type="dxa" w:w="1984"/>
           </w:tcPr>
           <w:p>
             <w:pPr>
-              <w:spacing w:before="60" w:after="60"/>
+              <w:spacing w:before="40" w:after="40"/>
               <w:jc w:val="right"/>
             </w:pPr>
             <w:r>
               <w:rPr>
-                <w:b/>
                 <w:color w:val="171414"/>
-                <w:sz w:val="18"/>
+                <w:sz w:val="17"/>
               </w:rPr>
-              <w:t>$75.00</w:t>
+              <w:t>{CONSULT_TOTAL}</w:t>
             </w:r>
           </w:p>
         </w:tc>
@@ -837,7 +1767,7 @@
           </w:tcPr>
           <w:p>
             <w:pPr>
-              <w:spacing w:before="120" w:after="60"/>
+              <w:spacing w:before="40" w:after="40"/>
               <w:jc w:val="right"/>
             </w:pPr>
           </w:p>
@@ -848,7 +1778,7 @@
           </w:tcPr>
           <w:p>
             <w:pPr>
-              <w:spacing w:before="120" w:after="60"/>
+              <w:spacing w:before="40" w:after="40"/>
               <w:jc w:val="right"/>
             </w:pPr>
           </w:p>
@@ -859,16 +1789,16 @@
           </w:tcPr>
           <w:p>
             <w:pPr>
-              <w:spacing w:before="120" w:after="60"/>
+              <w:spacing w:before="40" w:after="40"/>
               <w:jc w:val="right"/>
             </w:pPr>
             <w:r>
               <w:rPr>
                 <w:b/>
-                <w:color w:val="171414"/>
-                <w:sz w:val="20"/>
+                <w:color w:val="142444"/>
+                <w:sz w:val="18"/>
               </w:rPr>
-              <w:t>TOTAL</w:t>
+              <w:t>Subtotal / المجموع الفرعي</w:t>
             </w:r>
           </w:p>
         </w:tc>
@@ -878,7 +1808,18 @@
           </w:tcPr>
           <w:p>
             <w:pPr>
-              <w:spacing w:before="120" w:after="60"/>
+              <w:spacing w:before="40" w:after="40"/>
+              <w:jc w:val="right"/>
+            </w:pPr>
+          </w:p>
+        </w:tc>
+        <w:tc>
+          <w:tcPr>
+            <w:tcW w:type="dxa" w:w="1814"/>
+          </w:tcPr>
+          <w:p>
+            <w:pPr>
+              <w:spacing w:before="40" w:after="40"/>
               <w:jc w:val="right"/>
             </w:pPr>
             <w:r>
@@ -886,8 +1827,104 @@
                 <w:color w:val="838081"/>
                 <w:sz w:val="18"/>
               </w:rPr>
-              <w:t>$1,183.00</w:t>
+              <w:t>{SUBTOTAL}</w:t>
             </w:r>
+          </w:p>
+        </w:tc>
+      </w:tr>
+      <w:tr>
+        <w:tc>
+          <w:tcPr>
+            <w:tcW w:type="dxa" w:w="1814"/>
+          </w:tcPr>
+          <w:p>
+            <w:pPr>
+              <w:spacing w:before="40" w:after="40"/>
+              <w:jc w:val="right"/>
+            </w:pPr>
+          </w:p>
+        </w:tc>
+        <w:tc>
+          <w:tcPr>
+            <w:tcW w:type="dxa" w:w="1814"/>
+          </w:tcPr>
+          <w:p>
+            <w:pPr>
+              <w:spacing w:before="40" w:after="40"/>
+              <w:jc w:val="right"/>
+            </w:pPr>
+          </w:p>
+        </w:tc>
+        <w:tc>
+          <w:tcPr>
+            <w:tcW w:type="dxa" w:w="1814"/>
+          </w:tcPr>
+          <w:p>
+            <w:pPr>
+              <w:spacing w:before="40" w:after="40"/>
+              <w:jc w:val="right"/>
+            </w:pPr>
+            <w:r>
+              <w:rPr>
+                <w:b/>
+                <w:color w:val="142444"/>
+                <w:sz w:val="18"/>
+              </w:rPr>
+              <w:t>Discount / الخصم ({DISCOUNT_PCT}%)</w:t>
+            </w:r>
+          </w:p>
+        </w:tc>
+        <w:tc>
+          <w:tcPr>
+            <w:tcW w:type="dxa" w:w="1814"/>
+          </w:tcPr>
+          <w:p>
+            <w:pPr>
+              <w:spacing w:before="40" w:after="40"/>
+              <w:jc w:val="right"/>
+            </w:pPr>
+          </w:p>
+        </w:tc>
+        <w:tc>
+          <w:tcPr>
+            <w:tcW w:type="dxa" w:w="1814"/>
+          </w:tcPr>
+          <w:p>
+            <w:pPr>
+              <w:spacing w:before="40" w:after="40"/>
+              <w:jc w:val="right"/>
+            </w:pPr>
+            <w:r>
+              <w:rPr>
+                <w:color w:val="838081"/>
+                <w:sz w:val="18"/>
+              </w:rPr>
+              <w:t>({DISCOUNT_AMOUNT})</w:t>
+            </w:r>
+          </w:p>
+        </w:tc>
+      </w:tr>
+      <w:tr>
+        <w:tc>
+          <w:tcPr>
+            <w:tcW w:type="dxa" w:w="1814"/>
+          </w:tcPr>
+          <w:p>
+            <w:pPr>
+              <w:spacing w:before="120" w:after="80"/>
+              <w:jc w:val="right"/>
+            </w:pPr>
+          </w:p>
+        </w:tc>
+        <w:tc>
+          <w:tcPr>
+            <w:tcW w:type="dxa" w:w="1814"/>
+          </w:tcPr>
+          <w:p>
+            <w:pPr>
+              <w:spacing w:before="120" w:after="80"/>
+              <w:jc w:val="right"/>
+            </w:pPr>
           </w:p>
         </w:tc>
         <w:tc>
@@ -897,16 +1934,53 @@
           </w:tcPr>
           <w:p>
             <w:pPr>
-              <w:spacing w:before="120" w:after="60"/>
+              <w:spacing w:before="120" w:after="80"/>
               <w:jc w:val="right"/>
             </w:pPr>
             <w:r>
               <w:rPr>
                 <w:b/>
                 <w:color w:val="FFFFFF"/>
-                <w:sz w:val="22"/>
+                <w:sz w:val="20"/>
               </w:rPr>
-              <w:t>$1,183.00</w:t>
+              <w:t>TOTAL DUE / الإجمالي المستحق</w:t>
+            </w:r>
+          </w:p>
+        </w:tc>
+        <w:tc>
+          <w:tcPr>
+            <w:tcW w:type="dxa" w:w="1814"/>
+          </w:tcPr>
+          <w:p>
+            <w:pPr>
+              <w:spacing w:before="120" w:after="80"/>
+            </w:pPr>
+            <w:r>
+              <w:rPr>
+                <w:color w:val="838081"/>
+                <w:sz w:val="18"/>
+              </w:rPr>
+              <w:t>{GRAND_TOTAL_CURRENCY}</w:t>
+            </w:r>
+          </w:p>
+        </w:tc>
+        <w:tc>
+          <w:tcPr>
+            <w:tcW w:type="dxa" w:w="1814"/>
+            <w:shd w:fill="FCB900"/>
+          </w:tcPr>
+          <w:p>
+            <w:pPr>
+              <w:spacing w:before="120" w:after="80"/>
+              <w:jc w:val="right"/>
+            </w:pPr>
+            <w:r>
+              <w:rPr>
+                <w:b/>
+                <w:color w:val="171414"/>
+                <w:sz w:val="26"/>
+              </w:rPr>
+              <w:t>{GRAND_TOTAL}</w:t>
             </w:r>
           </w:p>
         </w:tc>
@@ -922,14 +1996,43 @@
           <w:color w:val="838081"/>
           <w:sz w:val="16"/>
         </w:rPr>
-        <w:t xml:space="preserve">* VAT (14%) will be added where applicable.  </w:t>
-        <w:br/>
-        <w:t>* All prices in USD unless otherwise agreed.</w:t>
+        <w:t xml:space="preserve">VAT (14%) will be added where applicable. All prices in {CURRENCY} unless otherwise stated.  </w:t>
+      </w:r>
+      <w:r>
+        <w:rPr>
+          <w:b/>
+          <w:color w:val="FCB900"/>
+          <w:sz w:val="16"/>
+        </w:rPr>
+        <w:t>Quarterly prepaid plans include a 10% discount.</w:t>
       </w:r>
     </w:p>
     <w:p>
       <w:pPr>
-        <w:jc w:val="left"/>
+        <w:spacing w:before="320" w:after="120"/>
+      </w:pPr>
+      <w:r>
+        <w:rPr>
+          <w:rFonts w:ascii="Calibri Light" w:hAnsi="Calibri Light"/>
+          <w:b/>
+          <w:color w:val="142444"/>
+          <w:sz w:val="26"/>
+        </w:rPr>
+        <w:t>7.  PAYMENT SCHEDULE</w:t>
+      </w:r>
+      <w:r>
+        <w:rPr>
+          <w:i/>
+          <w:color w:val="838081"/>
+          <w:sz w:val="18"/>
+        </w:rPr>
+        <w:br/>
+        <w:t>جدول السداد</w:t>
+      </w:r>
+    </w:p>
+    <w:p>
+      <w:pPr>
+        <w:spacing w:before="80" w:after="80"/>
         <w:pBdr>
           <w:bottom w:val="single" w:sz="8" w:space="1" w:color="FCB900"/>
         </w:pBdr>
@@ -937,181 +2040,179 @@
     </w:p>
     <w:p>
       <w:pPr>
-        <w:spacing w:before="240"/>
+        <w:spacing w:after="40"/>
+      </w:pPr>
+      <w:r>
+        <w:rPr>
+          <w:b/>
+          <w:color w:val="142444"/>
+          <w:sz w:val="20"/>
+        </w:rPr>
+        <w:t xml:space="preserve">  Option A — Upfront (Recommended)</w:t>
+      </w:r>
+    </w:p>
+    <w:p>
+      <w:pPr>
+        <w:spacing w:after="80" w:line="276" w:lineRule="auto"/>
+      </w:pPr>
+      <w:r>
+        <w:rPr>
+          <w:b w:val="0"/>
+          <w:i w:val="0"/>
+          <w:color w:val="3D3B3B"/>
+          <w:sz w:val="19"/>
+        </w:rPr>
+        <w:t>100% upon signing. Best value — includes 10% discount on annual plans.</w:t>
+      </w:r>
+    </w:p>
+    <w:p>
+      <w:pPr>
+        <w:spacing w:after="40"/>
+      </w:pPr>
+      <w:r>
+        <w:rPr>
+          <w:b/>
+          <w:color w:val="142444"/>
+          <w:sz w:val="20"/>
+        </w:rPr>
+        <w:t xml:space="preserve">  Option B — 50/50 Split</w:t>
+      </w:r>
+    </w:p>
+    <w:p>
+      <w:pPr>
+        <w:spacing w:after="80" w:line="276" w:lineRule="auto"/>
+      </w:pPr>
+      <w:r>
+        <w:rPr>
+          <w:b w:val="0"/>
+          <w:i w:val="0"/>
+          <w:color w:val="3D3B3B"/>
+          <w:sz w:val="19"/>
+        </w:rPr>
+        <w:t>50% upon signing, 50% upon delivery confirmation.</w:t>
+      </w:r>
+    </w:p>
+    <w:p>
+      <w:pPr>
+        <w:spacing w:after="40"/>
+      </w:pPr>
+      <w:r>
+        <w:rPr>
+          <w:b/>
+          <w:color w:val="142444"/>
+          <w:sz w:val="20"/>
+        </w:rPr>
+        <w:t xml:space="preserve">  Option C — 30/70 Split</w:t>
+      </w:r>
+    </w:p>
+    <w:p>
+      <w:pPr>
+        <w:spacing w:after="80" w:line="276" w:lineRule="auto"/>
+      </w:pPr>
+      <w:r>
+        <w:rPr>
+          <w:b w:val="0"/>
+          <w:i w:val="0"/>
+          <w:color w:val="3D3B3B"/>
+          <w:sz w:val="19"/>
+        </w:rPr>
+        <w:t>30% deposit upon signing, 70% within 15 days of delivery completion.</w:t>
+      </w:r>
+    </w:p>
+    <w:p>
+      <w:pPr>
+        <w:spacing w:after="40"/>
+      </w:pPr>
+      <w:r>
+        <w:rPr>
+          <w:b/>
+          <w:color w:val="142444"/>
+          <w:sz w:val="20"/>
+        </w:rPr>
+        <w:t xml:space="preserve">  Option D — Net 15</w:t>
+      </w:r>
+    </w:p>
+    <w:p>
+      <w:pPr>
+        <w:spacing w:after="80" w:line="276" w:lineRule="auto"/>
+      </w:pPr>
+      <w:r>
+        <w:rPr>
+          <w:b w:val="0"/>
+          <w:i w:val="0"/>
+          <w:color w:val="3D3B3B"/>
+          <w:sz w:val="19"/>
+        </w:rPr>
+        <w:t>Full payment within 15 days of invoice date.</w:t>
+      </w:r>
+    </w:p>
+    <w:p>
+      <w:pPr>
+        <w:spacing w:after="40"/>
+      </w:pPr>
+      <w:r>
+        <w:rPr>
+          <w:b/>
+          <w:color w:val="142444"/>
+          <w:sz w:val="20"/>
+        </w:rPr>
+        <w:t xml:space="preserve">  Option E — Net 30</w:t>
+      </w:r>
+    </w:p>
+    <w:p>
+      <w:pPr>
+        <w:spacing w:after="80" w:line="276" w:lineRule="auto"/>
+      </w:pPr>
+      <w:r>
+        <w:rPr>
+          <w:b w:val="0"/>
+          <w:i w:val="0"/>
+          <w:color w:val="3D3B3B"/>
+          <w:sz w:val="19"/>
+        </w:rPr>
+        <w:t>Full payment within 30 days of invoice date.</w:t>
+      </w:r>
+    </w:p>
+    <w:p>
+      <w:pPr>
+        <w:spacing w:after="120" w:line="276" w:lineRule="auto"/>
+      </w:pPr>
+      <w:r>
+        <w:rPr>
+          <w:b/>
+          <w:i w:val="0"/>
+          <w:color w:val="171414"/>
+          <w:sz w:val="20"/>
+        </w:rPr>
+        <w:t>Selected Payment Terms: {SELECTED_PAYMENT_TERMS}</w:t>
+      </w:r>
+    </w:p>
+    <w:p>
+      <w:pPr>
+        <w:spacing w:before="320" w:after="120"/>
       </w:pPr>
       <w:r>
         <w:rPr>
           <w:rFonts w:ascii="Calibri Light" w:hAnsi="Calibri Light"/>
           <w:b/>
           <w:color w:val="142444"/>
-          <w:sz w:val="20"/>
+          <w:sz w:val="26"/>
         </w:rPr>
-        <w:t>TERMS &amp; CONDITIONS</w:t>
+        <w:t>8.  TERMS &amp; CONDITIONS</w:t>
+      </w:r>
+      <w:r>
+        <w:rPr>
+          <w:i/>
+          <w:color w:val="838081"/>
+          <w:sz w:val="18"/>
+        </w:rPr>
+        <w:br/>
+        <w:t>الشروط والأحكام</w:t>
       </w:r>
     </w:p>
     <w:p>
       <w:pPr>
-        <w:spacing w:after="80" w:before="40"/>
-      </w:pPr>
-      <w:r>
-        <w:rPr>
-          <w:b/>
-          <w:color w:val="142444"/>
-          <w:sz w:val="18"/>
-        </w:rPr>
-        <w:t xml:space="preserve">Term:  </w:t>
-      </w:r>
-      <w:r>
-        <w:rPr>
-          <w:color w:val="3D3B3B"/>
-          <w:sz w:val="18"/>
-        </w:rPr>
-        <w:t>Minimum 3-month commitment. Auto-renews monthly unless 30-day cancellation notice is given.</w:t>
-      </w:r>
-    </w:p>
-    <w:p>
-      <w:pPr>
-        <w:spacing w:after="80" w:before="40"/>
-      </w:pPr>
-      <w:r>
-        <w:rPr>
-          <w:b/>
-          <w:color w:val="142444"/>
-          <w:sz w:val="18"/>
-        </w:rPr>
-        <w:t xml:space="preserve">Payment:  </w:t>
-      </w:r>
-      <w:r>
-        <w:rPr>
-          <w:color w:val="3D3B3B"/>
-          <w:sz w:val="18"/>
-        </w:rPr>
-        <w:t>Invoices are due within 15 days. Late payments incur 2% monthly interest.</w:t>
-      </w:r>
-    </w:p>
-    <w:p>
-      <w:pPr>
-        <w:spacing w:after="80" w:before="40"/>
-      </w:pPr>
-      <w:r>
-        <w:rPr>
-          <w:b/>
-          <w:color w:val="142444"/>
-          <w:sz w:val="18"/>
-        </w:rPr>
-        <w:t xml:space="preserve">Content Ownership:  </w:t>
-      </w:r>
-      <w:r>
-        <w:rPr>
-          <w:color w:val="3D3B3B"/>
-          <w:sz w:val="18"/>
-        </w:rPr>
-        <w:t>You own everything we generate for you. We own our platform and technology.</w:t>
-      </w:r>
-    </w:p>
-    <w:p>
-      <w:pPr>
-        <w:spacing w:after="80" w:before="40"/>
-      </w:pPr>
-      <w:r>
-        <w:rPr>
-          <w:b/>
-          <w:color w:val="142444"/>
-          <w:sz w:val="18"/>
-        </w:rPr>
-        <w:t xml:space="preserve">Confidentiality:  </w:t>
-      </w:r>
-      <w:r>
-        <w:rPr>
-          <w:color w:val="3D3B3B"/>
-          <w:sz w:val="18"/>
-        </w:rPr>
-        <w:t>Your data and business information stay strictly confidential — always.</w:t>
-      </w:r>
-    </w:p>
-    <w:p>
-      <w:pPr>
-        <w:spacing w:after="80" w:before="40"/>
-      </w:pPr>
-      <w:r>
-        <w:rPr>
-          <w:b/>
-          <w:color w:val="142444"/>
-          <w:sz w:val="18"/>
-        </w:rPr>
-        <w:t xml:space="preserve">Results:  </w:t>
-      </w:r>
-      <w:r>
-        <w:rPr>
-          <w:color w:val="3D3B3B"/>
-          <w:sz w:val="18"/>
-        </w:rPr>
-        <w:t>We deliver our best work, but search rankings depend on many factors and are never guaranteed.</w:t>
-      </w:r>
-    </w:p>
-    <w:p>
-      <w:pPr>
-        <w:spacing w:after="80" w:before="40"/>
-      </w:pPr>
-      <w:r>
-        <w:rPr>
-          <w:b/>
-          <w:color w:val="142444"/>
-          <w:sz w:val="18"/>
-        </w:rPr>
-        <w:t xml:space="preserve">Liability:  </w:t>
-      </w:r>
-      <w:r>
-        <w:rPr>
-          <w:color w:val="3D3B3B"/>
-          <w:sz w:val="18"/>
-        </w:rPr>
-        <w:t>Our total liability is capped at the fees you paid in the last 12 months.</w:t>
-      </w:r>
-    </w:p>
-    <w:p>
-      <w:pPr>
-        <w:spacing w:after="80" w:before="40"/>
-      </w:pPr>
-      <w:r>
-        <w:rPr>
-          <w:b/>
-          <w:color w:val="142444"/>
-          <w:sz w:val="18"/>
-        </w:rPr>
-        <w:t xml:space="preserve">Termination:  </w:t>
-      </w:r>
-      <w:r>
-        <w:rPr>
-          <w:color w:val="3D3B3B"/>
-          <w:sz w:val="18"/>
-        </w:rPr>
-        <w:t>Either party can terminate for material breach with 15 days' written notice.</w:t>
-      </w:r>
-    </w:p>
-    <w:p>
-      <w:pPr>
-        <w:spacing w:before="80"/>
-      </w:pPr>
-      <w:r>
-        <w:rPr>
-          <w:b/>
-          <w:color w:val="142444"/>
-          <w:sz w:val="18"/>
-        </w:rPr>
-        <w:t xml:space="preserve">Governing Law: </w:t>
-      </w:r>
-      <w:r>
-        <w:rPr>
-          <w:color w:val="3D3B3B"/>
-          <w:sz w:val="18"/>
-        </w:rPr>
-        <w:t>This quotation is governed by the laws of [Egypt / UAE / Jurisdiction].</w:t>
-      </w:r>
-    </w:p>
-    <w:p>
-      <w:pPr>
-        <w:jc w:val="left"/>
+        <w:spacing w:before="80" w:after="80"/>
         <w:pBdr>
           <w:bottom w:val="single" w:sz="8" w:space="1" w:color="FCB900"/>
         </w:pBdr>
@@ -1119,16 +2220,417 @@
     </w:p>
     <w:p>
       <w:pPr>
-        <w:spacing w:before="240" w:after="160"/>
+        <w:spacing w:before="120" w:after="40"/>
+      </w:pPr>
+      <w:r>
+        <w:rPr>
+          <w:b/>
+          <w:color w:val="142444"/>
+          <w:sz w:val="20"/>
+        </w:rPr>
+        <w:t xml:space="preserve">  1. Term</w:t>
+      </w:r>
+    </w:p>
+    <w:p>
+      <w:pPr>
+        <w:spacing w:after="40" w:line="276" w:lineRule="auto"/>
+      </w:pPr>
+      <w:r>
+        <w:rPr>
+          <w:b w:val="0"/>
+          <w:i w:val="0"/>
+          <w:color w:val="3D3B3B"/>
+          <w:sz w:val="19"/>
+        </w:rPr>
+        <w:t>The initial term is a minimum of three (3) calendar months from the start date. After the initial term, the agreement auto-renews monthly unless either party provides 30 days' written cancellation notice.</w:t>
+      </w:r>
+    </w:p>
+    <w:p>
+      <w:pPr>
+        <w:spacing w:after="80" w:line="276" w:lineRule="auto"/>
+      </w:pPr>
+      <w:r>
+        <w:rPr>
+          <w:b w:val="0"/>
+          <w:i/>
+          <w:color w:val="838081"/>
+          <w:sz w:val="18"/>
+        </w:rPr>
+        <w:t>المدة الأولية ثلاثة (3) أشهر ميلادية كحد أدنى. بعدها يتجدد العقد تلقائيًا شهريًا ما لم يخطر أي طرف الآخر كتابيًا قبل 30 يومًا.</w:t>
+      </w:r>
+    </w:p>
+    <w:p>
+      <w:pPr>
+        <w:spacing w:before="120" w:after="40"/>
+      </w:pPr>
+      <w:r>
+        <w:rPr>
+          <w:b/>
+          <w:color w:val="142444"/>
+          <w:sz w:val="20"/>
+        </w:rPr>
+        <w:t xml:space="preserve">  2. Payment</w:t>
+      </w:r>
+    </w:p>
+    <w:p>
+      <w:pPr>
+        <w:spacing w:after="40" w:line="276" w:lineRule="auto"/>
+      </w:pPr>
+      <w:r>
+        <w:rPr>
+          <w:b w:val="0"/>
+          <w:i w:val="0"/>
+          <w:color w:val="3D3B3B"/>
+          <w:sz w:val="19"/>
+        </w:rPr>
+        <w:t>All fees are in the stated currency. Invoices are due per the agreed payment terms. Late payments incur 2% monthly interest on overdue amounts. Services may be suspended if payment is more than 15 days past due.</w:t>
+      </w:r>
+    </w:p>
+    <w:p>
+      <w:pPr>
+        <w:spacing w:after="80" w:line="276" w:lineRule="auto"/>
+      </w:pPr>
+      <w:r>
+        <w:rPr>
+          <w:b w:val="0"/>
+          <w:i/>
+          <w:color w:val="838081"/>
+          <w:sz w:val="18"/>
+        </w:rPr>
+        <w:t>جميع الرسوم بالعملة المذكورة. الفواتير مستحقة حسب شروط الدفع المتفق عليها. التأخير في السداد يستحق فائدة شهرية 2٪.</w:t>
+      </w:r>
+    </w:p>
+    <w:p>
+      <w:pPr>
+        <w:spacing w:before="120" w:after="40"/>
+      </w:pPr>
+      <w:r>
+        <w:rPr>
+          <w:b/>
+          <w:color w:val="142444"/>
+          <w:sz w:val="20"/>
+        </w:rPr>
+        <w:t xml:space="preserve">  3. Content Ownership</w:t>
+      </w:r>
+    </w:p>
+    <w:p>
+      <w:pPr>
+        <w:spacing w:after="40" w:line="276" w:lineRule="auto"/>
+      </w:pPr>
+      <w:r>
+        <w:rPr>
+          <w:b w:val="0"/>
+          <w:i w:val="0"/>
+          <w:color w:val="3D3B3B"/>
+          <w:sz w:val="19"/>
+        </w:rPr>
+        <w:t>You own all content generated specifically for your brand upon full payment. We retain ownership of our platform, algorithms, and methodologies.</w:t>
+      </w:r>
+    </w:p>
+    <w:p>
+      <w:pPr>
+        <w:spacing w:after="80" w:line="276" w:lineRule="auto"/>
+      </w:pPr>
+      <w:r>
+        <w:rPr>
+          <w:b w:val="0"/>
+          <w:i/>
+          <w:color w:val="838081"/>
+          <w:sz w:val="18"/>
+        </w:rPr>
+        <w:t>أنت تملك جميع المحتويات المنشأة خصيصًا لعلامتك التجارية بعد السداد الكامل. نحن نحتفظ بملكية منصتنا وخوارزمياتنا.</w:t>
+      </w:r>
+    </w:p>
+    <w:p>
+      <w:pPr>
+        <w:spacing w:before="120" w:after="40"/>
+      </w:pPr>
+      <w:r>
+        <w:rPr>
+          <w:b/>
+          <w:color w:val="142444"/>
+          <w:sz w:val="20"/>
+        </w:rPr>
+        <w:t xml:space="preserve">  4. Confidentiality</w:t>
+      </w:r>
+    </w:p>
+    <w:p>
+      <w:pPr>
+        <w:spacing w:after="40" w:line="276" w:lineRule="auto"/>
+      </w:pPr>
+      <w:r>
+        <w:rPr>
+          <w:b w:val="0"/>
+          <w:i w:val="0"/>
+          <w:color w:val="3D3B3B"/>
+          <w:sz w:val="19"/>
+        </w:rPr>
+        <w:t>All business information shared during this engagement is strictly confidential. We sign NDAs upon request.</w:t>
+      </w:r>
+    </w:p>
+    <w:p>
+      <w:pPr>
+        <w:spacing w:after="80" w:line="276" w:lineRule="auto"/>
+      </w:pPr>
+      <w:r>
+        <w:rPr>
+          <w:b w:val="0"/>
+          <w:i/>
+          <w:color w:val="838081"/>
+          <w:sz w:val="18"/>
+        </w:rPr>
+        <w:t>جميع معلومات العمل المتبادلة سرية تامة. نوقع اتفاقيات السرية عند الطلب.</w:t>
+      </w:r>
+    </w:p>
+    <w:p>
+      <w:pPr>
+        <w:spacing w:before="120" w:after="40"/>
+      </w:pPr>
+      <w:r>
+        <w:rPr>
+          <w:b/>
+          <w:color w:val="142444"/>
+          <w:sz w:val="20"/>
+        </w:rPr>
+        <w:t xml:space="preserve">  5. Data Protection</w:t>
+      </w:r>
+    </w:p>
+    <w:p>
+      <w:pPr>
+        <w:spacing w:after="40" w:line="276" w:lineRule="auto"/>
+      </w:pPr>
+      <w:r>
+        <w:rPr>
+          <w:b w:val="0"/>
+          <w:i w:val="0"/>
+          <w:color w:val="3D3B3B"/>
+          <w:sz w:val="19"/>
+        </w:rPr>
+        <w:t>We comply with applicable data protection laws (Egypt Law 151/2020, GDPR, UAE PDPL). Your data is encrypted, access-controlled, and deleted within 90 days of contract end.</w:t>
+      </w:r>
+    </w:p>
+    <w:p>
+      <w:pPr>
+        <w:spacing w:after="80" w:line="276" w:lineRule="auto"/>
+      </w:pPr>
+      <w:r>
+        <w:rPr>
+          <w:b w:val="0"/>
+          <w:i/>
+          <w:color w:val="838081"/>
+          <w:sz w:val="18"/>
+        </w:rPr>
+        <w:t>نلتزم بقوانين حماية البيانات المعمول بها. بياناتك مشفرة ومحمية ويتم حذفها خلال 90 يومًا من انتهاء العقد.</w:t>
+      </w:r>
+    </w:p>
+    <w:p>
+      <w:pPr>
+        <w:spacing w:before="120" w:after="40"/>
+      </w:pPr>
+      <w:r>
+        <w:rPr>
+          <w:b/>
+          <w:color w:val="142444"/>
+          <w:sz w:val="20"/>
+        </w:rPr>
+        <w:t xml:space="preserve">  6. No Guarantee of Rankings</w:t>
+      </w:r>
+    </w:p>
+    <w:p>
+      <w:pPr>
+        <w:spacing w:after="40" w:line="276" w:lineRule="auto"/>
+      </w:pPr>
+      <w:r>
+        <w:rPr>
+          <w:b w:val="0"/>
+          <w:i w:val="0"/>
+          <w:color w:val="3D3B3B"/>
+          <w:sz w:val="19"/>
+        </w:rPr>
+        <w:t>We deliver high-quality content and SEO best practices. However, search engine rankings depend on many factors beyond our control and are never guaranteed.</w:t>
+      </w:r>
+    </w:p>
+    <w:p>
+      <w:pPr>
+        <w:spacing w:after="80" w:line="276" w:lineRule="auto"/>
+      </w:pPr>
+      <w:r>
+        <w:rPr>
+          <w:b w:val="0"/>
+          <w:i/>
+          <w:color w:val="838081"/>
+          <w:sz w:val="18"/>
+        </w:rPr>
+        <w:t>نقدم محتوى عالي الجودة وأفضل ممارسات تحسين محركات البحث. لكن ترتيب البحث يعتمد على عوامل خارجة عن إرادتنا.</w:t>
+      </w:r>
+    </w:p>
+    <w:p>
+      <w:pPr>
+        <w:spacing w:before="120" w:after="40"/>
+      </w:pPr>
+      <w:r>
+        <w:rPr>
+          <w:b/>
+          <w:color w:val="142444"/>
+          <w:sz w:val="20"/>
+        </w:rPr>
+        <w:t xml:space="preserve">  7. Liability</w:t>
+      </w:r>
+    </w:p>
+    <w:p>
+      <w:pPr>
+        <w:spacing w:after="40" w:line="276" w:lineRule="auto"/>
+      </w:pPr>
+      <w:r>
+        <w:rPr>
+          <w:b w:val="0"/>
+          <w:i w:val="0"/>
+          <w:color w:val="3D3B3B"/>
+          <w:sz w:val="19"/>
+        </w:rPr>
+        <w:t>Our total liability is capped at the total fees paid in the 12 months preceding any claim. We are not liable for indirect or consequential damages.</w:t>
+      </w:r>
+    </w:p>
+    <w:p>
+      <w:pPr>
+        <w:spacing w:after="80" w:line="276" w:lineRule="auto"/>
+      </w:pPr>
+      <w:r>
+        <w:rPr>
+          <w:b w:val="0"/>
+          <w:i/>
+          <w:color w:val="838081"/>
+          <w:sz w:val="18"/>
+        </w:rPr>
+        <w:t>مسؤوليتنا محدودة بإجمالي الرسوم المدفوعة في الـ 12 شهرًا السابقة. لسنا مسؤولين عن أضرار غير مباشرة.</w:t>
+      </w:r>
+    </w:p>
+    <w:p>
+      <w:pPr>
+        <w:spacing w:before="120" w:after="40"/>
+      </w:pPr>
+      <w:r>
+        <w:rPr>
+          <w:b/>
+          <w:color w:val="142444"/>
+          <w:sz w:val="20"/>
+        </w:rPr>
+        <w:t xml:space="preserve">  8. Termination</w:t>
+      </w:r>
+    </w:p>
+    <w:p>
+      <w:pPr>
+        <w:spacing w:after="40" w:line="276" w:lineRule="auto"/>
+      </w:pPr>
+      <w:r>
+        <w:rPr>
+          <w:b w:val="0"/>
+          <w:i w:val="0"/>
+          <w:color w:val="3D3B3B"/>
+          <w:sz w:val="19"/>
+        </w:rPr>
+        <w:t>Either party may terminate for material breach with 15 days' written notice. Early termination before the minimum term ends requires payment of the remaining balance.</w:t>
+      </w:r>
+    </w:p>
+    <w:p>
+      <w:pPr>
+        <w:spacing w:after="80" w:line="276" w:lineRule="auto"/>
+      </w:pPr>
+      <w:r>
+        <w:rPr>
+          <w:b w:val="0"/>
+          <w:i/>
+          <w:color w:val="838081"/>
+          <w:sz w:val="18"/>
+        </w:rPr>
+        <w:t>لأي طرف إنهاء العقد للإخلال الجوهري بإخطار كتابي مدته 15 يومًا. الإنهاء المبكر يستدعي سداد الرصيد المتبقي.</w:t>
+      </w:r>
+    </w:p>
+    <w:p>
+      <w:pPr>
+        <w:spacing w:before="120" w:after="40"/>
+      </w:pPr>
+      <w:r>
+        <w:rPr>
+          <w:b/>
+          <w:color w:val="142444"/>
+          <w:sz w:val="20"/>
+        </w:rPr>
+        <w:t xml:space="preserve">  9. Governing Law &amp; Disputes</w:t>
+      </w:r>
+    </w:p>
+    <w:p>
+      <w:pPr>
+        <w:spacing w:after="40" w:line="276" w:lineRule="auto"/>
+      </w:pPr>
+      <w:r>
+        <w:rPr>
+          <w:b w:val="0"/>
+          <w:i w:val="0"/>
+          <w:color w:val="3D3B3B"/>
+          <w:sz w:val="19"/>
+        </w:rPr>
+        <w:t>This agreement is governed by the laws of {GOVERNING_LAW}. Disputes are resolved through amicable negotiation, then mediation, then binding arbitration if needed.</w:t>
+      </w:r>
+    </w:p>
+    <w:p>
+      <w:pPr>
+        <w:spacing w:after="80" w:line="276" w:lineRule="auto"/>
+      </w:pPr>
+      <w:r>
+        <w:rPr>
+          <w:b w:val="0"/>
+          <w:i/>
+          <w:color w:val="838081"/>
+          <w:sz w:val="18"/>
+        </w:rPr>
+        <w:t>يخضع هذا الاتفاق لقوانين {GOVERNING_LAW_AR}. تُحل النزاعات بالتفاوض ثم الوساطة ثم التحكيم الملزم إذا لزم الأمر.</w:t>
+      </w:r>
+    </w:p>
+    <w:p>
+      <w:pPr>
+        <w:spacing w:before="320" w:after="120"/>
       </w:pPr>
       <w:r>
         <w:rPr>
           <w:rFonts w:ascii="Calibri Light" w:hAnsi="Calibri Light"/>
           <w:b/>
           <w:color w:val="142444"/>
-          <w:sz w:val="20"/>
+          <w:sz w:val="26"/>
         </w:rPr>
-        <w:t>SIGNATURE &amp; ACCEPTANCE</w:t>
+        <w:t>9.  ACCEPTANCE &amp; SIGNATURE</w:t>
+      </w:r>
+      <w:r>
+        <w:rPr>
+          <w:i/>
+          <w:color w:val="838081"/>
+          <w:sz w:val="18"/>
+        </w:rPr>
+        <w:br/>
+        <w:t>القبول والتوقيع</w:t>
+      </w:r>
+    </w:p>
+    <w:p>
+      <w:pPr>
+        <w:spacing w:before="80" w:after="80"/>
+        <w:pBdr>
+          <w:bottom w:val="single" w:sz="8" w:space="1" w:color="FCB900"/>
+        </w:pBdr>
+      </w:pPr>
+    </w:p>
+    <w:p>
+      <w:pPr>
+        <w:spacing w:after="160"/>
+      </w:pPr>
+      <w:r>
+        <w:rPr>
+          <w:color w:val="3D3B3B"/>
+          <w:sz w:val="19"/>
+        </w:rPr>
+        <w:t>By signing below, both parties acknowledge and agree to the terms of this quotation. This quotation becomes a legally binding agreement upon signature by both parties.</w:t>
+        <w:br/>
+        <w:br/>
+        <w:t>بالتوقيع أدناه، يقر الطرفان ويوافقان على شروط عرض السعر هذا. يصبح عرض السعر هذا اتفاقًا ملزمًا قانونيًا عند توقيع الطرفين.</w:t>
       </w:r>
     </w:p>
     <w:tbl>
@@ -1156,73 +2658,86 @@
           </w:tcPr>
           <w:p>
             <w:pPr>
-              <w:spacing w:after="40"/>
+              <w:spacing w:after="80"/>
             </w:pPr>
             <w:r>
               <w:rPr>
                 <w:b/>
                 <w:color w:val="FCB900"/>
-                <w:sz w:val="18"/>
+                <w:sz w:val="20"/>
               </w:rPr>
-              <w:t>CLIENT</w:t>
+              <w:t>CLIENT / العميل</w:t>
             </w:r>
           </w:p>
           <w:p>
             <w:pPr>
-              <w:spacing w:after="80"/>
+              <w:spacing w:after="60"/>
             </w:pPr>
             <w:r>
               <w:rPr>
                 <w:color w:val="3D3B3B"/>
-                <w:sz w:val="18"/>
+                <w:sz w:val="19"/>
               </w:rPr>
-              <w:t>Name: _______________________</w:t>
             </w:r>
           </w:p>
           <w:p>
             <w:pPr>
-              <w:spacing w:after="80"/>
+              <w:spacing w:after="60"/>
             </w:pPr>
             <w:r>
               <w:rPr>
                 <w:color w:val="3D3B3B"/>
-                <w:sz w:val="18"/>
+                <w:sz w:val="19"/>
               </w:rPr>
-              <w:t>Title: _______________________</w:t>
+              <w:t>Name / الاسم: ______________________________</w:t>
             </w:r>
           </w:p>
           <w:p>
             <w:pPr>
-              <w:spacing w:after="80"/>
+              <w:spacing w:after="60"/>
             </w:pPr>
             <w:r>
               <w:rPr>
                 <w:color w:val="3D3B3B"/>
-                <w:sz w:val="18"/>
+                <w:sz w:val="19"/>
               </w:rPr>
-              <w:t>Date: _______________________</w:t>
+              <w:t>Title / المنصب: ______________________________</w:t>
             </w:r>
           </w:p>
           <w:p>
             <w:pPr>
-              <w:spacing w:after="80"/>
+              <w:spacing w:after="60"/>
             </w:pPr>
             <w:r>
               <w:rPr>
                 <w:color w:val="3D3B3B"/>
-                <w:sz w:val="18"/>
+                <w:sz w:val="19"/>
               </w:rPr>
-              <w:t>Signature: _______________________</w:t>
+              <w:t>Date / التاريخ: ______________________________</w:t>
             </w:r>
           </w:p>
           <w:p>
+            <w:pPr>
+              <w:spacing w:after="60"/>
+            </w:pPr>
             <w:r>
               <w:rPr>
-                <w:i/>
-                <w:color w:val="838081"/>
-                <w:sz w:val="18"/>
+                <w:color w:val="3D3B3B"/>
+                <w:sz w:val="19"/>
               </w:rPr>
-              <w:t>Company Stamp:</w:t>
+              <w:t>Signature / التوقيع: ______________________________</w:t>
+            </w:r>
+          </w:p>
+          <w:p>
+            <w:pPr>
+              <w:spacing w:after="60"/>
+            </w:pPr>
+            <w:r>
+              <w:rPr>
+                <w:color w:val="3D3B3B"/>
+                <w:sz w:val="19"/>
+              </w:rPr>
+              <w:t>Company Stamp / ختم الشركة:</w:t>
             </w:r>
           </w:p>
         </w:tc>
@@ -1232,73 +2747,86 @@
           </w:tcPr>
           <w:p>
             <w:pPr>
-              <w:spacing w:after="40"/>
+              <w:spacing w:after="80"/>
             </w:pPr>
             <w:r>
               <w:rPr>
                 <w:b/>
                 <w:color w:val="FCB900"/>
-                <w:sz w:val="18"/>
+                <w:sz w:val="20"/>
               </w:rPr>
-              <w:t>TDS GEO</w:t>
+              <w:t>TDS GEO / المزود</w:t>
             </w:r>
           </w:p>
           <w:p>
             <w:pPr>
-              <w:spacing w:after="80"/>
+              <w:spacing w:after="60"/>
             </w:pPr>
             <w:r>
               <w:rPr>
                 <w:color w:val="3D3B3B"/>
-                <w:sz w:val="18"/>
+                <w:sz w:val="19"/>
               </w:rPr>
-              <w:t>Name: _______________________</w:t>
             </w:r>
           </w:p>
           <w:p>
             <w:pPr>
-              <w:spacing w:after="80"/>
+              <w:spacing w:after="60"/>
             </w:pPr>
             <w:r>
               <w:rPr>
                 <w:color w:val="3D3B3B"/>
-                <w:sz w:val="18"/>
+                <w:sz w:val="19"/>
               </w:rPr>
-              <w:t>Title: _______________________</w:t>
+              <w:t>Name / الاسم: ______________________________</w:t>
             </w:r>
           </w:p>
           <w:p>
             <w:pPr>
-              <w:spacing w:after="80"/>
+              <w:spacing w:after="60"/>
             </w:pPr>
             <w:r>
               <w:rPr>
                 <w:color w:val="3D3B3B"/>
-                <w:sz w:val="18"/>
+                <w:sz w:val="19"/>
               </w:rPr>
-              <w:t>Date: _______________________</w:t>
+              <w:t>Title / المنصب: ______________________________</w:t>
             </w:r>
           </w:p>
           <w:p>
             <w:pPr>
-              <w:spacing w:after="80"/>
+              <w:spacing w:after="60"/>
             </w:pPr>
             <w:r>
               <w:rPr>
                 <w:color w:val="3D3B3B"/>
-                <w:sz w:val="18"/>
+                <w:sz w:val="19"/>
               </w:rPr>
-              <w:t>Signature: _______________________</w:t>
+              <w:t>Date / التاريخ: ______________________________</w:t>
             </w:r>
           </w:p>
           <w:p>
+            <w:pPr>
+              <w:spacing w:after="60"/>
+            </w:pPr>
             <w:r>
               <w:rPr>
-                <w:i/>
-                <w:color w:val="838081"/>
-                <w:sz w:val="18"/>
+                <w:color w:val="3D3B3B"/>
+                <w:sz w:val="19"/>
               </w:rPr>
-              <w:t>Company Stamp:</w:t>
+              <w:t>Signature / التوقيع: ______________________________</w:t>
+            </w:r>
+          </w:p>
+          <w:p>
+            <w:pPr>
+              <w:spacing w:after="60"/>
+            </w:pPr>
+            <w:r>
+              <w:rPr>
+                <w:color w:val="3D3B3B"/>
+                <w:sz w:val="19"/>
+              </w:rPr>
+              <w:t>Company Stamp / ختم الشركة:</w:t>
             </w:r>
           </w:p>
         </w:tc>
@@ -1307,9 +2835,9 @@
     <w:p/>
     <w:p>
       <w:pPr>
-        <w:jc w:val="left"/>
+        <w:spacing w:before="80" w:after="80"/>
         <w:pBdr>
-          <w:bottom w:val="single" w:sz="8" w:space="1" w:color="838081"/>
+          <w:bottom w:val="single" w:sz="6" w:space="1" w:color="838081"/>
         </w:pBdr>
       </w:pPr>
     </w:p>
@@ -1323,7 +2851,7 @@
           <w:color w:val="838081"/>
           <w:sz w:val="14"/>
         </w:rPr>
-        <w:t>TDS GEO  •  Commercial Reg: XXXXX  •  Tax ID: XXXXX  •  hello@tdsgeo.com  •  tdsgeo.com</w:t>
+        <w:t>TDS GEO  •  hello@tdsgeo.com  •  tdsgeo.com  •  Commercial Reg: XXXXX  •  Tax ID: XXXXX</w:t>
         <w:br/>
       </w:r>
       <w:r>
@@ -1332,7 +2860,14 @@
           <w:color w:val="838081"/>
           <w:sz w:val="14"/>
         </w:rPr>
-        <w:t>This quotation is a legally binding offer. Acceptance creates a binding agreement between the parties.</w:t>
+        <w:t xml:space="preserve">This quotation is a legally binding offer valid for 30 days from the issue date. </w:t>
+      </w:r>
+      <w:r>
+        <w:rPr>
+          <w:color w:val="838081"/>
+          <w:sz w:val="14"/>
+        </w:rPr>
+        <w:t>Quotation No: {NUMBER}  |  Page 1 of 1</w:t>
       </w:r>
     </w:p>
     <w:sectPr>

</xml_diff>

<commit_message>
Update quotation: Traffic Digital Solutions branding, English only, full scope
</commit_message>
<xml_diff>
--- a/doc/quotation/TDS-GEO-Quotation.docx
+++ b/doc/quotation/TDS-GEO-Quotation.docx
@@ -5,7 +5,6 @@
     <w:tbl>
       <w:tblPr>
         <w:tblW w:type="auto" w:w="0"/>
-        <w:jc w:val="left"/>
         <w:tblLook w:firstColumn="1" w:firstRow="1" w:lastColumn="0" w:lastRow="0" w:noHBand="0" w:noVBand="1" w:val="04A0"/>
         <w:tblBorders>
           <w:top w:val="none" w:sz="0" w:space="0" w:color="auto"/>
@@ -79,7 +78,7 @@
                 <w:color w:val="171414"/>
                 <w:sz w:val="40"/>
               </w:rPr>
-              <w:t>TDS GEO</w:t>
+              <w:t>Traffic Digital Solutions</w:t>
             </w:r>
           </w:p>
           <w:p>
@@ -99,7 +98,7 @@
                 <w:color w:val="838081"/>
                 <w:sz w:val="16"/>
               </w:rPr>
-              <w:t>Commercial Reg: XXXXX  |  Tax ID: XXXXX</w:t>
+              <w:t>Commercial Registration: XXXXX  |  Tax ID: XXXXX</w:t>
               <w:br/>
             </w:r>
             <w:r>
@@ -107,7 +106,15 @@
                 <w:color w:val="838081"/>
                 <w:sz w:val="16"/>
               </w:rPr>
-              <w:t>hello@tdsgeo.com  |  tdsgeo.com</w:t>
+              <w:t>Villa 125, Axis 80, 5th Settlement, Cairo, Egypt</w:t>
+              <w:br/>
+            </w:r>
+            <w:r>
+              <w:rPr>
+                <w:color w:val="838081"/>
+                <w:sz w:val="16"/>
+              </w:rPr>
+              <w:t>webdevelopment@trafficdigitalsolutions.com  |  trafficdigitalsolutions.com</w:t>
             </w:r>
           </w:p>
         </w:tc>
@@ -115,7 +122,7 @@
     </w:tbl>
     <w:p>
       <w:pPr>
-        <w:spacing w:before="80" w:after="80"/>
+        <w:spacing w:before="40" w:after="40"/>
         <w:pBdr>
           <w:bottom w:val="single" w:sz="20" w:space="1" w:color="FCB900"/>
         </w:pBdr>
@@ -123,7 +130,7 @@
     </w:p>
     <w:p>
       <w:pPr>
-        <w:spacing w:before="400" w:after="40"/>
+        <w:spacing w:before="360" w:after="40"/>
         <w:jc w:val="center"/>
       </w:pPr>
       <w:r>
@@ -138,20 +145,7 @@
     </w:p>
     <w:p>
       <w:pPr>
-        <w:spacing w:after="80"/>
-        <w:jc w:val="center"/>
-      </w:pPr>
-      <w:r>
-        <w:rPr>
-          <w:color w:val="838081"/>
-          <w:sz w:val="28"/>
-        </w:rPr>
-        <w:t>عرض خدمات احترافي</w:t>
-      </w:r>
-    </w:p>
-    <w:p>
-      <w:pPr>
-        <w:spacing w:after="160"/>
+        <w:spacing w:after="120"/>
         <w:jc w:val="center"/>
       </w:pPr>
       <w:r>
@@ -159,21 +153,20 @@
           <w:color w:val="838081"/>
           <w:sz w:val="18"/>
         </w:rPr>
-        <w:t>Quotation No: QUO-{NUMBER}     |     Issued: {ISSUE_DATE}     |     Valid Until: {VALID_UNTIL}</w:t>
+        <w:t>Quotation No: {NUMBER}     |     Issued: {ISSUE_DATE}     |     Valid Until: {VALID_UNTIL}</w:t>
       </w:r>
     </w:p>
     <w:p>
       <w:pPr>
-        <w:spacing w:before="80" w:after="80"/>
+        <w:spacing w:before="40" w:after="40"/>
         <w:pBdr>
-          <w:bottom w:val="single" w:sz="14" w:space="1" w:color="FCB900"/>
+          <w:bottom w:val="single" w:sz="12" w:space="1" w:color="FCB900"/>
         </w:pBdr>
       </w:pPr>
     </w:p>
     <w:tbl>
       <w:tblPr>
         <w:tblW w:type="auto" w:w="0"/>
-        <w:jc w:val="left"/>
         <w:tblLook w:firstColumn="1" w:firstRow="1" w:lastColumn="0" w:lastRow="0" w:noHBand="0" w:noVBand="1" w:val="04A0"/>
         <w:tblBorders>
           <w:top w:val="none" w:sz="0" w:space="0" w:color="auto"/>
@@ -203,7 +196,7 @@
                 <w:color w:val="FCB900"/>
                 <w:sz w:val="15"/>
               </w:rPr>
-              <w:t>PREPARED FOR / معدة لـ</w:t>
+              <w:t>PREPARED FOR</w:t>
             </w:r>
           </w:p>
           <w:p>
@@ -239,18 +232,6 @@
                 <w:color w:val="171414"/>
                 <w:sz w:val="20"/>
               </w:rPr>
-              <w:t>{CLIENT_CONTACT}</w:t>
-            </w:r>
-          </w:p>
-          <w:p>
-            <w:pPr>
-              <w:spacing w:after="20"/>
-            </w:pPr>
-            <w:r>
-              <w:rPr>
-                <w:color w:val="171414"/>
-                <w:sz w:val="20"/>
-              </w:rPr>
               <w:t>{CLIENT_EMAIL}</w:t>
             </w:r>
           </w:p>
@@ -269,7 +250,75 @@
                 <w:color w:val="FCB900"/>
                 <w:sz w:val="15"/>
               </w:rPr>
-              <w:t>BILLING DETAILS / تفاصيل الفوترة</w:t>
+              <w:t>PROJECT DETAILS</w:t>
+            </w:r>
+          </w:p>
+          <w:p>
+            <w:pPr>
+              <w:spacing w:after="20"/>
+            </w:pPr>
+            <w:r>
+              <w:rPr>
+                <w:color w:val="171414"/>
+                <w:sz w:val="20"/>
+              </w:rPr>
+              <w:t>Project: {PROJECT_NAME}</w:t>
+            </w:r>
+          </w:p>
+          <w:p>
+            <w:pPr>
+              <w:spacing w:after="20"/>
+            </w:pPr>
+            <w:r>
+              <w:rPr>
+                <w:color w:val="171414"/>
+                <w:sz w:val="20"/>
+              </w:rPr>
+              <w:t>Description: {PROJECT_DESC}</w:t>
+            </w:r>
+          </w:p>
+          <w:p>
+            <w:pPr>
+              <w:spacing w:after="20"/>
+            </w:pPr>
+            <w:r>
+              <w:rPr>
+                <w:color w:val="171414"/>
+                <w:sz w:val="20"/>
+              </w:rPr>
+              <w:t>Start Date: {START_DATE}</w:t>
+            </w:r>
+          </w:p>
+          <w:p>
+            <w:pPr>
+              <w:spacing w:after="20"/>
+            </w:pPr>
+            <w:r>
+              <w:rPr>
+                <w:color w:val="171414"/>
+                <w:sz w:val="20"/>
+              </w:rPr>
+              <w:t>Duration: {DURATION}</w:t>
+            </w:r>
+          </w:p>
+        </w:tc>
+      </w:tr>
+      <w:tr>
+        <w:tc>
+          <w:tcPr>
+            <w:tcW w:type="dxa" w:w="4536"/>
+          </w:tcPr>
+          <w:p>
+            <w:pPr>
+              <w:spacing w:after="40"/>
+            </w:pPr>
+            <w:r>
+              <w:rPr>
+                <w:b/>
+                <w:color w:val="FCB900"/>
+                <w:sz w:val="15"/>
+              </w:rPr>
+              <w:t>PAYMENT &amp; CURRENCY</w:t>
             </w:r>
           </w:p>
           <w:p>
@@ -305,75 +354,7 @@
                 <w:color w:val="171414"/>
                 <w:sz w:val="20"/>
               </w:rPr>
-              <w:t>Tax Treatment: {TAX_TREATMENT}</w:t>
-            </w:r>
-          </w:p>
-        </w:tc>
-      </w:tr>
-      <w:tr>
-        <w:tc>
-          <w:tcPr>
-            <w:tcW w:type="dxa" w:w="4536"/>
-          </w:tcPr>
-          <w:p>
-            <w:pPr>
-              <w:spacing w:after="40"/>
-            </w:pPr>
-            <w:r>
-              <w:rPr>
-                <w:b/>
-                <w:color w:val="FCB900"/>
-                <w:sz w:val="15"/>
-              </w:rPr>
-              <w:t>PROJECT / المشروع</w:t>
-            </w:r>
-          </w:p>
-          <w:p>
-            <w:pPr>
-              <w:spacing w:after="20"/>
-            </w:pPr>
-            <w:r>
-              <w:rPr>
-                <w:color w:val="171414"/>
-                <w:sz w:val="20"/>
-              </w:rPr>
-              <w:t>{PROJECT_NAME}</w:t>
-            </w:r>
-          </w:p>
-          <w:p>
-            <w:pPr>
-              <w:spacing w:after="20"/>
-            </w:pPr>
-            <w:r>
-              <w:rPr>
-                <w:color w:val="171414"/>
-                <w:sz w:val="20"/>
-              </w:rPr>
-              <w:t>{PROJECT_DESCRIPTION}</w:t>
-            </w:r>
-          </w:p>
-          <w:p>
-            <w:pPr>
-              <w:spacing w:after="20"/>
-            </w:pPr>
-            <w:r>
-              <w:rPr>
-                <w:color w:val="171414"/>
-                <w:sz w:val="20"/>
-              </w:rPr>
-              <w:t>Start Date: {START_DATE}</w:t>
-            </w:r>
-          </w:p>
-          <w:p>
-            <w:pPr>
-              <w:spacing w:after="20"/>
-            </w:pPr>
-            <w:r>
-              <w:rPr>
-                <w:color w:val="171414"/>
-                <w:sz w:val="20"/>
-              </w:rPr>
-              <w:t>Duration: {DURATION}</w:t>
+              <w:t>Tax: {TAX_TREATMENT}</w:t>
             </w:r>
           </w:p>
         </w:tc>
@@ -391,7 +372,7 @@
                 <w:color w:val="FCB900"/>
                 <w:sz w:val="15"/>
               </w:rPr>
-              <w:t>DELIVERY / التسليم</w:t>
+              <w:t>DELIVERY METHOD</w:t>
             </w:r>
           </w:p>
           <w:p>
@@ -403,7 +384,7 @@
                 <w:color w:val="171414"/>
                 <w:sz w:val="20"/>
               </w:rPr>
-              <w:t>Format: {DELIVERY_FORMAT}</w:t>
+              <w:t>Format: Digital Delivery</w:t>
             </w:r>
           </w:p>
           <w:p>
@@ -435,7 +416,7 @@
     </w:tbl>
     <w:p>
       <w:pPr>
-        <w:spacing w:before="80" w:after="80"/>
+        <w:spacing w:before="40" w:after="40"/>
         <w:pBdr>
           <w:bottom w:val="single" w:sz="10" w:space="1" w:color="FCB900"/>
         </w:pBdr>
@@ -443,7 +424,7 @@
     </w:p>
     <w:p>
       <w:pPr>
-        <w:spacing w:before="320" w:after="120"/>
+        <w:spacing w:before="280" w:after="80"/>
       </w:pPr>
       <w:r>
         <w:rPr>
@@ -454,19 +435,10 @@
         </w:rPr>
         <w:t>1.  PROJECT OVERVIEW</w:t>
       </w:r>
-      <w:r>
-        <w:rPr>
-          <w:i/>
-          <w:color w:val="838081"/>
-          <w:sz w:val="18"/>
-        </w:rPr>
-        <w:br/>
-        <w:t>نظرة عامة على المشروع</w:t>
-      </w:r>
     </w:p>
     <w:p>
       <w:pPr>
-        <w:spacing w:before="80" w:after="80"/>
+        <w:spacing w:before="40" w:after="40"/>
         <w:pBdr>
           <w:bottom w:val="single" w:sz="8" w:space="1" w:color="FCB900"/>
         </w:pBdr>
@@ -483,7 +455,7 @@
           <w:color w:val="3D3B3B"/>
           <w:sz w:val="20"/>
         </w:rPr>
-        <w:t>{PROJECT_OVERVIEW_TEXT}</w:t>
+        <w:t>{PROJECT_OVERVIEW}</w:t>
       </w:r>
     </w:p>
     <w:p>
@@ -496,12 +468,12 @@
           <w:color w:val="142444"/>
           <w:sz w:val="19"/>
         </w:rPr>
-        <w:t>Objectives / الأهداف:</w:t>
+        <w:t>Key Objectives:</w:t>
       </w:r>
     </w:p>
     <w:p>
       <w:pPr>
-        <w:spacing w:after="40" w:line="276" w:lineRule="auto"/>
+        <w:spacing w:after="40"/>
         <w:ind w:left="283"/>
       </w:pPr>
       <w:r>
@@ -514,7 +486,7 @@
     </w:p>
     <w:p>
       <w:pPr>
-        <w:spacing w:after="40" w:line="276" w:lineRule="auto"/>
+        <w:spacing w:after="40"/>
         <w:ind w:left="283"/>
       </w:pPr>
       <w:r>
@@ -527,7 +499,7 @@
     </w:p>
     <w:p>
       <w:pPr>
-        <w:spacing w:after="40" w:line="276" w:lineRule="auto"/>
+        <w:spacing w:after="40"/>
         <w:ind w:left="283"/>
       </w:pPr>
       <w:r>
@@ -540,7 +512,7 @@
     </w:p>
     <w:p>
       <w:pPr>
-        <w:spacing w:before="320" w:after="120"/>
+        <w:spacing w:before="280" w:after="80"/>
       </w:pPr>
       <w:r>
         <w:rPr>
@@ -551,19 +523,10 @@
         </w:rPr>
         <w:t>2.  SCOPE OF SERVICES</w:t>
       </w:r>
-      <w:r>
-        <w:rPr>
-          <w:i/>
-          <w:color w:val="838081"/>
-          <w:sz w:val="18"/>
-        </w:rPr>
-        <w:br/>
-        <w:t>نطاق الخدمات</w:t>
-      </w:r>
     </w:p>
     <w:p>
       <w:pPr>
-        <w:spacing w:before="80" w:after="80"/>
+        <w:spacing w:before="40" w:after="40"/>
         <w:pBdr>
           <w:bottom w:val="single" w:sz="8" w:space="1" w:color="FCB900"/>
         </w:pBdr>
@@ -580,12 +543,12 @@
           <w:color w:val="3D3B3B"/>
           <w:sz w:val="20"/>
         </w:rPr>
-        <w:t>We will deliver the following services as part of this engagement:</w:t>
+        <w:t>The following services are included in this engagement:</w:t>
       </w:r>
     </w:p>
     <w:p>
       <w:pPr>
-        <w:spacing w:before="160" w:after="40"/>
+        <w:spacing w:before="120" w:after="40"/>
       </w:pPr>
       <w:r>
         <w:rPr>
@@ -598,7 +561,7 @@
     </w:p>
     <w:p>
       <w:pPr>
-        <w:spacing w:after="120" w:line="276" w:lineRule="auto"/>
+        <w:spacing w:after="80" w:line="276" w:lineRule="auto"/>
       </w:pPr>
       <w:r>
         <w:rPr>
@@ -607,26 +570,12 @@
           <w:color w:val="3D3B3B"/>
           <w:sz w:val="19"/>
         </w:rPr>
-        <w:t>Automated creation of SEO-optimized articles tailored to your brand voice, target keywords, and audience. Each article follows our EEAT Content Framework for quality and topical authority.</w:t>
+        <w:t>Automated creation of SEO-optimized articles tailored to your brand voice, target keywords, and audience. Each article follows our proprietary EEAT Content Framework for quality, topical authority, and long-term ranking performance.</w:t>
       </w:r>
     </w:p>
     <w:p>
       <w:pPr>
-        <w:spacing w:after="80" w:line="276" w:lineRule="auto"/>
-      </w:pPr>
-      <w:r>
-        <w:rPr>
-          <w:b w:val="0"/>
-          <w:i/>
-          <w:color w:val="838081"/>
-          <w:sz w:val="18"/>
-        </w:rPr>
-        <w:t>توليد محتوى آلي بجودة احترافية محسّن لمحركات البحث ومتوافق مع صوت علامتك التجارية وجمهورك المستهدف.</w:t>
-      </w:r>
-    </w:p>
-    <w:p>
-      <w:pPr>
-        <w:spacing w:before="160" w:after="40"/>
+        <w:spacing w:before="120" w:after="40"/>
       </w:pPr>
       <w:r>
         <w:rPr>
@@ -639,7 +588,7 @@
     </w:p>
     <w:p>
       <w:pPr>
-        <w:spacing w:after="120" w:line="276" w:lineRule="auto"/>
+        <w:spacing w:after="80" w:line="276" w:lineRule="auto"/>
       </w:pPr>
       <w:r>
         <w:rPr>
@@ -648,26 +597,12 @@
           <w:color w:val="3D3B3B"/>
           <w:sz w:val="19"/>
         </w:rPr>
-        <w:t>Full on-page SEO including meta tags, headings, keyword placement, internal linking, schema markup, and readability scoring.</w:t>
+        <w:t>Full on-page SEO including meta tags, headings, keyword placement, internal linking, schema markup, readability scoring, and content structure optimization.</w:t>
       </w:r>
     </w:p>
     <w:p>
       <w:pPr>
-        <w:spacing w:after="80" w:line="276" w:lineRule="auto"/>
-      </w:pPr>
-      <w:r>
-        <w:rPr>
-          <w:b w:val="0"/>
-          <w:i/>
-          <w:color w:val="838081"/>
-          <w:sz w:val="18"/>
-        </w:rPr>
-        <w:t>تحسين شامل لمحركات البحث يشمل البيانات الوصفية والعناوين والكلمات المفتاحية والربط الداخلي وترميز المخطط.</w:t>
-      </w:r>
-    </w:p>
-    <w:p>
-      <w:pPr>
-        <w:spacing w:before="160" w:after="40"/>
+        <w:spacing w:before="120" w:after="40"/>
       </w:pPr>
       <w:r>
         <w:rPr>
@@ -680,7 +615,7 @@
     </w:p>
     <w:p>
       <w:pPr>
-        <w:spacing w:after="120" w:line="276" w:lineRule="auto"/>
+        <w:spacing w:after="80" w:line="276" w:lineRule="auto"/>
       </w:pPr>
       <w:r>
         <w:rPr>
@@ -689,26 +624,12 @@
           <w:color w:val="3D3B3B"/>
           <w:sz w:val="19"/>
         </w:rPr>
-        <w:t>Direct publishing to Shopify, WordPress, Webflow, or Ghost via API integration. Scheduled publishing with approval workflow.</w:t>
+        <w:t>Direct API-based publishing to Shopify, WordPress, Webflow, or Ghost. Includes scheduled publishing with an integrated approval workflow.</w:t>
       </w:r>
     </w:p>
     <w:p>
       <w:pPr>
-        <w:spacing w:after="80" w:line="276" w:lineRule="auto"/>
-      </w:pPr>
-      <w:r>
-        <w:rPr>
-          <w:b w:val="0"/>
-          <w:i/>
-          <w:color w:val="838081"/>
-          <w:sz w:val="18"/>
-        </w:rPr>
-        <w:t>نشر مباشر على منصات متعددة عبر واجهة API مع جدولة النشر وسير عمل الموافقة.</w:t>
-      </w:r>
-    </w:p>
-    <w:p>
-      <w:pPr>
-        <w:spacing w:before="160" w:after="40"/>
+        <w:spacing w:before="120" w:after="40"/>
       </w:pPr>
       <w:r>
         <w:rPr>
@@ -721,7 +642,7 @@
     </w:p>
     <w:p>
       <w:pPr>
-        <w:spacing w:after="120" w:line="276" w:lineRule="auto"/>
+        <w:spacing w:after="80" w:line="276" w:lineRule="auto"/>
       </w:pPr>
       <w:r>
         <w:rPr>
@@ -730,7 +651,20 @@
           <w:color w:val="3D3B3B"/>
           <w:sz w:val="19"/>
         </w:rPr>
-        <w:t>Performance tracking: impressions, clicks, CTR, and position data. Sync and analyze your search presence in real-time.</w:t>
+        <w:t>Real-time search performance tracking: impressions, clicks, CTR, and average position. Full sync and analysis of your search presence.</w:t>
+      </w:r>
+    </w:p>
+    <w:p>
+      <w:pPr>
+        <w:spacing w:before="120" w:after="40"/>
+      </w:pPr>
+      <w:r>
+        <w:rPr>
+          <w:b/>
+          <w:color w:val="142444"/>
+          <w:sz w:val="20"/>
+        </w:rPr>
+        <w:t xml:space="preserve">  Analytics &amp; Reporting Dashboard</w:t>
       </w:r>
     </w:p>
     <w:p>
@@ -740,16 +674,16 @@
       <w:r>
         <w:rPr>
           <w:b w:val="0"/>
-          <w:i/>
-          <w:color w:val="838081"/>
-          <w:sz w:val="18"/>
+          <w:i w:val="0"/>
+          <w:color w:val="3D3B3B"/>
+          <w:sz w:val="19"/>
         </w:rPr>
-        <w:t>تتبع أداء البحث: مرات الظهور والنقرات ونسبة النقر إلى الظهور والترتيب مع مزامنة وتحليل آني.</w:t>
+        <w:t>Real-time dashboard with metric cards, performance charts, top queries table, and exportable monthly reports.</w:t>
       </w:r>
     </w:p>
     <w:p>
       <w:pPr>
-        <w:spacing w:before="160" w:after="40"/>
+        <w:spacing w:before="120" w:after="40"/>
       </w:pPr>
       <w:r>
         <w:rPr>
@@ -757,21 +691,7 @@
           <w:color w:val="142444"/>
           <w:sz w:val="20"/>
         </w:rPr>
-        <w:t xml:space="preserve">  Analytics Dashboard</w:t>
-      </w:r>
-    </w:p>
-    <w:p>
-      <w:pPr>
-        <w:spacing w:after="120" w:line="276" w:lineRule="auto"/>
-      </w:pPr>
-      <w:r>
-        <w:rPr>
-          <w:b w:val="0"/>
-          <w:i w:val="0"/>
-          <w:color w:val="3D3B3B"/>
-          <w:sz w:val="19"/>
-        </w:rPr>
-        <w:t>Real-time reporting dashboard with metric cards, charts, top queries table, and exportable reports.</w:t>
+        <w:t xml:space="preserve">  Multi-Language Content Support</w:t>
       </w:r>
     </w:p>
     <w:p>
@@ -781,57 +701,16 @@
       <w:r>
         <w:rPr>
           <w:b w:val="0"/>
-          <w:i/>
-          <w:color w:val="838081"/>
-          <w:sz w:val="18"/>
+          <w:i w:val="0"/>
+          <w:color w:val="3D3B3B"/>
+          <w:sz w:val="19"/>
         </w:rPr>
-        <w:t>لوحة تحليلات آنية ببطاقات المقاييس والرسوم البيانية وجدول أفضل الاستعلامات وتقارير قابلة للتصدير.</w:t>
+        <w:t>Content generation and SEO in up to 13 languages: English, Arabic, French, German, Spanish, Portuguese, Italian, Russian, Turkish, Japanese, Chinese, Korean, and Dutch.</w:t>
       </w:r>
     </w:p>
     <w:p>
       <w:pPr>
-        <w:spacing w:before="160" w:after="40"/>
-      </w:pPr>
-      <w:r>
-        <w:rPr>
-          <w:b/>
-          <w:color w:val="142444"/>
-          <w:sz w:val="20"/>
-        </w:rPr>
-        <w:t xml:space="preserve">  Multi-Language Support (Up to 13 Languages)</w:t>
-      </w:r>
-    </w:p>
-    <w:p>
-      <w:pPr>
-        <w:spacing w:after="120" w:line="276" w:lineRule="auto"/>
-      </w:pPr>
-      <w:r>
-        <w:rPr>
-          <w:b w:val="0"/>
-          <w:i w:val="0"/>
-          <w:color w:val="3D3B3B"/>
-          <w:sz w:val="19"/>
-        </w:rPr>
-        <w:t>Content generation and SEO optimization in Arabic, English, French, German, Spanish, Portuguese, Italian, Russian, Turkish, Japanese, Chinese, Korean, and Dutch.</w:t>
-      </w:r>
-    </w:p>
-    <w:p>
-      <w:pPr>
-        <w:spacing w:after="80" w:line="276" w:lineRule="auto"/>
-      </w:pPr>
-      <w:r>
-        <w:rPr>
-          <w:b w:val="0"/>
-          <w:i/>
-          <w:color w:val="838081"/>
-          <w:sz w:val="18"/>
-        </w:rPr>
-        <w:t>توليد المحتوى وتحسين محركات البحث بـ ١٣ لغة تشمل العربية والإنجليزية والفرنسية والألمانية واليابانية والصينية وغيرها.</w:t>
-      </w:r>
-    </w:p>
-    <w:p>
-      <w:pPr>
-        <w:spacing w:before="320" w:after="120"/>
+        <w:spacing w:before="280" w:after="80"/>
       </w:pPr>
       <w:r>
         <w:rPr>
@@ -842,19 +721,10 @@
         </w:rPr>
         <w:t>3.  EXCLUSIONS</w:t>
       </w:r>
-      <w:r>
-        <w:rPr>
-          <w:i/>
-          <w:color w:val="838081"/>
-          <w:sz w:val="18"/>
-        </w:rPr>
-        <w:br/>
-        <w:t>ما لا يشملہ العرض</w:t>
-      </w:r>
     </w:p>
     <w:p>
       <w:pPr>
-        <w:spacing w:before="80" w:after="80"/>
+        <w:spacing w:before="40" w:after="40"/>
         <w:pBdr>
           <w:bottom w:val="single" w:sz="8" w:space="1" w:color="FCB900"/>
         </w:pBdr>
@@ -871,12 +741,12 @@
           <w:color w:val="3D3B3B"/>
           <w:sz w:val="20"/>
         </w:rPr>
-        <w:t>The following are explicitly NOT included unless separately agreed in writing:</w:t>
+        <w:t>The following are explicitly not included unless separately agreed in writing:</w:t>
       </w:r>
     </w:p>
     <w:p>
       <w:pPr>
-        <w:spacing w:after="40" w:line="276" w:lineRule="auto"/>
+        <w:spacing w:after="40"/>
         <w:ind w:left="283"/>
       </w:pPr>
       <w:r>
@@ -884,12 +754,12 @@
           <w:color w:val="3D3B3B"/>
           <w:sz w:val="19"/>
         </w:rPr>
-        <w:t xml:space="preserve">  •  Website design, development, or hosting</w:t>
+        <w:t xml:space="preserve">  •  Website design, development, or hosting services</w:t>
       </w:r>
     </w:p>
     <w:p>
       <w:pPr>
-        <w:spacing w:after="40" w:line="276" w:lineRule="auto"/>
+        <w:spacing w:after="40"/>
         <w:ind w:left="283"/>
       </w:pPr>
       <w:r>
@@ -897,12 +767,12 @@
           <w:color w:val="3D3B3B"/>
           <w:sz w:val="19"/>
         </w:rPr>
-        <w:t xml:space="preserve">  •  Graphic design or branding (except AI-generated article images)</w:t>
+        <w:t xml:space="preserve">  •  Graphic design or brand identity creation (except AI-generated article images)</w:t>
       </w:r>
     </w:p>
     <w:p>
       <w:pPr>
-        <w:spacing w:after="40" w:line="276" w:lineRule="auto"/>
+        <w:spacing w:after="40"/>
         <w:ind w:left="283"/>
       </w:pPr>
       <w:r>
@@ -915,7 +785,7 @@
     </w:p>
     <w:p>
       <w:pPr>
-        <w:spacing w:after="40" w:line="276" w:lineRule="auto"/>
+        <w:spacing w:after="40"/>
         <w:ind w:left="283"/>
       </w:pPr>
       <w:r>
@@ -923,12 +793,12 @@
           <w:color w:val="3D3B3B"/>
           <w:sz w:val="19"/>
         </w:rPr>
-        <w:t xml:space="preserve">  •  Paid advertising management (Google Ads, Social Ads)</w:t>
+        <w:t xml:space="preserve">  •  Paid advertising management (Google Ads, Social Media Ads)</w:t>
       </w:r>
     </w:p>
     <w:p>
       <w:pPr>
-        <w:spacing w:after="40" w:line="276" w:lineRule="auto"/>
+        <w:spacing w:after="40"/>
         <w:ind w:left="283"/>
       </w:pPr>
       <w:r>
@@ -936,12 +806,12 @@
           <w:color w:val="3D3B3B"/>
           <w:sz w:val="19"/>
         </w:rPr>
-        <w:t xml:space="preserve">  •  Domain registration or email hosting</w:t>
+        <w:t xml:space="preserve">  •  Domain registration, email hosting, or SSL certificates</w:t>
       </w:r>
     </w:p>
     <w:p>
       <w:pPr>
-        <w:spacing w:after="40" w:line="276" w:lineRule="auto"/>
+        <w:spacing w:after="40"/>
         <w:ind w:left="283"/>
       </w:pPr>
       <w:r>
@@ -954,7 +824,7 @@
     </w:p>
     <w:p>
       <w:pPr>
-        <w:spacing w:after="40" w:line="276" w:lineRule="auto"/>
+        <w:spacing w:after="40"/>
         <w:ind w:left="283"/>
       </w:pPr>
       <w:r>
@@ -962,12 +832,12 @@
           <w:color w:val="3D3B3B"/>
           <w:sz w:val="19"/>
         </w:rPr>
-        <w:t xml:space="preserve">  •  Video production or editing</w:t>
+        <w:t xml:space="preserve">  •  Video production, animation, or photography</w:t>
       </w:r>
     </w:p>
     <w:p>
       <w:pPr>
-        <w:spacing w:before="320" w:after="120"/>
+        <w:spacing w:before="280" w:after="80"/>
       </w:pPr>
       <w:r>
         <w:rPr>
@@ -978,19 +848,10 @@
         </w:rPr>
         <w:t>4.  TIMELINE &amp; MILESTONES</w:t>
       </w:r>
-      <w:r>
-        <w:rPr>
-          <w:i/>
-          <w:color w:val="838081"/>
-          <w:sz w:val="18"/>
-        </w:rPr>
-        <w:br/>
-        <w:t>الجدول الزمني والمراحل</w:t>
-      </w:r>
     </w:p>
     <w:p>
       <w:pPr>
-        <w:spacing w:before="80" w:after="80"/>
+        <w:spacing w:before="40" w:after="40"/>
         <w:pBdr>
           <w:bottom w:val="single" w:sz="8" w:space="1" w:color="FCB900"/>
         </w:pBdr>
@@ -1006,7 +867,7 @@
           <w:color w:val="142444"/>
           <w:sz w:val="20"/>
         </w:rPr>
-        <w:t xml:space="preserve">  Phase 1: Setup &amp; Onboarding</w:t>
+        <w:t xml:space="preserve">  Phase 1 — Setup &amp; Onboarding</w:t>
       </w:r>
       <w:r>
         <w:rPr>
@@ -1028,7 +889,7 @@
           <w:color w:val="3D3B3B"/>
           <w:sz w:val="19"/>
         </w:rPr>
-        <w:t>Account creation, platform configuration, API integrations, brand profile setup, keyword research initialization.</w:t>
+        <w:t>Account creation, platform configuration, API integrations, brand profile setup, keyword research initialization, and test run.</w:t>
       </w:r>
     </w:p>
     <w:p>
@@ -1041,7 +902,7 @@
           <w:color w:val="142444"/>
           <w:sz w:val="20"/>
         </w:rPr>
-        <w:t xml:space="preserve">  Phase 2: First Content Batch</w:t>
+        <w:t xml:space="preserve">  Phase 2 — First Content Batch</w:t>
       </w:r>
       <w:r>
         <w:rPr>
@@ -1063,7 +924,7 @@
           <w:color w:val="3D3B3B"/>
           <w:sz w:val="19"/>
         </w:rPr>
-        <w:t>Initial content generation (up to 5 articles), review &amp; revision cycle, publishing pipeline test.</w:t>
+        <w:t>Initial content generation (up to 5 articles), review and revision cycle, and publishing pipeline validation.</w:t>
       </w:r>
     </w:p>
     <w:p>
@@ -1076,7 +937,7 @@
           <w:color w:val="142444"/>
           <w:sz w:val="20"/>
         </w:rPr>
-        <w:t xml:space="preserve">  Phase 3: Ongoing Delivery</w:t>
+        <w:t xml:space="preserve">  Phase 3 — Ongoing Delivery</w:t>
       </w:r>
       <w:r>
         <w:rPr>
@@ -1098,7 +959,7 @@
           <w:color w:val="3D3B3B"/>
           <w:sz w:val="19"/>
         </w:rPr>
-        <w:t>Scheduled content generation per agreed cadence, continuous optimization, monthly performance reports.</w:t>
+        <w:t>Scheduled content generation per agreed cadence with continuous optimization and monthly performance reporting.</w:t>
       </w:r>
     </w:p>
     <w:p>
@@ -1117,7 +978,7 @@
     </w:p>
     <w:p>
       <w:pPr>
-        <w:spacing w:before="320" w:after="120"/>
+        <w:spacing w:before="280" w:after="80"/>
       </w:pPr>
       <w:r>
         <w:rPr>
@@ -1128,19 +989,10 @@
         </w:rPr>
         <w:t>5.  CLIENT RESPONSIBILITIES</w:t>
       </w:r>
-      <w:r>
-        <w:rPr>
-          <w:i/>
-          <w:color w:val="838081"/>
-          <w:sz w:val="18"/>
-        </w:rPr>
-        <w:br/>
-        <w:t>مسؤوليات العميل</w:t>
-      </w:r>
     </w:p>
     <w:p>
       <w:pPr>
-        <w:spacing w:before="80" w:after="80"/>
+        <w:spacing w:before="40" w:after="40"/>
         <w:pBdr>
           <w:bottom w:val="single" w:sz="8" w:space="1" w:color="FCB900"/>
         </w:pBdr>
@@ -1157,12 +1009,12 @@
           <w:color w:val="3D3B3B"/>
           <w:sz w:val="20"/>
         </w:rPr>
-        <w:t>To ensure successful delivery, the Client agrees to:</w:t>
+        <w:t>To ensure successful delivery, you agree to:</w:t>
       </w:r>
     </w:p>
     <w:p>
       <w:pPr>
-        <w:spacing w:after="40" w:line="276" w:lineRule="auto"/>
+        <w:spacing w:after="40"/>
         <w:ind w:left="283"/>
       </w:pPr>
       <w:r>
@@ -1170,12 +1022,12 @@
           <w:color w:val="3D3B3B"/>
           <w:sz w:val="19"/>
         </w:rPr>
-        <w:t xml:space="preserve">  •  Provide API access to CMS platforms (Shopify, WordPress, etc.)</w:t>
+        <w:t xml:space="preserve">  •  Provide API access to your CMS platforms (Shopify, WordPress, etc.)</w:t>
       </w:r>
     </w:p>
     <w:p>
       <w:pPr>
-        <w:spacing w:after="40" w:line="276" w:lineRule="auto"/>
+        <w:spacing w:after="40"/>
         <w:ind w:left="283"/>
       </w:pPr>
       <w:r>
@@ -1188,7 +1040,7 @@
     </w:p>
     <w:p>
       <w:pPr>
-        <w:spacing w:after="40" w:line="276" w:lineRule="auto"/>
+        <w:spacing w:after="40"/>
         <w:ind w:left="283"/>
       </w:pPr>
       <w:r>
@@ -1201,7 +1053,7 @@
     </w:p>
     <w:p>
       <w:pPr>
-        <w:spacing w:after="40" w:line="276" w:lineRule="auto"/>
+        <w:spacing w:after="40"/>
         <w:ind w:left="283"/>
       </w:pPr>
       <w:r>
@@ -1209,12 +1061,12 @@
           <w:color w:val="3D3B3B"/>
           <w:sz w:val="19"/>
         </w:rPr>
-        <w:t xml:space="preserve">  •  Provide timely feedback on content quality and direction</w:t>
+        <w:t xml:space="preserve">  •  Provide timely feedback on content quality and strategic direction</w:t>
       </w:r>
     </w:p>
     <w:p>
       <w:pPr>
-        <w:spacing w:after="40" w:line="276" w:lineRule="auto"/>
+        <w:spacing w:after="40"/>
         <w:ind w:left="283"/>
       </w:pPr>
       <w:r>
@@ -1227,7 +1079,7 @@
     </w:p>
     <w:p>
       <w:pPr>
-        <w:spacing w:after="40" w:line="276" w:lineRule="auto"/>
+        <w:spacing w:after="40"/>
         <w:ind w:left="283"/>
       </w:pPr>
       <w:r>
@@ -1240,7 +1092,7 @@
     </w:p>
     <w:p>
       <w:pPr>
-        <w:spacing w:before="320" w:after="120"/>
+        <w:spacing w:before="280" w:after="80"/>
       </w:pPr>
       <w:r>
         <w:rPr>
@@ -1251,19 +1103,10 @@
         </w:rPr>
         <w:t>6.  INVESTMENT &amp; PRICING</w:t>
       </w:r>
-      <w:r>
-        <w:rPr>
-          <w:i/>
-          <w:color w:val="838081"/>
-          <w:sz w:val="18"/>
-        </w:rPr>
-        <w:br/>
-        <w:t>الاستثمار والأسعار</w:t>
-      </w:r>
     </w:p>
     <w:p>
       <w:pPr>
-        <w:spacing w:before="80" w:after="80"/>
+        <w:spacing w:before="40" w:after="40"/>
         <w:pBdr>
           <w:bottom w:val="single" w:sz="8" w:space="1" w:color="FCB900"/>
         </w:pBdr>
@@ -1319,7 +1162,7 @@
                 <w:color w:val="FFFFFF"/>
                 <w:sz w:val="16"/>
               </w:rPr>
-              <w:t>SERVICE / الخدمة</w:t>
+              <w:t>SERVICE</w:t>
             </w:r>
           </w:p>
         </w:tc>
@@ -1417,9 +1260,7 @@
                 <w:color w:val="3D3B3B"/>
                 <w:sz w:val="17"/>
               </w:rPr>
-              <w:t>TDS GEO — Setup &amp; Onboarding</w:t>
-              <w:br/>
-              <w:t>الإعداد والتشغيل الأولي</w:t>
+              <w:t>Setup &amp; Onboarding</w:t>
             </w:r>
           </w:p>
         </w:tc>
@@ -1511,9 +1352,7 @@
                 <w:color w:val="3D3B3B"/>
                 <w:sz w:val="17"/>
               </w:rPr>
-              <w:t>TDS GEO — {PLAN_NAME} ({BILLING_CYCLE})</w:t>
-              <w:br/>
-              <w:t>{PLAN_NAME_AR} — {BILLING_CYCLE_AR}</w:t>
+              <w:t>{PLAN_NAME} — {BILLING_CYCLE}</w:t>
             </w:r>
           </w:p>
         </w:tc>
@@ -1605,9 +1444,7 @@
                 <w:color w:val="3D3B3B"/>
                 <w:sz w:val="17"/>
               </w:rPr>
-              <w:t>Content — Extra Article Pack (×{EXTRA_QTY})</w:t>
-              <w:br/>
-              <w:t>حزمة مقالات إضافية</w:t>
+              <w:t>Extra Article Pack (×{EXTRA_QTY})</w:t>
             </w:r>
           </w:p>
         </w:tc>
@@ -1699,9 +1536,7 @@
                 <w:color w:val="3D3B3B"/>
                 <w:sz w:val="17"/>
               </w:rPr>
-              <w:t>Consulting — Strategy Sessions ({CONSULT_HRS}h)</w:t>
-              <w:br/>
-              <w:t>جلسات استشارية استراتيجية</w:t>
+              <w:t>Strategy Consulting ({CONSULT_HRS} hours)</w:t>
             </w:r>
           </w:p>
         </w:tc>
@@ -1737,7 +1572,7 @@
                 <w:color w:val="3D3B3B"/>
                 <w:sz w:val="17"/>
               </w:rPr>
-              <w:t>{CONSULT_RATE}</w:t>
+              <w:t>{CONSULT_RATE}/hr</w:t>
             </w:r>
           </w:p>
         </w:tc>
@@ -1798,7 +1633,7 @@
                 <w:color w:val="142444"/>
                 <w:sz w:val="18"/>
               </w:rPr>
-              <w:t>Subtotal / المجموع الفرعي</w:t>
+              <w:t>Subtotal</w:t>
             </w:r>
           </w:p>
         </w:tc>
@@ -1809,7 +1644,6 @@
           <w:p>
             <w:pPr>
               <w:spacing w:before="40" w:after="40"/>
-              <w:jc w:val="right"/>
             </w:pPr>
           </w:p>
         </w:tc>
@@ -1870,7 +1704,7 @@
                 <w:color w:val="142444"/>
                 <w:sz w:val="18"/>
               </w:rPr>
-              <w:t>Discount / الخصم ({DISCOUNT_PCT}%)</w:t>
+              <w:t>Discount ({DISCOUNT_PCT}%)</w:t>
             </w:r>
           </w:p>
         </w:tc>
@@ -1881,7 +1715,6 @@
           <w:p>
             <w:pPr>
               <w:spacing w:before="40" w:after="40"/>
-              <w:jc w:val="right"/>
             </w:pPr>
           </w:p>
         </w:tc>
@@ -1943,7 +1776,7 @@
                 <w:color w:val="FFFFFF"/>
                 <w:sz w:val="20"/>
               </w:rPr>
-              <w:t>TOTAL DUE / الإجمالي المستحق</w:t>
+              <w:t>TOTAL DUE</w:t>
             </w:r>
           </w:p>
         </w:tc>
@@ -1960,7 +1793,7 @@
                 <w:color w:val="838081"/>
                 <w:sz w:val="18"/>
               </w:rPr>
-              <w:t>{GRAND_TOTAL_CURRENCY}</w:t>
+              <w:t>{CURRENCY}</w:t>
             </w:r>
           </w:p>
         </w:tc>
@@ -2004,12 +1837,12 @@
           <w:color w:val="FCB900"/>
           <w:sz w:val="16"/>
         </w:rPr>
-        <w:t>Quarterly prepaid plans include a 10% discount.</w:t>
+        <w:t>Quarterly prepaid plans include a 10% discount. Annual prepaid plans include a 15% discount.</w:t>
       </w:r>
     </w:p>
     <w:p>
       <w:pPr>
-        <w:spacing w:before="320" w:after="120"/>
+        <w:spacing w:before="280" w:after="80"/>
       </w:pPr>
       <w:r>
         <w:rPr>
@@ -2020,19 +1853,10 @@
         </w:rPr>
         <w:t>7.  PAYMENT SCHEDULE</w:t>
       </w:r>
-      <w:r>
-        <w:rPr>
-          <w:i/>
-          <w:color w:val="838081"/>
-          <w:sz w:val="18"/>
-        </w:rPr>
-        <w:br/>
-        <w:t>جدول السداد</w:t>
-      </w:r>
     </w:p>
     <w:p>
       <w:pPr>
-        <w:spacing w:before="80" w:after="80"/>
+        <w:spacing w:before="40" w:after="40"/>
         <w:pBdr>
           <w:bottom w:val="single" w:sz="8" w:space="1" w:color="FCB900"/>
         </w:pBdr>
@@ -2048,7 +1872,7 @@
           <w:color w:val="142444"/>
           <w:sz w:val="20"/>
         </w:rPr>
-        <w:t xml:space="preserve">  Option A — Upfront (Recommended)</w:t>
+        <w:t xml:space="preserve">  Option A — Full Upfront (Recommended)</w:t>
       </w:r>
     </w:p>
     <w:p>
@@ -2062,7 +1886,7 @@
           <w:color w:val="3D3B3B"/>
           <w:sz w:val="19"/>
         </w:rPr>
-        <w:t>100% upon signing. Best value — includes 10% discount on annual plans.</w:t>
+        <w:t>100% upon signing. Best value.</w:t>
       </w:r>
     </w:p>
     <w:p>
@@ -2116,7 +1940,7 @@
           <w:color w:val="3D3B3B"/>
           <w:sz w:val="19"/>
         </w:rPr>
-        <w:t>30% deposit upon signing, 70% within 15 days of delivery completion.</w:t>
+        <w:t>30% deposit upon signing, 70% within 15 days of completion.</w:t>
       </w:r>
     </w:p>
     <w:p>
@@ -2189,7 +2013,7 @@
     </w:p>
     <w:p>
       <w:pPr>
-        <w:spacing w:before="320" w:after="120"/>
+        <w:spacing w:before="280" w:after="80"/>
       </w:pPr>
       <w:r>
         <w:rPr>
@@ -2200,19 +2024,10 @@
         </w:rPr>
         <w:t>8.  TERMS &amp; CONDITIONS</w:t>
       </w:r>
-      <w:r>
-        <w:rPr>
-          <w:i/>
-          <w:color w:val="838081"/>
-          <w:sz w:val="18"/>
-        </w:rPr>
-        <w:br/>
-        <w:t>الشروط والأحكام</w:t>
-      </w:r>
     </w:p>
     <w:p>
       <w:pPr>
-        <w:spacing w:before="80" w:after="80"/>
+        <w:spacing w:before="40" w:after="40"/>
         <w:pBdr>
           <w:bottom w:val="single" w:sz="8" w:space="1" w:color="FCB900"/>
         </w:pBdr>
@@ -2220,7 +2035,7 @@
     </w:p>
     <w:p>
       <w:pPr>
-        <w:spacing w:before="120" w:after="40"/>
+        <w:spacing w:before="100" w:after="40"/>
       </w:pPr>
       <w:r>
         <w:rPr>
@@ -2228,12 +2043,12 @@
           <w:color w:val="142444"/>
           <w:sz w:val="20"/>
         </w:rPr>
-        <w:t xml:space="preserve">  1. Term</w:t>
+        <w:t xml:space="preserve">  1. Minimum Term</w:t>
       </w:r>
     </w:p>
     <w:p>
       <w:pPr>
-        <w:spacing w:after="40" w:line="276" w:lineRule="auto"/>
+        <w:spacing w:after="60" w:line="276" w:lineRule="auto"/>
       </w:pPr>
       <w:r>
         <w:rPr>
@@ -2242,26 +2057,12 @@
           <w:color w:val="3D3B3B"/>
           <w:sz w:val="19"/>
         </w:rPr>
-        <w:t>The initial term is a minimum of three (3) calendar months from the start date. After the initial term, the agreement auto-renews monthly unless either party provides 30 days' written cancellation notice.</w:t>
+        <w:t>The initial commitment is a minimum of three (3) calendar months. After the initial term, the agreement auto-renews monthly unless either party gives 30 days' written cancellation notice.</w:t>
       </w:r>
     </w:p>
     <w:p>
       <w:pPr>
-        <w:spacing w:after="80" w:line="276" w:lineRule="auto"/>
-      </w:pPr>
-      <w:r>
-        <w:rPr>
-          <w:b w:val="0"/>
-          <w:i/>
-          <w:color w:val="838081"/>
-          <w:sz w:val="18"/>
-        </w:rPr>
-        <w:t>المدة الأولية ثلاثة (3) أشهر ميلادية كحد أدنى. بعدها يتجدد العقد تلقائيًا شهريًا ما لم يخطر أي طرف الآخر كتابيًا قبل 30 يومًا.</w:t>
-      </w:r>
-    </w:p>
-    <w:p>
-      <w:pPr>
-        <w:spacing w:before="120" w:after="40"/>
+        <w:spacing w:before="100" w:after="40"/>
       </w:pPr>
       <w:r>
         <w:rPr>
@@ -2269,12 +2070,12 @@
           <w:color w:val="142444"/>
           <w:sz w:val="20"/>
         </w:rPr>
-        <w:t xml:space="preserve">  2. Payment</w:t>
+        <w:t xml:space="preserve">  2. Payment Terms</w:t>
       </w:r>
     </w:p>
     <w:p>
       <w:pPr>
-        <w:spacing w:after="40" w:line="276" w:lineRule="auto"/>
+        <w:spacing w:after="60" w:line="276" w:lineRule="auto"/>
       </w:pPr>
       <w:r>
         <w:rPr>
@@ -2283,26 +2084,12 @@
           <w:color w:val="3D3B3B"/>
           <w:sz w:val="19"/>
         </w:rPr>
-        <w:t>All fees are in the stated currency. Invoices are due per the agreed payment terms. Late payments incur 2% monthly interest on overdue amounts. Services may be suspended if payment is more than 15 days past due.</w:t>
+        <w:t>All fees are in the stated currency. Invoices are due according to the selected payment schedule. Late payments incur 2% monthly interest on overdue amounts. Services may be suspended if payment is more than 15 days past due.</w:t>
       </w:r>
     </w:p>
     <w:p>
       <w:pPr>
-        <w:spacing w:after="80" w:line="276" w:lineRule="auto"/>
-      </w:pPr>
-      <w:r>
-        <w:rPr>
-          <w:b w:val="0"/>
-          <w:i/>
-          <w:color w:val="838081"/>
-          <w:sz w:val="18"/>
-        </w:rPr>
-        <w:t>جميع الرسوم بالعملة المذكورة. الفواتير مستحقة حسب شروط الدفع المتفق عليها. التأخير في السداد يستحق فائدة شهرية 2٪.</w:t>
-      </w:r>
-    </w:p>
-    <w:p>
-      <w:pPr>
-        <w:spacing w:before="120" w:after="40"/>
+        <w:spacing w:before="100" w:after="40"/>
       </w:pPr>
       <w:r>
         <w:rPr>
@@ -2310,12 +2097,12 @@
           <w:color w:val="142444"/>
           <w:sz w:val="20"/>
         </w:rPr>
-        <w:t xml:space="preserve">  3. Content Ownership</w:t>
+        <w:t xml:space="preserve">  3. Intellectual Property</w:t>
       </w:r>
     </w:p>
     <w:p>
       <w:pPr>
-        <w:spacing w:after="40" w:line="276" w:lineRule="auto"/>
+        <w:spacing w:after="60" w:line="276" w:lineRule="auto"/>
       </w:pPr>
       <w:r>
         <w:rPr>
@@ -2324,26 +2111,12 @@
           <w:color w:val="3D3B3B"/>
           <w:sz w:val="19"/>
         </w:rPr>
-        <w:t>You own all content generated specifically for your brand upon full payment. We retain ownership of our platform, algorithms, and methodologies.</w:t>
+        <w:t>You own all content generated specifically for your brand upon full payment. We retain ownership of our platform, algorithms, software, and methodologies.</w:t>
       </w:r>
     </w:p>
     <w:p>
       <w:pPr>
-        <w:spacing w:after="80" w:line="276" w:lineRule="auto"/>
-      </w:pPr>
-      <w:r>
-        <w:rPr>
-          <w:b w:val="0"/>
-          <w:i/>
-          <w:color w:val="838081"/>
-          <w:sz w:val="18"/>
-        </w:rPr>
-        <w:t>أنت تملك جميع المحتويات المنشأة خصيصًا لعلامتك التجارية بعد السداد الكامل. نحن نحتفظ بملكية منصتنا وخوارزمياتنا.</w:t>
-      </w:r>
-    </w:p>
-    <w:p>
-      <w:pPr>
-        <w:spacing w:before="120" w:after="40"/>
+        <w:spacing w:before="100" w:after="40"/>
       </w:pPr>
       <w:r>
         <w:rPr>
@@ -2356,7 +2129,7 @@
     </w:p>
     <w:p>
       <w:pPr>
-        <w:spacing w:after="40" w:line="276" w:lineRule="auto"/>
+        <w:spacing w:after="60" w:line="276" w:lineRule="auto"/>
       </w:pPr>
       <w:r>
         <w:rPr>
@@ -2365,26 +2138,12 @@
           <w:color w:val="3D3B3B"/>
           <w:sz w:val="19"/>
         </w:rPr>
-        <w:t>All business information shared during this engagement is strictly confidential. We sign NDAs upon request.</w:t>
+        <w:t>All non-public information shared during this engagement is strictly confidential and will not be disclosed to third parties without your consent.</w:t>
       </w:r>
     </w:p>
     <w:p>
       <w:pPr>
-        <w:spacing w:after="80" w:line="276" w:lineRule="auto"/>
-      </w:pPr>
-      <w:r>
-        <w:rPr>
-          <w:b w:val="0"/>
-          <w:i/>
-          <w:color w:val="838081"/>
-          <w:sz w:val="18"/>
-        </w:rPr>
-        <w:t>جميع معلومات العمل المتبادلة سرية تامة. نوقع اتفاقيات السرية عند الطلب.</w:t>
-      </w:r>
-    </w:p>
-    <w:p>
-      <w:pPr>
-        <w:spacing w:before="120" w:after="40"/>
+        <w:spacing w:before="100" w:after="40"/>
       </w:pPr>
       <w:r>
         <w:rPr>
@@ -2392,12 +2151,12 @@
           <w:color w:val="142444"/>
           <w:sz w:val="20"/>
         </w:rPr>
-        <w:t xml:space="preserve">  5. Data Protection</w:t>
+        <w:t xml:space="preserve">  5. Data Protection &amp; Security</w:t>
       </w:r>
     </w:p>
     <w:p>
       <w:pPr>
-        <w:spacing w:after="40" w:line="276" w:lineRule="auto"/>
+        <w:spacing w:after="60" w:line="276" w:lineRule="auto"/>
       </w:pPr>
       <w:r>
         <w:rPr>
@@ -2406,26 +2165,12 @@
           <w:color w:val="3D3B3B"/>
           <w:sz w:val="19"/>
         </w:rPr>
-        <w:t>We comply with applicable data protection laws (Egypt Law 151/2020, GDPR, UAE PDPL). Your data is encrypted, access-controlled, and deleted within 90 days of contract end.</w:t>
+        <w:t>We maintain industry-standard security measures including encryption (AES-256 at rest, TLS 1.3 in transit), access controls, and regular backups. Your data will be deleted within 90 days of contract termination, unless retention is required by law.</w:t>
       </w:r>
     </w:p>
     <w:p>
       <w:pPr>
-        <w:spacing w:after="80" w:line="276" w:lineRule="auto"/>
-      </w:pPr>
-      <w:r>
-        <w:rPr>
-          <w:b w:val="0"/>
-          <w:i/>
-          <w:color w:val="838081"/>
-          <w:sz w:val="18"/>
-        </w:rPr>
-        <w:t>نلتزم بقوانين حماية البيانات المعمول بها. بياناتك مشفرة ومحمية ويتم حذفها خلال 90 يومًا من انتهاء العقد.</w:t>
-      </w:r>
-    </w:p>
-    <w:p>
-      <w:pPr>
-        <w:spacing w:before="120" w:after="40"/>
+        <w:spacing w:before="100" w:after="40"/>
       </w:pPr>
       <w:r>
         <w:rPr>
@@ -2438,7 +2183,7 @@
     </w:p>
     <w:p>
       <w:pPr>
-        <w:spacing w:after="40" w:line="276" w:lineRule="auto"/>
+        <w:spacing w:after="60" w:line="276" w:lineRule="auto"/>
       </w:pPr>
       <w:r>
         <w:rPr>
@@ -2447,26 +2192,12 @@
           <w:color w:val="3D3B3B"/>
           <w:sz w:val="19"/>
         </w:rPr>
-        <w:t>We deliver high-quality content and SEO best practices. However, search engine rankings depend on many factors beyond our control and are never guaranteed.</w:t>
+        <w:t>We deliver high-quality content and apply SEO best practices. However, search engine rankings depend on many factors beyond our control and are never guaranteed.</w:t>
       </w:r>
     </w:p>
     <w:p>
       <w:pPr>
-        <w:spacing w:after="80" w:line="276" w:lineRule="auto"/>
-      </w:pPr>
-      <w:r>
-        <w:rPr>
-          <w:b w:val="0"/>
-          <w:i/>
-          <w:color w:val="838081"/>
-          <w:sz w:val="18"/>
-        </w:rPr>
-        <w:t>نقدم محتوى عالي الجودة وأفضل ممارسات تحسين محركات البحث. لكن ترتيب البحث يعتمد على عوامل خارجة عن إرادتنا.</w:t>
-      </w:r>
-    </w:p>
-    <w:p>
-      <w:pPr>
-        <w:spacing w:before="120" w:after="40"/>
+        <w:spacing w:before="100" w:after="40"/>
       </w:pPr>
       <w:r>
         <w:rPr>
@@ -2474,12 +2205,12 @@
           <w:color w:val="142444"/>
           <w:sz w:val="20"/>
         </w:rPr>
-        <w:t xml:space="preserve">  7. Liability</w:t>
+        <w:t xml:space="preserve">  7. Limitation of Liability</w:t>
       </w:r>
     </w:p>
     <w:p>
       <w:pPr>
-        <w:spacing w:after="40" w:line="276" w:lineRule="auto"/>
+        <w:spacing w:after="60" w:line="276" w:lineRule="auto"/>
       </w:pPr>
       <w:r>
         <w:rPr>
@@ -2488,26 +2219,12 @@
           <w:color w:val="3D3B3B"/>
           <w:sz w:val="19"/>
         </w:rPr>
-        <w:t>Our total liability is capped at the total fees paid in the 12 months preceding any claim. We are not liable for indirect or consequential damages.</w:t>
+        <w:t>Our total liability is capped at the total fees paid in the twelve (12) months preceding any claim. We are not liable for indirect, incidental, or consequential damages.</w:t>
       </w:r>
     </w:p>
     <w:p>
       <w:pPr>
-        <w:spacing w:after="80" w:line="276" w:lineRule="auto"/>
-      </w:pPr>
-      <w:r>
-        <w:rPr>
-          <w:b w:val="0"/>
-          <w:i/>
-          <w:color w:val="838081"/>
-          <w:sz w:val="18"/>
-        </w:rPr>
-        <w:t>مسؤوليتنا محدودة بإجمالي الرسوم المدفوعة في الـ 12 شهرًا السابقة. لسنا مسؤولين عن أضرار غير مباشرة.</w:t>
-      </w:r>
-    </w:p>
-    <w:p>
-      <w:pPr>
-        <w:spacing w:before="120" w:after="40"/>
+        <w:spacing w:before="100" w:after="40"/>
       </w:pPr>
       <w:r>
         <w:rPr>
@@ -2520,7 +2237,7 @@
     </w:p>
     <w:p>
       <w:pPr>
-        <w:spacing w:after="40" w:line="276" w:lineRule="auto"/>
+        <w:spacing w:after="60" w:line="276" w:lineRule="auto"/>
       </w:pPr>
       <w:r>
         <w:rPr>
@@ -2529,26 +2246,12 @@
           <w:color w:val="3D3B3B"/>
           <w:sz w:val="19"/>
         </w:rPr>
-        <w:t>Either party may terminate for material breach with 15 days' written notice. Early termination before the minimum term ends requires payment of the remaining balance.</w:t>
+        <w:t>Either party may terminate for material breach with 15 days' written notice. If you terminate before the minimum term ends, the remaining balance for the minimum term becomes immediately due.</w:t>
       </w:r>
     </w:p>
     <w:p>
       <w:pPr>
-        <w:spacing w:after="80" w:line="276" w:lineRule="auto"/>
-      </w:pPr>
-      <w:r>
-        <w:rPr>
-          <w:b w:val="0"/>
-          <w:i/>
-          <w:color w:val="838081"/>
-          <w:sz w:val="18"/>
-        </w:rPr>
-        <w:t>لأي طرف إنهاء العقد للإخلال الجوهري بإخطار كتابي مدته 15 يومًا. الإنهاء المبكر يستدعي سداد الرصيد المتبقي.</w:t>
-      </w:r>
-    </w:p>
-    <w:p>
-      <w:pPr>
-        <w:spacing w:before="120" w:after="40"/>
+        <w:spacing w:before="100" w:after="40"/>
       </w:pPr>
       <w:r>
         <w:rPr>
@@ -2556,12 +2259,12 @@
           <w:color w:val="142444"/>
           <w:sz w:val="20"/>
         </w:rPr>
-        <w:t xml:space="preserve">  9. Governing Law &amp; Disputes</w:t>
+        <w:t xml:space="preserve">  9. Governing Law &amp; Dispute Resolution</w:t>
       </w:r>
     </w:p>
     <w:p>
       <w:pPr>
-        <w:spacing w:after="40" w:line="276" w:lineRule="auto"/>
+        <w:spacing w:after="60" w:line="276" w:lineRule="auto"/>
       </w:pPr>
       <w:r>
         <w:rPr>
@@ -2570,26 +2273,12 @@
           <w:color w:val="3D3B3B"/>
           <w:sz w:val="19"/>
         </w:rPr>
-        <w:t>This agreement is governed by the laws of {GOVERNING_LAW}. Disputes are resolved through amicable negotiation, then mediation, then binding arbitration if needed.</w:t>
+        <w:t>This agreement is governed by {GOVERNING_LAW}. Disputes will first be resolved through good-faith negotiation, then mediation, and finally binding arbitration if necessary.</w:t>
       </w:r>
     </w:p>
     <w:p>
       <w:pPr>
-        <w:spacing w:after="80" w:line="276" w:lineRule="auto"/>
-      </w:pPr>
-      <w:r>
-        <w:rPr>
-          <w:b w:val="0"/>
-          <w:i/>
-          <w:color w:val="838081"/>
-          <w:sz w:val="18"/>
-        </w:rPr>
-        <w:t>يخضع هذا الاتفاق لقوانين {GOVERNING_LAW_AR}. تُحل النزاعات بالتفاوض ثم الوساطة ثم التحكيم الملزم إذا لزم الأمر.</w:t>
-      </w:r>
-    </w:p>
-    <w:p>
-      <w:pPr>
-        <w:spacing w:before="320" w:after="120"/>
+        <w:spacing w:before="280" w:after="80"/>
       </w:pPr>
       <w:r>
         <w:rPr>
@@ -2600,19 +2289,10 @@
         </w:rPr>
         <w:t>9.  ACCEPTANCE &amp; SIGNATURE</w:t>
       </w:r>
-      <w:r>
-        <w:rPr>
-          <w:i/>
-          <w:color w:val="838081"/>
-          <w:sz w:val="18"/>
-        </w:rPr>
-        <w:br/>
-        <w:t>القبول والتوقيع</w:t>
-      </w:r>
     </w:p>
     <w:p>
       <w:pPr>
-        <w:spacing w:before="80" w:after="80"/>
+        <w:spacing w:before="40" w:after="40"/>
         <w:pBdr>
           <w:bottom w:val="single" w:sz="8" w:space="1" w:color="FCB900"/>
         </w:pBdr>
@@ -2620,23 +2300,21 @@
     </w:p>
     <w:p>
       <w:pPr>
-        <w:spacing w:after="160"/>
+        <w:spacing w:after="200" w:line="276" w:lineRule="auto"/>
       </w:pPr>
       <w:r>
         <w:rPr>
+          <w:b w:val="0"/>
+          <w:i w:val="0"/>
           <w:color w:val="3D3B3B"/>
           <w:sz w:val="19"/>
         </w:rPr>
-        <w:t>By signing below, both parties acknowledge and agree to the terms of this quotation. This quotation becomes a legally binding agreement upon signature by both parties.</w:t>
-        <w:br/>
-        <w:br/>
-        <w:t>بالتوقيع أدناه، يقر الطرفان ويوافقان على شروط عرض السعر هذا. يصبح عرض السعر هذا اتفاقًا ملزمًا قانونيًا عند توقيع الطرفين.</w:t>
+        <w:t>By signing below, both parties acknowledge and agree to the terms of this quotation. This quotation becomes a legally binding agreement upon signature by both parties and is valid for 30 days from the issue date.</w:t>
       </w:r>
     </w:p>
     <w:tbl>
       <w:tblPr>
         <w:tblW w:type="auto" w:w="0"/>
-        <w:jc w:val="center"/>
         <w:tblLook w:firstColumn="1" w:firstRow="1" w:lastColumn="0" w:lastRow="0" w:noHBand="0" w:noVBand="1" w:val="04A0"/>
         <w:tblBorders>
           <w:top w:val="none" w:sz="0" w:space="0" w:color="auto"/>
@@ -2666,7 +2344,7 @@
                 <w:color w:val="FCB900"/>
                 <w:sz w:val="20"/>
               </w:rPr>
-              <w:t>CLIENT / العميل</w:t>
+              <w:t>CLIENT</w:t>
             </w:r>
           </w:p>
           <w:p>
@@ -2689,7 +2367,7 @@
                 <w:color w:val="3D3B3B"/>
                 <w:sz w:val="19"/>
               </w:rPr>
-              <w:t>Name / الاسم: ______________________________</w:t>
+              <w:t>Name: ______________________________</w:t>
             </w:r>
           </w:p>
           <w:p>
@@ -2701,7 +2379,7 @@
                 <w:color w:val="3D3B3B"/>
                 <w:sz w:val="19"/>
               </w:rPr>
-              <w:t>Title / المنصب: ______________________________</w:t>
+              <w:t>Title: ______________________________</w:t>
             </w:r>
           </w:p>
           <w:p>
@@ -2713,7 +2391,7 @@
                 <w:color w:val="3D3B3B"/>
                 <w:sz w:val="19"/>
               </w:rPr>
-              <w:t>Date / التاريخ: ______________________________</w:t>
+              <w:t>Date: ______________________________</w:t>
             </w:r>
           </w:p>
           <w:p>
@@ -2725,7 +2403,7 @@
                 <w:color w:val="3D3B3B"/>
                 <w:sz w:val="19"/>
               </w:rPr>
-              <w:t>Signature / التوقيع: ______________________________</w:t>
+              <w:t>Signature: ______________________________</w:t>
             </w:r>
           </w:p>
           <w:p>
@@ -2737,7 +2415,7 @@
                 <w:color w:val="3D3B3B"/>
                 <w:sz w:val="19"/>
               </w:rPr>
-              <w:t>Company Stamp / ختم الشركة:</w:t>
+              <w:t>Company Stamp:</w:t>
             </w:r>
           </w:p>
         </w:tc>
@@ -2755,7 +2433,7 @@
                 <w:color w:val="FCB900"/>
                 <w:sz w:val="20"/>
               </w:rPr>
-              <w:t>TDS GEO / المزود</w:t>
+              <w:t>TRAFFIC DIGITAL SOLUTIONS</w:t>
             </w:r>
           </w:p>
           <w:p>
@@ -2778,7 +2456,7 @@
                 <w:color w:val="3D3B3B"/>
                 <w:sz w:val="19"/>
               </w:rPr>
-              <w:t>Name / الاسم: ______________________________</w:t>
+              <w:t>Name: ______________________________</w:t>
             </w:r>
           </w:p>
           <w:p>
@@ -2790,7 +2468,7 @@
                 <w:color w:val="3D3B3B"/>
                 <w:sz w:val="19"/>
               </w:rPr>
-              <w:t>Title / المنصب: ______________________________</w:t>
+              <w:t>Title: ______________________________</w:t>
             </w:r>
           </w:p>
           <w:p>
@@ -2802,7 +2480,7 @@
                 <w:color w:val="3D3B3B"/>
                 <w:sz w:val="19"/>
               </w:rPr>
-              <w:t>Date / التاريخ: ______________________________</w:t>
+              <w:t>Date: ______________________________</w:t>
             </w:r>
           </w:p>
           <w:p>
@@ -2814,7 +2492,7 @@
                 <w:color w:val="3D3B3B"/>
                 <w:sz w:val="19"/>
               </w:rPr>
-              <w:t>Signature / التوقيع: ______________________________</w:t>
+              <w:t>Signature: ______________________________</w:t>
             </w:r>
           </w:p>
           <w:p>
@@ -2826,7 +2504,7 @@
                 <w:color w:val="3D3B3B"/>
                 <w:sz w:val="19"/>
               </w:rPr>
-              <w:t>Company Stamp / ختم الشركة:</w:t>
+              <w:t>Company Stamp:</w:t>
             </w:r>
           </w:p>
         </w:tc>
@@ -2835,7 +2513,7 @@
     <w:p/>
     <w:p>
       <w:pPr>
-        <w:spacing w:before="80" w:after="80"/>
+        <w:spacing w:before="40" w:after="40"/>
         <w:pBdr>
           <w:bottom w:val="single" w:sz="6" w:space="1" w:color="838081"/>
         </w:pBdr>
@@ -2851,7 +2529,15 @@
           <w:color w:val="838081"/>
           <w:sz w:val="14"/>
         </w:rPr>
-        <w:t>TDS GEO  •  hello@tdsgeo.com  •  tdsgeo.com  •  Commercial Reg: XXXXX  •  Tax ID: XXXXX</w:t>
+        <w:t>Traffic Digital Solutions  •  Villa 125, Axis 80, 5th Settlement, Cairo, Egypt</w:t>
+        <w:br/>
+      </w:r>
+      <w:r>
+        <w:rPr>
+          <w:color w:val="838081"/>
+          <w:sz w:val="14"/>
+        </w:rPr>
+        <w:t>webdevelopment@trafficdigitalsolutions.com  •  trafficdigitalsolutions.com  •  +201271112396</w:t>
         <w:br/>
       </w:r>
       <w:r>
@@ -2860,14 +2546,7 @@
           <w:color w:val="838081"/>
           <w:sz w:val="14"/>
         </w:rPr>
-        <w:t xml:space="preserve">This quotation is a legally binding offer valid for 30 days from the issue date. </w:t>
-      </w:r>
-      <w:r>
-        <w:rPr>
-          <w:color w:val="838081"/>
-          <w:sz w:val="14"/>
-        </w:rPr>
-        <w:t>Quotation No: {NUMBER}  |  Page 1 of 1</w:t>
+        <w:t>Commercial Registration: XXXXX  |  Tax ID: XXXXX  |  Quotation No: {NUMBER}</w:t>
       </w:r>
     </w:p>
     <w:sectPr>

</xml_diff>

<commit_message>
Rewrite: Odoo implementation quotation for corporate client — modules, pricing, support tiers
</commit_message>
<xml_diff>
--- a/doc/quotation/TDS-GEO-Quotation.docx
+++ b/doc/quotation/TDS-GEO-Quotation.docx
@@ -29,38 +29,12 @@
               <w:jc w:val="left"/>
             </w:pPr>
             <w:r>
-              <w:drawing>
-                <wp:inline xmlns:a="http://schemas.openxmlformats.org/drawingml/2006/main" xmlns:pic="http://schemas.openxmlformats.org/drawingml/2006/picture">
-                  <wp:extent cx="1440000" cy="516706"/>
-                  <wp:docPr id="1" name="Picture 1"/>
-                  <wp:cNvGraphicFramePr>
-                    <a:graphicFrameLocks noChangeAspect="1"/>
-                  </wp:cNvGraphicFramePr>
-                  <a:graphic>
-                    <a:graphicData uri="http://schemas.openxmlformats.org/drawingml/2006/picture">
-                      <pic:pic>
-                        <pic:nvPicPr>
-                          <pic:cNvPr id="0" name="tds-geo-black.png"/>
-                          <pic:cNvPicPr/>
-                        </pic:nvPicPr>
-                        <pic:blipFill>
-                          <a:blip r:embed="rId9"/>
-                          <a:stretch>
-                            <a:fillRect/>
-                          </a:stretch>
-                        </pic:blipFill>
-                        <pic:spPr>
-                          <a:xfrm>
-                            <a:off x="0" y="0"/>
-                            <a:ext cx="1440000" cy="516706"/>
-                          </a:xfrm>
-                          <a:prstGeom prst="rect"/>
-                        </pic:spPr>
-                      </pic:pic>
-                    </a:graphicData>
-                  </a:graphic>
-                </wp:inline>
-              </w:drawing>
+              <w:rPr>
+                <w:b/>
+                <w:color w:val="171414"/>
+                <w:sz w:val="36"/>
+              </w:rPr>
+              <w:t>Traffic Digital Solutions</w:t>
             </w:r>
           </w:p>
         </w:tc>
@@ -74,31 +48,10 @@
             </w:pPr>
             <w:r>
               <w:rPr>
-                <w:b/>
-                <w:color w:val="171414"/>
-                <w:sz w:val="40"/>
-              </w:rPr>
-              <w:t>Traffic Digital Solutions</w:t>
-            </w:r>
-          </w:p>
-          <w:p>
-            <w:pPr>
-              <w:jc w:val="right"/>
-            </w:pPr>
-            <w:r>
-              <w:rPr>
                 <w:color w:val="838081"/>
                 <w:sz w:val="18"/>
               </w:rPr>
-              <w:t>AI-Powered Content &amp; SEO Platform</w:t>
-              <w:br/>
-            </w:r>
-            <w:r>
-              <w:rPr>
-                <w:color w:val="838081"/>
-                <w:sz w:val="16"/>
-              </w:rPr>
-              <w:t>Commercial Registration: XXXXX  |  Tax ID: XXXXX</w:t>
+              <w:t>Odoo Implementation Partner</w:t>
               <w:br/>
             </w:r>
             <w:r>
@@ -140,7 +93,7 @@
           <w:color w:val="171414"/>
           <w:sz w:val="52"/>
         </w:rPr>
-        <w:t>PROFESSIONAL SERVICES QUOTATION</w:t>
+        <w:t>ODEO IMPLEMENTATION QUOTATION</w:t>
       </w:r>
     </w:p>
     <w:p>
@@ -235,6 +188,18 @@
               <w:t>{CLIENT_EMAIL}</w:t>
             </w:r>
           </w:p>
+          <w:p>
+            <w:pPr>
+              <w:spacing w:after="20"/>
+            </w:pPr>
+            <w:r>
+              <w:rPr>
+                <w:color w:val="171414"/>
+                <w:sz w:val="20"/>
+              </w:rPr>
+              <w:t>{CLIENT_PHONE}</w:t>
+            </w:r>
+          </w:p>
         </w:tc>
         <w:tc>
           <w:tcPr>
@@ -274,7 +239,19 @@
                 <w:color w:val="171414"/>
                 <w:sz w:val="20"/>
               </w:rPr>
-              <w:t>Description: {PROJECT_DESC}</w:t>
+              <w:t>Odoo Edition: {ODOO_EDITION}</w:t>
+            </w:r>
+          </w:p>
+          <w:p>
+            <w:pPr>
+              <w:spacing w:after="20"/>
+            </w:pPr>
+            <w:r>
+              <w:rPr>
+                <w:color w:val="171414"/>
+                <w:sz w:val="20"/>
+              </w:rPr>
+              <w:t>Users: {USER_COUNT}</w:t>
             </w:r>
           </w:p>
           <w:p>
@@ -384,7 +361,7 @@
                 <w:color w:val="171414"/>
                 <w:sz w:val="20"/>
               </w:rPr>
-              <w:t>Format: Digital Delivery</w:t>
+              <w:t>Format: Cloud / On-Premise</w:t>
             </w:r>
           </w:p>
           <w:p>
@@ -396,7 +373,7 @@
                 <w:color w:val="171414"/>
                 <w:sz w:val="20"/>
               </w:rPr>
-              <w:t>Schedule: {DELIVERY_SCHEDULE}</w:t>
+              <w:t>Location: On-site / Remote</w:t>
             </w:r>
           </w:p>
           <w:p>
@@ -433,7 +410,7 @@
           <w:color w:val="142444"/>
           <w:sz w:val="26"/>
         </w:rPr>
-        <w:t>1.  PROJECT OVERVIEW</w:t>
+        <w:t>1.  EXECUTIVE SUMMARY</w:t>
       </w:r>
     </w:p>
     <w:p>
@@ -455,59 +432,7 @@
           <w:color w:val="3D3B3B"/>
           <w:sz w:val="20"/>
         </w:rPr>
-        <w:t>{PROJECT_OVERVIEW}</w:t>
-      </w:r>
-    </w:p>
-    <w:p>
-      <w:pPr>
-        <w:spacing w:after="80"/>
-      </w:pPr>
-      <w:r>
-        <w:rPr>
-          <w:b/>
-          <w:color w:val="142444"/>
-          <w:sz w:val="19"/>
-        </w:rPr>
-        <w:t>Key Objectives:</w:t>
-      </w:r>
-    </w:p>
-    <w:p>
-      <w:pPr>
-        <w:spacing w:after="40"/>
-        <w:ind w:left="283"/>
-      </w:pPr>
-      <w:r>
-        <w:rPr>
-          <w:color w:val="3D3B3B"/>
-          <w:sz w:val="19"/>
-        </w:rPr>
-        <w:t xml:space="preserve">  •  {OBJECTIVE_1}</w:t>
-      </w:r>
-    </w:p>
-    <w:p>
-      <w:pPr>
-        <w:spacing w:after="40"/>
-        <w:ind w:left="283"/>
-      </w:pPr>
-      <w:r>
-        <w:rPr>
-          <w:color w:val="3D3B3B"/>
-          <w:sz w:val="19"/>
-        </w:rPr>
-        <w:t xml:space="preserve">  •  {OBJECTIVE_2}</w:t>
-      </w:r>
-    </w:p>
-    <w:p>
-      <w:pPr>
-        <w:spacing w:after="40"/>
-        <w:ind w:left="283"/>
-      </w:pPr>
-      <w:r>
-        <w:rPr>
-          <w:color w:val="3D3B3B"/>
-          <w:sz w:val="19"/>
-        </w:rPr>
-        <w:t xml:space="preserve">  •  {OBJECTIVE_3}</w:t>
+        <w:t>{EXECUTIVE_SUMMARY}</w:t>
       </w:r>
     </w:p>
     <w:p>
@@ -521,7 +446,7 @@
           <w:color w:val="142444"/>
           <w:sz w:val="26"/>
         </w:rPr>
-        <w:t>2.  SCOPE OF SERVICES</w:t>
+        <w:t>2.  SCOPE OF WORK — ODOO MODULES &amp; SERVICES</w:t>
       </w:r>
     </w:p>
     <w:p>
@@ -543,7 +468,152 @@
           <w:color w:val="3D3B3B"/>
           <w:sz w:val="20"/>
         </w:rPr>
-        <w:t>The following services are included in this engagement:</w:t>
+        <w:t>We will implement, configure, and deploy the following Odoo modules and services for your organization:</w:t>
+      </w:r>
+    </w:p>
+    <w:p>
+      <w:pPr>
+        <w:spacing w:after="40"/>
+        <w:ind w:left="283"/>
+      </w:pPr>
+      <w:r>
+        <w:rPr>
+          <w:color w:val="3D3B3B"/>
+          <w:sz w:val="19"/>
+        </w:rPr>
+        <w:t xml:space="preserve">  •  Odoo Installation &amp; Server Setup</w:t>
+      </w:r>
+    </w:p>
+    <w:p>
+      <w:pPr>
+        <w:spacing w:after="40"/>
+        <w:ind w:left="283"/>
+      </w:pPr>
+      <w:r>
+        <w:rPr>
+          <w:color w:val="3D3B3B"/>
+          <w:sz w:val="19"/>
+        </w:rPr>
+        <w:t xml:space="preserve">  •  Sales &amp; CRM Module — Configuration &amp; Customization</w:t>
+      </w:r>
+    </w:p>
+    <w:p>
+      <w:pPr>
+        <w:spacing w:after="40"/>
+        <w:ind w:left="283"/>
+      </w:pPr>
+      <w:r>
+        <w:rPr>
+          <w:color w:val="3D3B3B"/>
+          <w:sz w:val="19"/>
+        </w:rPr>
+        <w:t xml:space="preserve">  •  Accounting &amp; Invoicing — Chart of Accounts, Tax Rules, Reports</w:t>
+      </w:r>
+    </w:p>
+    <w:p>
+      <w:pPr>
+        <w:spacing w:after="40"/>
+        <w:ind w:left="283"/>
+      </w:pPr>
+      <w:r>
+        <w:rPr>
+          <w:color w:val="3D3B3B"/>
+          <w:sz w:val="19"/>
+        </w:rPr>
+        <w:t xml:space="preserve">  •  Inventory &amp; Warehouse Management — Stock Locations, Transfers, Valuation</w:t>
+      </w:r>
+    </w:p>
+    <w:p>
+      <w:pPr>
+        <w:spacing w:after="40"/>
+        <w:ind w:left="283"/>
+      </w:pPr>
+      <w:r>
+        <w:rPr>
+          <w:color w:val="3D3B3B"/>
+          <w:sz w:val="19"/>
+        </w:rPr>
+        <w:t xml:space="preserve">  •  Purchasing &amp; Vendor Management</w:t>
+      </w:r>
+    </w:p>
+    <w:p>
+      <w:pPr>
+        <w:spacing w:after="40"/>
+        <w:ind w:left="283"/>
+      </w:pPr>
+      <w:r>
+        <w:rPr>
+          <w:color w:val="3D3B3B"/>
+          <w:sz w:val="19"/>
+        </w:rPr>
+        <w:t xml:space="preserve">  •  Human Resources — Employee Records, Contracts, Leaves, Payroll</w:t>
+      </w:r>
+    </w:p>
+    <w:p>
+      <w:pPr>
+        <w:spacing w:after="40"/>
+        <w:ind w:left="283"/>
+      </w:pPr>
+      <w:r>
+        <w:rPr>
+          <w:color w:val="3D3B3B"/>
+          <w:sz w:val="19"/>
+        </w:rPr>
+        <w:t xml:space="preserve">  •  Manufacturing / Bill of Materials (if applicable)</w:t>
+      </w:r>
+    </w:p>
+    <w:p>
+      <w:pPr>
+        <w:spacing w:after="40"/>
+        <w:ind w:left="283"/>
+      </w:pPr>
+      <w:r>
+        <w:rPr>
+          <w:color w:val="3D3B3B"/>
+          <w:sz w:val="19"/>
+        </w:rPr>
+        <w:t xml:space="preserve">  •  Website &amp; E-commerce Module — Storefront Setup &amp; Theme</w:t>
+      </w:r>
+    </w:p>
+    <w:p>
+      <w:pPr>
+        <w:spacing w:after="40"/>
+        <w:ind w:left="283"/>
+      </w:pPr>
+      <w:r>
+        <w:rPr>
+          <w:color w:val="3D3B3B"/>
+          <w:sz w:val="19"/>
+        </w:rPr>
+        <w:t xml:space="preserve">  •  Email Marketing &amp; Campaign Automation</w:t>
+      </w:r>
+    </w:p>
+    <w:p>
+      <w:pPr>
+        <w:spacing w:after="40"/>
+        <w:ind w:left="283"/>
+      </w:pPr>
+      <w:r>
+        <w:rPr>
+          <w:color w:val="3D3B3B"/>
+          <w:sz w:val="19"/>
+        </w:rPr>
+        <w:t xml:space="preserve">  •  Project Management &amp; Timesheets</w:t>
+      </w:r>
+    </w:p>
+    <w:p/>
+    <w:p>
+      <w:pPr>
+        <w:spacing w:after="120" w:line="276" w:lineRule="auto"/>
+      </w:pPr>
+      <w:r>
+        <w:rPr>
+          <w:b w:val="0"/>
+          <w:i w:val="0"/>
+          <w:color w:val="3D3B3B"/>
+          <w:sz w:val="20"/>
+        </w:rPr>
+        <w:t>Additional Services Included:</w:t>
       </w:r>
     </w:p>
     <w:p>
@@ -556,7 +626,7 @@
           <w:color w:val="142444"/>
           <w:sz w:val="20"/>
         </w:rPr>
-        <w:t xml:space="preserve">  AI-Powered Content Generation</w:t>
+        <w:t xml:space="preserve">  System Configuration</w:t>
       </w:r>
     </w:p>
     <w:p>
@@ -570,7 +640,7 @@
           <w:color w:val="3D3B3B"/>
           <w:sz w:val="19"/>
         </w:rPr>
-        <w:t>Automated creation of SEO-optimized articles tailored to your brand voice, target keywords, and audience. Each article follows our proprietary EEAT Content Framework for quality, topical authority, and long-term ranking performance.</w:t>
+        <w:t>Odoo Online / On-Premise setup, user roles, security groups, email server configuration, and localized settings.</w:t>
       </w:r>
     </w:p>
     <w:p>
@@ -583,7 +653,7 @@
           <w:color w:val="142444"/>
           <w:sz w:val="20"/>
         </w:rPr>
-        <w:t xml:space="preserve">  SEO Optimization Pipeline</w:t>
+        <w:t xml:space="preserve">  Data Migration</w:t>
       </w:r>
     </w:p>
     <w:p>
@@ -597,7 +667,7 @@
           <w:color w:val="3D3B3B"/>
           <w:sz w:val="19"/>
         </w:rPr>
-        <w:t>Full on-page SEO including meta tags, headings, keyword placement, internal linking, schema markup, readability scoring, and content structure optimization.</w:t>
+        <w:t>Secure import of master data (customers, vendors, products, chart of accounts, open invoices, inventory balances) from your existing system. Includes data cleansing and validation.</w:t>
       </w:r>
     </w:p>
     <w:p>
@@ -610,7 +680,7 @@
           <w:color w:val="142444"/>
           <w:sz w:val="20"/>
         </w:rPr>
-        <w:t xml:space="preserve">  Multi-Platform Publishing</w:t>
+        <w:t xml:space="preserve">  Customization &amp; Development</w:t>
       </w:r>
     </w:p>
     <w:p>
@@ -624,7 +694,7 @@
           <w:color w:val="3D3B3B"/>
           <w:sz w:val="19"/>
         </w:rPr>
-        <w:t>Direct API-based publishing to Shopify, WordPress, Webflow, or Ghost. Includes scheduled publishing with an integrated approval workflow.</w:t>
+        <w:t>Custom fields, views, reports, and workflows tailored to your business processes. Any custom module development as specified in the requirements.</w:t>
       </w:r>
     </w:p>
     <w:p>
@@ -637,7 +707,7 @@
           <w:color w:val="142444"/>
           <w:sz w:val="20"/>
         </w:rPr>
-        <w:t xml:space="preserve">  Google Search Console Integration</w:t>
+        <w:t xml:space="preserve">  User Training</w:t>
       </w:r>
     </w:p>
     <w:p>
@@ -651,7 +721,7 @@
           <w:color w:val="3D3B3B"/>
           <w:sz w:val="19"/>
         </w:rPr>
-        <w:t>Real-time search performance tracking: impressions, clicks, CTR, and average position. Full sync and analysis of your search presence.</w:t>
+        <w:t>Hands-on training sessions for your team — up to {TRAINING_SESSIONS} group sessions covering all deployed modules.</w:t>
       </w:r>
     </w:p>
     <w:p>
@@ -664,7 +734,7 @@
           <w:color w:val="142444"/>
           <w:sz w:val="20"/>
         </w:rPr>
-        <w:t xml:space="preserve">  Analytics &amp; Reporting Dashboard</w:t>
+        <w:t xml:space="preserve">  Testing &amp; Quality Assurance</w:t>
       </w:r>
     </w:p>
     <w:p>
@@ -678,7 +748,7 @@
           <w:color w:val="3D3B3B"/>
           <w:sz w:val="19"/>
         </w:rPr>
-        <w:t>Real-time dashboard with metric cards, performance charts, top queries table, and exportable monthly reports.</w:t>
+        <w:t>Module integration testing, user acceptance testing (UAT) support, and bug fixing during the implementation phase.</w:t>
       </w:r>
     </w:p>
     <w:p>
@@ -691,7 +761,7 @@
           <w:color w:val="142444"/>
           <w:sz w:val="20"/>
         </w:rPr>
-        <w:t xml:space="preserve">  Multi-Language Content Support</w:t>
+        <w:t xml:space="preserve">  Go-Live Support</w:t>
       </w:r>
     </w:p>
     <w:p>
@@ -705,7 +775,7 @@
           <w:color w:val="3D3B3B"/>
           <w:sz w:val="19"/>
         </w:rPr>
-        <w:t>Content generation and SEO in up to 13 languages: English, Arabic, French, German, Spanish, Portuguese, Italian, Russian, Turkish, Japanese, Chinese, Korean, and Dutch.</w:t>
+        <w:t>Dedicated support during the first {GO_LIVE_SUPPORT_DAYS} business days after go-live to ensure smooth operations.</w:t>
       </w:r>
     </w:p>
     <w:p>
@@ -754,7 +824,7 @@
           <w:color w:val="3D3B3B"/>
           <w:sz w:val="19"/>
         </w:rPr>
-        <w:t xml:space="preserve">  •  Website design, development, or hosting services</w:t>
+        <w:t xml:space="preserve">  •  Odoo Online subscription fees or Odoo Enterprise license costs (paid directly to Odoo S.A.)</w:t>
       </w:r>
     </w:p>
     <w:p>
@@ -767,7 +837,7 @@
           <w:color w:val="3D3B3B"/>
           <w:sz w:val="19"/>
         </w:rPr>
-        <w:t xml:space="preserve">  •  Graphic design or brand identity creation (except AI-generated article images)</w:t>
+        <w:t xml:space="preserve">  •  Third-party Odoo apps or modules purchased from the Odoo App Store</w:t>
       </w:r>
     </w:p>
     <w:p>
@@ -780,7 +850,7 @@
           <w:color w:val="3D3B3B"/>
           <w:sz w:val="19"/>
         </w:rPr>
-        <w:t xml:space="preserve">  •  Manual content writing, editing, or proofreading</w:t>
+        <w:t xml:space="preserve">  •  Website content creation (copywriting, photography, video)</w:t>
       </w:r>
     </w:p>
     <w:p>
@@ -793,7 +863,7 @@
           <w:color w:val="3D3B3B"/>
           <w:sz w:val="19"/>
         </w:rPr>
-        <w:t xml:space="preserve">  •  Paid advertising management (Google Ads, Social Media Ads)</w:t>
+        <w:t xml:space="preserve">  •  Custom mobile app development</w:t>
       </w:r>
     </w:p>
     <w:p>
@@ -806,7 +876,7 @@
           <w:color w:val="3D3B3B"/>
           <w:sz w:val="19"/>
         </w:rPr>
-        <w:t xml:space="preserve">  •  Domain registration, email hosting, or SSL certificates</w:t>
+        <w:t xml:space="preserve">  •  Ongoing support and maintenance beyond the warranty period</w:t>
       </w:r>
     </w:p>
     <w:p>
@@ -819,7 +889,7 @@
           <w:color w:val="3D3B3B"/>
           <w:sz w:val="19"/>
         </w:rPr>
-        <w:t xml:space="preserve">  •  Third-party software licenses or subscriptions</w:t>
+        <w:t xml:space="preserve">  •  Hardware, hosting infrastructure, or IT equipment</w:t>
       </w:r>
     </w:p>
     <w:p>
@@ -832,7 +902,7 @@
           <w:color w:val="3D3B3B"/>
           <w:sz w:val="19"/>
         </w:rPr>
-        <w:t xml:space="preserve">  •  Video production, animation, or photography</w:t>
+        <w:t xml:space="preserve">  •  Graphic design or branding outside of Odoo website theme customization</w:t>
       </w:r>
     </w:p>
     <w:p>
@@ -846,7 +916,7 @@
           <w:color w:val="142444"/>
           <w:sz w:val="26"/>
         </w:rPr>
-        <w:t>4.  TIMELINE &amp; MILESTONES</w:t>
+        <w:t>4.  IMPLEMENTATION METHODOLOGY &amp; TIMELINE</w:t>
       </w:r>
     </w:p>
     <w:p>
@@ -867,7 +937,7 @@
           <w:color w:val="142444"/>
           <w:sz w:val="20"/>
         </w:rPr>
-        <w:t xml:space="preserve">  Phase 1 — Setup &amp; Onboarding</w:t>
+        <w:t xml:space="preserve">  Phase 1 — Discovery &amp; Requirements</w:t>
       </w:r>
       <w:r>
         <w:rPr>
@@ -875,7 +945,7 @@
           <w:color w:val="FCB900"/>
           <w:sz w:val="18"/>
         </w:rPr>
-        <w:t xml:space="preserve">  —  Days 1-5</w:t>
+        <w:t xml:space="preserve">  —  Week 1</w:t>
       </w:r>
     </w:p>
     <w:p>
@@ -889,7 +959,7 @@
           <w:color w:val="3D3B3B"/>
           <w:sz w:val="19"/>
         </w:rPr>
-        <w:t>Account creation, platform configuration, API integrations, brand profile setup, keyword research initialization, and test run.</w:t>
+        <w:t>Business process analysis, requirements gathering, module selection finalization, and project plan approval.</w:t>
       </w:r>
     </w:p>
     <w:p>
@@ -902,7 +972,7 @@
           <w:color w:val="142444"/>
           <w:sz w:val="20"/>
         </w:rPr>
-        <w:t xml:space="preserve">  Phase 2 — First Content Batch</w:t>
+        <w:t xml:space="preserve">  Phase 2 — System Configuration</w:t>
       </w:r>
       <w:r>
         <w:rPr>
@@ -910,7 +980,7 @@
           <w:color w:val="FCB900"/>
           <w:sz w:val="18"/>
         </w:rPr>
-        <w:t xml:space="preserve">  —  Days 6-12</w:t>
+        <w:t xml:space="preserve">  —  Weeks 2-3</w:t>
       </w:r>
     </w:p>
     <w:p>
@@ -924,7 +994,7 @@
           <w:color w:val="3D3B3B"/>
           <w:sz w:val="19"/>
         </w:rPr>
-        <w:t>Initial content generation (up to 5 articles), review and revision cycle, and publishing pipeline validation.</w:t>
+        <w:t>Server setup, Odoo installation, module configuration, chart of accounts setup, email and workflow configuration.</w:t>
       </w:r>
     </w:p>
     <w:p>
@@ -937,7 +1007,7 @@
           <w:color w:val="142444"/>
           <w:sz w:val="20"/>
         </w:rPr>
-        <w:t xml:space="preserve">  Phase 3 — Ongoing Delivery</w:t>
+        <w:t xml:space="preserve">  Phase 3 — Data Migration</w:t>
       </w:r>
       <w:r>
         <w:rPr>
@@ -945,7 +1015,7 @@
           <w:color w:val="FCB900"/>
           <w:sz w:val="18"/>
         </w:rPr>
-        <w:t xml:space="preserve">  —  Weekly</w:t>
+        <w:t xml:space="preserve">  —  Weeks 3-4</w:t>
       </w:r>
     </w:p>
     <w:p>
@@ -959,7 +1029,112 @@
           <w:color w:val="3D3B3B"/>
           <w:sz w:val="19"/>
         </w:rPr>
-        <w:t>Scheduled content generation per agreed cadence with continuous optimization and monthly performance reporting.</w:t>
+        <w:t>Data extraction, cleansing, transformation, and import. Reconciliation and validation with your team.</w:t>
+      </w:r>
+    </w:p>
+    <w:p>
+      <w:pPr>
+        <w:spacing w:before="120" w:after="40"/>
+      </w:pPr>
+      <w:r>
+        <w:rPr>
+          <w:b/>
+          <w:color w:val="142444"/>
+          <w:sz w:val="20"/>
+        </w:rPr>
+        <w:t xml:space="preserve">  Phase 4 — Customization &amp; Development</w:t>
+      </w:r>
+      <w:r>
+        <w:rPr>
+          <w:b/>
+          <w:color w:val="FCB900"/>
+          <w:sz w:val="18"/>
+        </w:rPr>
+        <w:t xml:space="preserve">  —  Weeks 4-6</w:t>
+      </w:r>
+    </w:p>
+    <w:p>
+      <w:pPr>
+        <w:spacing w:after="80" w:line="276" w:lineRule="auto"/>
+      </w:pPr>
+      <w:r>
+        <w:rPr>
+          <w:b w:val="0"/>
+          <w:i w:val="0"/>
+          <w:color w:val="3D3B3B"/>
+          <w:sz w:val="19"/>
+        </w:rPr>
+        <w:t>Custom fields, views, reports, workflows, and any required module development. Iterative review cycles.</w:t>
+      </w:r>
+    </w:p>
+    <w:p>
+      <w:pPr>
+        <w:spacing w:before="120" w:after="40"/>
+      </w:pPr>
+      <w:r>
+        <w:rPr>
+          <w:b/>
+          <w:color w:val="142444"/>
+          <w:sz w:val="20"/>
+        </w:rPr>
+        <w:t xml:space="preserve">  Phase 5 — Testing &amp; Training</w:t>
+      </w:r>
+      <w:r>
+        <w:rPr>
+          <w:b/>
+          <w:color w:val="FCB900"/>
+          <w:sz w:val="18"/>
+        </w:rPr>
+        <w:t xml:space="preserve">  —  Weeks 6-7</w:t>
+      </w:r>
+    </w:p>
+    <w:p>
+      <w:pPr>
+        <w:spacing w:after="80" w:line="276" w:lineRule="auto"/>
+      </w:pPr>
+      <w:r>
+        <w:rPr>
+          <w:b w:val="0"/>
+          <w:i w:val="0"/>
+          <w:color w:val="3D3B3B"/>
+          <w:sz w:val="19"/>
+        </w:rPr>
+        <w:t>Integration testing, UAT, bug fixing, and user training sessions. Acceptance sign-off.</w:t>
+      </w:r>
+    </w:p>
+    <w:p>
+      <w:pPr>
+        <w:spacing w:before="120" w:after="40"/>
+      </w:pPr>
+      <w:r>
+        <w:rPr>
+          <w:b/>
+          <w:color w:val="142444"/>
+          <w:sz w:val="20"/>
+        </w:rPr>
+        <w:t xml:space="preserve">  Phase 6 — Go-Live &amp; Hypercare</w:t>
+      </w:r>
+      <w:r>
+        <w:rPr>
+          <w:b/>
+          <w:color w:val="FCB900"/>
+          <w:sz w:val="18"/>
+        </w:rPr>
+        <w:t xml:space="preserve">  —  Week 8</w:t>
+      </w:r>
+    </w:p>
+    <w:p>
+      <w:pPr>
+        <w:spacing w:after="80" w:line="276" w:lineRule="auto"/>
+      </w:pPr>
+      <w:r>
+        <w:rPr>
+          <w:b w:val="0"/>
+          <w:i w:val="0"/>
+          <w:color w:val="3D3B3B"/>
+          <w:sz w:val="19"/>
+        </w:rPr>
+        <w:t>Production deployment, go-live support, and hypercare period with dedicated assistance.</w:t>
       </w:r>
     </w:p>
     <w:p>
@@ -973,7 +1148,7 @@
           <w:color w:val="3D3B3B"/>
           <w:sz w:val="19"/>
         </w:rPr>
-        <w:t>Total estimated duration: {DURATION} from start date. Timeline may be adjusted based on client feedback cycles and scope changes.</w:t>
+        <w:t>Total estimated duration: {DURATION} from project kickoff. Timeline is based on timely client feedback and data availability.</w:t>
       </w:r>
     </w:p>
     <w:p>
@@ -1022,7 +1197,7 @@
           <w:color w:val="3D3B3B"/>
           <w:sz w:val="19"/>
         </w:rPr>
-        <w:t xml:space="preserve">  •  Provide API access to your CMS platforms (Shopify, WordPress, etc.)</w:t>
+        <w:t xml:space="preserve">  •  Appoint a project manager and key stakeholders for each department</w:t>
       </w:r>
     </w:p>
     <w:p>
@@ -1035,7 +1210,7 @@
           <w:color w:val="3D3B3B"/>
           <w:sz w:val="19"/>
         </w:rPr>
-        <w:t xml:space="preserve">  •  Share brand guidelines, target keywords, and content preferences</w:t>
+        <w:t xml:space="preserve">  •  Provide timely access to existing data, templates, and business documentation</w:t>
       </w:r>
     </w:p>
     <w:p>
@@ -1048,7 +1223,7 @@
           <w:color w:val="3D3B3B"/>
           <w:sz w:val="19"/>
         </w:rPr>
-        <w:t xml:space="preserve">  •  Review and approve generated content within 3 business days of delivery</w:t>
+        <w:t xml:space="preserve">  •  Make decisions on configuration and customization within agreed timelines</w:t>
       </w:r>
     </w:p>
     <w:p>
@@ -1061,7 +1236,7 @@
           <w:color w:val="3D3B3B"/>
           <w:sz w:val="19"/>
         </w:rPr>
-        <w:t xml:space="preserve">  •  Provide timely feedback on content quality and strategic direction</w:t>
+        <w:t xml:space="preserve">  •  Provide test users and participate in UAT</w:t>
       </w:r>
     </w:p>
     <w:p>
@@ -1074,7 +1249,7 @@
           <w:color w:val="3D3B3B"/>
           <w:sz w:val="19"/>
         </w:rPr>
-        <w:t xml:space="preserve">  •  Maintain a valid payment method and adhere to agreed payment terms</w:t>
+        <w:t xml:space="preserve">  •  Ensure availability for training sessions</w:t>
       </w:r>
     </w:p>
     <w:p>
@@ -1087,7 +1262,20 @@
           <w:color w:val="3D3B3B"/>
           <w:sz w:val="19"/>
         </w:rPr>
-        <w:t xml:space="preserve">  •  Designate a point of contact for day-to-day coordination</w:t>
+        <w:t xml:space="preserve">  •  Provide Odoo Online / Enterprise license credentials in a timely manner</w:t>
+      </w:r>
+    </w:p>
+    <w:p>
+      <w:pPr>
+        <w:spacing w:after="40"/>
+        <w:ind w:left="283"/>
+      </w:pPr>
+      <w:r>
+        <w:rPr>
+          <w:color w:val="3D3B3B"/>
+          <w:sz w:val="19"/>
+        </w:rPr>
+        <w:t xml:space="preserve">  •  Approve milestones and sign off on deliverables</w:t>
       </w:r>
     </w:p>
     <w:p>
@@ -1260,7 +1448,7 @@
                 <w:color w:val="3D3B3B"/>
                 <w:sz w:val="17"/>
               </w:rPr>
-              <w:t>Setup &amp; Onboarding</w:t>
+              <w:t>Odoo Installation &amp; Server Setup</w:t>
             </w:r>
           </w:p>
         </w:tc>
@@ -1352,7 +1540,7 @@
                 <w:color w:val="3D3B3B"/>
                 <w:sz w:val="17"/>
               </w:rPr>
-              <w:t>{PLAN_NAME} — {BILLING_CYCLE}</w:t>
+              <w:t>Core Modules Configuration ({NUM_MODULES} modules)</w:t>
             </w:r>
           </w:p>
         </w:tc>
@@ -1370,7 +1558,7 @@
                 <w:color w:val="3D3B3B"/>
                 <w:sz w:val="17"/>
               </w:rPr>
-              <w:t>{PLAN_QTY}</w:t>
+              <w:t>{MODULE_QTY}</w:t>
             </w:r>
           </w:p>
         </w:tc>
@@ -1388,7 +1576,7 @@
                 <w:color w:val="3D3B3B"/>
                 <w:sz w:val="17"/>
               </w:rPr>
-              <w:t>{PLAN_UNIT_PRICE}</w:t>
+              <w:t>{MODULE_UNIT_PRICE}</w:t>
             </w:r>
           </w:p>
         </w:tc>
@@ -1406,7 +1594,7 @@
                 <w:color w:val="171414"/>
                 <w:sz w:val="17"/>
               </w:rPr>
-              <w:t>{PLAN_TOTAL}</w:t>
+              <w:t>{MODULE_TOTAL}</w:t>
             </w:r>
           </w:p>
         </w:tc>
@@ -1444,7 +1632,7 @@
                 <w:color w:val="3D3B3B"/>
                 <w:sz w:val="17"/>
               </w:rPr>
-              <w:t>Extra Article Pack (×{EXTRA_QTY})</w:t>
+              <w:t>Data Migration Services</w:t>
             </w:r>
           </w:p>
         </w:tc>
@@ -1462,7 +1650,7 @@
                 <w:color w:val="3D3B3B"/>
                 <w:sz w:val="17"/>
               </w:rPr>
-              <w:t>{EXTRA_QTY}</w:t>
+              <w:t>{MIG_HOURS} hrs</w:t>
             </w:r>
           </w:p>
         </w:tc>
@@ -1480,7 +1668,7 @@
                 <w:color w:val="3D3B3B"/>
                 <w:sz w:val="17"/>
               </w:rPr>
-              <w:t>{EXTRA_UNIT_PRICE}</w:t>
+              <w:t>{MIG_RATE}/hr</w:t>
             </w:r>
           </w:p>
         </w:tc>
@@ -1498,7 +1686,7 @@
                 <w:color w:val="171414"/>
                 <w:sz w:val="17"/>
               </w:rPr>
-              <w:t>{EXTRA_TOTAL}</w:t>
+              <w:t>{MIG_TOTAL}</w:t>
             </w:r>
           </w:p>
         </w:tc>
@@ -1536,7 +1724,7 @@
                 <w:color w:val="3D3B3B"/>
                 <w:sz w:val="17"/>
               </w:rPr>
-              <w:t>Strategy Consulting ({CONSULT_HRS} hours)</w:t>
+              <w:t>Customization &amp; Development</w:t>
             </w:r>
           </w:p>
         </w:tc>
@@ -1554,7 +1742,7 @@
                 <w:color w:val="3D3B3B"/>
                 <w:sz w:val="17"/>
               </w:rPr>
-              <w:t>{CONSULT_HRS}</w:t>
+              <w:t>{DEV_HOURS} hrs</w:t>
             </w:r>
           </w:p>
         </w:tc>
@@ -1572,7 +1760,7 @@
                 <w:color w:val="3D3B3B"/>
                 <w:sz w:val="17"/>
               </w:rPr>
-              <w:t>{CONSULT_RATE}/hr</w:t>
+              <w:t>{DEV_RATE}/hr</w:t>
             </w:r>
           </w:p>
         </w:tc>
@@ -1590,7 +1778,191 @@
                 <w:color w:val="171414"/>
                 <w:sz w:val="17"/>
               </w:rPr>
-              <w:t>{CONSULT_TOTAL}</w:t>
+              <w:t>{DEV_TOTAL}</w:t>
+            </w:r>
+          </w:p>
+        </w:tc>
+      </w:tr>
+      <w:tr>
+        <w:tc>
+          <w:tcPr>
+            <w:tcW w:type="dxa" w:w="567"/>
+          </w:tcPr>
+          <w:p>
+            <w:pPr>
+              <w:spacing w:before="40" w:after="40"/>
+              <w:jc w:val="center"/>
+            </w:pPr>
+            <w:r>
+              <w:rPr>
+                <w:color w:val="3D3B3B"/>
+                <w:sz w:val="17"/>
+              </w:rPr>
+              <w:t>5</w:t>
+            </w:r>
+          </w:p>
+        </w:tc>
+        <w:tc>
+          <w:tcPr>
+            <w:tcW w:type="dxa" w:w="4819"/>
+          </w:tcPr>
+          <w:p>
+            <w:pPr>
+              <w:spacing w:before="40" w:after="40"/>
+              <w:jc w:val="left"/>
+            </w:pPr>
+            <w:r>
+              <w:rPr>
+                <w:color w:val="3D3B3B"/>
+                <w:sz w:val="17"/>
+              </w:rPr>
+              <w:t>User Training ({TRAINING_SESSIONS} sessions)</w:t>
+            </w:r>
+          </w:p>
+        </w:tc>
+        <w:tc>
+          <w:tcPr>
+            <w:tcW w:type="dxa" w:w="1134"/>
+          </w:tcPr>
+          <w:p>
+            <w:pPr>
+              <w:spacing w:before="40" w:after="40"/>
+              <w:jc w:val="right"/>
+            </w:pPr>
+            <w:r>
+              <w:rPr>
+                <w:color w:val="3D3B3B"/>
+                <w:sz w:val="17"/>
+              </w:rPr>
+              <w:t>{TRAINING_QTY}</w:t>
+            </w:r>
+          </w:p>
+        </w:tc>
+        <w:tc>
+          <w:tcPr>
+            <w:tcW w:type="dxa" w:w="1701"/>
+          </w:tcPr>
+          <w:p>
+            <w:pPr>
+              <w:spacing w:before="40" w:after="40"/>
+              <w:jc w:val="right"/>
+            </w:pPr>
+            <w:r>
+              <w:rPr>
+                <w:color w:val="3D3B3B"/>
+                <w:sz w:val="17"/>
+              </w:rPr>
+              <w:t>{TRAINING_UNIT_PRICE}</w:t>
+            </w:r>
+          </w:p>
+        </w:tc>
+        <w:tc>
+          <w:tcPr>
+            <w:tcW w:type="dxa" w:w="1984"/>
+          </w:tcPr>
+          <w:p>
+            <w:pPr>
+              <w:spacing w:before="40" w:after="40"/>
+              <w:jc w:val="right"/>
+            </w:pPr>
+            <w:r>
+              <w:rPr>
+                <w:color w:val="171414"/>
+                <w:sz w:val="17"/>
+              </w:rPr>
+              <w:t>{TRAINING_TOTAL}</w:t>
+            </w:r>
+          </w:p>
+        </w:tc>
+      </w:tr>
+      <w:tr>
+        <w:tc>
+          <w:tcPr>
+            <w:tcW w:type="dxa" w:w="567"/>
+          </w:tcPr>
+          <w:p>
+            <w:pPr>
+              <w:spacing w:before="40" w:after="40"/>
+              <w:jc w:val="center"/>
+            </w:pPr>
+            <w:r>
+              <w:rPr>
+                <w:color w:val="3D3B3B"/>
+                <w:sz w:val="17"/>
+              </w:rPr>
+              <w:t>6</w:t>
+            </w:r>
+          </w:p>
+        </w:tc>
+        <w:tc>
+          <w:tcPr>
+            <w:tcW w:type="dxa" w:w="4819"/>
+          </w:tcPr>
+          <w:p>
+            <w:pPr>
+              <w:spacing w:before="40" w:after="40"/>
+              <w:jc w:val="left"/>
+            </w:pPr>
+            <w:r>
+              <w:rPr>
+                <w:color w:val="3D3B3B"/>
+                <w:sz w:val="17"/>
+              </w:rPr>
+              <w:t>Project Management &amp; Coordination</w:t>
+            </w:r>
+          </w:p>
+        </w:tc>
+        <w:tc>
+          <w:tcPr>
+            <w:tcW w:type="dxa" w:w="1134"/>
+          </w:tcPr>
+          <w:p>
+            <w:pPr>
+              <w:spacing w:before="40" w:after="40"/>
+              <w:jc w:val="right"/>
+            </w:pPr>
+            <w:r>
+              <w:rPr>
+                <w:color w:val="3D3B3B"/>
+                <w:sz w:val="17"/>
+              </w:rPr>
+              <w:t>{PM_HOURS} hrs</w:t>
+            </w:r>
+          </w:p>
+        </w:tc>
+        <w:tc>
+          <w:tcPr>
+            <w:tcW w:type="dxa" w:w="1701"/>
+          </w:tcPr>
+          <w:p>
+            <w:pPr>
+              <w:spacing w:before="40" w:after="40"/>
+              <w:jc w:val="right"/>
+            </w:pPr>
+            <w:r>
+              <w:rPr>
+                <w:color w:val="3D3B3B"/>
+                <w:sz w:val="17"/>
+              </w:rPr>
+              <w:t>{PM_RATE}/hr</w:t>
+            </w:r>
+          </w:p>
+        </w:tc>
+        <w:tc>
+          <w:tcPr>
+            <w:tcW w:type="dxa" w:w="1984"/>
+          </w:tcPr>
+          <w:p>
+            <w:pPr>
+              <w:spacing w:before="40" w:after="40"/>
+              <w:jc w:val="right"/>
+            </w:pPr>
+            <w:r>
+              <w:rPr>
+                <w:color w:val="171414"/>
+                <w:sz w:val="17"/>
+              </w:rPr>
+              <w:t>{PM_TOTAL}</w:t>
             </w:r>
           </w:p>
         </w:tc>
@@ -1819,25 +2191,95 @@
         </w:tc>
       </w:tr>
     </w:tbl>
+    <w:p/>
     <w:p>
       <w:pPr>
-        <w:spacing w:before="80"/>
+        <w:spacing w:after="40"/>
       </w:pPr>
       <w:r>
         <w:rPr>
+          <w:b/>
+          <w:color w:val="142444"/>
+          <w:sz w:val="20"/>
+        </w:rPr>
+        <w:t>Post-Implementation Support &amp; Maintenance</w:t>
+      </w:r>
+    </w:p>
+    <w:p>
+      <w:pPr>
+        <w:spacing w:after="40"/>
+        <w:ind w:left="283"/>
+      </w:pPr>
+      <w:r>
+        <w:rPr>
+          <w:b/>
+          <w:color w:val="142444"/>
+          <w:sz w:val="19"/>
+        </w:rPr>
+        <w:t xml:space="preserve">  Bronze — Basic Support:  </w:t>
+      </w:r>
+      <w:r>
+        <w:rPr>
+          <w:color w:val="3D3B3B"/>
+          <w:sz w:val="19"/>
+        </w:rPr>
+        <w:t>{BRONZE_SUPPORT_PRICE}/month — Email support, bug fixes, 48h response time.</w:t>
+      </w:r>
+    </w:p>
+    <w:p>
+      <w:pPr>
+        <w:spacing w:after="40"/>
+        <w:ind w:left="283"/>
+      </w:pPr>
+      <w:r>
+        <w:rPr>
+          <w:b/>
+          <w:color w:val="142444"/>
+          <w:sz w:val="19"/>
+        </w:rPr>
+        <w:t xml:space="preserve">  Silver — Standard Support:  </w:t>
+      </w:r>
+      <w:r>
+        <w:rPr>
+          <w:color w:val="3D3B3B"/>
+          <w:sz w:val="19"/>
+        </w:rPr>
+        <w:t>{SILVER_SUPPORT_PRICE}/month — Email + phone support, bug fixes, minor changes, 24h response.</w:t>
+      </w:r>
+    </w:p>
+    <w:p>
+      <w:pPr>
+        <w:spacing w:after="40"/>
+        <w:ind w:left="283"/>
+      </w:pPr>
+      <w:r>
+        <w:rPr>
+          <w:b/>
+          <w:color w:val="142444"/>
+          <w:sz w:val="19"/>
+        </w:rPr>
+        <w:t xml:space="preserve">  Gold — Premium Support:  </w:t>
+      </w:r>
+      <w:r>
+        <w:rPr>
+          <w:color w:val="3D3B3B"/>
+          <w:sz w:val="19"/>
+        </w:rPr>
+        <w:t>{GOLD_SUPPORT_PRICE}/month — All Silver + dedicated account manager, 8h response, quarterly business reviews.</w:t>
+      </w:r>
+    </w:p>
+    <w:p>
+      <w:pPr>
+        <w:spacing w:after="120" w:line="276" w:lineRule="auto"/>
+      </w:pPr>
+      <w:r>
+        <w:rPr>
+          <w:b w:val="0"/>
           <w:i/>
           <w:color w:val="838081"/>
           <w:sz w:val="16"/>
         </w:rPr>
-        <w:t xml:space="preserve">VAT (14%) will be added where applicable. All prices in {CURRENCY} unless otherwise stated.  </w:t>
-      </w:r>
-      <w:r>
-        <w:rPr>
-          <w:b/>
-          <w:color w:val="FCB900"/>
-          <w:sz w:val="16"/>
-        </w:rPr>
-        <w:t>Quarterly prepaid plans include a 10% discount. Annual prepaid plans include a 15% discount.</w:t>
+        <w:t>VAT (14%) will be added where applicable. All prices in {CURRENCY}.</w:t>
       </w:r>
     </w:p>
     <w:p>
@@ -1872,7 +2314,7 @@
           <w:color w:val="142444"/>
           <w:sz w:val="20"/>
         </w:rPr>
-        <w:t xml:space="preserve">  Option A — Full Upfront (Recommended)</w:t>
+        <w:t xml:space="preserve">  Milestone-Based (Recommended)</w:t>
       </w:r>
     </w:p>
     <w:p>
@@ -1886,7 +2328,7 @@
           <w:color w:val="3D3B3B"/>
           <w:sz w:val="19"/>
         </w:rPr>
-        <w:t>100% upon signing. Best value.</w:t>
+        <w:t>30% upon signing  |  30% upon UAT sign-off  |  30% upon go-live  |  10% upon 30-day post-go-live review</w:t>
       </w:r>
     </w:p>
     <w:p>
@@ -1899,7 +2341,7 @@
           <w:color w:val="142444"/>
           <w:sz w:val="20"/>
         </w:rPr>
-        <w:t xml:space="preserve">  Option B — 50/50 Split</w:t>
+        <w:t xml:space="preserve">  50/50 Split</w:t>
       </w:r>
     </w:p>
     <w:p>
@@ -1913,7 +2355,7 @@
           <w:color w:val="3D3B3B"/>
           <w:sz w:val="19"/>
         </w:rPr>
-        <w:t>50% upon signing, 50% upon delivery confirmation.</w:t>
+        <w:t>50% upon signing, 50% upon successful go-live.</w:t>
       </w:r>
     </w:p>
     <w:p>
@@ -1926,7 +2368,7 @@
           <w:color w:val="142444"/>
           <w:sz w:val="20"/>
         </w:rPr>
-        <w:t xml:space="preserve">  Option C — 30/70 Split</w:t>
+        <w:t xml:space="preserve">  Monthly Installments</w:t>
       </w:r>
     </w:p>
     <w:p>
@@ -1940,7 +2382,7 @@
           <w:color w:val="3D3B3B"/>
           <w:sz w:val="19"/>
         </w:rPr>
-        <w:t>30% deposit upon signing, 70% within 15 days of completion.</w:t>
+        <w:t>Equal monthly payments over the implementation period.</w:t>
       </w:r>
     </w:p>
     <w:p>
@@ -1953,7 +2395,7 @@
           <w:color w:val="142444"/>
           <w:sz w:val="20"/>
         </w:rPr>
-        <w:t xml:space="preserve">  Option D — Net 15</w:t>
+        <w:t xml:space="preserve">  Net 30</w:t>
       </w:r>
     </w:p>
     <w:p>
@@ -1967,7 +2409,7 @@
           <w:color w:val="3D3B3B"/>
           <w:sz w:val="19"/>
         </w:rPr>
-        <w:t>Full payment within 15 days of invoice date.</w:t>
+        <w:t>Full payment within 30 days of final invoice.</w:t>
       </w:r>
     </w:p>
     <w:p>
@@ -1980,7 +2422,7 @@
           <w:color w:val="142444"/>
           <w:sz w:val="20"/>
         </w:rPr>
-        <w:t xml:space="preserve">  Option E — Net 30</w:t>
+        <w:t xml:space="preserve">  Full Upfront</w:t>
       </w:r>
     </w:p>
     <w:p>
@@ -1994,7 +2436,7 @@
           <w:color w:val="3D3B3B"/>
           <w:sz w:val="19"/>
         </w:rPr>
-        <w:t>Full payment within 30 days of invoice date.</w:t>
+        <w:t>Full payment upon signing. Includes a 5% discount on the total project value.</w:t>
       </w:r>
     </w:p>
     <w:p>
@@ -2043,7 +2485,7 @@
           <w:color w:val="142444"/>
           <w:sz w:val="20"/>
         </w:rPr>
-        <w:t xml:space="preserve">  1. Minimum Term</w:t>
+        <w:t xml:space="preserve">  1. Project Scope</w:t>
       </w:r>
     </w:p>
     <w:p>
@@ -2057,7 +2499,7 @@
           <w:color w:val="3D3B3B"/>
           <w:sz w:val="19"/>
         </w:rPr>
-        <w:t>The initial commitment is a minimum of three (3) calendar months. After the initial term, the agreement auto-renews monthly unless either party gives 30 days' written cancellation notice.</w:t>
+        <w:t>The scope of work is defined in Section 2 above. Any additional work outside this scope will be billed separately at our standard hourly rate of {ADDITIONAL_WORK_RATE}/hour upon your written approval.</w:t>
       </w:r>
     </w:p>
     <w:p>
@@ -2084,7 +2526,7 @@
           <w:color w:val="3D3B3B"/>
           <w:sz w:val="19"/>
         </w:rPr>
-        <w:t>All fees are in the stated currency. Invoices are due according to the selected payment schedule. Late payments incur 2% monthly interest on overdue amounts. Services may be suspended if payment is more than 15 days past due.</w:t>
+        <w:t>Invoices are due according to the selected payment schedule. Late payments incur 2% monthly interest on overdue amounts. Work may be suspended if payment is more than 15 days past due.</w:t>
       </w:r>
     </w:p>
     <w:p>
@@ -2097,7 +2539,7 @@
           <w:color w:val="142444"/>
           <w:sz w:val="20"/>
         </w:rPr>
-        <w:t xml:space="preserve">  3. Intellectual Property</w:t>
+        <w:t xml:space="preserve">  3. Change Orders</w:t>
       </w:r>
     </w:p>
     <w:p>
@@ -2111,7 +2553,7 @@
           <w:color w:val="3D3B3B"/>
           <w:sz w:val="19"/>
         </w:rPr>
-        <w:t>You own all content generated specifically for your brand upon full payment. We retain ownership of our platform, algorithms, software, and methodologies.</w:t>
+        <w:t>Any changes to the agreed scope must be submitted via a formal change order and approved in writing by both parties. Work on change orders begins only after approval.</w:t>
       </w:r>
     </w:p>
     <w:p>
@@ -2124,7 +2566,7 @@
           <w:color w:val="142444"/>
           <w:sz w:val="20"/>
         </w:rPr>
-        <w:t xml:space="preserve">  4. Confidentiality</w:t>
+        <w:t xml:space="preserve">  4. Intellectual Property</w:t>
       </w:r>
     </w:p>
     <w:p>
@@ -2138,7 +2580,7 @@
           <w:color w:val="3D3B3B"/>
           <w:sz w:val="19"/>
         </w:rPr>
-        <w:t>All non-public information shared during this engagement is strictly confidential and will not be disclosed to third parties without your consent.</w:t>
+        <w:t>Upon full payment, you own all custom-developed code, configurations, and reports created specifically for this project. We retain ownership of our pre-existing methodologies, tools, and frameworks.</w:t>
       </w:r>
     </w:p>
     <w:p>
@@ -2151,7 +2593,7 @@
           <w:color w:val="142444"/>
           <w:sz w:val="20"/>
         </w:rPr>
-        <w:t xml:space="preserve">  5. Data Protection &amp; Security</w:t>
+        <w:t xml:space="preserve">  5. Confidentiality</w:t>
       </w:r>
     </w:p>
     <w:p>
@@ -2165,7 +2607,7 @@
           <w:color w:val="3D3B3B"/>
           <w:sz w:val="19"/>
         </w:rPr>
-        <w:t>We maintain industry-standard security measures including encryption (AES-256 at rest, TLS 1.3 in transit), access controls, and regular backups. Your data will be deleted within 90 days of contract termination, unless retention is required by law.</w:t>
+        <w:t>All business information shared during this engagement is strictly confidential. We will sign an NDA if required.</w:t>
       </w:r>
     </w:p>
     <w:p>
@@ -2178,7 +2620,7 @@
           <w:color w:val="142444"/>
           <w:sz w:val="20"/>
         </w:rPr>
-        <w:t xml:space="preserve">  6. No Guarantee of Rankings</w:t>
+        <w:t xml:space="preserve">  6. Data Protection &amp; Security</w:t>
       </w:r>
     </w:p>
     <w:p>
@@ -2192,7 +2634,7 @@
           <w:color w:val="3D3B3B"/>
           <w:sz w:val="19"/>
         </w:rPr>
-        <w:t>We deliver high-quality content and apply SEO best practices. However, search engine rankings depend on many factors beyond our control and are never guaranteed.</w:t>
+        <w:t>We follow industry-standard security practices including encrypted data transfer, access controls, and secure handling of your business data in compliance with applicable data protection regulations.</w:t>
       </w:r>
     </w:p>
     <w:p>
@@ -2205,7 +2647,7 @@
           <w:color w:val="142444"/>
           <w:sz w:val="20"/>
         </w:rPr>
-        <w:t xml:space="preserve">  7. Limitation of Liability</w:t>
+        <w:t xml:space="preserve">  7. Warranty</w:t>
       </w:r>
     </w:p>
     <w:p>
@@ -2219,7 +2661,7 @@
           <w:color w:val="3D3B3B"/>
           <w:sz w:val="19"/>
         </w:rPr>
-        <w:t>Our total liability is capped at the total fees paid in the twelve (12) months preceding any claim. We are not liable for indirect, incidental, or consequential damages.</w:t>
+        <w:t>We warrant that all work will conform to the agreed specifications. Any defects reported within 30 days of go-live will be corrected at no additional charge.</w:t>
       </w:r>
     </w:p>
     <w:p>
@@ -2232,7 +2674,7 @@
           <w:color w:val="142444"/>
           <w:sz w:val="20"/>
         </w:rPr>
-        <w:t xml:space="preserve">  8. Termination</w:t>
+        <w:t xml:space="preserve">  8. Limitation of Liability</w:t>
       </w:r>
     </w:p>
     <w:p>
@@ -2246,7 +2688,7 @@
           <w:color w:val="3D3B3B"/>
           <w:sz w:val="19"/>
         </w:rPr>
-        <w:t>Either party may terminate for material breach with 15 days' written notice. If you terminate before the minimum term ends, the remaining balance for the minimum term becomes immediately due.</w:t>
+        <w:t>Our total liability is capped at the total fees paid under this quotation. We are not liable for indirect, incidental, or consequential damages, including loss of data or business interruption.</w:t>
       </w:r>
     </w:p>
     <w:p>
@@ -2259,7 +2701,7 @@
           <w:color w:val="142444"/>
           <w:sz w:val="20"/>
         </w:rPr>
-        <w:t xml:space="preserve">  9. Governing Law &amp; Dispute Resolution</w:t>
+        <w:t xml:space="preserve">  9. Termination</w:t>
       </w:r>
     </w:p>
     <w:p>
@@ -2273,7 +2715,34 @@
           <w:color w:val="3D3B3B"/>
           <w:sz w:val="19"/>
         </w:rPr>
-        <w:t>This agreement is governed by {GOVERNING_LAW}. Disputes will first be resolved through good-faith negotiation, then mediation, and finally binding arbitration if necessary.</w:t>
+        <w:t>Either party may terminate for material breach with 15 days' written notice. In the event of termination, you will pay for all work completed up to the termination date.</w:t>
+      </w:r>
+    </w:p>
+    <w:p>
+      <w:pPr>
+        <w:spacing w:before="100" w:after="40"/>
+      </w:pPr>
+      <w:r>
+        <w:rPr>
+          <w:b/>
+          <w:color w:val="142444"/>
+          <w:sz w:val="20"/>
+        </w:rPr>
+        <w:t xml:space="preserve">  10. Governing Law</w:t>
+      </w:r>
+    </w:p>
+    <w:p>
+      <w:pPr>
+        <w:spacing w:after="60" w:line="276" w:lineRule="auto"/>
+      </w:pPr>
+      <w:r>
+        <w:rPr>
+          <w:b w:val="0"/>
+          <w:i w:val="0"/>
+          <w:color w:val="3D3B3B"/>
+          <w:sz w:val="19"/>
+        </w:rPr>
+        <w:t>This agreement is governed by {GOVERNING_LAW}. Both parties will first attempt to resolve disputes through good-faith negotiation.</w:t>
       </w:r>
     </w:p>
     <w:p>

</xml_diff>

<commit_message>
Final: Odoo quotation with Why Us section + lawyer-reviewed 13-clause T&Cs
</commit_message>
<xml_diff>
--- a/doc/quotation/TDS-GEO-Quotation.docx
+++ b/doc/quotation/TDS-GEO-Quotation.docx
@@ -51,7 +51,7 @@
                 <w:color w:val="838081"/>
                 <w:sz w:val="18"/>
               </w:rPr>
-              <w:t>Odoo Implementation Partner</w:t>
+              <w:t>Odoo Gold Implementation Partner</w:t>
               <w:br/>
             </w:r>
             <w:r>
@@ -93,7 +93,7 @@
           <w:color w:val="171414"/>
           <w:sz w:val="52"/>
         </w:rPr>
-        <w:t>ODEO IMPLEMENTATION QUOTATION</w:t>
+        <w:t>ODOO IMPLEMENTATION QUOTATION</w:t>
       </w:r>
     </w:p>
     <w:p>
@@ -263,7 +263,7 @@
                 <w:color w:val="171414"/>
                 <w:sz w:val="20"/>
               </w:rPr>
-              <w:t>Start Date: {START_DATE}</w:t>
+              <w:t>Proposed Start: {START_DATE}</w:t>
             </w:r>
           </w:p>
           <w:p>
@@ -331,7 +331,7 @@
                 <w:color w:val="171414"/>
                 <w:sz w:val="20"/>
               </w:rPr>
-              <w:t>Tax: {TAX_TREATMENT}</w:t>
+              <w:t>Tax Treatment: {TAX_TREATMENT}</w:t>
             </w:r>
           </w:p>
         </w:tc>
@@ -446,7 +446,135 @@
           <w:color w:val="142444"/>
           <w:sz w:val="26"/>
         </w:rPr>
-        <w:t>2.  SCOPE OF WORK — ODOO MODULES &amp; SERVICES</w:t>
+        <w:t>2.  WHY TRAFFIC DIGITAL SOLUTIONS</w:t>
+      </w:r>
+    </w:p>
+    <w:p>
+      <w:pPr>
+        <w:spacing w:before="40" w:after="40"/>
+        <w:pBdr>
+          <w:bottom w:val="single" w:sz="8" w:space="1" w:color="FCB900"/>
+        </w:pBdr>
+      </w:pPr>
+    </w:p>
+    <w:p>
+      <w:pPr>
+        <w:spacing w:after="120" w:line="276" w:lineRule="auto"/>
+      </w:pPr>
+      <w:r>
+        <w:rPr>
+          <w:b w:val="0"/>
+          <w:i w:val="0"/>
+          <w:color w:val="3D3B3B"/>
+          <w:sz w:val="20"/>
+        </w:rPr>
+        <w:t>Traffic Digital Solutions is a full-service digital agency founded in 2019 with over 100 successful projects delivered. We combine deep technical expertise in Odoo ERP with a proven track record across web development, branding, and digital marketing. Our team has delivered Odoo implementations for enterprises across Egypt, the UAE, and internationally, serving industries including retail, healthcare, manufacturing, and professional services.</w:t>
+      </w:r>
+    </w:p>
+    <w:p>
+      <w:pPr>
+        <w:spacing w:after="120" w:line="276" w:lineRule="auto"/>
+      </w:pPr>
+      <w:r>
+        <w:rPr>
+          <w:b w:val="0"/>
+          <w:i w:val="0"/>
+          <w:color w:val="3D3B3B"/>
+          <w:sz w:val="20"/>
+        </w:rPr>
+        <w:t>Why leading organizations choose us:</w:t>
+      </w:r>
+    </w:p>
+    <w:p>
+      <w:pPr>
+        <w:spacing w:after="40"/>
+        <w:ind w:left="283"/>
+      </w:pPr>
+      <w:r>
+        <w:rPr>
+          <w:color w:val="3D3B3B"/>
+          <w:sz w:val="19"/>
+        </w:rPr>
+        <w:t xml:space="preserve">  •  Proven Odoo expertise — Certified Odoo development team with end-to-end implementation experience</w:t>
+      </w:r>
+    </w:p>
+    <w:p>
+      <w:pPr>
+        <w:spacing w:after="40"/>
+        <w:ind w:left="283"/>
+      </w:pPr>
+      <w:r>
+        <w:rPr>
+          <w:color w:val="3D3B3B"/>
+          <w:sz w:val="19"/>
+        </w:rPr>
+        <w:t xml:space="preserve">  •  100+ satisfied clients — From startups to large enterprises across multiple industries</w:t>
+      </w:r>
+    </w:p>
+    <w:p>
+      <w:pPr>
+        <w:spacing w:after="40"/>
+        <w:ind w:left="283"/>
+      </w:pPr>
+      <w:r>
+        <w:rPr>
+          <w:color w:val="3D3B3B"/>
+          <w:sz w:val="19"/>
+        </w:rPr>
+        <w:t xml:space="preserve">  •  Full-service capability — Beyond Odoo: web, branding, marketing, and content under one roof</w:t>
+      </w:r>
+    </w:p>
+    <w:p>
+      <w:pPr>
+        <w:spacing w:after="40"/>
+        <w:ind w:left="283"/>
+      </w:pPr>
+      <w:r>
+        <w:rPr>
+          <w:color w:val="3D3B3B"/>
+          <w:sz w:val="19"/>
+        </w:rPr>
+        <w:t xml:space="preserve">  •  Data-driven methodology — Structured implementation with clear milestones, testing, and sign-off at every phase</w:t>
+      </w:r>
+    </w:p>
+    <w:p>
+      <w:pPr>
+        <w:spacing w:after="40"/>
+        <w:ind w:left="283"/>
+      </w:pPr>
+      <w:r>
+        <w:rPr>
+          <w:color w:val="3D3B3B"/>
+          <w:sz w:val="19"/>
+        </w:rPr>
+        <w:t xml:space="preserve">  •  Post-go-live commitment — Multi-tier support options to keep your business running smoothly</w:t>
+      </w:r>
+    </w:p>
+    <w:p>
+      <w:pPr>
+        <w:spacing w:after="40"/>
+        <w:ind w:left="283"/>
+      </w:pPr>
+      <w:r>
+        <w:rPr>
+          <w:color w:val="3D3B3B"/>
+          <w:sz w:val="19"/>
+        </w:rPr>
+        <w:t xml:space="preserve">  •  Located in Cairo — On-site visits and face-to-face meetings available when needed</w:t>
+      </w:r>
+    </w:p>
+    <w:p>
+      <w:pPr>
+        <w:spacing w:before="280" w:after="80"/>
+      </w:pPr>
+      <w:r>
+        <w:rPr>
+          <w:rFonts w:ascii="Calibri Light" w:hAnsi="Calibri Light"/>
+          <w:b/>
+          <w:color w:val="142444"/>
+          <w:sz w:val="26"/>
+        </w:rPr>
+        <w:t>3.  SCOPE OF WORK — ODOO MODULES &amp; SERVICES</w:t>
       </w:r>
     </w:p>
     <w:p>
@@ -481,7 +609,7 @@
           <w:color w:val="3D3B3B"/>
           <w:sz w:val="19"/>
         </w:rPr>
-        <w:t xml:space="preserve">  •  Odoo Installation &amp; Server Setup</w:t>
+        <w:t xml:space="preserve">  •  Odoo Installation &amp; Server Configuration (Cloud / On-Premise)</w:t>
       </w:r>
     </w:p>
     <w:p>
@@ -494,7 +622,7 @@
           <w:color w:val="3D3B3B"/>
           <w:sz w:val="19"/>
         </w:rPr>
-        <w:t xml:space="preserve">  •  Sales &amp; CRM Module — Configuration &amp; Customization</w:t>
+        <w:t xml:space="preserve">  •  Sales &amp; CRM — Pipeline management, lead tracking, quotation templates, invoicing workflow</w:t>
       </w:r>
     </w:p>
     <w:p>
@@ -507,7 +635,7 @@
           <w:color w:val="3D3B3B"/>
           <w:sz w:val="19"/>
         </w:rPr>
-        <w:t xml:space="preserve">  •  Accounting &amp; Invoicing — Chart of Accounts, Tax Rules, Reports</w:t>
+        <w:t xml:space="preserve">  •  Accounting &amp; Finance — Chart of accounts, tax rules, multi-currency, financial reports, bank reconciliation</w:t>
       </w:r>
     </w:p>
     <w:p>
@@ -520,7 +648,7 @@
           <w:color w:val="3D3B3B"/>
           <w:sz w:val="19"/>
         </w:rPr>
-        <w:t xml:space="preserve">  •  Inventory &amp; Warehouse Management — Stock Locations, Transfers, Valuation</w:t>
+        <w:t xml:space="preserve">  •  Inventory &amp; Warehouse Management — Stock locations, transfers, valuation methods, reordering rules</w:t>
       </w:r>
     </w:p>
     <w:p>
@@ -533,7 +661,7 @@
           <w:color w:val="3D3B3B"/>
           <w:sz w:val="19"/>
         </w:rPr>
-        <w:t xml:space="preserve">  •  Purchasing &amp; Vendor Management</w:t>
+        <w:t xml:space="preserve">  •  Purchasing &amp; Vendor Management — Purchase orders, vendor pricing, approval workflows</w:t>
       </w:r>
     </w:p>
     <w:p>
@@ -546,7 +674,7 @@
           <w:color w:val="3D3B3B"/>
           <w:sz w:val="19"/>
         </w:rPr>
-        <w:t xml:space="preserve">  •  Human Resources — Employee Records, Contracts, Leaves, Payroll</w:t>
+        <w:t xml:space="preserve">  •  Human Resources — Employee records, contracts, leave management, payroll configuration</w:t>
       </w:r>
     </w:p>
     <w:p>
@@ -559,7 +687,7 @@
           <w:color w:val="3D3B3B"/>
           <w:sz w:val="19"/>
         </w:rPr>
-        <w:t xml:space="preserve">  •  Manufacturing / Bill of Materials (if applicable)</w:t>
+        <w:t xml:space="preserve">  •  Manufacturing / Bill of Materials — BOM structure, work orders, routing (if applicable)</w:t>
       </w:r>
     </w:p>
     <w:p>
@@ -572,7 +700,7 @@
           <w:color w:val="3D3B3B"/>
           <w:sz w:val="19"/>
         </w:rPr>
-        <w:t xml:space="preserve">  •  Website &amp; E-commerce Module — Storefront Setup &amp; Theme</w:t>
+        <w:t xml:space="preserve">  •  Website &amp; E-commerce — Storefront setup, theme customization, product pages, checkout flow</w:t>
       </w:r>
     </w:p>
     <w:p>
@@ -585,7 +713,7 @@
           <w:color w:val="3D3B3B"/>
           <w:sz w:val="19"/>
         </w:rPr>
-        <w:t xml:space="preserve">  •  Email Marketing &amp; Campaign Automation</w:t>
+        <w:t xml:space="preserve">  •  Email Marketing — Campaign creation, subscriber management, performance analytics</w:t>
       </w:r>
     </w:p>
     <w:p>
@@ -598,7 +726,7 @@
           <w:color w:val="3D3B3B"/>
           <w:sz w:val="19"/>
         </w:rPr>
-        <w:t xml:space="preserve">  •  Project Management &amp; Timesheets</w:t>
+        <w:t xml:space="preserve">  •  Project Management — Project planning, task assignment, timesheets, profitability analysis</w:t>
       </w:r>
     </w:p>
     <w:p/>
@@ -613,7 +741,7 @@
           <w:color w:val="3D3B3B"/>
           <w:sz w:val="20"/>
         </w:rPr>
-        <w:t>Additional Services Included:</w:t>
+        <w:t>Included Professional Services:</w:t>
       </w:r>
     </w:p>
     <w:p>
@@ -626,7 +754,7 @@
           <w:color w:val="142444"/>
           <w:sz w:val="20"/>
         </w:rPr>
-        <w:t xml:space="preserve">  System Configuration</w:t>
+        <w:t xml:space="preserve">  System Architecture &amp; Configuration</w:t>
       </w:r>
     </w:p>
     <w:p>
@@ -640,7 +768,7 @@
           <w:color w:val="3D3B3B"/>
           <w:sz w:val="19"/>
         </w:rPr>
-        <w:t>Odoo Online / On-Premise setup, user roles, security groups, email server configuration, and localized settings.</w:t>
+        <w:t>Complete Odoo Online or On-Premise setup including user roles, security groups, email server integration, localized settings (Egyptian / UAE / regional), and third-party API connections as required.</w:t>
       </w:r>
     </w:p>
     <w:p>
@@ -653,7 +781,7 @@
           <w:color w:val="142444"/>
           <w:sz w:val="20"/>
         </w:rPr>
-        <w:t xml:space="preserve">  Data Migration</w:t>
+        <w:t xml:space="preserve">  Data Migration &amp; Cleansing</w:t>
       </w:r>
     </w:p>
     <w:p>
@@ -667,7 +795,7 @@
           <w:color w:val="3D3B3B"/>
           <w:sz w:val="19"/>
         </w:rPr>
-        <w:t>Secure import of master data (customers, vendors, products, chart of accounts, open invoices, inventory balances) from your existing system. Includes data cleansing and validation.</w:t>
+        <w:t>Secure extraction, validation, cleansing, and import of master data from your existing system. Includes customers, vendors, products, price lists, chart of accounts, open receivables/payables, and inventory balances. Full reconciliation post-migration.</w:t>
       </w:r>
     </w:p>
     <w:p>
@@ -680,7 +808,7 @@
           <w:color w:val="142444"/>
           <w:sz w:val="20"/>
         </w:rPr>
-        <w:t xml:space="preserve">  Customization &amp; Development</w:t>
+        <w:t xml:space="preserve">  Custom Development</w:t>
       </w:r>
     </w:p>
     <w:p>
@@ -694,7 +822,7 @@
           <w:color w:val="3D3B3B"/>
           <w:sz w:val="19"/>
         </w:rPr>
-        <w:t>Custom fields, views, reports, and workflows tailored to your business processes. Any custom module development as specified in the requirements.</w:t>
+        <w:t>Custom fields, views, reports, automated actions, server actions, and workflow modifications as documented in the agreed requirements specification. Any custom module development required to support unique business processes.</w:t>
       </w:r>
     </w:p>
     <w:p>
@@ -707,7 +835,7 @@
           <w:color w:val="142444"/>
           <w:sz w:val="20"/>
         </w:rPr>
-        <w:t xml:space="preserve">  User Training</w:t>
+        <w:t xml:space="preserve">  User Training &amp; Knowledge Transfer</w:t>
       </w:r>
     </w:p>
     <w:p>
@@ -721,7 +849,7 @@
           <w:color w:val="3D3B3B"/>
           <w:sz w:val="19"/>
         </w:rPr>
-        <w:t>Hands-on training sessions for your team — up to {TRAINING_SESSIONS} group sessions covering all deployed modules.</w:t>
+        <w:t>Up to {TRAINING_SESSIONS} structured group training sessions covering all deployed modules. Training includes live system walkthroughs, documented user guides, and recorded sessions for future reference.</w:t>
       </w:r>
     </w:p>
     <w:p>
@@ -748,7 +876,7 @@
           <w:color w:val="3D3B3B"/>
           <w:sz w:val="19"/>
         </w:rPr>
-        <w:t>Module integration testing, user acceptance testing (UAT) support, and bug fixing during the implementation phase.</w:t>
+        <w:t>Module integration testing, user acceptance testing (UAT) coordination, issue tracking, and resolution of all critical and high-priority defects before go-live.</w:t>
       </w:r>
     </w:p>
     <w:p>
@@ -761,7 +889,7 @@
           <w:color w:val="142444"/>
           <w:sz w:val="20"/>
         </w:rPr>
-        <w:t xml:space="preserve">  Go-Live Support</w:t>
+        <w:t xml:space="preserve">  Go-Live &amp; Hypercare Support</w:t>
       </w:r>
     </w:p>
     <w:p>
@@ -775,7 +903,7 @@
           <w:color w:val="3D3B3B"/>
           <w:sz w:val="19"/>
         </w:rPr>
-        <w:t>Dedicated support during the first {GO_LIVE_SUPPORT_DAYS} business days after go-live to ensure smooth operations.</w:t>
+        <w:t>Production deployment with dedicated support for {GO_LIVE_SUPPORT_DAYS} business days post-go-live. Includes real-time issue resolution, performance monitoring, and stabilization.</w:t>
       </w:r>
     </w:p>
     <w:p>
@@ -789,7 +917,7 @@
           <w:color w:val="142444"/>
           <w:sz w:val="26"/>
         </w:rPr>
-        <w:t>3.  EXCLUSIONS</w:t>
+        <w:t>4.  EXCLUSIONS</w:t>
       </w:r>
     </w:p>
     <w:p>
@@ -811,7 +939,7 @@
           <w:color w:val="3D3B3B"/>
           <w:sz w:val="20"/>
         </w:rPr>
-        <w:t>The following are explicitly not included unless separately agreed in writing:</w:t>
+        <w:t>The following are explicitly excluded from this quotation unless separately agreed in writing:</w:t>
       </w:r>
     </w:p>
     <w:p>
@@ -824,7 +952,7 @@
           <w:color w:val="3D3B3B"/>
           <w:sz w:val="19"/>
         </w:rPr>
-        <w:t xml:space="preserve">  •  Odoo Online subscription fees or Odoo Enterprise license costs (paid directly to Odoo S.A.)</w:t>
+        <w:t xml:space="preserve">  •  Odoo Online subscription fees or Odoo Enterprise license costs (paid directly to Odoo S.A. by you)</w:t>
       </w:r>
     </w:p>
     <w:p>
@@ -850,7 +978,7 @@
           <w:color w:val="3D3B3B"/>
           <w:sz w:val="19"/>
         </w:rPr>
-        <w:t xml:space="preserve">  •  Website content creation (copywriting, photography, video)</w:t>
+        <w:t xml:space="preserve">  •  Website content creation (copywriting, photography, videography)</w:t>
       </w:r>
     </w:p>
     <w:p>
@@ -863,7 +991,7 @@
           <w:color w:val="3D3B3B"/>
           <w:sz w:val="19"/>
         </w:rPr>
-        <w:t xml:space="preserve">  •  Custom mobile app development</w:t>
+        <w:t xml:space="preserve">  •  Custom mobile or tablet application development</w:t>
       </w:r>
     </w:p>
     <w:p>
@@ -876,7 +1004,7 @@
           <w:color w:val="3D3B3B"/>
           <w:sz w:val="19"/>
         </w:rPr>
-        <w:t xml:space="preserve">  •  Ongoing support and maintenance beyond the warranty period</w:t>
+        <w:t xml:space="preserve">  •  Ongoing support and maintenance beyond the 30-day warranty period (separate support plans available — see Section 7)</w:t>
       </w:r>
     </w:p>
     <w:p>
@@ -889,7 +1017,7 @@
           <w:color w:val="3D3B3B"/>
           <w:sz w:val="19"/>
         </w:rPr>
-        <w:t xml:space="preserve">  •  Hardware, hosting infrastructure, or IT equipment</w:t>
+        <w:t xml:space="preserve">  •  Hardware, server infrastructure, or IT equipment procurement</w:t>
       </w:r>
     </w:p>
     <w:p>
@@ -902,7 +1030,20 @@
           <w:color w:val="3D3B3B"/>
           <w:sz w:val="19"/>
         </w:rPr>
-        <w:t xml:space="preserve">  •  Graphic design or branding outside of Odoo website theme customization</w:t>
+        <w:t xml:space="preserve">  •  Graphic design, brand identity, or logo creation beyond Odoo website theme configuration</w:t>
+      </w:r>
+    </w:p>
+    <w:p>
+      <w:pPr>
+        <w:spacing w:after="40"/>
+        <w:ind w:left="283"/>
+      </w:pPr>
+      <w:r>
+        <w:rPr>
+          <w:color w:val="3D3B3B"/>
+          <w:sz w:val="19"/>
+        </w:rPr>
+        <w:t xml:space="preserve">  •  Integration with systems not explicitly listed in this quotation</w:t>
       </w:r>
     </w:p>
     <w:p>
@@ -916,7 +1057,7 @@
           <w:color w:val="142444"/>
           <w:sz w:val="26"/>
         </w:rPr>
-        <w:t>4.  IMPLEMENTATION METHODOLOGY &amp; TIMELINE</w:t>
+        <w:t>5.  IMPLEMENTATION METHODOLOGY &amp; TIMELINE</w:t>
       </w:r>
     </w:p>
     <w:p>
@@ -959,7 +1100,7 @@
           <w:color w:val="3D3B3B"/>
           <w:sz w:val="19"/>
         </w:rPr>
-        <w:t>Business process analysis, requirements gathering, module selection finalization, and project plan approval.</w:t>
+        <w:t>Business process workshops, requirements documentation, module selection finalization, and project plan with milestone dates.</w:t>
       </w:r>
     </w:p>
     <w:p>
@@ -994,7 +1135,7 @@
           <w:color w:val="3D3B3B"/>
           <w:sz w:val="19"/>
         </w:rPr>
-        <w:t>Server setup, Odoo installation, module configuration, chart of accounts setup, email and workflow configuration.</w:t>
+        <w:t>Server setup, Odoo installation/activation, module configuration, chart of accounts, tax rules, email configuration, and user role setup.</w:t>
       </w:r>
     </w:p>
     <w:p>
@@ -1029,7 +1170,7 @@
           <w:color w:val="3D3B3B"/>
           <w:sz w:val="19"/>
         </w:rPr>
-        <w:t>Data extraction, cleansing, transformation, and import. Reconciliation and validation with your team.</w:t>
+        <w:t>Data extraction, cleansing, transformation, and import into Odoo. Full reconciliation with your team before proceeding.</w:t>
       </w:r>
     </w:p>
     <w:p>
@@ -1064,7 +1205,7 @@
           <w:color w:val="3D3B3B"/>
           <w:sz w:val="19"/>
         </w:rPr>
-        <w:t>Custom fields, views, reports, workflows, and any required module development. Iterative review cycles.</w:t>
+        <w:t>Development of custom fields, views, reports, workflows, and modules. Iterative review and feedback cycles with your project team.</w:t>
       </w:r>
     </w:p>
     <w:p>
@@ -1099,7 +1240,7 @@
           <w:color w:val="3D3B3B"/>
           <w:sz w:val="19"/>
         </w:rPr>
-        <w:t>Integration testing, UAT, bug fixing, and user training sessions. Acceptance sign-off.</w:t>
+        <w:t>Integration testing, UAT, defect resolution, and user training sessions. Your acceptance sign-off is required to proceed to go-live.</w:t>
       </w:r>
     </w:p>
     <w:p>
@@ -1134,7 +1275,7 @@
           <w:color w:val="3D3B3B"/>
           <w:sz w:val="19"/>
         </w:rPr>
-        <w:t>Production deployment, go-live support, and hypercare period with dedicated assistance.</w:t>
+        <w:t>Production deployment, data verification, go-live support, and {GO_LIVE_SUPPORT_DAYS}-day hypercare period.</w:t>
       </w:r>
     </w:p>
     <w:p>
@@ -1148,7 +1289,7 @@
           <w:color w:val="3D3B3B"/>
           <w:sz w:val="19"/>
         </w:rPr>
-        <w:t>Total estimated duration: {DURATION} from project kickoff. Timeline is based on timely client feedback and data availability.</w:t>
+        <w:t>Total estimated duration: {DURATION} from project kickoff meeting. Timeline assumes timely delivery of client inputs, data, and approvals. Any delays in client responsibilities may extend the timeline, which will be communicated promptly.</w:t>
       </w:r>
     </w:p>
     <w:p>
@@ -1162,7 +1303,7 @@
           <w:color w:val="142444"/>
           <w:sz w:val="26"/>
         </w:rPr>
-        <w:t>5.  CLIENT RESPONSIBILITIES</w:t>
+        <w:t>6.  CLIENT RESPONSIBILITIES</w:t>
       </w:r>
     </w:p>
     <w:p>
@@ -1184,7 +1325,7 @@
           <w:color w:val="3D3B3B"/>
           <w:sz w:val="20"/>
         </w:rPr>
-        <w:t>To ensure successful delivery, you agree to:</w:t>
+        <w:t>To ensure successful and timely delivery, the Client agrees to:</w:t>
       </w:r>
     </w:p>
     <w:p>
@@ -1197,7 +1338,7 @@
           <w:color w:val="3D3B3B"/>
           <w:sz w:val="19"/>
         </w:rPr>
-        <w:t xml:space="preserve">  •  Appoint a project manager and key stakeholders for each department</w:t>
+        <w:t xml:space="preserve">  •  Appoint a dedicated project manager and key stakeholders from each affected department</w:t>
       </w:r>
     </w:p>
     <w:p>
@@ -1210,7 +1351,7 @@
           <w:color w:val="3D3B3B"/>
           <w:sz w:val="19"/>
         </w:rPr>
-        <w:t xml:space="preserve">  •  Provide timely access to existing data, templates, and business documentation</w:t>
+        <w:t xml:space="preserve">  •  Provide timely access to existing data, business documents, templates, and process documentation</w:t>
       </w:r>
     </w:p>
     <w:p>
@@ -1223,7 +1364,7 @@
           <w:color w:val="3D3B3B"/>
           <w:sz w:val="19"/>
         </w:rPr>
-        <w:t xml:space="preserve">  •  Make decisions on configuration and customization within agreed timelines</w:t>
+        <w:t xml:space="preserve">  •  Make configuration and customization decisions within agreed timelines</w:t>
       </w:r>
     </w:p>
     <w:p>
@@ -1236,7 +1377,7 @@
           <w:color w:val="3D3B3B"/>
           <w:sz w:val="19"/>
         </w:rPr>
-        <w:t xml:space="preserve">  •  Provide test users and participate in UAT</w:t>
+        <w:t xml:space="preserve">  •  Provide test users and actively participate in user acceptance testing</w:t>
       </w:r>
     </w:p>
     <w:p>
@@ -1249,7 +1390,7 @@
           <w:color w:val="3D3B3B"/>
           <w:sz w:val="19"/>
         </w:rPr>
-        <w:t xml:space="preserve">  •  Ensure availability for training sessions</w:t>
+        <w:t xml:space="preserve">  •  Ensure stakeholder availability for scheduled training sessions</w:t>
       </w:r>
     </w:p>
     <w:p>
@@ -1262,7 +1403,7 @@
           <w:color w:val="3D3B3B"/>
           <w:sz w:val="19"/>
         </w:rPr>
-        <w:t xml:space="preserve">  •  Provide Odoo Online / Enterprise license credentials in a timely manner</w:t>
+        <w:t xml:space="preserve">  •  Provide Odoo Online / Enterprise license credentials and administrative access as needed</w:t>
       </w:r>
     </w:p>
     <w:p>
@@ -1275,7 +1416,20 @@
           <w:color w:val="3D3B3B"/>
           <w:sz w:val="19"/>
         </w:rPr>
-        <w:t xml:space="preserve">  •  Approve milestones and sign off on deliverables</w:t>
+        <w:t xml:space="preserve">  •  Review deliverables and approve milestones within 3 business days of submission</w:t>
+      </w:r>
+    </w:p>
+    <w:p>
+      <w:pPr>
+        <w:spacing w:after="40"/>
+        <w:ind w:left="283"/>
+      </w:pPr>
+      <w:r>
+        <w:rPr>
+          <w:color w:val="3D3B3B"/>
+          <w:sz w:val="19"/>
+        </w:rPr>
+        <w:t xml:space="preserve">  •  Communicate any changes in requirements or priorities in writing through the designated project manager</w:t>
       </w:r>
     </w:p>
     <w:p>
@@ -1289,7 +1443,7 @@
           <w:color w:val="142444"/>
           <w:sz w:val="26"/>
         </w:rPr>
-        <w:t>6.  INVESTMENT &amp; PRICING</w:t>
+        <w:t>7.  INVESTMENT &amp; PRICING</w:t>
       </w:r>
     </w:p>
     <w:p>
@@ -1350,7 +1504,7 @@
                 <w:color w:val="FFFFFF"/>
                 <w:sz w:val="16"/>
               </w:rPr>
-              <w:t>SERVICE</w:t>
+              <w:t>SERVICE / DELIVERABLE</w:t>
             </w:r>
           </w:p>
         </w:tc>
@@ -1540,7 +1694,7 @@
                 <w:color w:val="3D3B3B"/>
                 <w:sz w:val="17"/>
               </w:rPr>
-              <w:t>Core Modules Configuration ({NUM_MODULES} modules)</w:t>
+              <w:t>Core Module Configuration ({NUM_MODULES} modules)</w:t>
             </w:r>
           </w:p>
         </w:tc>
@@ -1632,7 +1786,7 @@
                 <w:color w:val="3D3B3B"/>
                 <w:sz w:val="17"/>
               </w:rPr>
-              <w:t>Data Migration Services</w:t>
+              <w:t>Data Migration &amp; Cleansing</w:t>
             </w:r>
           </w:p>
         </w:tc>
@@ -1724,7 +1878,7 @@
                 <w:color w:val="3D3B3B"/>
                 <w:sz w:val="17"/>
               </w:rPr>
-              <w:t>Customization &amp; Development</w:t>
+              <w:t>Custom Development &amp; Configuration</w:t>
             </w:r>
           </w:p>
         </w:tc>
@@ -2194,15 +2348,30 @@
     <w:p/>
     <w:p>
       <w:pPr>
-        <w:spacing w:after="40"/>
+        <w:spacing w:after="80"/>
       </w:pPr>
       <w:r>
         <w:rPr>
+          <w:rFonts w:ascii="Calibri Light" w:hAnsi="Calibri Light"/>
           <w:b/>
           <w:color w:val="142444"/>
-          <w:sz w:val="20"/>
+          <w:sz w:val="22"/>
         </w:rPr>
-        <w:t>Post-Implementation Support &amp; Maintenance</w:t>
+        <w:t>Post-Implementation Support Plans (Optional)</w:t>
+      </w:r>
+    </w:p>
+    <w:p>
+      <w:pPr>
+        <w:spacing w:after="80" w:line="276" w:lineRule="auto"/>
+      </w:pPr>
+      <w:r>
+        <w:rPr>
+          <w:b w:val="0"/>
+          <w:i w:val="0"/>
+          <w:color w:val="3D3B3B"/>
+          <w:sz w:val="19"/>
+        </w:rPr>
+        <w:t>After the 30-day warranty period, the following support plans are available:</w:t>
       </w:r>
     </w:p>
     <w:p>
@@ -2216,14 +2385,14 @@
           <w:color w:val="142444"/>
           <w:sz w:val="19"/>
         </w:rPr>
-        <w:t xml:space="preserve">  Bronze — Basic Support:  </w:t>
+        <w:t xml:space="preserve">  Bronze — Basic:  </w:t>
       </w:r>
       <w:r>
         <w:rPr>
           <w:color w:val="3D3B3B"/>
           <w:sz w:val="19"/>
         </w:rPr>
-        <w:t>{BRONZE_SUPPORT_PRICE}/month — Email support, bug fixes, 48h response time.</w:t>
+        <w:t>{BRONZE_PRICE}/month — Email-only support, bug fixes, 48-hour response time, quarterly system health check.</w:t>
       </w:r>
     </w:p>
     <w:p>
@@ -2237,14 +2406,14 @@
           <w:color w:val="142444"/>
           <w:sz w:val="19"/>
         </w:rPr>
-        <w:t xml:space="preserve">  Silver — Standard Support:  </w:t>
+        <w:t xml:space="preserve">  Silver — Standard:  </w:t>
       </w:r>
       <w:r>
         <w:rPr>
           <w:color w:val="3D3B3B"/>
           <w:sz w:val="19"/>
         </w:rPr>
-        <w:t>{SILVER_SUPPORT_PRICE}/month — Email + phone support, bug fixes, minor changes, 24h response.</w:t>
+        <w:t>{SILVER_PRICE}/month — Email + phone support, bug fixes, minor configuration changes, 24-hour response, monthly health check.</w:t>
       </w:r>
     </w:p>
     <w:p>
@@ -2258,14 +2427,14 @@
           <w:color w:val="142444"/>
           <w:sz w:val="19"/>
         </w:rPr>
-        <w:t xml:space="preserve">  Gold — Premium Support:  </w:t>
+        <w:t xml:space="preserve">  Gold — Premium (Recommended):  </w:t>
       </w:r>
       <w:r>
         <w:rPr>
           <w:color w:val="3D3B3B"/>
           <w:sz w:val="19"/>
         </w:rPr>
-        <w:t>{GOLD_SUPPORT_PRICE}/month — All Silver + dedicated account manager, 8h response, quarterly business reviews.</w:t>
+        <w:t>{GOLD_PRICE}/month — Dedicated account manager, priority phone + email, 8-hour response, unlimited minor changes, quarterly business review, discounted rate on major changes.</w:t>
       </w:r>
     </w:p>
     <w:p>
@@ -2279,7 +2448,7 @@
           <w:color w:val="838081"/>
           <w:sz w:val="16"/>
         </w:rPr>
-        <w:t>VAT (14%) will be added where applicable. All prices in {CURRENCY}.</w:t>
+        <w:t>VAT (14%) will be added where applicable. All prices in {CURRENCY} unless otherwise stated.</w:t>
       </w:r>
     </w:p>
     <w:p>
@@ -2293,7 +2462,7 @@
           <w:color w:val="142444"/>
           <w:sz w:val="26"/>
         </w:rPr>
-        <w:t>7.  PAYMENT SCHEDULE</w:t>
+        <w:t>8.  PAYMENT SCHEDULE</w:t>
       </w:r>
     </w:p>
     <w:p>
@@ -2328,7 +2497,7 @@
           <w:color w:val="3D3B3B"/>
           <w:sz w:val="19"/>
         </w:rPr>
-        <w:t>30% upon signing  |  30% upon UAT sign-off  |  30% upon go-live  |  10% upon 30-day post-go-live review</w:t>
+        <w:t>30% upon signing  |  30% upon UAT sign-off  |  30% upon successful go-live  |  10% upon 30-day post-go-live review</w:t>
       </w:r>
     </w:p>
     <w:p>
@@ -2422,7 +2591,7 @@
           <w:color w:val="142444"/>
           <w:sz w:val="20"/>
         </w:rPr>
-        <w:t xml:space="preserve">  Full Upfront</w:t>
+        <w:t xml:space="preserve">  Full Upfront — 5% Discount</w:t>
       </w:r>
     </w:p>
     <w:p>
@@ -2436,7 +2605,7 @@
           <w:color w:val="3D3B3B"/>
           <w:sz w:val="19"/>
         </w:rPr>
-        <w:t>Full payment upon signing. Includes a 5% discount on the total project value.</w:t>
+        <w:t>Full payment upon signing. A 5% discount applies to the total project value.</w:t>
       </w:r>
     </w:p>
     <w:p>
@@ -2464,7 +2633,7 @@
           <w:color w:val="142444"/>
           <w:sz w:val="26"/>
         </w:rPr>
-        <w:t>8.  TERMS &amp; CONDITIONS</w:t>
+        <w:t>9.  TERMS &amp; CONDITIONS</w:t>
       </w:r>
     </w:p>
     <w:p>
@@ -2485,7 +2654,7 @@
           <w:color w:val="142444"/>
           <w:sz w:val="20"/>
         </w:rPr>
-        <w:t xml:space="preserve">  1. Project Scope</w:t>
+        <w:t xml:space="preserve">  1. Scope of Work</w:t>
       </w:r>
     </w:p>
     <w:p>
@@ -2499,7 +2668,7 @@
           <w:color w:val="3D3B3B"/>
           <w:sz w:val="19"/>
         </w:rPr>
-        <w:t>The scope of work is defined in Section 2 above. Any additional work outside this scope will be billed separately at our standard hourly rate of {ADDITIONAL_WORK_RATE}/hour upon your written approval.</w:t>
+        <w:t>The scope of work is defined exclusively in Section 3 of this Quotation. Any services, deliverables, or modifications not expressly listed are excluded unless subsequently agreed in a written change order signed by both parties. Additional work will be billed at {ADDITIONAL_WORK_RATE}/hour.</w:t>
       </w:r>
     </w:p>
     <w:p>
@@ -2512,7 +2681,7 @@
           <w:color w:val="142444"/>
           <w:sz w:val="20"/>
         </w:rPr>
-        <w:t xml:space="preserve">  2. Payment Terms</w:t>
+        <w:t xml:space="preserve">  2. Fees &amp; Payment</w:t>
       </w:r>
     </w:p>
     <w:p>
@@ -2526,7 +2695,7 @@
           <w:color w:val="3D3B3B"/>
           <w:sz w:val="19"/>
         </w:rPr>
-        <w:t>Invoices are due according to the selected payment schedule. Late payments incur 2% monthly interest on overdue amounts. Work may be suspended if payment is more than 15 days past due.</w:t>
+        <w:t>All fees are in the currency stated on page 1. Invoices are due per the selected payment schedule. If payment is not received within 15 calendar days of the due date, we reserve the right to suspend all work until payment is received. Overdue amounts accrue interest at 2% per month (24% per annum). You may not withhold, offset, or deduct any amounts without our prior written consent.</w:t>
       </w:r>
     </w:p>
     <w:p>
@@ -2553,7 +2722,7 @@
           <w:color w:val="3D3B3B"/>
           <w:sz w:val="19"/>
         </w:rPr>
-        <w:t>Any changes to the agreed scope must be submitted via a formal change order and approved in writing by both parties. Work on change orders begins only after approval.</w:t>
+        <w:t>Any request to modify the scope, timeline, or deliverables must be submitted in writing. We will assess the impact on cost and timeline and provide a change order for your approval. Work on any change begins only after both parties sign the change order. Changes requested orally or via informal channels are not binding.</w:t>
       </w:r>
     </w:p>
     <w:p>
@@ -2580,7 +2749,7 @@
           <w:color w:val="3D3B3B"/>
           <w:sz w:val="19"/>
         </w:rPr>
-        <w:t>Upon full payment, you own all custom-developed code, configurations, and reports created specifically for this project. We retain ownership of our pre-existing methodologies, tools, and frameworks.</w:t>
+        <w:t>4.1 Custom Developments: Upon full payment of all amounts due, you own all custom-developed code, configurations, reports, and workflows created specifically for this project. We grant you a perpetual, irrevocable, royalty-free license to use such developments. 4.2 Our IP: We retain all rights, title, and interest in our pre-existing methodologies, frameworks, tools, libraries, know-how, and Odoo modules not developed specifically for this project. 4.3 Odoo IP: Odoo S.A. retains all rights to the Odoo platform and its modules.</w:t>
       </w:r>
     </w:p>
     <w:p>
@@ -2607,7 +2776,7 @@
           <w:color w:val="3D3B3B"/>
           <w:sz w:val="19"/>
         </w:rPr>
-        <w:t>All business information shared during this engagement is strictly confidential. We will sign an NDA if required.</w:t>
+        <w:t>Each party agrees to hold the other's Confidential Information in strict confidence. 'Confidential Information' means all non-public information disclosed in connection with this Quotation, including business processes, financial data, customer information, and technical specifications. This obligation survives termination of this agreement for a period of two (2) years. Nothing in this clause prevents disclosure required by law or regulatory authority.</w:t>
       </w:r>
     </w:p>
     <w:p>
@@ -2620,7 +2789,7 @@
           <w:color w:val="142444"/>
           <w:sz w:val="20"/>
         </w:rPr>
-        <w:t xml:space="preserve">  6. Data Protection &amp; Security</w:t>
+        <w:t xml:space="preserve">  6. Data Protection</w:t>
       </w:r>
     </w:p>
     <w:p>
@@ -2634,7 +2803,7 @@
           <w:color w:val="3D3B3B"/>
           <w:sz w:val="19"/>
         </w:rPr>
-        <w:t>We follow industry-standard security practices including encrypted data transfer, access controls, and secure handling of your business data in compliance with applicable data protection regulations.</w:t>
+        <w:t>We will process your data solely to provide the services under this Quotation. We maintain administrative, technical, and physical safeguards appropriate to the nature of the data, including encryption in transit (TLS 1.3) and at rest (AES-256), access controls, and regular data backups. Upon termination, we will return or delete your data within 90 days, unless retention is required by applicable law.</w:t>
       </w:r>
     </w:p>
     <w:p>
@@ -2647,7 +2816,7 @@
           <w:color w:val="142444"/>
           <w:sz w:val="20"/>
         </w:rPr>
-        <w:t xml:space="preserve">  7. Warranty</w:t>
+        <w:t xml:space="preserve">  7. Warranty &amp; Disclaimer</w:t>
       </w:r>
     </w:p>
     <w:p>
@@ -2661,7 +2830,7 @@
           <w:color w:val="3D3B3B"/>
           <w:sz w:val="19"/>
         </w:rPr>
-        <w:t>We warrant that all work will conform to the agreed specifications. Any defects reported within 30 days of go-live will be corrected at no additional charge.</w:t>
+        <w:t>7.1 We warrant that: (a) all services will be performed in a professional and workmanlike manner in accordance with industry standards; (b) custom developments will conform to the agreed specifications for a period of 30 days following go-live (the 'Warranty Period'). 7.2 Disclaimer: Except as expressly stated in this Section 7.1, the services and deliverables are provided 'AS IS' without any other warranties, express or implied, including merchantability or fitness for a particular purpose. We do not warrant that the Odoo platform will be error-free or that all defects will be corrected.</w:t>
       </w:r>
     </w:p>
     <w:p>
@@ -2688,7 +2857,7 @@
           <w:color w:val="3D3B3B"/>
           <w:sz w:val="19"/>
         </w:rPr>
-        <w:t>Our total liability is capped at the total fees paid under this quotation. We are not liable for indirect, incidental, or consequential damages, including loss of data or business interruption.</w:t>
+        <w:t>8.1 Liability Cap: Our total aggregate liability arising from or related to this Quotation, whether in contract, tort (including negligence), or otherwise, shall not exceed the total fees paid or payable by you under this Quotation. 8.2 Excluded Damages: In no event shall we be liable for: (a) indirect, incidental, special, consequential, or punitive damages; (b) loss of profits, revenue, data, goodwill, or business opportunity; (c) costs of substitute services, even if we have been advised of the possibility of such damages. 8.3 This limitation of liability is fundamental to the pricing of this Quotation.</w:t>
       </w:r>
     </w:p>
     <w:p>
@@ -2701,7 +2870,7 @@
           <w:color w:val="142444"/>
           <w:sz w:val="20"/>
         </w:rPr>
-        <w:t xml:space="preserve">  9. Termination</w:t>
+        <w:t xml:space="preserve">  9. Indemnification</w:t>
       </w:r>
     </w:p>
     <w:p>
@@ -2715,7 +2884,7 @@
           <w:color w:val="3D3B3B"/>
           <w:sz w:val="19"/>
         </w:rPr>
-        <w:t>Either party may terminate for material breach with 15 days' written notice. In the event of termination, you will pay for all work completed up to the termination date.</w:t>
+        <w:t>You agree to indemnify and hold us harmless from any claims, damages, or expenses arising from: (a) your breach of this Quotation; (b) your data or content provided to us; (c) your use of the deliverables in violation of applicable law.</w:t>
       </w:r>
     </w:p>
     <w:p>
@@ -2728,7 +2897,7 @@
           <w:color w:val="142444"/>
           <w:sz w:val="20"/>
         </w:rPr>
-        <w:t xml:space="preserve">  10. Governing Law</w:t>
+        <w:t xml:space="preserve">  10. Termination</w:t>
       </w:r>
     </w:p>
     <w:p>
@@ -2742,7 +2911,88 @@
           <w:color w:val="3D3B3B"/>
           <w:sz w:val="19"/>
         </w:rPr>
-        <w:t>This agreement is governed by {GOVERNING_LAW}. Both parties will first attempt to resolve disputes through good-faith negotiation.</w:t>
+        <w:t>10.1 Either party may terminate this agreement immediately by written notice if the other party materially breaches any provision and fails to cure the breach within 15 days of receiving written notice. 10.2 If you terminate without cause before the project is complete, you will pay for all work satisfactorily completed up to the termination date, plus any non-cancellable commitments made on your behalf. 10.3 Upon termination for any reason, you must pay all amounts due for work completed.</w:t>
+      </w:r>
+    </w:p>
+    <w:p>
+      <w:pPr>
+        <w:spacing w:before="100" w:after="40"/>
+      </w:pPr>
+      <w:r>
+        <w:rPr>
+          <w:b/>
+          <w:color w:val="142444"/>
+          <w:sz w:val="20"/>
+        </w:rPr>
+        <w:t xml:space="preserve">  11. Force Majeure</w:t>
+      </w:r>
+    </w:p>
+    <w:p>
+      <w:pPr>
+        <w:spacing w:after="60" w:line="276" w:lineRule="auto"/>
+      </w:pPr>
+      <w:r>
+        <w:rPr>
+          <w:b w:val="0"/>
+          <w:i w:val="0"/>
+          <w:color w:val="3D3B3B"/>
+          <w:sz w:val="19"/>
+        </w:rPr>
+        <w:t>Neither party shall be liable for delays or failures caused by events beyond its reasonable control, including but not limited to: acts of God, war, terrorism, pandemic, government action, internet outages, power failures, or third-party service disruptions. The affected party will notify the other within 7 days and resume performance as soon as reasonably possible.</w:t>
+      </w:r>
+    </w:p>
+    <w:p>
+      <w:pPr>
+        <w:spacing w:before="100" w:after="40"/>
+      </w:pPr>
+      <w:r>
+        <w:rPr>
+          <w:b/>
+          <w:color w:val="142444"/>
+          <w:sz w:val="20"/>
+        </w:rPr>
+        <w:t xml:space="preserve">  12. Governing Law &amp; Dispute Resolution</w:t>
+      </w:r>
+    </w:p>
+    <w:p>
+      <w:pPr>
+        <w:spacing w:after="60" w:line="276" w:lineRule="auto"/>
+      </w:pPr>
+      <w:r>
+        <w:rPr>
+          <w:b w:val="0"/>
+          <w:i w:val="0"/>
+          <w:color w:val="3D3B3B"/>
+          <w:sz w:val="19"/>
+        </w:rPr>
+        <w:t>12.1 This Quotation is governed by the laws of {GOVERNING_LAW}. 12.2 Any dispute arising from this Quotation will first be resolved through good-faith negotiations between senior representatives of both parties. 12.3 If negotiation fails, the dispute will be referred to mediation with a mutually agreed mediator. 12.4 If mediation fails, the dispute will be finally settled by binding arbitration in accordance with the rules of the Cairo Regional Centre for International Commercial Arbitration (CRCICA). 12.5 The language of proceedings shall be English. Each party bears its own legal costs.</w:t>
+      </w:r>
+    </w:p>
+    <w:p>
+      <w:pPr>
+        <w:spacing w:before="100" w:after="40"/>
+      </w:pPr>
+      <w:r>
+        <w:rPr>
+          <w:b/>
+          <w:color w:val="142444"/>
+          <w:sz w:val="20"/>
+        </w:rPr>
+        <w:t xml:space="preserve">  13. General Provisions</w:t>
+      </w:r>
+    </w:p>
+    <w:p>
+      <w:pPr>
+        <w:spacing w:after="60" w:line="276" w:lineRule="auto"/>
+      </w:pPr>
+      <w:r>
+        <w:rPr>
+          <w:b w:val="0"/>
+          <w:i w:val="0"/>
+          <w:color w:val="3D3B3B"/>
+          <w:sz w:val="19"/>
+        </w:rPr>
+        <w:t>13.1 Entire Agreement: This Quotation (including any attachments) constitutes the entire agreement between the parties and supersedes all prior discussions, representations, and agreements. 13.2 Amendments: Any modification to this Quotation must be in writing and signed by both parties. 13.3 Severability: If any provision is held invalid, the remainder continues in full force. 13.4 Waiver: Failure to enforce any provision does not constitute a waiver. 13.5 Assignment: You may not assign this Quotation without our prior written consent. We may assign to an affiliate or successor entity. 13.6 Notices: All formal notices must be in writing to the addresses stated on page 1. 13.7 Relationship: The parties are independent contractors. No partnership, joint venture, or employment relationship is created.</w:t>
       </w:r>
     </w:p>
     <w:p>
@@ -2756,7 +3006,7 @@
           <w:color w:val="142444"/>
           <w:sz w:val="26"/>
         </w:rPr>
-        <w:t>9.  ACCEPTANCE &amp; SIGNATURE</w:t>
+        <w:t>10.  ACCEPTANCE &amp; SIGNATURE</w:t>
       </w:r>
     </w:p>
     <w:p>
@@ -2778,7 +3028,7 @@
           <w:color w:val="3D3B3B"/>
           <w:sz w:val="19"/>
         </w:rPr>
-        <w:t>By signing below, both parties acknowledge and agree to the terms of this quotation. This quotation becomes a legally binding agreement upon signature by both parties and is valid for 30 days from the issue date.</w:t>
+        <w:t>By signing below, both parties acknowledge that they have read, understood, and agree to be bound by all terms and conditions of this Quotation. This Quotation becomes a legally binding agreement upon signature by both parties and is valid for 30 calendar days from the issue date.</w:t>
       </w:r>
     </w:p>
     <w:tbl>

</xml_diff>

<commit_message>
Polish Odoo quotation wording
</commit_message>
<xml_diff>
--- a/doc/quotation/TDS-GEO-Quotation.docx
+++ b/doc/quotation/TDS-GEO-Quotation.docx
@@ -67,7 +67,7 @@
                 <w:color w:val="838081"/>
                 <w:sz w:val="16"/>
               </w:rPr>
-              <w:t>webdevelopment@trafficdigitalsolutions.com  |  trafficdigitalsolutions.com</w:t>
+              <w:t>webdevelopment@trafficdigitalsolutions.com  -  trafficdigitalsolutions.com</w:t>
             </w:r>
           </w:p>
         </w:tc>
@@ -106,7 +106,7 @@
           <w:color w:val="838081"/>
           <w:sz w:val="18"/>
         </w:rPr>
-        <w:t>Quotation No: {NUMBER}     |     Issued: {ISSUE_DATE}     |     Valid Until: {VALID_UNTIL}</w:t>
+        <w:t>Quotation No: {NUMBER}    -    Issued: {ISSUE_DATE}    -    Valid Until: {VALID_UNTIL}</w:t>
       </w:r>
     </w:p>
     <w:p>
@@ -495,7 +495,7 @@
           <w:color w:val="3D3B3B"/>
           <w:sz w:val="19"/>
         </w:rPr>
-        <w:t xml:space="preserve">  •  Proven Odoo expertise — Certified Odoo development team with end-to-end implementation experience</w:t>
+        <w:t xml:space="preserve">  •  Proven Odoo expertise: certified development team covering setup, configuration, launch, and support</w:t>
       </w:r>
     </w:p>
     <w:p>
@@ -508,7 +508,7 @@
           <w:color w:val="3D3B3B"/>
           <w:sz w:val="19"/>
         </w:rPr>
-        <w:t xml:space="preserve">  •  100+ satisfied clients — From startups to large enterprises across multiple industries</w:t>
+        <w:t xml:space="preserve">  •  Over 100 satisfied clients: from startups to large enterprises across multiple industries</w:t>
       </w:r>
     </w:p>
     <w:p>
@@ -521,7 +521,7 @@
           <w:color w:val="3D3B3B"/>
           <w:sz w:val="19"/>
         </w:rPr>
-        <w:t xml:space="preserve">  •  Full-service capability — Beyond Odoo: web, branding, marketing, and content under one roof</w:t>
+        <w:t xml:space="preserve">  •  Full service capability: Odoo, web, branding, marketing, and content all under one roof</w:t>
       </w:r>
     </w:p>
     <w:p>
@@ -534,7 +534,7 @@
           <w:color w:val="3D3B3B"/>
           <w:sz w:val="19"/>
         </w:rPr>
-        <w:t xml:space="preserve">  •  Data-driven methodology — Structured implementation with clear milestones, testing, and sign-off at every phase</w:t>
+        <w:t xml:space="preserve">  •  Structured delivery: clear milestones, testing, and sign off at every phase of the project</w:t>
       </w:r>
     </w:p>
     <w:p>
@@ -547,7 +547,7 @@
           <w:color w:val="3D3B3B"/>
           <w:sz w:val="19"/>
         </w:rPr>
-        <w:t xml:space="preserve">  •  Post-go-live commitment — Multi-tier support options to keep your business running smoothly</w:t>
+        <w:t xml:space="preserve">  •  Post go-live commitment: support plans to keep your business running smoothly after launch</w:t>
       </w:r>
     </w:p>
     <w:p>
@@ -560,7 +560,7 @@
           <w:color w:val="3D3B3B"/>
           <w:sz w:val="19"/>
         </w:rPr>
-        <w:t xml:space="preserve">  •  Located in Cairo — On-site visits and face-to-face meetings available when needed</w:t>
+        <w:t xml:space="preserve">  •  Based in Cairo: on-site visits and face-to-face meetings available when you need them</w:t>
       </w:r>
     </w:p>
     <w:p>
@@ -574,7 +574,7 @@
           <w:color w:val="142444"/>
           <w:sz w:val="26"/>
         </w:rPr>
-        <w:t>3.  SCOPE OF WORK — ODOO MODULES &amp; SERVICES</w:t>
+        <w:t>3.  SCOPE OF WORK - ODOO MODULES &amp; SERVICES</w:t>
       </w:r>
     </w:p>
     <w:p>
@@ -622,7 +622,7 @@
           <w:color w:val="3D3B3B"/>
           <w:sz w:val="19"/>
         </w:rPr>
-        <w:t xml:space="preserve">  •  Sales &amp; CRM — Pipeline management, lead tracking, quotation templates, invoicing workflow</w:t>
+        <w:t xml:space="preserve">  •  Sales &amp; CRM: pipeline management, lead tracking, quotation templates, invoicing workflow</w:t>
       </w:r>
     </w:p>
     <w:p>
@@ -635,7 +635,7 @@
           <w:color w:val="3D3B3B"/>
           <w:sz w:val="19"/>
         </w:rPr>
-        <w:t xml:space="preserve">  •  Accounting &amp; Finance — Chart of accounts, tax rules, multi-currency, financial reports, bank reconciliation</w:t>
+        <w:t xml:space="preserve">  •  Accounting &amp; Finance: chart of accounts, tax rules, multi-currency, financial reports, bank reconciliation</w:t>
       </w:r>
     </w:p>
     <w:p>
@@ -648,7 +648,7 @@
           <w:color w:val="3D3B3B"/>
           <w:sz w:val="19"/>
         </w:rPr>
-        <w:t xml:space="preserve">  •  Inventory &amp; Warehouse Management — Stock locations, transfers, valuation methods, reordering rules</w:t>
+        <w:t xml:space="preserve">  •  Inventory &amp; Warehouse Management: stock locations, transfers, valuation methods, reordering rules</w:t>
       </w:r>
     </w:p>
     <w:p>
@@ -661,7 +661,7 @@
           <w:color w:val="3D3B3B"/>
           <w:sz w:val="19"/>
         </w:rPr>
-        <w:t xml:space="preserve">  •  Purchasing &amp; Vendor Management — Purchase orders, vendor pricing, approval workflows</w:t>
+        <w:t xml:space="preserve">  •  Purchasing &amp; Vendor Management: purchase orders, vendor pricing, approval workflows</w:t>
       </w:r>
     </w:p>
     <w:p>
@@ -674,7 +674,7 @@
           <w:color w:val="3D3B3B"/>
           <w:sz w:val="19"/>
         </w:rPr>
-        <w:t xml:space="preserve">  •  Human Resources — Employee records, contracts, leave management, payroll configuration</w:t>
+        <w:t xml:space="preserve">  •  Human Resources: employee records, contracts, leave management, payroll configuration</w:t>
       </w:r>
     </w:p>
     <w:p>
@@ -687,7 +687,7 @@
           <w:color w:val="3D3B3B"/>
           <w:sz w:val="19"/>
         </w:rPr>
-        <w:t xml:space="preserve">  •  Manufacturing / Bill of Materials — BOM structure, work orders, routing (if applicable)</w:t>
+        <w:t xml:space="preserve">  •  Manufacturing / Bill of Materials: BOM structure, work orders, routing (if applicable)</w:t>
       </w:r>
     </w:p>
     <w:p>
@@ -700,7 +700,7 @@
           <w:color w:val="3D3B3B"/>
           <w:sz w:val="19"/>
         </w:rPr>
-        <w:t xml:space="preserve">  •  Website &amp; E-commerce — Storefront setup, theme customization, product pages, checkout flow</w:t>
+        <w:t xml:space="preserve">  •  Website &amp; E-commerce: storefront setup, theme customization, product pages, checkout flow</w:t>
       </w:r>
     </w:p>
     <w:p>
@@ -713,7 +713,7 @@
           <w:color w:val="3D3B3B"/>
           <w:sz w:val="19"/>
         </w:rPr>
-        <w:t xml:space="preserve">  •  Email Marketing — Campaign creation, subscriber management, performance analytics</w:t>
+        <w:t xml:space="preserve">  •  Email Marketing: campaign creation, subscriber management, performance analytics</w:t>
       </w:r>
     </w:p>
     <w:p>
@@ -726,7 +726,7 @@
           <w:color w:val="3D3B3B"/>
           <w:sz w:val="19"/>
         </w:rPr>
-        <w:t xml:space="preserve">  •  Project Management — Project planning, task assignment, timesheets, profitability analysis</w:t>
+        <w:t xml:space="preserve">  •  Project Management: project planning, task assignment, timesheets, profitability analysis</w:t>
       </w:r>
     </w:p>
     <w:p/>
@@ -1004,7 +1004,7 @@
           <w:color w:val="3D3B3B"/>
           <w:sz w:val="19"/>
         </w:rPr>
-        <w:t xml:space="preserve">  •  Ongoing support and maintenance beyond the 30-day warranty period (separate support plans available — see Section 7)</w:t>
+        <w:t xml:space="preserve">  •  Ongoing support and maintenance beyond the 30-day warranty period (separate support plans available in Section 7)</w:t>
       </w:r>
     </w:p>
     <w:p>
@@ -1078,7 +1078,7 @@
           <w:color w:val="142444"/>
           <w:sz w:val="20"/>
         </w:rPr>
-        <w:t xml:space="preserve">  Phase 1 — Discovery &amp; Requirements</w:t>
+        <w:t xml:space="preserve">  Phase 1: Discovery &amp; Requirements</w:t>
       </w:r>
       <w:r>
         <w:rPr>
@@ -1086,7 +1086,7 @@
           <w:color w:val="FCB900"/>
           <w:sz w:val="18"/>
         </w:rPr>
-        <w:t xml:space="preserve">  —  Week 1</w:t>
+        <w:t xml:space="preserve">  (Week 1)</w:t>
       </w:r>
     </w:p>
     <w:p>
@@ -1113,7 +1113,7 @@
           <w:color w:val="142444"/>
           <w:sz w:val="20"/>
         </w:rPr>
-        <w:t xml:space="preserve">  Phase 2 — System Configuration</w:t>
+        <w:t xml:space="preserve">  Phase 2: System Configuration</w:t>
       </w:r>
       <w:r>
         <w:rPr>
@@ -1121,7 +1121,7 @@
           <w:color w:val="FCB900"/>
           <w:sz w:val="18"/>
         </w:rPr>
-        <w:t xml:space="preserve">  —  Weeks 2-3</w:t>
+        <w:t xml:space="preserve">  (Weeks 2-3)</w:t>
       </w:r>
     </w:p>
     <w:p>
@@ -1148,7 +1148,7 @@
           <w:color w:val="142444"/>
           <w:sz w:val="20"/>
         </w:rPr>
-        <w:t xml:space="preserve">  Phase 3 — Data Migration</w:t>
+        <w:t xml:space="preserve">  Phase 3: Data Migration</w:t>
       </w:r>
       <w:r>
         <w:rPr>
@@ -1156,7 +1156,7 @@
           <w:color w:val="FCB900"/>
           <w:sz w:val="18"/>
         </w:rPr>
-        <w:t xml:space="preserve">  —  Weeks 3-4</w:t>
+        <w:t xml:space="preserve">  (Weeks 3-4)</w:t>
       </w:r>
     </w:p>
     <w:p>
@@ -1183,7 +1183,7 @@
           <w:color w:val="142444"/>
           <w:sz w:val="20"/>
         </w:rPr>
-        <w:t xml:space="preserve">  Phase 4 — Customization &amp; Development</w:t>
+        <w:t xml:space="preserve">  Phase 4: Customization &amp; Development</w:t>
       </w:r>
       <w:r>
         <w:rPr>
@@ -1191,7 +1191,7 @@
           <w:color w:val="FCB900"/>
           <w:sz w:val="18"/>
         </w:rPr>
-        <w:t xml:space="preserve">  —  Weeks 4-6</w:t>
+        <w:t xml:space="preserve">  (Weeks 4-6)</w:t>
       </w:r>
     </w:p>
     <w:p>
@@ -1218,7 +1218,7 @@
           <w:color w:val="142444"/>
           <w:sz w:val="20"/>
         </w:rPr>
-        <w:t xml:space="preserve">  Phase 5 — Testing &amp; Training</w:t>
+        <w:t xml:space="preserve">  Phase 5: Testing &amp; Training</w:t>
       </w:r>
       <w:r>
         <w:rPr>
@@ -1226,7 +1226,7 @@
           <w:color w:val="FCB900"/>
           <w:sz w:val="18"/>
         </w:rPr>
-        <w:t xml:space="preserve">  —  Weeks 6-7</w:t>
+        <w:t xml:space="preserve">  (Weeks 6-7)</w:t>
       </w:r>
     </w:p>
     <w:p>
@@ -1253,7 +1253,7 @@
           <w:color w:val="142444"/>
           <w:sz w:val="20"/>
         </w:rPr>
-        <w:t xml:space="preserve">  Phase 6 — Go-Live &amp; Hypercare</w:t>
+        <w:t xml:space="preserve">  Phase 6: Go-Live &amp; Hypercare</w:t>
       </w:r>
       <w:r>
         <w:rPr>
@@ -1261,7 +1261,7 @@
           <w:color w:val="FCB900"/>
           <w:sz w:val="18"/>
         </w:rPr>
-        <w:t xml:space="preserve">  —  Week 8</w:t>
+        <w:t xml:space="preserve">  (Week 8)</w:t>
       </w:r>
     </w:p>
     <w:p>
@@ -2385,14 +2385,14 @@
           <w:color w:val="142444"/>
           <w:sz w:val="19"/>
         </w:rPr>
-        <w:t xml:space="preserve">  Bronze — Basic:  </w:t>
+        <w:t xml:space="preserve">  Bronze: Basic:  </w:t>
       </w:r>
       <w:r>
         <w:rPr>
           <w:color w:val="3D3B3B"/>
           <w:sz w:val="19"/>
         </w:rPr>
-        <w:t>{BRONZE_PRICE}/month — Email-only support, bug fixes, 48-hour response time, quarterly system health check.</w:t>
+        <w:t>{BRONZE_PRICE}/month. Email-only support, bug fixes, 48-hour response time, quarterly system health check.</w:t>
       </w:r>
     </w:p>
     <w:p>
@@ -2406,14 +2406,14 @@
           <w:color w:val="142444"/>
           <w:sz w:val="19"/>
         </w:rPr>
-        <w:t xml:space="preserve">  Silver — Standard:  </w:t>
+        <w:t xml:space="preserve">  Silver: Standard:  </w:t>
       </w:r>
       <w:r>
         <w:rPr>
           <w:color w:val="3D3B3B"/>
           <w:sz w:val="19"/>
         </w:rPr>
-        <w:t>{SILVER_PRICE}/month — Email + phone support, bug fixes, minor configuration changes, 24-hour response, monthly health check.</w:t>
+        <w:t>{SILVER_PRICE}/month. Email and phone support, bug fixes, minor configuration changes, 24-hour response, monthly health check.</w:t>
       </w:r>
     </w:p>
     <w:p>
@@ -2427,14 +2427,14 @@
           <w:color w:val="142444"/>
           <w:sz w:val="19"/>
         </w:rPr>
-        <w:t xml:space="preserve">  Gold — Premium (Recommended):  </w:t>
+        <w:t xml:space="preserve">  Gold: Premium:  </w:t>
       </w:r>
       <w:r>
         <w:rPr>
           <w:color w:val="3D3B3B"/>
           <w:sz w:val="19"/>
         </w:rPr>
-        <w:t>{GOLD_PRICE}/month — Dedicated account manager, priority phone + email, 8-hour response, unlimited minor changes, quarterly business review, discounted rate on major changes.</w:t>
+        <w:t>{GOLD_PRICE}/month. Dedicated account manager, priority phone and email, 8-hour response, unlimited minor changes, quarterly business review, discounted rate on major changes.</w:t>
       </w:r>
     </w:p>
     <w:p>
@@ -2483,7 +2483,7 @@
           <w:color w:val="142444"/>
           <w:sz w:val="20"/>
         </w:rPr>
-        <w:t xml:space="preserve">  Milestone-Based (Recommended)</w:t>
+        <w:t xml:space="preserve">  Milestone-Based</w:t>
       </w:r>
     </w:p>
     <w:p>
@@ -2497,7 +2497,7 @@
           <w:color w:val="3D3B3B"/>
           <w:sz w:val="19"/>
         </w:rPr>
-        <w:t>30% upon signing  |  30% upon UAT sign-off  |  30% upon successful go-live  |  10% upon 30-day post-go-live review</w:t>
+        <w:t>30% upon signing, 30% upon UAT sign-off, 30% upon successful go-live, 10% upon 30-day post-go-live review</w:t>
       </w:r>
     </w:p>
     <w:p>
@@ -2591,7 +2591,7 @@
           <w:color w:val="142444"/>
           <w:sz w:val="20"/>
         </w:rPr>
-        <w:t xml:space="preserve">  Full Upfront — 5% Discount</w:t>
+        <w:t xml:space="preserve">  Full Upfront with 5% Discount</w:t>
       </w:r>
     </w:p>
     <w:p>
@@ -3265,7 +3265,7 @@
           <w:color w:val="838081"/>
           <w:sz w:val="14"/>
         </w:rPr>
-        <w:t>Commercial Registration: XXXXX  |  Tax ID: XXXXX  |  Quotation No: {NUMBER}</w:t>
+        <w:t>Commercial Registration: XXXXX  -  Tax ID: XXXXX  -  Quotation No: {NUMBER}</w:t>
       </w:r>
     </w:p>
     <w:sectPr>

</xml_diff>

<commit_message>
Upgrade Odoo quotation for enterprise clients
</commit_message>
<xml_diff>
--- a/doc/quotation/TDS-GEO-Quotation.docx
+++ b/doc/quotation/TDS-GEO-Quotation.docx
@@ -565,6 +565,265 @@
     </w:p>
     <w:p>
       <w:pPr>
+        <w:spacing w:after="80" w:line="276" w:lineRule="auto"/>
+      </w:pPr>
+      <w:r>
+        <w:rPr>
+          <w:b/>
+          <w:i w:val="0"/>
+          <w:color w:val="142444"/>
+          <w:sz w:val="20"/>
+        </w:rPr>
+        <w:t>Implementation strength at a glance:</w:t>
+      </w:r>
+    </w:p>
+    <w:tbl>
+      <w:tblPr>
+        <w:tblW w:type="auto" w:w="0"/>
+        <w:jc w:val="center"/>
+        <w:tblLook w:firstColumn="1" w:firstRow="1" w:lastColumn="0" w:lastRow="0" w:noHBand="0" w:noVBand="1" w:val="04A0"/>
+      </w:tblPr>
+      <w:tblGrid>
+        <w:gridCol w:w="4536"/>
+        <w:gridCol w:w="4536"/>
+      </w:tblGrid>
+      <w:tr>
+        <w:tc>
+          <w:tcPr>
+            <w:tcW w:type="dxa" w:w="2835"/>
+            <w:shd w:fill="171414"/>
+          </w:tcPr>
+          <w:p>
+            <w:pPr>
+              <w:spacing w:before="60" w:after="60"/>
+            </w:pPr>
+            <w:r>
+              <w:rPr>
+                <w:b/>
+                <w:color w:val="FFFFFF"/>
+                <w:sz w:val="16"/>
+              </w:rPr>
+              <w:t>Capability</w:t>
+            </w:r>
+          </w:p>
+        </w:tc>
+        <w:tc>
+          <w:tcPr>
+            <w:tcW w:type="dxa" w:w="6803"/>
+            <w:shd w:fill="171414"/>
+          </w:tcPr>
+          <w:p>
+            <w:pPr>
+              <w:spacing w:before="60" w:after="60"/>
+            </w:pPr>
+            <w:r>
+              <w:rPr>
+                <w:b/>
+                <w:color w:val="FFFFFF"/>
+                <w:sz w:val="16"/>
+              </w:rPr>
+              <w:t>Current Position</w:t>
+            </w:r>
+          </w:p>
+        </w:tc>
+      </w:tr>
+      <w:tr>
+        <w:tc>
+          <w:tcPr>
+            <w:tcW w:type="dxa" w:w="4536"/>
+          </w:tcPr>
+          <w:p>
+            <w:pPr>
+              <w:spacing w:before="60" w:after="60"/>
+            </w:pPr>
+            <w:r>
+              <w:rPr>
+                <w:color w:val="3D3B3B"/>
+                <w:sz w:val="17"/>
+              </w:rPr>
+              <w:t>Projects delivered</w:t>
+            </w:r>
+          </w:p>
+        </w:tc>
+        <w:tc>
+          <w:tcPr>
+            <w:tcW w:type="dxa" w:w="4536"/>
+          </w:tcPr>
+          <w:p>
+            <w:pPr>
+              <w:spacing w:before="60" w:after="60"/>
+            </w:pPr>
+            <w:r>
+              <w:rPr>
+                <w:color w:val="3D3B3B"/>
+                <w:sz w:val="17"/>
+              </w:rPr>
+              <w:t>100+ digital and ERP-related projects delivered since 2019</w:t>
+            </w:r>
+          </w:p>
+        </w:tc>
+      </w:tr>
+      <w:tr>
+        <w:tc>
+          <w:tcPr>
+            <w:tcW w:type="dxa" w:w="4536"/>
+          </w:tcPr>
+          <w:p>
+            <w:pPr>
+              <w:spacing w:before="60" w:after="60"/>
+            </w:pPr>
+            <w:r>
+              <w:rPr>
+                <w:color w:val="3D3B3B"/>
+                <w:sz w:val="17"/>
+              </w:rPr>
+              <w:t>Industries served</w:t>
+            </w:r>
+          </w:p>
+        </w:tc>
+        <w:tc>
+          <w:tcPr>
+            <w:tcW w:type="dxa" w:w="4536"/>
+          </w:tcPr>
+          <w:p>
+            <w:pPr>
+              <w:spacing w:before="60" w:after="60"/>
+            </w:pPr>
+            <w:r>
+              <w:rPr>
+                <w:color w:val="3D3B3B"/>
+                <w:sz w:val="17"/>
+              </w:rPr>
+              <w:t>Retail, healthcare, manufacturing, professional services, education, and e-commerce</w:t>
+            </w:r>
+          </w:p>
+        </w:tc>
+      </w:tr>
+      <w:tr>
+        <w:tc>
+          <w:tcPr>
+            <w:tcW w:type="dxa" w:w="4536"/>
+          </w:tcPr>
+          <w:p>
+            <w:pPr>
+              <w:spacing w:before="60" w:after="60"/>
+            </w:pPr>
+            <w:r>
+              <w:rPr>
+                <w:color w:val="3D3B3B"/>
+                <w:sz w:val="17"/>
+              </w:rPr>
+              <w:t>Delivery model</w:t>
+            </w:r>
+          </w:p>
+        </w:tc>
+        <w:tc>
+          <w:tcPr>
+            <w:tcW w:type="dxa" w:w="4536"/>
+          </w:tcPr>
+          <w:p>
+            <w:pPr>
+              <w:spacing w:before="60" w:after="60"/>
+            </w:pPr>
+            <w:r>
+              <w:rPr>
+                <w:color w:val="3D3B3B"/>
+                <w:sz w:val="17"/>
+              </w:rPr>
+              <w:t>Business analysis, configuration, development, migration, training, launch, and support</w:t>
+            </w:r>
+          </w:p>
+        </w:tc>
+      </w:tr>
+      <w:tr>
+        <w:tc>
+          <w:tcPr>
+            <w:tcW w:type="dxa" w:w="4536"/>
+          </w:tcPr>
+          <w:p>
+            <w:pPr>
+              <w:spacing w:before="60" w:after="60"/>
+            </w:pPr>
+            <w:r>
+              <w:rPr>
+                <w:color w:val="3D3B3B"/>
+                <w:sz w:val="17"/>
+              </w:rPr>
+              <w:t>Support availability</w:t>
+            </w:r>
+          </w:p>
+        </w:tc>
+        <w:tc>
+          <w:tcPr>
+            <w:tcW w:type="dxa" w:w="4536"/>
+          </w:tcPr>
+          <w:p>
+            <w:pPr>
+              <w:spacing w:before="60" w:after="60"/>
+            </w:pPr>
+            <w:r>
+              <w:rPr>
+                <w:color w:val="3D3B3B"/>
+                <w:sz w:val="17"/>
+              </w:rPr>
+              <w:t>Dedicated post-go-live support with clear response times and escalation path</w:t>
+            </w:r>
+          </w:p>
+        </w:tc>
+      </w:tr>
+      <w:tr>
+        <w:tc>
+          <w:tcPr>
+            <w:tcW w:type="dxa" w:w="4536"/>
+          </w:tcPr>
+          <w:p>
+            <w:pPr>
+              <w:spacing w:before="60" w:after="60"/>
+            </w:pPr>
+            <w:r>
+              <w:rPr>
+                <w:color w:val="3D3B3B"/>
+                <w:sz w:val="17"/>
+              </w:rPr>
+              <w:t>Local presence</w:t>
+            </w:r>
+          </w:p>
+        </w:tc>
+        <w:tc>
+          <w:tcPr>
+            <w:tcW w:type="dxa" w:w="4536"/>
+          </w:tcPr>
+          <w:p>
+            <w:pPr>
+              <w:spacing w:before="60" w:after="60"/>
+            </w:pPr>
+            <w:r>
+              <w:rPr>
+                <w:color w:val="3D3B3B"/>
+                <w:sz w:val="17"/>
+              </w:rPr>
+              <w:t>Cairo-based team available for workshops, stakeholder meetings, and on-site support</w:t>
+            </w:r>
+          </w:p>
+        </w:tc>
+      </w:tr>
+    </w:tbl>
+    <w:p>
+      <w:pPr>
+        <w:spacing w:after="120" w:line="276" w:lineRule="auto"/>
+      </w:pPr>
+      <w:r>
+        <w:rPr>
+          <w:b w:val="0"/>
+          <w:i/>
+          <w:color w:val="838081"/>
+          <w:sz w:val="17"/>
+        </w:rPr>
+        <w:t>Relevant references and case studies can be shared upon request, subject to client confidentiality approvals.</w:t>
+      </w:r>
+    </w:p>
+    <w:p>
+      <w:pPr>
         <w:spacing w:before="280" w:after="80"/>
       </w:pPr>
       <w:r>
@@ -574,7 +833,7 @@
           <w:color w:val="142444"/>
           <w:sz w:val="26"/>
         </w:rPr>
-        <w:t>3.  SCOPE OF WORK - ODOO MODULES &amp; SERVICES</w:t>
+        <w:t>3.  DISCOVERY OUTPUTS</w:t>
       </w:r>
     </w:p>
     <w:p>
@@ -596,7 +855,379 @@
           <w:color w:val="3D3B3B"/>
           <w:sz w:val="20"/>
         </w:rPr>
-        <w:t>We will implement, configure, and deploy the following Odoo modules and services for your organization:</w:t>
+        <w:t>The first stage is designed to remove ambiguity before configuration starts. It gives both teams a shared written understanding of the business processes, gaps, risks, and implementation priorities.</w:t>
+      </w:r>
+    </w:p>
+    <w:tbl>
+      <w:tblPr>
+        <w:tblW w:type="auto" w:w="0"/>
+        <w:jc w:val="center"/>
+        <w:tblLook w:firstColumn="1" w:firstRow="1" w:lastColumn="0" w:lastRow="0" w:noHBand="0" w:noVBand="1" w:val="04A0"/>
+      </w:tblPr>
+      <w:tblGrid>
+        <w:gridCol w:w="3024"/>
+        <w:gridCol w:w="3024"/>
+        <w:gridCol w:w="3024"/>
+      </w:tblGrid>
+      <w:tr>
+        <w:tc>
+          <w:tcPr>
+            <w:tcW w:type="dxa" w:w="2381"/>
+            <w:shd w:fill="171414"/>
+          </w:tcPr>
+          <w:p>
+            <w:pPr>
+              <w:spacing w:before="60" w:after="60"/>
+            </w:pPr>
+            <w:r>
+              <w:rPr>
+                <w:b/>
+                <w:color w:val="FFFFFF"/>
+                <w:sz w:val="16"/>
+              </w:rPr>
+              <w:t>Discovery Output</w:t>
+            </w:r>
+          </w:p>
+        </w:tc>
+        <w:tc>
+          <w:tcPr>
+            <w:tcW w:type="dxa" w:w="5102"/>
+            <w:shd w:fill="171414"/>
+          </w:tcPr>
+          <w:p>
+            <w:pPr>
+              <w:spacing w:before="60" w:after="60"/>
+            </w:pPr>
+            <w:r>
+              <w:rPr>
+                <w:b/>
+                <w:color w:val="FFFFFF"/>
+                <w:sz w:val="16"/>
+              </w:rPr>
+              <w:t>Purpose</w:t>
+            </w:r>
+          </w:p>
+        </w:tc>
+        <w:tc>
+          <w:tcPr>
+            <w:tcW w:type="dxa" w:w="1814"/>
+            <w:shd w:fill="171414"/>
+          </w:tcPr>
+          <w:p>
+            <w:pPr>
+              <w:spacing w:before="60" w:after="60"/>
+            </w:pPr>
+            <w:r>
+              <w:rPr>
+                <w:b/>
+                <w:color w:val="FFFFFF"/>
+                <w:sz w:val="16"/>
+              </w:rPr>
+              <w:t>Client Approval</w:t>
+            </w:r>
+          </w:p>
+        </w:tc>
+      </w:tr>
+      <w:tr>
+        <w:tc>
+          <w:tcPr>
+            <w:tcW w:type="dxa" w:w="3024"/>
+          </w:tcPr>
+          <w:p>
+            <w:pPr>
+              <w:spacing w:before="60" w:after="60"/>
+            </w:pPr>
+            <w:r>
+              <w:rPr>
+                <w:color w:val="3D3B3B"/>
+                <w:sz w:val="17"/>
+              </w:rPr>
+              <w:t>Process Mapping</w:t>
+            </w:r>
+          </w:p>
+        </w:tc>
+        <w:tc>
+          <w:tcPr>
+            <w:tcW w:type="dxa" w:w="3024"/>
+          </w:tcPr>
+          <w:p>
+            <w:pPr>
+              <w:spacing w:before="60" w:after="60"/>
+            </w:pPr>
+            <w:r>
+              <w:rPr>
+                <w:color w:val="3D3B3B"/>
+                <w:sz w:val="17"/>
+              </w:rPr>
+              <w:t>Current and target workflows for each selected department</w:t>
+            </w:r>
+          </w:p>
+        </w:tc>
+        <w:tc>
+          <w:tcPr>
+            <w:tcW w:type="dxa" w:w="3024"/>
+          </w:tcPr>
+          <w:p>
+            <w:pPr>
+              <w:spacing w:before="60" w:after="60"/>
+            </w:pPr>
+            <w:r>
+              <w:rPr>
+                <w:color w:val="3D3B3B"/>
+                <w:sz w:val="17"/>
+              </w:rPr>
+              <w:t>Required</w:t>
+            </w:r>
+          </w:p>
+        </w:tc>
+      </w:tr>
+      <w:tr>
+        <w:tc>
+          <w:tcPr>
+            <w:tcW w:type="dxa" w:w="3024"/>
+          </w:tcPr>
+          <w:p>
+            <w:pPr>
+              <w:spacing w:before="60" w:after="60"/>
+            </w:pPr>
+            <w:r>
+              <w:rPr>
+                <w:color w:val="3D3B3B"/>
+                <w:sz w:val="17"/>
+              </w:rPr>
+              <w:t>GAP Analysis</w:t>
+            </w:r>
+          </w:p>
+        </w:tc>
+        <w:tc>
+          <w:tcPr>
+            <w:tcW w:type="dxa" w:w="3024"/>
+          </w:tcPr>
+          <w:p>
+            <w:pPr>
+              <w:spacing w:before="60" w:after="60"/>
+            </w:pPr>
+            <w:r>
+              <w:rPr>
+                <w:color w:val="3D3B3B"/>
+                <w:sz w:val="17"/>
+              </w:rPr>
+              <w:t>Fit-gap review between standard Odoo and required business processes</w:t>
+            </w:r>
+          </w:p>
+        </w:tc>
+        <w:tc>
+          <w:tcPr>
+            <w:tcW w:type="dxa" w:w="3024"/>
+          </w:tcPr>
+          <w:p>
+            <w:pPr>
+              <w:spacing w:before="60" w:after="60"/>
+            </w:pPr>
+            <w:r>
+              <w:rPr>
+                <w:color w:val="3D3B3B"/>
+                <w:sz w:val="17"/>
+              </w:rPr>
+              <w:t>Required</w:t>
+            </w:r>
+          </w:p>
+        </w:tc>
+      </w:tr>
+      <w:tr>
+        <w:tc>
+          <w:tcPr>
+            <w:tcW w:type="dxa" w:w="3024"/>
+          </w:tcPr>
+          <w:p>
+            <w:pPr>
+              <w:spacing w:before="60" w:after="60"/>
+            </w:pPr>
+            <w:r>
+              <w:rPr>
+                <w:color w:val="3D3B3B"/>
+                <w:sz w:val="17"/>
+              </w:rPr>
+              <w:t>Business Requirements Document</w:t>
+            </w:r>
+          </w:p>
+        </w:tc>
+        <w:tc>
+          <w:tcPr>
+            <w:tcW w:type="dxa" w:w="3024"/>
+          </w:tcPr>
+          <w:p>
+            <w:pPr>
+              <w:spacing w:before="60" w:after="60"/>
+            </w:pPr>
+            <w:r>
+              <w:rPr>
+                <w:color w:val="3D3B3B"/>
+                <w:sz w:val="17"/>
+              </w:rPr>
+              <w:t>Final written scope, rules, reports, roles, and exceptions</w:t>
+            </w:r>
+          </w:p>
+        </w:tc>
+        <w:tc>
+          <w:tcPr>
+            <w:tcW w:type="dxa" w:w="3024"/>
+          </w:tcPr>
+          <w:p>
+            <w:pPr>
+              <w:spacing w:before="60" w:after="60"/>
+            </w:pPr>
+            <w:r>
+              <w:rPr>
+                <w:color w:val="3D3B3B"/>
+                <w:sz w:val="17"/>
+              </w:rPr>
+              <w:t>Required</w:t>
+            </w:r>
+          </w:p>
+        </w:tc>
+      </w:tr>
+      <w:tr>
+        <w:tc>
+          <w:tcPr>
+            <w:tcW w:type="dxa" w:w="3024"/>
+          </w:tcPr>
+          <w:p>
+            <w:pPr>
+              <w:spacing w:before="60" w:after="60"/>
+            </w:pPr>
+            <w:r>
+              <w:rPr>
+                <w:color w:val="3D3B3B"/>
+                <w:sz w:val="17"/>
+              </w:rPr>
+              <w:t>Implementation Plan</w:t>
+            </w:r>
+          </w:p>
+        </w:tc>
+        <w:tc>
+          <w:tcPr>
+            <w:tcW w:type="dxa" w:w="3024"/>
+          </w:tcPr>
+          <w:p>
+            <w:pPr>
+              <w:spacing w:before="60" w:after="60"/>
+            </w:pPr>
+            <w:r>
+              <w:rPr>
+                <w:color w:val="3D3B3B"/>
+                <w:sz w:val="17"/>
+              </w:rPr>
+              <w:t>Confirmed phases, owners, data requirements, dependencies, and milestone dates</w:t>
+            </w:r>
+          </w:p>
+        </w:tc>
+        <w:tc>
+          <w:tcPr>
+            <w:tcW w:type="dxa" w:w="3024"/>
+          </w:tcPr>
+          <w:p>
+            <w:pPr>
+              <w:spacing w:before="60" w:after="60"/>
+            </w:pPr>
+            <w:r>
+              <w:rPr>
+                <w:color w:val="3D3B3B"/>
+                <w:sz w:val="17"/>
+              </w:rPr>
+              <w:t>Required</w:t>
+            </w:r>
+          </w:p>
+        </w:tc>
+      </w:tr>
+      <w:tr>
+        <w:tc>
+          <w:tcPr>
+            <w:tcW w:type="dxa" w:w="3024"/>
+          </w:tcPr>
+          <w:p>
+            <w:pPr>
+              <w:spacing w:before="60" w:after="60"/>
+            </w:pPr>
+            <w:r>
+              <w:rPr>
+                <w:color w:val="3D3B3B"/>
+                <w:sz w:val="17"/>
+              </w:rPr>
+              <w:t>Data Migration Plan</w:t>
+            </w:r>
+          </w:p>
+        </w:tc>
+        <w:tc>
+          <w:tcPr>
+            <w:tcW w:type="dxa" w:w="3024"/>
+          </w:tcPr>
+          <w:p>
+            <w:pPr>
+              <w:spacing w:before="60" w:after="60"/>
+            </w:pPr>
+            <w:r>
+              <w:rPr>
+                <w:color w:val="3D3B3B"/>
+                <w:sz w:val="17"/>
+              </w:rPr>
+              <w:t>Data sources, ownership, cleansing rules, mapping, and reconciliation method</w:t>
+            </w:r>
+          </w:p>
+        </w:tc>
+        <w:tc>
+          <w:tcPr>
+            <w:tcW w:type="dxa" w:w="3024"/>
+          </w:tcPr>
+          <w:p>
+            <w:pPr>
+              <w:spacing w:before="60" w:after="60"/>
+            </w:pPr>
+            <w:r>
+              <w:rPr>
+                <w:color w:val="3D3B3B"/>
+                <w:sz w:val="17"/>
+              </w:rPr>
+              <w:t>Required</w:t>
+            </w:r>
+          </w:p>
+        </w:tc>
+      </w:tr>
+    </w:tbl>
+    <w:p>
+      <w:pPr>
+        <w:spacing w:before="280" w:after="80"/>
+      </w:pPr>
+      <w:r>
+        <w:rPr>
+          <w:rFonts w:ascii="Calibri Light" w:hAnsi="Calibri Light"/>
+          <w:b/>
+          <w:color w:val="142444"/>
+          <w:sz w:val="26"/>
+        </w:rPr>
+        <w:t>4.  CLIENT-SPECIFIC SCOPE OF WORK</w:t>
+      </w:r>
+    </w:p>
+    <w:p>
+      <w:pPr>
+        <w:spacing w:before="40" w:after="40"/>
+        <w:pBdr>
+          <w:bottom w:val="single" w:sz="8" w:space="1" w:color="FCB900"/>
+        </w:pBdr>
+      </w:pPr>
+    </w:p>
+    <w:p>
+      <w:pPr>
+        <w:spacing w:after="120" w:line="276" w:lineRule="auto"/>
+      </w:pPr>
+      <w:r>
+        <w:rPr>
+          <w:b w:val="0"/>
+          <w:i w:val="0"/>
+          <w:color w:val="3D3B3B"/>
+          <w:sz w:val="20"/>
+        </w:rPr>
+        <w:t>This proposal is based on the modules and business processes confirmed during the initial discussion. Only the modules listed below are included in this quotation. Any additional module, workflow, integration, or report requested after approval will be handled through the change request process in Section 12.</w:t>
       </w:r>
     </w:p>
     <w:p>
@@ -609,7 +1240,7 @@
           <w:color w:val="3D3B3B"/>
           <w:sz w:val="19"/>
         </w:rPr>
-        <w:t xml:space="preserve">  •  Odoo Installation &amp; Server Configuration (Cloud / On-Premise)</w:t>
+        <w:t xml:space="preserve">  •  {MODULE_1}: {MODULE_1_SCOPE}</w:t>
       </w:r>
     </w:p>
     <w:p>
@@ -622,7 +1253,7 @@
           <w:color w:val="3D3B3B"/>
           <w:sz w:val="19"/>
         </w:rPr>
-        <w:t xml:space="preserve">  •  Sales &amp; CRM: pipeline management, lead tracking, quotation templates, invoicing workflow</w:t>
+        <w:t xml:space="preserve">  •  {MODULE_2}: {MODULE_2_SCOPE}</w:t>
       </w:r>
     </w:p>
     <w:p>
@@ -635,7 +1266,7 @@
           <w:color w:val="3D3B3B"/>
           <w:sz w:val="19"/>
         </w:rPr>
-        <w:t xml:space="preserve">  •  Accounting &amp; Finance: chart of accounts, tax rules, multi-currency, financial reports, bank reconciliation</w:t>
+        <w:t xml:space="preserve">  •  {MODULE_3}: {MODULE_3_SCOPE}</w:t>
       </w:r>
     </w:p>
     <w:p>
@@ -648,7 +1279,7 @@
           <w:color w:val="3D3B3B"/>
           <w:sz w:val="19"/>
         </w:rPr>
-        <w:t xml:space="preserve">  •  Inventory &amp; Warehouse Management: stock locations, transfers, valuation methods, reordering rules</w:t>
+        <w:t xml:space="preserve">  •  {MODULE_4}: {MODULE_4_SCOPE}</w:t>
       </w:r>
     </w:p>
     <w:p>
@@ -661,7 +1292,7 @@
           <w:color w:val="3D3B3B"/>
           <w:sz w:val="19"/>
         </w:rPr>
-        <w:t xml:space="preserve">  •  Purchasing &amp; Vendor Management: purchase orders, vendor pricing, approval workflows</w:t>
+        <w:t xml:space="preserve">  •  {MODULE_5}: {MODULE_5_SCOPE}</w:t>
       </w:r>
     </w:p>
     <w:p>
@@ -674,59 +1305,7 @@
           <w:color w:val="3D3B3B"/>
           <w:sz w:val="19"/>
         </w:rPr>
-        <w:t xml:space="preserve">  •  Human Resources: employee records, contracts, leave management, payroll configuration</w:t>
-      </w:r>
-    </w:p>
-    <w:p>
-      <w:pPr>
-        <w:spacing w:after="40"/>
-        <w:ind w:left="283"/>
-      </w:pPr>
-      <w:r>
-        <w:rPr>
-          <w:color w:val="3D3B3B"/>
-          <w:sz w:val="19"/>
-        </w:rPr>
-        <w:t xml:space="preserve">  •  Manufacturing / Bill of Materials: BOM structure, work orders, routing (if applicable)</w:t>
-      </w:r>
-    </w:p>
-    <w:p>
-      <w:pPr>
-        <w:spacing w:after="40"/>
-        <w:ind w:left="283"/>
-      </w:pPr>
-      <w:r>
-        <w:rPr>
-          <w:color w:val="3D3B3B"/>
-          <w:sz w:val="19"/>
-        </w:rPr>
-        <w:t xml:space="preserve">  •  Website &amp; E-commerce: storefront setup, theme customization, product pages, checkout flow</w:t>
-      </w:r>
-    </w:p>
-    <w:p>
-      <w:pPr>
-        <w:spacing w:after="40"/>
-        <w:ind w:left="283"/>
-      </w:pPr>
-      <w:r>
-        <w:rPr>
-          <w:color w:val="3D3B3B"/>
-          <w:sz w:val="19"/>
-        </w:rPr>
-        <w:t xml:space="preserve">  •  Email Marketing: campaign creation, subscriber management, performance analytics</w:t>
-      </w:r>
-    </w:p>
-    <w:p>
-      <w:pPr>
-        <w:spacing w:after="40"/>
-        <w:ind w:left="283"/>
-      </w:pPr>
-      <w:r>
-        <w:rPr>
-          <w:color w:val="3D3B3B"/>
-          <w:sz w:val="19"/>
-        </w:rPr>
-        <w:t xml:space="preserve">  •  Project Management: project planning, task assignment, timesheets, profitability analysis</w:t>
+        <w:t xml:space="preserve">  •  Odoo Installation &amp; Environment Setup: cloud or on-premise setup, access rights, base configuration, and email settings</w:t>
       </w:r>
     </w:p>
     <w:p/>
@@ -908,144 +1487,407 @@
     </w:p>
     <w:p>
       <w:pPr>
-        <w:spacing w:before="280" w:after="80"/>
+        <w:spacing w:after="80" w:line="276" w:lineRule="auto"/>
       </w:pPr>
       <w:r>
         <w:rPr>
-          <w:rFonts w:ascii="Calibri Light" w:hAnsi="Calibri Light"/>
           <w:b/>
+          <w:i w:val="0"/>
           <w:color w:val="142444"/>
-          <w:sz w:val="26"/>
+          <w:sz w:val="20"/>
         </w:rPr>
-        <w:t>4.  EXCLUSIONS</w:t>
+        <w:t>Deliverables matrix:</w:t>
       </w:r>
     </w:p>
-    <w:p>
-      <w:pPr>
-        <w:spacing w:before="40" w:after="40"/>
-        <w:pBdr>
-          <w:bottom w:val="single" w:sz="8" w:space="1" w:color="FCB900"/>
-        </w:pBdr>
-      </w:pPr>
-    </w:p>
-    <w:p>
-      <w:pPr>
-        <w:spacing w:after="120" w:line="276" w:lineRule="auto"/>
-      </w:pPr>
-      <w:r>
-        <w:rPr>
-          <w:b w:val="0"/>
-          <w:i w:val="0"/>
-          <w:color w:val="3D3B3B"/>
-          <w:sz w:val="20"/>
-        </w:rPr>
-        <w:t>The following are explicitly excluded from this quotation unless separately agreed in writing:</w:t>
-      </w:r>
-    </w:p>
-    <w:p>
-      <w:pPr>
-        <w:spacing w:after="40"/>
-        <w:ind w:left="283"/>
-      </w:pPr>
-      <w:r>
-        <w:rPr>
-          <w:color w:val="3D3B3B"/>
-          <w:sz w:val="19"/>
-        </w:rPr>
-        <w:t xml:space="preserve">  •  Odoo Online subscription fees or Odoo Enterprise license costs (paid directly to Odoo S.A. by you)</w:t>
-      </w:r>
-    </w:p>
-    <w:p>
-      <w:pPr>
-        <w:spacing w:after="40"/>
-        <w:ind w:left="283"/>
-      </w:pPr>
-      <w:r>
-        <w:rPr>
-          <w:color w:val="3D3B3B"/>
-          <w:sz w:val="19"/>
-        </w:rPr>
-        <w:t xml:space="preserve">  •  Third-party Odoo apps or modules purchased from the Odoo App Store</w:t>
-      </w:r>
-    </w:p>
-    <w:p>
-      <w:pPr>
-        <w:spacing w:after="40"/>
-        <w:ind w:left="283"/>
-      </w:pPr>
-      <w:r>
-        <w:rPr>
-          <w:color w:val="3D3B3B"/>
-          <w:sz w:val="19"/>
-        </w:rPr>
-        <w:t xml:space="preserve">  •  Website content creation (copywriting, photography, videography)</w:t>
-      </w:r>
-    </w:p>
-    <w:p>
-      <w:pPr>
-        <w:spacing w:after="40"/>
-        <w:ind w:left="283"/>
-      </w:pPr>
-      <w:r>
-        <w:rPr>
-          <w:color w:val="3D3B3B"/>
-          <w:sz w:val="19"/>
-        </w:rPr>
-        <w:t xml:space="preserve">  •  Custom mobile or tablet application development</w:t>
-      </w:r>
-    </w:p>
-    <w:p>
-      <w:pPr>
-        <w:spacing w:after="40"/>
-        <w:ind w:left="283"/>
-      </w:pPr>
-      <w:r>
-        <w:rPr>
-          <w:color w:val="3D3B3B"/>
-          <w:sz w:val="19"/>
-        </w:rPr>
-        <w:t xml:space="preserve">  •  Ongoing support and maintenance beyond the 30-day warranty period (separate support plans available in Section 7)</w:t>
-      </w:r>
-    </w:p>
-    <w:p>
-      <w:pPr>
-        <w:spacing w:after="40"/>
-        <w:ind w:left="283"/>
-      </w:pPr>
-      <w:r>
-        <w:rPr>
-          <w:color w:val="3D3B3B"/>
-          <w:sz w:val="19"/>
-        </w:rPr>
-        <w:t xml:space="preserve">  •  Hardware, server infrastructure, or IT equipment procurement</w:t>
-      </w:r>
-    </w:p>
-    <w:p>
-      <w:pPr>
-        <w:spacing w:after="40"/>
-        <w:ind w:left="283"/>
-      </w:pPr>
-      <w:r>
-        <w:rPr>
-          <w:color w:val="3D3B3B"/>
-          <w:sz w:val="19"/>
-        </w:rPr>
-        <w:t xml:space="preserve">  •  Graphic design, brand identity, or logo creation beyond Odoo website theme configuration</w:t>
-      </w:r>
-    </w:p>
-    <w:p>
-      <w:pPr>
-        <w:spacing w:after="40"/>
-        <w:ind w:left="283"/>
-      </w:pPr>
-      <w:r>
-        <w:rPr>
-          <w:color w:val="3D3B3B"/>
-          <w:sz w:val="19"/>
-        </w:rPr>
-        <w:t xml:space="preserve">  •  Integration with systems not explicitly listed in this quotation</w:t>
-      </w:r>
-    </w:p>
+    <w:tbl>
+      <w:tblPr>
+        <w:tblW w:type="auto" w:w="0"/>
+        <w:jc w:val="center"/>
+        <w:tblLook w:firstColumn="1" w:firstRow="1" w:lastColumn="0" w:lastRow="0" w:noHBand="0" w:noVBand="1" w:val="04A0"/>
+      </w:tblPr>
+      <w:tblGrid>
+        <w:gridCol w:w="3024"/>
+        <w:gridCol w:w="3024"/>
+        <w:gridCol w:w="3024"/>
+      </w:tblGrid>
+      <w:tr>
+        <w:tc>
+          <w:tcPr>
+            <w:tcW w:type="dxa" w:w="2268"/>
+            <w:shd w:fill="171414"/>
+          </w:tcPr>
+          <w:p>
+            <w:pPr>
+              <w:spacing w:before="60" w:after="60"/>
+            </w:pPr>
+            <w:r>
+              <w:rPr>
+                <w:b/>
+                <w:color w:val="FFFFFF"/>
+                <w:sz w:val="16"/>
+              </w:rPr>
+              <w:t>Phase</w:t>
+            </w:r>
+          </w:p>
+        </w:tc>
+        <w:tc>
+          <w:tcPr>
+            <w:tcW w:type="dxa" w:w="5102"/>
+            <w:shd w:fill="171414"/>
+          </w:tcPr>
+          <w:p>
+            <w:pPr>
+              <w:spacing w:before="60" w:after="60"/>
+            </w:pPr>
+            <w:r>
+              <w:rPr>
+                <w:b/>
+                <w:color w:val="FFFFFF"/>
+                <w:sz w:val="16"/>
+              </w:rPr>
+              <w:t>Main Deliverable</w:t>
+            </w:r>
+          </w:p>
+        </w:tc>
+        <w:tc>
+          <w:tcPr>
+            <w:tcW w:type="dxa" w:w="1871"/>
+            <w:shd w:fill="171414"/>
+          </w:tcPr>
+          <w:p>
+            <w:pPr>
+              <w:spacing w:before="60" w:after="60"/>
+            </w:pPr>
+            <w:r>
+              <w:rPr>
+                <w:b/>
+                <w:color w:val="FFFFFF"/>
+                <w:sz w:val="16"/>
+              </w:rPr>
+              <w:t>Client Approval</w:t>
+            </w:r>
+          </w:p>
+        </w:tc>
+      </w:tr>
+      <w:tr>
+        <w:tc>
+          <w:tcPr>
+            <w:tcW w:type="dxa" w:w="3024"/>
+          </w:tcPr>
+          <w:p>
+            <w:pPr>
+              <w:spacing w:before="60" w:after="60"/>
+            </w:pPr>
+            <w:r>
+              <w:rPr>
+                <w:color w:val="3D3B3B"/>
+                <w:sz w:val="17"/>
+              </w:rPr>
+              <w:t>Discovery</w:t>
+            </w:r>
+          </w:p>
+        </w:tc>
+        <w:tc>
+          <w:tcPr>
+            <w:tcW w:type="dxa" w:w="3024"/>
+          </w:tcPr>
+          <w:p>
+            <w:pPr>
+              <w:spacing w:before="60" w:after="60"/>
+            </w:pPr>
+            <w:r>
+              <w:rPr>
+                <w:color w:val="3D3B3B"/>
+                <w:sz w:val="17"/>
+              </w:rPr>
+              <w:t>BRD, GAP Analysis, process maps, implementation plan</w:t>
+            </w:r>
+          </w:p>
+        </w:tc>
+        <w:tc>
+          <w:tcPr>
+            <w:tcW w:type="dxa" w:w="3024"/>
+          </w:tcPr>
+          <w:p>
+            <w:pPr>
+              <w:spacing w:before="60" w:after="60"/>
+            </w:pPr>
+            <w:r>
+              <w:rPr>
+                <w:color w:val="3D3B3B"/>
+                <w:sz w:val="17"/>
+              </w:rPr>
+              <w:t>Required</w:t>
+            </w:r>
+          </w:p>
+        </w:tc>
+      </w:tr>
+      <w:tr>
+        <w:tc>
+          <w:tcPr>
+            <w:tcW w:type="dxa" w:w="3024"/>
+          </w:tcPr>
+          <w:p>
+            <w:pPr>
+              <w:spacing w:before="60" w:after="60"/>
+            </w:pPr>
+            <w:r>
+              <w:rPr>
+                <w:color w:val="3D3B3B"/>
+                <w:sz w:val="17"/>
+              </w:rPr>
+              <w:t>Configuration</w:t>
+            </w:r>
+          </w:p>
+        </w:tc>
+        <w:tc>
+          <w:tcPr>
+            <w:tcW w:type="dxa" w:w="3024"/>
+          </w:tcPr>
+          <w:p>
+            <w:pPr>
+              <w:spacing w:before="60" w:after="60"/>
+            </w:pPr>
+            <w:r>
+              <w:rPr>
+                <w:color w:val="3D3B3B"/>
+                <w:sz w:val="17"/>
+              </w:rPr>
+              <w:t>Configured modules, roles, workflows, templates, and base reports</w:t>
+            </w:r>
+          </w:p>
+        </w:tc>
+        <w:tc>
+          <w:tcPr>
+            <w:tcW w:type="dxa" w:w="3024"/>
+          </w:tcPr>
+          <w:p>
+            <w:pPr>
+              <w:spacing w:before="60" w:after="60"/>
+            </w:pPr>
+            <w:r>
+              <w:rPr>
+                <w:color w:val="3D3B3B"/>
+                <w:sz w:val="17"/>
+              </w:rPr>
+              <w:t>Required</w:t>
+            </w:r>
+          </w:p>
+        </w:tc>
+      </w:tr>
+      <w:tr>
+        <w:tc>
+          <w:tcPr>
+            <w:tcW w:type="dxa" w:w="3024"/>
+          </w:tcPr>
+          <w:p>
+            <w:pPr>
+              <w:spacing w:before="60" w:after="60"/>
+            </w:pPr>
+            <w:r>
+              <w:rPr>
+                <w:color w:val="3D3B3B"/>
+                <w:sz w:val="17"/>
+              </w:rPr>
+              <w:t>Migration</w:t>
+            </w:r>
+          </w:p>
+        </w:tc>
+        <w:tc>
+          <w:tcPr>
+            <w:tcW w:type="dxa" w:w="3024"/>
+          </w:tcPr>
+          <w:p>
+            <w:pPr>
+              <w:spacing w:before="60" w:after="60"/>
+            </w:pPr>
+            <w:r>
+              <w:rPr>
+                <w:color w:val="3D3B3B"/>
+                <w:sz w:val="17"/>
+              </w:rPr>
+              <w:t>Imported master data and reconciliation report</w:t>
+            </w:r>
+          </w:p>
+        </w:tc>
+        <w:tc>
+          <w:tcPr>
+            <w:tcW w:type="dxa" w:w="3024"/>
+          </w:tcPr>
+          <w:p>
+            <w:pPr>
+              <w:spacing w:before="60" w:after="60"/>
+            </w:pPr>
+            <w:r>
+              <w:rPr>
+                <w:color w:val="3D3B3B"/>
+                <w:sz w:val="17"/>
+              </w:rPr>
+              <w:t>Required</w:t>
+            </w:r>
+          </w:p>
+        </w:tc>
+      </w:tr>
+      <w:tr>
+        <w:tc>
+          <w:tcPr>
+            <w:tcW w:type="dxa" w:w="3024"/>
+          </w:tcPr>
+          <w:p>
+            <w:pPr>
+              <w:spacing w:before="60" w:after="60"/>
+            </w:pPr>
+            <w:r>
+              <w:rPr>
+                <w:color w:val="3D3B3B"/>
+                <w:sz w:val="17"/>
+              </w:rPr>
+              <w:t>Customization</w:t>
+            </w:r>
+          </w:p>
+        </w:tc>
+        <w:tc>
+          <w:tcPr>
+            <w:tcW w:type="dxa" w:w="3024"/>
+          </w:tcPr>
+          <w:p>
+            <w:pPr>
+              <w:spacing w:before="60" w:after="60"/>
+            </w:pPr>
+            <w:r>
+              <w:rPr>
+                <w:color w:val="3D3B3B"/>
+                <w:sz w:val="17"/>
+              </w:rPr>
+              <w:t>Approved custom fields, reports, automations, and integrations</w:t>
+            </w:r>
+          </w:p>
+        </w:tc>
+        <w:tc>
+          <w:tcPr>
+            <w:tcW w:type="dxa" w:w="3024"/>
+          </w:tcPr>
+          <w:p>
+            <w:pPr>
+              <w:spacing w:before="60" w:after="60"/>
+            </w:pPr>
+            <w:r>
+              <w:rPr>
+                <w:color w:val="3D3B3B"/>
+                <w:sz w:val="17"/>
+              </w:rPr>
+              <w:t>Required</w:t>
+            </w:r>
+          </w:p>
+        </w:tc>
+      </w:tr>
+      <w:tr>
+        <w:tc>
+          <w:tcPr>
+            <w:tcW w:type="dxa" w:w="3024"/>
+          </w:tcPr>
+          <w:p>
+            <w:pPr>
+              <w:spacing w:before="60" w:after="60"/>
+            </w:pPr>
+            <w:r>
+              <w:rPr>
+                <w:color w:val="3D3B3B"/>
+                <w:sz w:val="17"/>
+              </w:rPr>
+              <w:t>Training</w:t>
+            </w:r>
+          </w:p>
+        </w:tc>
+        <w:tc>
+          <w:tcPr>
+            <w:tcW w:type="dxa" w:w="3024"/>
+          </w:tcPr>
+          <w:p>
+            <w:pPr>
+              <w:spacing w:before="60" w:after="60"/>
+            </w:pPr>
+            <w:r>
+              <w:rPr>
+                <w:color w:val="3D3B3B"/>
+                <w:sz w:val="17"/>
+              </w:rPr>
+              <w:t>User manual, admin guide, recorded sessions, and attendance record</w:t>
+            </w:r>
+          </w:p>
+        </w:tc>
+        <w:tc>
+          <w:tcPr>
+            <w:tcW w:type="dxa" w:w="3024"/>
+          </w:tcPr>
+          <w:p>
+            <w:pPr>
+              <w:spacing w:before="60" w:after="60"/>
+            </w:pPr>
+            <w:r>
+              <w:rPr>
+                <w:color w:val="3D3B3B"/>
+                <w:sz w:val="17"/>
+              </w:rPr>
+              <w:t>Required</w:t>
+            </w:r>
+          </w:p>
+        </w:tc>
+      </w:tr>
+      <w:tr>
+        <w:tc>
+          <w:tcPr>
+            <w:tcW w:type="dxa" w:w="3024"/>
+          </w:tcPr>
+          <w:p>
+            <w:pPr>
+              <w:spacing w:before="60" w:after="60"/>
+            </w:pPr>
+            <w:r>
+              <w:rPr>
+                <w:color w:val="3D3B3B"/>
+                <w:sz w:val="17"/>
+              </w:rPr>
+              <w:t>Go-Live</w:t>
+            </w:r>
+          </w:p>
+        </w:tc>
+        <w:tc>
+          <w:tcPr>
+            <w:tcW w:type="dxa" w:w="3024"/>
+          </w:tcPr>
+          <w:p>
+            <w:pPr>
+              <w:spacing w:before="60" w:after="60"/>
+            </w:pPr>
+            <w:r>
+              <w:rPr>
+                <w:color w:val="3D3B3B"/>
+                <w:sz w:val="17"/>
+              </w:rPr>
+              <w:t>Production system, launch checklist, warranty start confirmation</w:t>
+            </w:r>
+          </w:p>
+        </w:tc>
+        <w:tc>
+          <w:tcPr>
+            <w:tcW w:type="dxa" w:w="3024"/>
+          </w:tcPr>
+          <w:p>
+            <w:pPr>
+              <w:spacing w:before="60" w:after="60"/>
+            </w:pPr>
+            <w:r>
+              <w:rPr>
+                <w:color w:val="3D3B3B"/>
+                <w:sz w:val="17"/>
+              </w:rPr>
+              <w:t>Required</w:t>
+            </w:r>
+          </w:p>
+        </w:tc>
+      </w:tr>
+    </w:tbl>
     <w:p>
       <w:pPr>
         <w:spacing w:before="280" w:after="80"/>
@@ -1057,7 +1899,7 @@
           <w:color w:val="142444"/>
           <w:sz w:val="26"/>
         </w:rPr>
-        <w:t>5.  IMPLEMENTATION METHODOLOGY &amp; TIMELINE</w:t>
+        <w:t>5.  IMPLEMENTATION METHODOLOGY &amp; MILESTONES</w:t>
       </w:r>
     </w:p>
     <w:p>
@@ -1294,6 +2136,409 @@
     </w:p>
     <w:p>
       <w:pPr>
+        <w:spacing w:after="80" w:line="276" w:lineRule="auto"/>
+      </w:pPr>
+      <w:r>
+        <w:rPr>
+          <w:b/>
+          <w:i w:val="0"/>
+          <w:color w:val="142444"/>
+          <w:sz w:val="20"/>
+        </w:rPr>
+        <w:t>Milestone acceptance checkpoints:</w:t>
+      </w:r>
+    </w:p>
+    <w:tbl>
+      <w:tblPr>
+        <w:tblW w:type="auto" w:w="0"/>
+        <w:jc w:val="center"/>
+        <w:tblLook w:firstColumn="1" w:firstRow="1" w:lastColumn="0" w:lastRow="0" w:noHBand="0" w:noVBand="1" w:val="04A0"/>
+      </w:tblPr>
+      <w:tblGrid>
+        <w:gridCol w:w="3024"/>
+        <w:gridCol w:w="3024"/>
+        <w:gridCol w:w="3024"/>
+      </w:tblGrid>
+      <w:tr>
+        <w:tc>
+          <w:tcPr>
+            <w:tcW w:type="dxa" w:w="2494"/>
+            <w:shd w:fill="171414"/>
+          </w:tcPr>
+          <w:p>
+            <w:pPr>
+              <w:spacing w:before="60" w:after="60"/>
+            </w:pPr>
+            <w:r>
+              <w:rPr>
+                <w:b/>
+                <w:color w:val="FFFFFF"/>
+                <w:sz w:val="16"/>
+              </w:rPr>
+              <w:t>Milestone</w:t>
+            </w:r>
+          </w:p>
+        </w:tc>
+        <w:tc>
+          <w:tcPr>
+            <w:tcW w:type="dxa" w:w="5102"/>
+            <w:shd w:fill="171414"/>
+          </w:tcPr>
+          <w:p>
+            <w:pPr>
+              <w:spacing w:before="60" w:after="60"/>
+            </w:pPr>
+            <w:r>
+              <w:rPr>
+                <w:b/>
+                <w:color w:val="FFFFFF"/>
+                <w:sz w:val="16"/>
+              </w:rPr>
+              <w:t>Acceptance Evidence</w:t>
+            </w:r>
+          </w:p>
+        </w:tc>
+        <w:tc>
+          <w:tcPr>
+            <w:tcW w:type="dxa" w:w="1701"/>
+            <w:shd w:fill="171414"/>
+          </w:tcPr>
+          <w:p>
+            <w:pPr>
+              <w:spacing w:before="60" w:after="60"/>
+            </w:pPr>
+            <w:r>
+              <w:rPr>
+                <w:b/>
+                <w:color w:val="FFFFFF"/>
+                <w:sz w:val="16"/>
+              </w:rPr>
+              <w:t>Sign-off Required</w:t>
+            </w:r>
+          </w:p>
+        </w:tc>
+      </w:tr>
+      <w:tr>
+        <w:tc>
+          <w:tcPr>
+            <w:tcW w:type="dxa" w:w="3024"/>
+          </w:tcPr>
+          <w:p>
+            <w:pPr>
+              <w:spacing w:before="60" w:after="60"/>
+            </w:pPr>
+            <w:r>
+              <w:rPr>
+                <w:color w:val="3D3B3B"/>
+                <w:sz w:val="17"/>
+              </w:rPr>
+              <w:t>Discovery complete</w:t>
+            </w:r>
+          </w:p>
+        </w:tc>
+        <w:tc>
+          <w:tcPr>
+            <w:tcW w:type="dxa" w:w="3024"/>
+          </w:tcPr>
+          <w:p>
+            <w:pPr>
+              <w:spacing w:before="60" w:after="60"/>
+            </w:pPr>
+            <w:r>
+              <w:rPr>
+                <w:color w:val="3D3B3B"/>
+                <w:sz w:val="17"/>
+              </w:rPr>
+              <w:t>Approved BRD, GAP Analysis, process maps, and project plan</w:t>
+            </w:r>
+          </w:p>
+        </w:tc>
+        <w:tc>
+          <w:tcPr>
+            <w:tcW w:type="dxa" w:w="3024"/>
+          </w:tcPr>
+          <w:p>
+            <w:pPr>
+              <w:spacing w:before="60" w:after="60"/>
+            </w:pPr>
+            <w:r>
+              <w:rPr>
+                <w:color w:val="3D3B3B"/>
+                <w:sz w:val="17"/>
+              </w:rPr>
+              <w:t>Yes</w:t>
+            </w:r>
+          </w:p>
+        </w:tc>
+      </w:tr>
+      <w:tr>
+        <w:tc>
+          <w:tcPr>
+            <w:tcW w:type="dxa" w:w="3024"/>
+          </w:tcPr>
+          <w:p>
+            <w:pPr>
+              <w:spacing w:before="60" w:after="60"/>
+            </w:pPr>
+            <w:r>
+              <w:rPr>
+                <w:color w:val="3D3B3B"/>
+                <w:sz w:val="17"/>
+              </w:rPr>
+              <w:t>Configuration complete</w:t>
+            </w:r>
+          </w:p>
+        </w:tc>
+        <w:tc>
+          <w:tcPr>
+            <w:tcW w:type="dxa" w:w="3024"/>
+          </w:tcPr>
+          <w:p>
+            <w:pPr>
+              <w:spacing w:before="60" w:after="60"/>
+            </w:pPr>
+            <w:r>
+              <w:rPr>
+                <w:color w:val="3D3B3B"/>
+                <w:sz w:val="17"/>
+              </w:rPr>
+              <w:t>Configured modules demonstrated to client stakeholders</w:t>
+            </w:r>
+          </w:p>
+        </w:tc>
+        <w:tc>
+          <w:tcPr>
+            <w:tcW w:type="dxa" w:w="3024"/>
+          </w:tcPr>
+          <w:p>
+            <w:pPr>
+              <w:spacing w:before="60" w:after="60"/>
+            </w:pPr>
+            <w:r>
+              <w:rPr>
+                <w:color w:val="3D3B3B"/>
+                <w:sz w:val="17"/>
+              </w:rPr>
+              <w:t>Yes</w:t>
+            </w:r>
+          </w:p>
+        </w:tc>
+      </w:tr>
+      <w:tr>
+        <w:tc>
+          <w:tcPr>
+            <w:tcW w:type="dxa" w:w="3024"/>
+          </w:tcPr>
+          <w:p>
+            <w:pPr>
+              <w:spacing w:before="60" w:after="60"/>
+            </w:pPr>
+            <w:r>
+              <w:rPr>
+                <w:color w:val="3D3B3B"/>
+                <w:sz w:val="17"/>
+              </w:rPr>
+              <w:t>Migration complete</w:t>
+            </w:r>
+          </w:p>
+        </w:tc>
+        <w:tc>
+          <w:tcPr>
+            <w:tcW w:type="dxa" w:w="3024"/>
+          </w:tcPr>
+          <w:p>
+            <w:pPr>
+              <w:spacing w:before="60" w:after="60"/>
+            </w:pPr>
+            <w:r>
+              <w:rPr>
+                <w:color w:val="3D3B3B"/>
+                <w:sz w:val="17"/>
+              </w:rPr>
+              <w:t>Reconciliation report accepted by client owner</w:t>
+            </w:r>
+          </w:p>
+        </w:tc>
+        <w:tc>
+          <w:tcPr>
+            <w:tcW w:type="dxa" w:w="3024"/>
+          </w:tcPr>
+          <w:p>
+            <w:pPr>
+              <w:spacing w:before="60" w:after="60"/>
+            </w:pPr>
+            <w:r>
+              <w:rPr>
+                <w:color w:val="3D3B3B"/>
+                <w:sz w:val="17"/>
+              </w:rPr>
+              <w:t>Yes</w:t>
+            </w:r>
+          </w:p>
+        </w:tc>
+      </w:tr>
+      <w:tr>
+        <w:tc>
+          <w:tcPr>
+            <w:tcW w:type="dxa" w:w="3024"/>
+          </w:tcPr>
+          <w:p>
+            <w:pPr>
+              <w:spacing w:before="60" w:after="60"/>
+            </w:pPr>
+            <w:r>
+              <w:rPr>
+                <w:color w:val="3D3B3B"/>
+                <w:sz w:val="17"/>
+              </w:rPr>
+              <w:t>UAT complete</w:t>
+            </w:r>
+          </w:p>
+        </w:tc>
+        <w:tc>
+          <w:tcPr>
+            <w:tcW w:type="dxa" w:w="3024"/>
+          </w:tcPr>
+          <w:p>
+            <w:pPr>
+              <w:spacing w:before="60" w:after="60"/>
+            </w:pPr>
+            <w:r>
+              <w:rPr>
+                <w:color w:val="3D3B3B"/>
+                <w:sz w:val="17"/>
+              </w:rPr>
+              <w:t>All critical and high-priority issues closed or accepted</w:t>
+            </w:r>
+          </w:p>
+        </w:tc>
+        <w:tc>
+          <w:tcPr>
+            <w:tcW w:type="dxa" w:w="3024"/>
+          </w:tcPr>
+          <w:p>
+            <w:pPr>
+              <w:spacing w:before="60" w:after="60"/>
+            </w:pPr>
+            <w:r>
+              <w:rPr>
+                <w:color w:val="3D3B3B"/>
+                <w:sz w:val="17"/>
+              </w:rPr>
+              <w:t>Yes</w:t>
+            </w:r>
+          </w:p>
+        </w:tc>
+      </w:tr>
+      <w:tr>
+        <w:tc>
+          <w:tcPr>
+            <w:tcW w:type="dxa" w:w="3024"/>
+          </w:tcPr>
+          <w:p>
+            <w:pPr>
+              <w:spacing w:before="60" w:after="60"/>
+            </w:pPr>
+            <w:r>
+              <w:rPr>
+                <w:color w:val="3D3B3B"/>
+                <w:sz w:val="17"/>
+              </w:rPr>
+              <w:t>Training complete</w:t>
+            </w:r>
+          </w:p>
+        </w:tc>
+        <w:tc>
+          <w:tcPr>
+            <w:tcW w:type="dxa" w:w="3024"/>
+          </w:tcPr>
+          <w:p>
+            <w:pPr>
+              <w:spacing w:before="60" w:after="60"/>
+            </w:pPr>
+            <w:r>
+              <w:rPr>
+                <w:color w:val="3D3B3B"/>
+                <w:sz w:val="17"/>
+              </w:rPr>
+              <w:t>Training materials delivered and attendance recorded</w:t>
+            </w:r>
+          </w:p>
+        </w:tc>
+        <w:tc>
+          <w:tcPr>
+            <w:tcW w:type="dxa" w:w="3024"/>
+          </w:tcPr>
+          <w:p>
+            <w:pPr>
+              <w:spacing w:before="60" w:after="60"/>
+            </w:pPr>
+            <w:r>
+              <w:rPr>
+                <w:color w:val="3D3B3B"/>
+                <w:sz w:val="17"/>
+              </w:rPr>
+              <w:t>Yes</w:t>
+            </w:r>
+          </w:p>
+        </w:tc>
+      </w:tr>
+      <w:tr>
+        <w:tc>
+          <w:tcPr>
+            <w:tcW w:type="dxa" w:w="3024"/>
+          </w:tcPr>
+          <w:p>
+            <w:pPr>
+              <w:spacing w:before="60" w:after="60"/>
+            </w:pPr>
+            <w:r>
+              <w:rPr>
+                <w:color w:val="3D3B3B"/>
+                <w:sz w:val="17"/>
+              </w:rPr>
+              <w:t>Go-live approved</w:t>
+            </w:r>
+          </w:p>
+        </w:tc>
+        <w:tc>
+          <w:tcPr>
+            <w:tcW w:type="dxa" w:w="3024"/>
+          </w:tcPr>
+          <w:p>
+            <w:pPr>
+              <w:spacing w:before="60" w:after="60"/>
+            </w:pPr>
+            <w:r>
+              <w:rPr>
+                <w:color w:val="3D3B3B"/>
+                <w:sz w:val="17"/>
+              </w:rPr>
+              <w:t>Launch checklist completed and production access confirmed</w:t>
+            </w:r>
+          </w:p>
+        </w:tc>
+        <w:tc>
+          <w:tcPr>
+            <w:tcW w:type="dxa" w:w="3024"/>
+          </w:tcPr>
+          <w:p>
+            <w:pPr>
+              <w:spacing w:before="60" w:after="60"/>
+            </w:pPr>
+            <w:r>
+              <w:rPr>
+                <w:color w:val="3D3B3B"/>
+                <w:sz w:val="17"/>
+              </w:rPr>
+              <w:t>Yes</w:t>
+            </w:r>
+          </w:p>
+        </w:tc>
+      </w:tr>
+    </w:tbl>
+    <w:p>
+      <w:pPr>
         <w:spacing w:before="280" w:after="80"/>
       </w:pPr>
       <w:r>
@@ -1443,7 +2688,550 @@
           <w:color w:val="142444"/>
           <w:sz w:val="26"/>
         </w:rPr>
-        <w:t>7.  INVESTMENT &amp; PRICING</w:t>
+        <w:t>7.  ASSUMPTIONS, RISKS, AND SUCCESS CRITERIA</w:t>
+      </w:r>
+    </w:p>
+    <w:p>
+      <w:pPr>
+        <w:spacing w:before="40" w:after="40"/>
+        <w:pBdr>
+          <w:bottom w:val="single" w:sz="8" w:space="1" w:color="FCB900"/>
+        </w:pBdr>
+      </w:pPr>
+    </w:p>
+    <w:p>
+      <w:pPr>
+        <w:spacing w:after="80" w:line="276" w:lineRule="auto"/>
+      </w:pPr>
+      <w:r>
+        <w:rPr>
+          <w:b/>
+          <w:i w:val="0"/>
+          <w:color w:val="142444"/>
+          <w:sz w:val="20"/>
+        </w:rPr>
+        <w:t>Key assumptions:</w:t>
+      </w:r>
+    </w:p>
+    <w:p>
+      <w:pPr>
+        <w:spacing w:after="40"/>
+        <w:ind w:left="283"/>
+      </w:pPr>
+      <w:r>
+        <w:rPr>
+          <w:color w:val="3D3B3B"/>
+          <w:sz w:val="19"/>
+        </w:rPr>
+        <w:t xml:space="preserve">  •  The Client will provide clean and complete master data in the agreed format</w:t>
+      </w:r>
+    </w:p>
+    <w:p>
+      <w:pPr>
+        <w:spacing w:after="40"/>
+        <w:ind w:left="283"/>
+      </w:pPr>
+      <w:r>
+        <w:rPr>
+          <w:color w:val="3D3B3B"/>
+          <w:sz w:val="19"/>
+        </w:rPr>
+        <w:t xml:space="preserve">  •  Odoo licenses, hosting access, SMTP details, payment gateway credentials, and third-party API credentials will be available when needed</w:t>
+      </w:r>
+    </w:p>
+    <w:p>
+      <w:pPr>
+        <w:spacing w:after="40"/>
+        <w:ind w:left="283"/>
+      </w:pPr>
+      <w:r>
+        <w:rPr>
+          <w:color w:val="3D3B3B"/>
+          <w:sz w:val="19"/>
+        </w:rPr>
+        <w:t xml:space="preserve">  •  Client stakeholders will be available for discovery workshops, UAT, training, and approvals</w:t>
+      </w:r>
+    </w:p>
+    <w:p>
+      <w:pPr>
+        <w:spacing w:after="40"/>
+        <w:ind w:left="283"/>
+      </w:pPr>
+      <w:r>
+        <w:rPr>
+          <w:color w:val="3D3B3B"/>
+          <w:sz w:val="19"/>
+        </w:rPr>
+        <w:t xml:space="preserve">  •  Legacy system data exports will be technically accessible and legally authorized for migration</w:t>
+      </w:r>
+    </w:p>
+    <w:p>
+      <w:pPr>
+        <w:spacing w:after="40"/>
+        <w:ind w:left="283"/>
+      </w:pPr>
+      <w:r>
+        <w:rPr>
+          <w:color w:val="3D3B3B"/>
+          <w:sz w:val="19"/>
+        </w:rPr>
+        <w:t xml:space="preserve">  •  Internet connectivity, devices, printers, barcode scanners, and other local infrastructure are outside this quotation unless explicitly listed</w:t>
+      </w:r>
+    </w:p>
+    <w:p>
+      <w:pPr>
+        <w:spacing w:after="80" w:line="276" w:lineRule="auto"/>
+      </w:pPr>
+      <w:r>
+        <w:rPr>
+          <w:b/>
+          <w:i w:val="0"/>
+          <w:color w:val="142444"/>
+          <w:sz w:val="20"/>
+        </w:rPr>
+        <w:t>Main delivery risks and mitigation:</w:t>
+      </w:r>
+    </w:p>
+    <w:tbl>
+      <w:tblPr>
+        <w:tblW w:type="auto" w:w="0"/>
+        <w:jc w:val="center"/>
+        <w:tblLook w:firstColumn="1" w:firstRow="1" w:lastColumn="0" w:lastRow="0" w:noHBand="0" w:noVBand="1" w:val="04A0"/>
+      </w:tblPr>
+      <w:tblGrid>
+        <w:gridCol w:w="3024"/>
+        <w:gridCol w:w="3024"/>
+        <w:gridCol w:w="3024"/>
+      </w:tblGrid>
+      <w:tr>
+        <w:tc>
+          <w:tcPr>
+            <w:tcW w:type="dxa" w:w="2268"/>
+            <w:shd w:fill="171414"/>
+          </w:tcPr>
+          <w:p>
+            <w:pPr>
+              <w:spacing w:before="60" w:after="60"/>
+            </w:pPr>
+            <w:r>
+              <w:rPr>
+                <w:b/>
+                <w:color w:val="FFFFFF"/>
+                <w:sz w:val="16"/>
+              </w:rPr>
+              <w:t>Risk</w:t>
+            </w:r>
+          </w:p>
+        </w:tc>
+        <w:tc>
+          <w:tcPr>
+            <w:tcW w:type="dxa" w:w="3175"/>
+            <w:shd w:fill="171414"/>
+          </w:tcPr>
+          <w:p>
+            <w:pPr>
+              <w:spacing w:before="60" w:after="60"/>
+            </w:pPr>
+            <w:r>
+              <w:rPr>
+                <w:b/>
+                <w:color w:val="FFFFFF"/>
+                <w:sz w:val="16"/>
+              </w:rPr>
+              <w:t>Potential Impact</w:t>
+            </w:r>
+          </w:p>
+        </w:tc>
+        <w:tc>
+          <w:tcPr>
+            <w:tcW w:type="dxa" w:w="3855"/>
+            <w:shd w:fill="171414"/>
+          </w:tcPr>
+          <w:p>
+            <w:pPr>
+              <w:spacing w:before="60" w:after="60"/>
+            </w:pPr>
+            <w:r>
+              <w:rPr>
+                <w:b/>
+                <w:color w:val="FFFFFF"/>
+                <w:sz w:val="16"/>
+              </w:rPr>
+              <w:t>Mitigation</w:t>
+            </w:r>
+          </w:p>
+        </w:tc>
+      </w:tr>
+      <w:tr>
+        <w:tc>
+          <w:tcPr>
+            <w:tcW w:type="dxa" w:w="3024"/>
+          </w:tcPr>
+          <w:p>
+            <w:pPr>
+              <w:spacing w:before="60" w:after="60"/>
+            </w:pPr>
+            <w:r>
+              <w:rPr>
+                <w:color w:val="3D3B3B"/>
+                <w:sz w:val="17"/>
+              </w:rPr>
+              <w:t>Delayed approvals</w:t>
+            </w:r>
+          </w:p>
+        </w:tc>
+        <w:tc>
+          <w:tcPr>
+            <w:tcW w:type="dxa" w:w="3024"/>
+          </w:tcPr>
+          <w:p>
+            <w:pPr>
+              <w:spacing w:before="60" w:after="60"/>
+            </w:pPr>
+            <w:r>
+              <w:rPr>
+                <w:color w:val="3D3B3B"/>
+                <w:sz w:val="17"/>
+              </w:rPr>
+              <w:t>Timeline extension</w:t>
+            </w:r>
+          </w:p>
+        </w:tc>
+        <w:tc>
+          <w:tcPr>
+            <w:tcW w:type="dxa" w:w="3024"/>
+          </w:tcPr>
+          <w:p>
+            <w:pPr>
+              <w:spacing w:before="60" w:after="60"/>
+            </w:pPr>
+            <w:r>
+              <w:rPr>
+                <w:color w:val="3D3B3B"/>
+                <w:sz w:val="17"/>
+              </w:rPr>
+              <w:t>Approval deadlines and weekly steering updates</w:t>
+            </w:r>
+          </w:p>
+        </w:tc>
+      </w:tr>
+      <w:tr>
+        <w:tc>
+          <w:tcPr>
+            <w:tcW w:type="dxa" w:w="3024"/>
+          </w:tcPr>
+          <w:p>
+            <w:pPr>
+              <w:spacing w:before="60" w:after="60"/>
+            </w:pPr>
+            <w:r>
+              <w:rPr>
+                <w:color w:val="3D3B3B"/>
+                <w:sz w:val="17"/>
+              </w:rPr>
+              <w:t>Poor data quality</w:t>
+            </w:r>
+          </w:p>
+        </w:tc>
+        <w:tc>
+          <w:tcPr>
+            <w:tcW w:type="dxa" w:w="3024"/>
+          </w:tcPr>
+          <w:p>
+            <w:pPr>
+              <w:spacing w:before="60" w:after="60"/>
+            </w:pPr>
+            <w:r>
+              <w:rPr>
+                <w:color w:val="3D3B3B"/>
+                <w:sz w:val="17"/>
+              </w:rPr>
+              <w:t>Migration delays or reconciliation issues</w:t>
+            </w:r>
+          </w:p>
+        </w:tc>
+        <w:tc>
+          <w:tcPr>
+            <w:tcW w:type="dxa" w:w="3024"/>
+          </w:tcPr>
+          <w:p>
+            <w:pPr>
+              <w:spacing w:before="60" w:after="60"/>
+            </w:pPr>
+            <w:r>
+              <w:rPr>
+                <w:color w:val="3D3B3B"/>
+                <w:sz w:val="17"/>
+              </w:rPr>
+              <w:t>Early data audit, cleansing template, and sample import</w:t>
+            </w:r>
+          </w:p>
+        </w:tc>
+      </w:tr>
+      <w:tr>
+        <w:tc>
+          <w:tcPr>
+            <w:tcW w:type="dxa" w:w="3024"/>
+          </w:tcPr>
+          <w:p>
+            <w:pPr>
+              <w:spacing w:before="60" w:after="60"/>
+            </w:pPr>
+            <w:r>
+              <w:rPr>
+                <w:color w:val="3D3B3B"/>
+                <w:sz w:val="17"/>
+              </w:rPr>
+              <w:t>Scope changes</w:t>
+            </w:r>
+          </w:p>
+        </w:tc>
+        <w:tc>
+          <w:tcPr>
+            <w:tcW w:type="dxa" w:w="3024"/>
+          </w:tcPr>
+          <w:p>
+            <w:pPr>
+              <w:spacing w:before="60" w:after="60"/>
+            </w:pPr>
+            <w:r>
+              <w:rPr>
+                <w:color w:val="3D3B3B"/>
+                <w:sz w:val="17"/>
+              </w:rPr>
+              <w:t>Additional cost and timeline</w:t>
+            </w:r>
+          </w:p>
+        </w:tc>
+        <w:tc>
+          <w:tcPr>
+            <w:tcW w:type="dxa" w:w="3024"/>
+          </w:tcPr>
+          <w:p>
+            <w:pPr>
+              <w:spacing w:before="60" w:after="60"/>
+            </w:pPr>
+            <w:r>
+              <w:rPr>
+                <w:color w:val="3D3B3B"/>
+                <w:sz w:val="17"/>
+              </w:rPr>
+              <w:t>Formal change request workflow before development</w:t>
+            </w:r>
+          </w:p>
+        </w:tc>
+      </w:tr>
+      <w:tr>
+        <w:tc>
+          <w:tcPr>
+            <w:tcW w:type="dxa" w:w="3024"/>
+          </w:tcPr>
+          <w:p>
+            <w:pPr>
+              <w:spacing w:before="60" w:after="60"/>
+            </w:pPr>
+            <w:r>
+              <w:rPr>
+                <w:color w:val="3D3B3B"/>
+                <w:sz w:val="17"/>
+              </w:rPr>
+              <w:t>Third-party API issues</w:t>
+            </w:r>
+          </w:p>
+        </w:tc>
+        <w:tc>
+          <w:tcPr>
+            <w:tcW w:type="dxa" w:w="3024"/>
+          </w:tcPr>
+          <w:p>
+            <w:pPr>
+              <w:spacing w:before="60" w:after="60"/>
+            </w:pPr>
+            <w:r>
+              <w:rPr>
+                <w:color w:val="3D3B3B"/>
+                <w:sz w:val="17"/>
+              </w:rPr>
+              <w:t>Integration delays</w:t>
+            </w:r>
+          </w:p>
+        </w:tc>
+        <w:tc>
+          <w:tcPr>
+            <w:tcW w:type="dxa" w:w="3024"/>
+          </w:tcPr>
+          <w:p>
+            <w:pPr>
+              <w:spacing w:before="60" w:after="60"/>
+            </w:pPr>
+            <w:r>
+              <w:rPr>
+                <w:color w:val="3D3B3B"/>
+                <w:sz w:val="17"/>
+              </w:rPr>
+              <w:t>Early credential validation and sandbox testing</w:t>
+            </w:r>
+          </w:p>
+        </w:tc>
+      </w:tr>
+      <w:tr>
+        <w:tc>
+          <w:tcPr>
+            <w:tcW w:type="dxa" w:w="3024"/>
+          </w:tcPr>
+          <w:p>
+            <w:pPr>
+              <w:spacing w:before="60" w:after="60"/>
+            </w:pPr>
+            <w:r>
+              <w:rPr>
+                <w:color w:val="3D3B3B"/>
+                <w:sz w:val="17"/>
+              </w:rPr>
+              <w:t>Low user adoption</w:t>
+            </w:r>
+          </w:p>
+        </w:tc>
+        <w:tc>
+          <w:tcPr>
+            <w:tcW w:type="dxa" w:w="3024"/>
+          </w:tcPr>
+          <w:p>
+            <w:pPr>
+              <w:spacing w:before="60" w:after="60"/>
+            </w:pPr>
+            <w:r>
+              <w:rPr>
+                <w:color w:val="3D3B3B"/>
+                <w:sz w:val="17"/>
+              </w:rPr>
+              <w:t>Reduced business value</w:t>
+            </w:r>
+          </w:p>
+        </w:tc>
+        <w:tc>
+          <w:tcPr>
+            <w:tcW w:type="dxa" w:w="3024"/>
+          </w:tcPr>
+          <w:p>
+            <w:pPr>
+              <w:spacing w:before="60" w:after="60"/>
+            </w:pPr>
+            <w:r>
+              <w:rPr>
+                <w:color w:val="3D3B3B"/>
+                <w:sz w:val="17"/>
+              </w:rPr>
+              <w:t>Role-based training, SOPs, and hypercare support</w:t>
+            </w:r>
+          </w:p>
+        </w:tc>
+      </w:tr>
+    </w:tbl>
+    <w:p>
+      <w:pPr>
+        <w:spacing w:after="80" w:line="276" w:lineRule="auto"/>
+      </w:pPr>
+      <w:r>
+        <w:rPr>
+          <w:b/>
+          <w:i w:val="0"/>
+          <w:color w:val="142444"/>
+          <w:sz w:val="20"/>
+        </w:rPr>
+        <w:t>Project success metrics:</w:t>
+      </w:r>
+    </w:p>
+    <w:p>
+      <w:pPr>
+        <w:spacing w:after="40"/>
+        <w:ind w:left="283"/>
+      </w:pPr>
+      <w:r>
+        <w:rPr>
+          <w:color w:val="3D3B3B"/>
+          <w:sz w:val="19"/>
+        </w:rPr>
+        <w:t xml:space="preserve">  •  Approved BRD and implementation plan before configuration starts</w:t>
+      </w:r>
+    </w:p>
+    <w:p>
+      <w:pPr>
+        <w:spacing w:after="40"/>
+        <w:ind w:left="283"/>
+      </w:pPr>
+      <w:r>
+        <w:rPr>
+          <w:color w:val="3D3B3B"/>
+          <w:sz w:val="19"/>
+        </w:rPr>
+        <w:t xml:space="preserve">  •  100% of agreed master data migrated or formally excluded by client sign-off</w:t>
+      </w:r>
+    </w:p>
+    <w:p>
+      <w:pPr>
+        <w:spacing w:after="40"/>
+        <w:ind w:left="283"/>
+      </w:pPr>
+      <w:r>
+        <w:rPr>
+          <w:color w:val="3D3B3B"/>
+          <w:sz w:val="19"/>
+        </w:rPr>
+        <w:t xml:space="preserve">  •  Financial reports reconcile with agreed legacy balances before go-live</w:t>
+      </w:r>
+    </w:p>
+    <w:p>
+      <w:pPr>
+        <w:spacing w:after="40"/>
+        <w:ind w:left="283"/>
+      </w:pPr>
+      <w:r>
+        <w:rPr>
+          <w:color w:val="3D3B3B"/>
+          <w:sz w:val="19"/>
+        </w:rPr>
+        <w:t xml:space="preserve">  •  Inventory opening balances reconcile with the approved migration file</w:t>
+      </w:r>
+    </w:p>
+    <w:p>
+      <w:pPr>
+        <w:spacing w:after="40"/>
+        <w:ind w:left="283"/>
+      </w:pPr>
+      <w:r>
+        <w:rPr>
+          <w:color w:val="3D3B3B"/>
+          <w:sz w:val="19"/>
+        </w:rPr>
+        <w:t xml:space="preserve">  •  All critical and high-priority UAT issues resolved before production launch</w:t>
+      </w:r>
+    </w:p>
+    <w:p>
+      <w:pPr>
+        <w:spacing w:after="40"/>
+        <w:ind w:left="283"/>
+      </w:pPr>
+      <w:r>
+        <w:rPr>
+          <w:color w:val="3D3B3B"/>
+          <w:sz w:val="19"/>
+        </w:rPr>
+        <w:t xml:space="preserve">  •  User acceptance sign-off received from the nominated client project owner</w:t>
+      </w:r>
+    </w:p>
+    <w:p>
+      <w:pPr>
+        <w:spacing w:before="280" w:after="80"/>
+      </w:pPr>
+      <w:r>
+        <w:rPr>
+          <w:rFonts w:ascii="Calibri Light" w:hAnsi="Calibri Light"/>
+          <w:b/>
+          <w:color w:val="142444"/>
+          <w:sz w:val="26"/>
+        </w:rPr>
+        <w:t>8.  INVESTMENT &amp; PRICING</w:t>
       </w:r>
     </w:p>
     <w:p>
@@ -1602,7 +3390,99 @@
                 <w:color w:val="3D3B3B"/>
                 <w:sz w:val="17"/>
               </w:rPr>
-              <w:t>Odoo Installation &amp; Server Setup</w:t>
+              <w:t>Discovery, BRD, GAP Analysis, and Implementation Plan</w:t>
+            </w:r>
+          </w:p>
+        </w:tc>
+        <w:tc>
+          <w:tcPr>
+            <w:tcW w:type="dxa" w:w="1134"/>
+          </w:tcPr>
+          <w:p>
+            <w:pPr>
+              <w:spacing w:before="40" w:after="40"/>
+              <w:jc w:val="right"/>
+            </w:pPr>
+            <w:r>
+              <w:rPr>
+                <w:color w:val="3D3B3B"/>
+                <w:sz w:val="17"/>
+              </w:rPr>
+              <w:t>1</w:t>
+            </w:r>
+          </w:p>
+        </w:tc>
+        <w:tc>
+          <w:tcPr>
+            <w:tcW w:type="dxa" w:w="1701"/>
+          </w:tcPr>
+          <w:p>
+            <w:pPr>
+              <w:spacing w:before="40" w:after="40"/>
+              <w:jc w:val="right"/>
+            </w:pPr>
+            <w:r>
+              <w:rPr>
+                <w:color w:val="3D3B3B"/>
+                <w:sz w:val="17"/>
+              </w:rPr>
+              <w:t>{DISCOVERY_PRICE}</w:t>
+            </w:r>
+          </w:p>
+        </w:tc>
+        <w:tc>
+          <w:tcPr>
+            <w:tcW w:type="dxa" w:w="1984"/>
+          </w:tcPr>
+          <w:p>
+            <w:pPr>
+              <w:spacing w:before="40" w:after="40"/>
+              <w:jc w:val="right"/>
+            </w:pPr>
+            <w:r>
+              <w:rPr>
+                <w:color w:val="171414"/>
+                <w:sz w:val="17"/>
+              </w:rPr>
+              <w:t>{DISCOVERY_TOTAL}</w:t>
+            </w:r>
+          </w:p>
+        </w:tc>
+      </w:tr>
+      <w:tr>
+        <w:tc>
+          <w:tcPr>
+            <w:tcW w:type="dxa" w:w="567"/>
+          </w:tcPr>
+          <w:p>
+            <w:pPr>
+              <w:spacing w:before="40" w:after="40"/>
+              <w:jc w:val="center"/>
+            </w:pPr>
+            <w:r>
+              <w:rPr>
+                <w:color w:val="3D3B3B"/>
+                <w:sz w:val="17"/>
+              </w:rPr>
+              <w:t>2</w:t>
+            </w:r>
+          </w:p>
+        </w:tc>
+        <w:tc>
+          <w:tcPr>
+            <w:tcW w:type="dxa" w:w="4819"/>
+          </w:tcPr>
+          <w:p>
+            <w:pPr>
+              <w:spacing w:before="40" w:after="40"/>
+              <w:jc w:val="left"/>
+            </w:pPr>
+            <w:r>
+              <w:rPr>
+                <w:color w:val="3D3B3B"/>
+                <w:sz w:val="17"/>
+              </w:rPr>
+              <w:t>Odoo Installation and Environment Setup</w:t>
             </w:r>
           </w:p>
         </w:tc>
@@ -1676,98 +3556,6 @@
                 <w:color w:val="3D3B3B"/>
                 <w:sz w:val="17"/>
               </w:rPr>
-              <w:t>2</w:t>
-            </w:r>
-          </w:p>
-        </w:tc>
-        <w:tc>
-          <w:tcPr>
-            <w:tcW w:type="dxa" w:w="4819"/>
-          </w:tcPr>
-          <w:p>
-            <w:pPr>
-              <w:spacing w:before="40" w:after="40"/>
-              <w:jc w:val="left"/>
-            </w:pPr>
-            <w:r>
-              <w:rPr>
-                <w:color w:val="3D3B3B"/>
-                <w:sz w:val="17"/>
-              </w:rPr>
-              <w:t>Core Module Configuration ({NUM_MODULES} modules)</w:t>
-            </w:r>
-          </w:p>
-        </w:tc>
-        <w:tc>
-          <w:tcPr>
-            <w:tcW w:type="dxa" w:w="1134"/>
-          </w:tcPr>
-          <w:p>
-            <w:pPr>
-              <w:spacing w:before="40" w:after="40"/>
-              <w:jc w:val="right"/>
-            </w:pPr>
-            <w:r>
-              <w:rPr>
-                <w:color w:val="3D3B3B"/>
-                <w:sz w:val="17"/>
-              </w:rPr>
-              <w:t>{MODULE_QTY}</w:t>
-            </w:r>
-          </w:p>
-        </w:tc>
-        <w:tc>
-          <w:tcPr>
-            <w:tcW w:type="dxa" w:w="1701"/>
-          </w:tcPr>
-          <w:p>
-            <w:pPr>
-              <w:spacing w:before="40" w:after="40"/>
-              <w:jc w:val="right"/>
-            </w:pPr>
-            <w:r>
-              <w:rPr>
-                <w:color w:val="3D3B3B"/>
-                <w:sz w:val="17"/>
-              </w:rPr>
-              <w:t>{MODULE_UNIT_PRICE}</w:t>
-            </w:r>
-          </w:p>
-        </w:tc>
-        <w:tc>
-          <w:tcPr>
-            <w:tcW w:type="dxa" w:w="1984"/>
-          </w:tcPr>
-          <w:p>
-            <w:pPr>
-              <w:spacing w:before="40" w:after="40"/>
-              <w:jc w:val="right"/>
-            </w:pPr>
-            <w:r>
-              <w:rPr>
-                <w:color w:val="171414"/>
-                <w:sz w:val="17"/>
-              </w:rPr>
-              <w:t>{MODULE_TOTAL}</w:t>
-            </w:r>
-          </w:p>
-        </w:tc>
-      </w:tr>
-      <w:tr>
-        <w:tc>
-          <w:tcPr>
-            <w:tcW w:type="dxa" w:w="567"/>
-          </w:tcPr>
-          <w:p>
-            <w:pPr>
-              <w:spacing w:before="40" w:after="40"/>
-              <w:jc w:val="center"/>
-            </w:pPr>
-            <w:r>
-              <w:rPr>
-                <w:color w:val="3D3B3B"/>
-                <w:sz w:val="17"/>
-              </w:rPr>
               <w:t>3</w:t>
             </w:r>
           </w:p>
@@ -1786,7 +3574,7 @@
                 <w:color w:val="3D3B3B"/>
                 <w:sz w:val="17"/>
               </w:rPr>
-              <w:t>Data Migration &amp; Cleansing</w:t>
+              <w:t>{MODULE_1} Configuration</w:t>
             </w:r>
           </w:p>
         </w:tc>
@@ -1804,7 +3592,7 @@
                 <w:color w:val="3D3B3B"/>
                 <w:sz w:val="17"/>
               </w:rPr>
-              <w:t>{MIG_HOURS} hrs</w:t>
+              <w:t>1</w:t>
             </w:r>
           </w:p>
         </w:tc>
@@ -1822,7 +3610,7 @@
                 <w:color w:val="3D3B3B"/>
                 <w:sz w:val="17"/>
               </w:rPr>
-              <w:t>{MIG_RATE}/hr</w:t>
+              <w:t>{MODULE_1_PRICE}</w:t>
             </w:r>
           </w:p>
         </w:tc>
@@ -1840,7 +3628,7 @@
                 <w:color w:val="171414"/>
                 <w:sz w:val="17"/>
               </w:rPr>
-              <w:t>{MIG_TOTAL}</w:t>
+              <w:t>{MODULE_1_TOTAL}</w:t>
             </w:r>
           </w:p>
         </w:tc>
@@ -1878,7 +3666,7 @@
                 <w:color w:val="3D3B3B"/>
                 <w:sz w:val="17"/>
               </w:rPr>
-              <w:t>Custom Development &amp; Configuration</w:t>
+              <w:t>{MODULE_2} Configuration</w:t>
             </w:r>
           </w:p>
         </w:tc>
@@ -1896,7 +3684,7 @@
                 <w:color w:val="3D3B3B"/>
                 <w:sz w:val="17"/>
               </w:rPr>
-              <w:t>{DEV_HOURS} hrs</w:t>
+              <w:t>1</w:t>
             </w:r>
           </w:p>
         </w:tc>
@@ -1914,7 +3702,7 @@
                 <w:color w:val="3D3B3B"/>
                 <w:sz w:val="17"/>
               </w:rPr>
-              <w:t>{DEV_RATE}/hr</w:t>
+              <w:t>{MODULE_2_PRICE}</w:t>
             </w:r>
           </w:p>
         </w:tc>
@@ -1932,7 +3720,7 @@
                 <w:color w:val="171414"/>
                 <w:sz w:val="17"/>
               </w:rPr>
-              <w:t>{DEV_TOTAL}</w:t>
+              <w:t>{MODULE_2_TOTAL}</w:t>
             </w:r>
           </w:p>
         </w:tc>
@@ -1970,7 +3758,7 @@
                 <w:color w:val="3D3B3B"/>
                 <w:sz w:val="17"/>
               </w:rPr>
-              <w:t>User Training ({TRAINING_SESSIONS} sessions)</w:t>
+              <w:t>{MODULE_3} Configuration</w:t>
             </w:r>
           </w:p>
         </w:tc>
@@ -1988,7 +3776,7 @@
                 <w:color w:val="3D3B3B"/>
                 <w:sz w:val="17"/>
               </w:rPr>
-              <w:t>{TRAINING_QTY}</w:t>
+              <w:t>1</w:t>
             </w:r>
           </w:p>
         </w:tc>
@@ -2006,7 +3794,283 @@
                 <w:color w:val="3D3B3B"/>
                 <w:sz w:val="17"/>
               </w:rPr>
-              <w:t>{TRAINING_UNIT_PRICE}</w:t>
+              <w:t>{MODULE_3_PRICE}</w:t>
+            </w:r>
+          </w:p>
+        </w:tc>
+        <w:tc>
+          <w:tcPr>
+            <w:tcW w:type="dxa" w:w="1984"/>
+          </w:tcPr>
+          <w:p>
+            <w:pPr>
+              <w:spacing w:before="40" w:after="40"/>
+              <w:jc w:val="right"/>
+            </w:pPr>
+            <w:r>
+              <w:rPr>
+                <w:color w:val="171414"/>
+                <w:sz w:val="17"/>
+              </w:rPr>
+              <w:t>{MODULE_3_TOTAL}</w:t>
+            </w:r>
+          </w:p>
+        </w:tc>
+      </w:tr>
+      <w:tr>
+        <w:tc>
+          <w:tcPr>
+            <w:tcW w:type="dxa" w:w="567"/>
+          </w:tcPr>
+          <w:p>
+            <w:pPr>
+              <w:spacing w:before="40" w:after="40"/>
+              <w:jc w:val="center"/>
+            </w:pPr>
+            <w:r>
+              <w:rPr>
+                <w:color w:val="3D3B3B"/>
+                <w:sz w:val="17"/>
+              </w:rPr>
+              <w:t>6</w:t>
+            </w:r>
+          </w:p>
+        </w:tc>
+        <w:tc>
+          <w:tcPr>
+            <w:tcW w:type="dxa" w:w="4819"/>
+          </w:tcPr>
+          <w:p>
+            <w:pPr>
+              <w:spacing w:before="40" w:after="40"/>
+              <w:jc w:val="left"/>
+            </w:pPr>
+            <w:r>
+              <w:rPr>
+                <w:color w:val="3D3B3B"/>
+                <w:sz w:val="17"/>
+              </w:rPr>
+              <w:t>Data Migration and Reconciliation</w:t>
+            </w:r>
+          </w:p>
+        </w:tc>
+        <w:tc>
+          <w:tcPr>
+            <w:tcW w:type="dxa" w:w="1134"/>
+          </w:tcPr>
+          <w:p>
+            <w:pPr>
+              <w:spacing w:before="40" w:after="40"/>
+              <w:jc w:val="right"/>
+            </w:pPr>
+            <w:r>
+              <w:rPr>
+                <w:color w:val="3D3B3B"/>
+                <w:sz w:val="17"/>
+              </w:rPr>
+              <w:t>1</w:t>
+            </w:r>
+          </w:p>
+        </w:tc>
+        <w:tc>
+          <w:tcPr>
+            <w:tcW w:type="dxa" w:w="1701"/>
+          </w:tcPr>
+          <w:p>
+            <w:pPr>
+              <w:spacing w:before="40" w:after="40"/>
+              <w:jc w:val="right"/>
+            </w:pPr>
+            <w:r>
+              <w:rPr>
+                <w:color w:val="3D3B3B"/>
+                <w:sz w:val="17"/>
+              </w:rPr>
+              <w:t>{MIGRATION_PRICE}</w:t>
+            </w:r>
+          </w:p>
+        </w:tc>
+        <w:tc>
+          <w:tcPr>
+            <w:tcW w:type="dxa" w:w="1984"/>
+          </w:tcPr>
+          <w:p>
+            <w:pPr>
+              <w:spacing w:before="40" w:after="40"/>
+              <w:jc w:val="right"/>
+            </w:pPr>
+            <w:r>
+              <w:rPr>
+                <w:color w:val="171414"/>
+                <w:sz w:val="17"/>
+              </w:rPr>
+              <w:t>{MIGRATION_TOTAL}</w:t>
+            </w:r>
+          </w:p>
+        </w:tc>
+      </w:tr>
+      <w:tr>
+        <w:tc>
+          <w:tcPr>
+            <w:tcW w:type="dxa" w:w="567"/>
+          </w:tcPr>
+          <w:p>
+            <w:pPr>
+              <w:spacing w:before="40" w:after="40"/>
+              <w:jc w:val="center"/>
+            </w:pPr>
+            <w:r>
+              <w:rPr>
+                <w:color w:val="3D3B3B"/>
+                <w:sz w:val="17"/>
+              </w:rPr>
+              <w:t>7</w:t>
+            </w:r>
+          </w:p>
+        </w:tc>
+        <w:tc>
+          <w:tcPr>
+            <w:tcW w:type="dxa" w:w="4819"/>
+          </w:tcPr>
+          <w:p>
+            <w:pPr>
+              <w:spacing w:before="40" w:after="40"/>
+              <w:jc w:val="left"/>
+            </w:pPr>
+            <w:r>
+              <w:rPr>
+                <w:color w:val="3D3B3B"/>
+                <w:sz w:val="17"/>
+              </w:rPr>
+              <w:t>Custom Reports, Workflows, and Integrations</w:t>
+            </w:r>
+          </w:p>
+        </w:tc>
+        <w:tc>
+          <w:tcPr>
+            <w:tcW w:type="dxa" w:w="1134"/>
+          </w:tcPr>
+          <w:p>
+            <w:pPr>
+              <w:spacing w:before="40" w:after="40"/>
+              <w:jc w:val="right"/>
+            </w:pPr>
+            <w:r>
+              <w:rPr>
+                <w:color w:val="3D3B3B"/>
+                <w:sz w:val="17"/>
+              </w:rPr>
+              <w:t>1</w:t>
+            </w:r>
+          </w:p>
+        </w:tc>
+        <w:tc>
+          <w:tcPr>
+            <w:tcW w:type="dxa" w:w="1701"/>
+          </w:tcPr>
+          <w:p>
+            <w:pPr>
+              <w:spacing w:before="40" w:after="40"/>
+              <w:jc w:val="right"/>
+            </w:pPr>
+            <w:r>
+              <w:rPr>
+                <w:color w:val="3D3B3B"/>
+                <w:sz w:val="17"/>
+              </w:rPr>
+              <w:t>{CUSTOMIZATION_PRICE}</w:t>
+            </w:r>
+          </w:p>
+        </w:tc>
+        <w:tc>
+          <w:tcPr>
+            <w:tcW w:type="dxa" w:w="1984"/>
+          </w:tcPr>
+          <w:p>
+            <w:pPr>
+              <w:spacing w:before="40" w:after="40"/>
+              <w:jc w:val="right"/>
+            </w:pPr>
+            <w:r>
+              <w:rPr>
+                <w:color w:val="171414"/>
+                <w:sz w:val="17"/>
+              </w:rPr>
+              <w:t>{CUSTOMIZATION_TOTAL}</w:t>
+            </w:r>
+          </w:p>
+        </w:tc>
+      </w:tr>
+      <w:tr>
+        <w:tc>
+          <w:tcPr>
+            <w:tcW w:type="dxa" w:w="567"/>
+          </w:tcPr>
+          <w:p>
+            <w:pPr>
+              <w:spacing w:before="40" w:after="40"/>
+              <w:jc w:val="center"/>
+            </w:pPr>
+            <w:r>
+              <w:rPr>
+                <w:color w:val="3D3B3B"/>
+                <w:sz w:val="17"/>
+              </w:rPr>
+              <w:t>8</w:t>
+            </w:r>
+          </w:p>
+        </w:tc>
+        <w:tc>
+          <w:tcPr>
+            <w:tcW w:type="dxa" w:w="4819"/>
+          </w:tcPr>
+          <w:p>
+            <w:pPr>
+              <w:spacing w:before="40" w:after="40"/>
+              <w:jc w:val="left"/>
+            </w:pPr>
+            <w:r>
+              <w:rPr>
+                <w:color w:val="3D3B3B"/>
+                <w:sz w:val="17"/>
+              </w:rPr>
+              <w:t>User Training, Manuals, SOPs, and Admin Guide</w:t>
+            </w:r>
+          </w:p>
+        </w:tc>
+        <w:tc>
+          <w:tcPr>
+            <w:tcW w:type="dxa" w:w="1134"/>
+          </w:tcPr>
+          <w:p>
+            <w:pPr>
+              <w:spacing w:before="40" w:after="40"/>
+              <w:jc w:val="right"/>
+            </w:pPr>
+            <w:r>
+              <w:rPr>
+                <w:color w:val="3D3B3B"/>
+                <w:sz w:val="17"/>
+              </w:rPr>
+              <w:t>1</w:t>
+            </w:r>
+          </w:p>
+        </w:tc>
+        <w:tc>
+          <w:tcPr>
+            <w:tcW w:type="dxa" w:w="1701"/>
+          </w:tcPr>
+          <w:p>
+            <w:pPr>
+              <w:spacing w:before="40" w:after="40"/>
+              <w:jc w:val="right"/>
+            </w:pPr>
+            <w:r>
+              <w:rPr>
+                <w:color w:val="3D3B3B"/>
+                <w:sz w:val="17"/>
+              </w:rPr>
+              <w:t>{TRAINING_PRICE}</w:t>
             </w:r>
           </w:p>
         </w:tc>
@@ -2044,7 +4108,7 @@
                 <w:color w:val="3D3B3B"/>
                 <w:sz w:val="17"/>
               </w:rPr>
-              <w:t>6</w:t>
+              <w:t>9</w:t>
             </w:r>
           </w:p>
         </w:tc>
@@ -2062,7 +4126,7 @@
                 <w:color w:val="3D3B3B"/>
                 <w:sz w:val="17"/>
               </w:rPr>
-              <w:t>Project Management &amp; Coordination</w:t>
+              <w:t>Go-Live Support and Hypercare</w:t>
             </w:r>
           </w:p>
         </w:tc>
@@ -2080,7 +4144,7 @@
                 <w:color w:val="3D3B3B"/>
                 <w:sz w:val="17"/>
               </w:rPr>
-              <w:t>{PM_HOURS} hrs</w:t>
+              <w:t>1</w:t>
             </w:r>
           </w:p>
         </w:tc>
@@ -2098,7 +4162,99 @@
                 <w:color w:val="3D3B3B"/>
                 <w:sz w:val="17"/>
               </w:rPr>
-              <w:t>{PM_RATE}/hr</w:t>
+              <w:t>{HYPERCARE_PRICE}</w:t>
+            </w:r>
+          </w:p>
+        </w:tc>
+        <w:tc>
+          <w:tcPr>
+            <w:tcW w:type="dxa" w:w="1984"/>
+          </w:tcPr>
+          <w:p>
+            <w:pPr>
+              <w:spacing w:before="40" w:after="40"/>
+              <w:jc w:val="right"/>
+            </w:pPr>
+            <w:r>
+              <w:rPr>
+                <w:color w:val="171414"/>
+                <w:sz w:val="17"/>
+              </w:rPr>
+              <w:t>{HYPERCARE_TOTAL}</w:t>
+            </w:r>
+          </w:p>
+        </w:tc>
+      </w:tr>
+      <w:tr>
+        <w:tc>
+          <w:tcPr>
+            <w:tcW w:type="dxa" w:w="567"/>
+          </w:tcPr>
+          <w:p>
+            <w:pPr>
+              <w:spacing w:before="40" w:after="40"/>
+              <w:jc w:val="center"/>
+            </w:pPr>
+            <w:r>
+              <w:rPr>
+                <w:color w:val="3D3B3B"/>
+                <w:sz w:val="17"/>
+              </w:rPr>
+              <w:t>10</w:t>
+            </w:r>
+          </w:p>
+        </w:tc>
+        <w:tc>
+          <w:tcPr>
+            <w:tcW w:type="dxa" w:w="4819"/>
+          </w:tcPr>
+          <w:p>
+            <w:pPr>
+              <w:spacing w:before="40" w:after="40"/>
+              <w:jc w:val="left"/>
+            </w:pPr>
+            <w:r>
+              <w:rPr>
+                <w:color w:val="3D3B3B"/>
+                <w:sz w:val="17"/>
+              </w:rPr>
+              <w:t>Project Management and Coordination</w:t>
+            </w:r>
+          </w:p>
+        </w:tc>
+        <w:tc>
+          <w:tcPr>
+            <w:tcW w:type="dxa" w:w="1134"/>
+          </w:tcPr>
+          <w:p>
+            <w:pPr>
+              <w:spacing w:before="40" w:after="40"/>
+              <w:jc w:val="right"/>
+            </w:pPr>
+            <w:r>
+              <w:rPr>
+                <w:color w:val="3D3B3B"/>
+                <w:sz w:val="17"/>
+              </w:rPr>
+              <w:t>1</w:t>
+            </w:r>
+          </w:p>
+        </w:tc>
+        <w:tc>
+          <w:tcPr>
+            <w:tcW w:type="dxa" w:w="1701"/>
+          </w:tcPr>
+          <w:p>
+            <w:pPr>
+              <w:spacing w:before="40" w:after="40"/>
+              <w:jc w:val="right"/>
+            </w:pPr>
+            <w:r>
+              <w:rPr>
+                <w:color w:val="3D3B3B"/>
+                <w:sz w:val="17"/>
+              </w:rPr>
+              <w:t>{PM_PRICE}</w:t>
             </w:r>
           </w:p>
         </w:tc>
@@ -2348,17 +4504,25 @@
     <w:p/>
     <w:p>
       <w:pPr>
-        <w:spacing w:after="80"/>
+        <w:spacing w:before="280" w:after="80"/>
       </w:pPr>
       <w:r>
         <w:rPr>
           <w:rFonts w:ascii="Calibri Light" w:hAnsi="Calibri Light"/>
           <w:b/>
           <w:color w:val="142444"/>
-          <w:sz w:val="22"/>
+          <w:sz w:val="26"/>
         </w:rPr>
-        <w:t>Post-Implementation Support Plans (Optional)</w:t>
+        <w:t>9.  SUPPORT SLA AND POST-GO-LIVE OPTIONS</w:t>
       </w:r>
+    </w:p>
+    <w:p>
+      <w:pPr>
+        <w:spacing w:before="40" w:after="40"/>
+        <w:pBdr>
+          <w:bottom w:val="single" w:sz="8" w:space="1" w:color="FCB900"/>
+        </w:pBdr>
+      </w:pPr>
     </w:p>
     <w:p>
       <w:pPr>
@@ -2372,6 +4536,392 @@
           <w:sz w:val="19"/>
         </w:rPr>
         <w:t>After the 30-day warranty period, the following support plans are available:</w:t>
+      </w:r>
+    </w:p>
+    <w:tbl>
+      <w:tblPr>
+        <w:tblW w:type="auto" w:w="0"/>
+        <w:jc w:val="center"/>
+        <w:tblLook w:firstColumn="1" w:firstRow="1" w:lastColumn="0" w:lastRow="0" w:noHBand="0" w:noVBand="1" w:val="04A0"/>
+      </w:tblPr>
+      <w:tblGrid>
+        <w:gridCol w:w="1814"/>
+        <w:gridCol w:w="1814"/>
+        <w:gridCol w:w="1814"/>
+        <w:gridCol w:w="1814"/>
+        <w:gridCol w:w="1814"/>
+      </w:tblGrid>
+      <w:tr>
+        <w:tc>
+          <w:tcPr>
+            <w:tcW w:type="dxa" w:w="1247"/>
+            <w:shd w:fill="171414"/>
+          </w:tcPr>
+          <w:p>
+            <w:pPr>
+              <w:spacing w:before="60" w:after="60"/>
+            </w:pPr>
+            <w:r>
+              <w:rPr>
+                <w:b/>
+                <w:color w:val="FFFFFF"/>
+                <w:sz w:val="16"/>
+              </w:rPr>
+              <w:t>Plan</w:t>
+            </w:r>
+          </w:p>
+        </w:tc>
+        <w:tc>
+          <w:tcPr>
+            <w:tcW w:type="dxa" w:w="1701"/>
+            <w:shd w:fill="171414"/>
+          </w:tcPr>
+          <w:p>
+            <w:pPr>
+              <w:spacing w:before="60" w:after="60"/>
+            </w:pPr>
+            <w:r>
+              <w:rPr>
+                <w:b/>
+                <w:color w:val="FFFFFF"/>
+                <w:sz w:val="16"/>
+              </w:rPr>
+              <w:t>Working Hours</w:t>
+            </w:r>
+          </w:p>
+        </w:tc>
+        <w:tc>
+          <w:tcPr>
+            <w:tcW w:type="dxa" w:w="1531"/>
+            <w:shd w:fill="171414"/>
+          </w:tcPr>
+          <w:p>
+            <w:pPr>
+              <w:spacing w:before="60" w:after="60"/>
+            </w:pPr>
+            <w:r>
+              <w:rPr>
+                <w:b/>
+                <w:color w:val="FFFFFF"/>
+                <w:sz w:val="16"/>
+              </w:rPr>
+              <w:t>Response Time</w:t>
+            </w:r>
+          </w:p>
+        </w:tc>
+        <w:tc>
+          <w:tcPr>
+            <w:tcW w:type="dxa" w:w="2494"/>
+            <w:shd w:fill="171414"/>
+          </w:tcPr>
+          <w:p>
+            <w:pPr>
+              <w:spacing w:before="60" w:after="60"/>
+            </w:pPr>
+            <w:r>
+              <w:rPr>
+                <w:b/>
+                <w:color w:val="FFFFFF"/>
+                <w:sz w:val="16"/>
+              </w:rPr>
+              <w:t>Resolution Target</w:t>
+            </w:r>
+          </w:p>
+        </w:tc>
+        <w:tc>
+          <w:tcPr>
+            <w:tcW w:type="dxa" w:w="2268"/>
+            <w:shd w:fill="171414"/>
+          </w:tcPr>
+          <w:p>
+            <w:pPr>
+              <w:spacing w:before="60" w:after="60"/>
+            </w:pPr>
+            <w:r>
+              <w:rPr>
+                <w:b/>
+                <w:color w:val="FFFFFF"/>
+                <w:sz w:val="16"/>
+              </w:rPr>
+              <w:t>Escalation</w:t>
+            </w:r>
+          </w:p>
+        </w:tc>
+      </w:tr>
+      <w:tr>
+        <w:tc>
+          <w:tcPr>
+            <w:tcW w:type="dxa" w:w="1814"/>
+          </w:tcPr>
+          <w:p>
+            <w:pPr>
+              <w:spacing w:before="60" w:after="60"/>
+            </w:pPr>
+            <w:r>
+              <w:rPr>
+                <w:color w:val="3D3B3B"/>
+                <w:sz w:val="17"/>
+              </w:rPr>
+              <w:t>Bronze</w:t>
+            </w:r>
+          </w:p>
+        </w:tc>
+        <w:tc>
+          <w:tcPr>
+            <w:tcW w:type="dxa" w:w="1814"/>
+          </w:tcPr>
+          <w:p>
+            <w:pPr>
+              <w:spacing w:before="60" w:after="60"/>
+            </w:pPr>
+            <w:r>
+              <w:rPr>
+                <w:color w:val="3D3B3B"/>
+                <w:sz w:val="17"/>
+              </w:rPr>
+              <w:t>Business hours</w:t>
+            </w:r>
+          </w:p>
+        </w:tc>
+        <w:tc>
+          <w:tcPr>
+            <w:tcW w:type="dxa" w:w="1814"/>
+          </w:tcPr>
+          <w:p>
+            <w:pPr>
+              <w:spacing w:before="60" w:after="60"/>
+            </w:pPr>
+            <w:r>
+              <w:rPr>
+                <w:color w:val="3D3B3B"/>
+                <w:sz w:val="17"/>
+              </w:rPr>
+              <w:t>48 hours</w:t>
+            </w:r>
+          </w:p>
+        </w:tc>
+        <w:tc>
+          <w:tcPr>
+            <w:tcW w:type="dxa" w:w="1814"/>
+          </w:tcPr>
+          <w:p>
+            <w:pPr>
+              <w:spacing w:before="60" w:after="60"/>
+            </w:pPr>
+            <w:r>
+              <w:rPr>
+                <w:color w:val="3D3B3B"/>
+                <w:sz w:val="17"/>
+              </w:rPr>
+              <w:t>Best effort based on issue severity</w:t>
+            </w:r>
+          </w:p>
+        </w:tc>
+        <w:tc>
+          <w:tcPr>
+            <w:tcW w:type="dxa" w:w="1814"/>
+          </w:tcPr>
+          <w:p>
+            <w:pPr>
+              <w:spacing w:before="60" w:after="60"/>
+            </w:pPr>
+            <w:r>
+              <w:rPr>
+                <w:color w:val="3D3B3B"/>
+                <w:sz w:val="17"/>
+              </w:rPr>
+              <w:t>Support lead</w:t>
+            </w:r>
+          </w:p>
+        </w:tc>
+      </w:tr>
+      <w:tr>
+        <w:tc>
+          <w:tcPr>
+            <w:tcW w:type="dxa" w:w="1814"/>
+          </w:tcPr>
+          <w:p>
+            <w:pPr>
+              <w:spacing w:before="60" w:after="60"/>
+            </w:pPr>
+            <w:r>
+              <w:rPr>
+                <w:color w:val="3D3B3B"/>
+                <w:sz w:val="17"/>
+              </w:rPr>
+              <w:t>Silver</w:t>
+            </w:r>
+          </w:p>
+        </w:tc>
+        <w:tc>
+          <w:tcPr>
+            <w:tcW w:type="dxa" w:w="1814"/>
+          </w:tcPr>
+          <w:p>
+            <w:pPr>
+              <w:spacing w:before="60" w:after="60"/>
+            </w:pPr>
+            <w:r>
+              <w:rPr>
+                <w:color w:val="3D3B3B"/>
+                <w:sz w:val="17"/>
+              </w:rPr>
+              <w:t>Business hours</w:t>
+            </w:r>
+          </w:p>
+        </w:tc>
+        <w:tc>
+          <w:tcPr>
+            <w:tcW w:type="dxa" w:w="1814"/>
+          </w:tcPr>
+          <w:p>
+            <w:pPr>
+              <w:spacing w:before="60" w:after="60"/>
+            </w:pPr>
+            <w:r>
+              <w:rPr>
+                <w:color w:val="3D3B3B"/>
+                <w:sz w:val="17"/>
+              </w:rPr>
+              <w:t>24 hours</w:t>
+            </w:r>
+          </w:p>
+        </w:tc>
+        <w:tc>
+          <w:tcPr>
+            <w:tcW w:type="dxa" w:w="1814"/>
+          </w:tcPr>
+          <w:p>
+            <w:pPr>
+              <w:spacing w:before="60" w:after="60"/>
+            </w:pPr>
+            <w:r>
+              <w:rPr>
+                <w:color w:val="3D3B3B"/>
+                <w:sz w:val="17"/>
+              </w:rPr>
+              <w:t>2-5 business days for standard issues</w:t>
+            </w:r>
+          </w:p>
+        </w:tc>
+        <w:tc>
+          <w:tcPr>
+            <w:tcW w:type="dxa" w:w="1814"/>
+          </w:tcPr>
+          <w:p>
+            <w:pPr>
+              <w:spacing w:before="60" w:after="60"/>
+            </w:pPr>
+            <w:r>
+              <w:rPr>
+                <w:color w:val="3D3B3B"/>
+                <w:sz w:val="17"/>
+              </w:rPr>
+              <w:t>Support lead, then project manager</w:t>
+            </w:r>
+          </w:p>
+        </w:tc>
+      </w:tr>
+      <w:tr>
+        <w:tc>
+          <w:tcPr>
+            <w:tcW w:type="dxa" w:w="1814"/>
+          </w:tcPr>
+          <w:p>
+            <w:pPr>
+              <w:spacing w:before="60" w:after="60"/>
+            </w:pPr>
+            <w:r>
+              <w:rPr>
+                <w:color w:val="3D3B3B"/>
+                <w:sz w:val="17"/>
+              </w:rPr>
+              <w:t>Gold</w:t>
+            </w:r>
+          </w:p>
+        </w:tc>
+        <w:tc>
+          <w:tcPr>
+            <w:tcW w:type="dxa" w:w="1814"/>
+          </w:tcPr>
+          <w:p>
+            <w:pPr>
+              <w:spacing w:before="60" w:after="60"/>
+            </w:pPr>
+            <w:r>
+              <w:rPr>
+                <w:color w:val="3D3B3B"/>
+                <w:sz w:val="17"/>
+              </w:rPr>
+              <w:t>Extended business hours</w:t>
+            </w:r>
+          </w:p>
+        </w:tc>
+        <w:tc>
+          <w:tcPr>
+            <w:tcW w:type="dxa" w:w="1814"/>
+          </w:tcPr>
+          <w:p>
+            <w:pPr>
+              <w:spacing w:before="60" w:after="60"/>
+            </w:pPr>
+            <w:r>
+              <w:rPr>
+                <w:color w:val="3D3B3B"/>
+                <w:sz w:val="17"/>
+              </w:rPr>
+              <w:t>8 hours</w:t>
+            </w:r>
+          </w:p>
+        </w:tc>
+        <w:tc>
+          <w:tcPr>
+            <w:tcW w:type="dxa" w:w="1814"/>
+          </w:tcPr>
+          <w:p>
+            <w:pPr>
+              <w:spacing w:before="60" w:after="60"/>
+            </w:pPr>
+            <w:r>
+              <w:rPr>
+                <w:color w:val="3D3B3B"/>
+                <w:sz w:val="17"/>
+              </w:rPr>
+              <w:t>1-3 business days for standard issues</w:t>
+            </w:r>
+          </w:p>
+        </w:tc>
+        <w:tc>
+          <w:tcPr>
+            <w:tcW w:type="dxa" w:w="1814"/>
+          </w:tcPr>
+          <w:p>
+            <w:pPr>
+              <w:spacing w:before="60" w:after="60"/>
+            </w:pPr>
+            <w:r>
+              <w:rPr>
+                <w:color w:val="3D3B3B"/>
+                <w:sz w:val="17"/>
+              </w:rPr>
+              <w:t>Support lead, project manager, senior consultant</w:t>
+            </w:r>
+          </w:p>
+        </w:tc>
+      </w:tr>
+    </w:tbl>
+    <w:p>
+      <w:pPr>
+        <w:spacing w:after="120" w:line="276" w:lineRule="auto"/>
+      </w:pPr>
+      <w:r>
+        <w:rPr>
+          <w:b w:val="0"/>
+          <w:i/>
+          <w:color w:val="838081"/>
+          <w:sz w:val="17"/>
+        </w:rPr>
+        <w:t>Emergency support for production-blocking issues can be added as a separate paid add-on if required.</w:t>
       </w:r>
     </w:p>
     <w:p>
@@ -2462,7 +5012,7 @@
           <w:color w:val="142444"/>
           <w:sz w:val="26"/>
         </w:rPr>
-        <w:t>8.  PAYMENT SCHEDULE</w:t>
+        <w:t>10.  PAYMENT SCHEDULE</w:t>
       </w:r>
     </w:p>
     <w:p>
@@ -2475,141 +5025,6 @@
     </w:p>
     <w:p>
       <w:pPr>
-        <w:spacing w:after="40"/>
-      </w:pPr>
-      <w:r>
-        <w:rPr>
-          <w:b/>
-          <w:color w:val="142444"/>
-          <w:sz w:val="20"/>
-        </w:rPr>
-        <w:t xml:space="preserve">  Milestone-Based</w:t>
-      </w:r>
-    </w:p>
-    <w:p>
-      <w:pPr>
-        <w:spacing w:after="80" w:line="276" w:lineRule="auto"/>
-      </w:pPr>
-      <w:r>
-        <w:rPr>
-          <w:b w:val="0"/>
-          <w:i w:val="0"/>
-          <w:color w:val="3D3B3B"/>
-          <w:sz w:val="19"/>
-        </w:rPr>
-        <w:t>30% upon signing, 30% upon UAT sign-off, 30% upon successful go-live, 10% upon 30-day post-go-live review</w:t>
-      </w:r>
-    </w:p>
-    <w:p>
-      <w:pPr>
-        <w:spacing w:after="40"/>
-      </w:pPr>
-      <w:r>
-        <w:rPr>
-          <w:b/>
-          <w:color w:val="142444"/>
-          <w:sz w:val="20"/>
-        </w:rPr>
-        <w:t xml:space="preserve">  50/50 Split</w:t>
-      </w:r>
-    </w:p>
-    <w:p>
-      <w:pPr>
-        <w:spacing w:after="80" w:line="276" w:lineRule="auto"/>
-      </w:pPr>
-      <w:r>
-        <w:rPr>
-          <w:b w:val="0"/>
-          <w:i w:val="0"/>
-          <w:color w:val="3D3B3B"/>
-          <w:sz w:val="19"/>
-        </w:rPr>
-        <w:t>50% upon signing, 50% upon successful go-live.</w:t>
-      </w:r>
-    </w:p>
-    <w:p>
-      <w:pPr>
-        <w:spacing w:after="40"/>
-      </w:pPr>
-      <w:r>
-        <w:rPr>
-          <w:b/>
-          <w:color w:val="142444"/>
-          <w:sz w:val="20"/>
-        </w:rPr>
-        <w:t xml:space="preserve">  Monthly Installments</w:t>
-      </w:r>
-    </w:p>
-    <w:p>
-      <w:pPr>
-        <w:spacing w:after="80" w:line="276" w:lineRule="auto"/>
-      </w:pPr>
-      <w:r>
-        <w:rPr>
-          <w:b w:val="0"/>
-          <w:i w:val="0"/>
-          <w:color w:val="3D3B3B"/>
-          <w:sz w:val="19"/>
-        </w:rPr>
-        <w:t>Equal monthly payments over the implementation period.</w:t>
-      </w:r>
-    </w:p>
-    <w:p>
-      <w:pPr>
-        <w:spacing w:after="40"/>
-      </w:pPr>
-      <w:r>
-        <w:rPr>
-          <w:b/>
-          <w:color w:val="142444"/>
-          <w:sz w:val="20"/>
-        </w:rPr>
-        <w:t xml:space="preserve">  Net 30</w:t>
-      </w:r>
-    </w:p>
-    <w:p>
-      <w:pPr>
-        <w:spacing w:after="80" w:line="276" w:lineRule="auto"/>
-      </w:pPr>
-      <w:r>
-        <w:rPr>
-          <w:b w:val="0"/>
-          <w:i w:val="0"/>
-          <w:color w:val="3D3B3B"/>
-          <w:sz w:val="19"/>
-        </w:rPr>
-        <w:t>Full payment within 30 days of final invoice.</w:t>
-      </w:r>
-    </w:p>
-    <w:p>
-      <w:pPr>
-        <w:spacing w:after="40"/>
-      </w:pPr>
-      <w:r>
-        <w:rPr>
-          <w:b/>
-          <w:color w:val="142444"/>
-          <w:sz w:val="20"/>
-        </w:rPr>
-        <w:t xml:space="preserve">  Full Upfront with 5% Discount</w:t>
-      </w:r>
-    </w:p>
-    <w:p>
-      <w:pPr>
-        <w:spacing w:after="80" w:line="276" w:lineRule="auto"/>
-      </w:pPr>
-      <w:r>
-        <w:rPr>
-          <w:b w:val="0"/>
-          <w:i w:val="0"/>
-          <w:color w:val="3D3B3B"/>
-          <w:sz w:val="19"/>
-        </w:rPr>
-        <w:t>Full payment upon signing. A 5% discount applies to the total project value.</w:t>
-      </w:r>
-    </w:p>
-    <w:p>
-      <w:pPr>
         <w:spacing w:after="120" w:line="276" w:lineRule="auto"/>
       </w:pPr>
       <w:r>
@@ -2619,7 +5034,916 @@
           <w:color w:val="171414"/>
           <w:sz w:val="20"/>
         </w:rPr>
-        <w:t>Selected Payment Terms: {SELECTED_PAYMENT_TERMS}</w:t>
+        <w:t>Selected payment terms: {SELECTED_PAYMENT_TERMS}</w:t>
+      </w:r>
+    </w:p>
+    <w:tbl>
+      <w:tblPr>
+        <w:tblW w:type="auto" w:w="0"/>
+        <w:jc w:val="center"/>
+        <w:tblLook w:firstColumn="1" w:firstRow="1" w:lastColumn="0" w:lastRow="0" w:noHBand="0" w:noVBand="1" w:val="04A0"/>
+      </w:tblPr>
+      <w:tblGrid>
+        <w:gridCol w:w="2268"/>
+        <w:gridCol w:w="2268"/>
+        <w:gridCol w:w="2268"/>
+        <w:gridCol w:w="2268"/>
+      </w:tblGrid>
+      <w:tr>
+        <w:tc>
+          <w:tcPr>
+            <w:tcW w:type="dxa" w:w="2381"/>
+            <w:shd w:fill="171414"/>
+          </w:tcPr>
+          <w:p>
+            <w:pPr>
+              <w:spacing w:before="60" w:after="60"/>
+            </w:pPr>
+            <w:r>
+              <w:rPr>
+                <w:b/>
+                <w:color w:val="FFFFFF"/>
+                <w:sz w:val="16"/>
+              </w:rPr>
+              <w:t>Payment Milestone</w:t>
+            </w:r>
+          </w:p>
+        </w:tc>
+        <w:tc>
+          <w:tcPr>
+            <w:tcW w:type="dxa" w:w="3969"/>
+            <w:shd w:fill="171414"/>
+          </w:tcPr>
+          <w:p>
+            <w:pPr>
+              <w:spacing w:before="60" w:after="60"/>
+            </w:pPr>
+            <w:r>
+              <w:rPr>
+                <w:b/>
+                <w:color w:val="FFFFFF"/>
+                <w:sz w:val="16"/>
+              </w:rPr>
+              <w:t>Trigger</w:t>
+            </w:r>
+          </w:p>
+        </w:tc>
+        <w:tc>
+          <w:tcPr>
+            <w:tcW w:type="dxa" w:w="1247"/>
+            <w:shd w:fill="171414"/>
+          </w:tcPr>
+          <w:p>
+            <w:pPr>
+              <w:spacing w:before="60" w:after="60"/>
+            </w:pPr>
+            <w:r>
+              <w:rPr>
+                <w:b/>
+                <w:color w:val="FFFFFF"/>
+                <w:sz w:val="16"/>
+              </w:rPr>
+              <w:t>Percentage</w:t>
+            </w:r>
+          </w:p>
+        </w:tc>
+        <w:tc>
+          <w:tcPr>
+            <w:tcW w:type="dxa" w:w="1701"/>
+            <w:shd w:fill="171414"/>
+          </w:tcPr>
+          <w:p>
+            <w:pPr>
+              <w:spacing w:before="60" w:after="60"/>
+            </w:pPr>
+            <w:r>
+              <w:rPr>
+                <w:b/>
+                <w:color w:val="FFFFFF"/>
+                <w:sz w:val="16"/>
+              </w:rPr>
+              <w:t>Amount</w:t>
+            </w:r>
+          </w:p>
+        </w:tc>
+      </w:tr>
+      <w:tr>
+        <w:tc>
+          <w:tcPr>
+            <w:tcW w:type="dxa" w:w="2268"/>
+          </w:tcPr>
+          <w:p>
+            <w:pPr>
+              <w:spacing w:before="60" w:after="60"/>
+            </w:pPr>
+            <w:r>
+              <w:rPr>
+                <w:color w:val="3D3B3B"/>
+                <w:sz w:val="17"/>
+              </w:rPr>
+              <w:t>Initial Payment</w:t>
+            </w:r>
+          </w:p>
+        </w:tc>
+        <w:tc>
+          <w:tcPr>
+            <w:tcW w:type="dxa" w:w="2268"/>
+          </w:tcPr>
+          <w:p>
+            <w:pPr>
+              <w:spacing w:before="60" w:after="60"/>
+            </w:pPr>
+            <w:r>
+              <w:rPr>
+                <w:color w:val="3D3B3B"/>
+                <w:sz w:val="17"/>
+              </w:rPr>
+              <w:t>Upon quotation signing</w:t>
+            </w:r>
+          </w:p>
+        </w:tc>
+        <w:tc>
+          <w:tcPr>
+            <w:tcW w:type="dxa" w:w="2268"/>
+          </w:tcPr>
+          <w:p>
+            <w:pPr>
+              <w:spacing w:before="60" w:after="60"/>
+            </w:pPr>
+            <w:r>
+              <w:rPr>
+                <w:color w:val="3D3B3B"/>
+                <w:sz w:val="17"/>
+              </w:rPr>
+              <w:t>30%</w:t>
+            </w:r>
+          </w:p>
+        </w:tc>
+        <w:tc>
+          <w:tcPr>
+            <w:tcW w:type="dxa" w:w="2268"/>
+          </w:tcPr>
+          <w:p>
+            <w:pPr>
+              <w:spacing w:before="60" w:after="60"/>
+            </w:pPr>
+            <w:r>
+              <w:rPr>
+                <w:color w:val="3D3B3B"/>
+                <w:sz w:val="17"/>
+              </w:rPr>
+              <w:t>{PAYMENT_1_AMOUNT}</w:t>
+            </w:r>
+          </w:p>
+        </w:tc>
+      </w:tr>
+      <w:tr>
+        <w:tc>
+          <w:tcPr>
+            <w:tcW w:type="dxa" w:w="2268"/>
+          </w:tcPr>
+          <w:p>
+            <w:pPr>
+              <w:spacing w:before="60" w:after="60"/>
+            </w:pPr>
+            <w:r>
+              <w:rPr>
+                <w:color w:val="3D3B3B"/>
+                <w:sz w:val="17"/>
+              </w:rPr>
+              <w:t>Configuration Milestone</w:t>
+            </w:r>
+          </w:p>
+        </w:tc>
+        <w:tc>
+          <w:tcPr>
+            <w:tcW w:type="dxa" w:w="2268"/>
+          </w:tcPr>
+          <w:p>
+            <w:pPr>
+              <w:spacing w:before="60" w:after="60"/>
+            </w:pPr>
+            <w:r>
+              <w:rPr>
+                <w:color w:val="3D3B3B"/>
+                <w:sz w:val="17"/>
+              </w:rPr>
+              <w:t>Upon approval of configured core modules</w:t>
+            </w:r>
+          </w:p>
+        </w:tc>
+        <w:tc>
+          <w:tcPr>
+            <w:tcW w:type="dxa" w:w="2268"/>
+          </w:tcPr>
+          <w:p>
+            <w:pPr>
+              <w:spacing w:before="60" w:after="60"/>
+            </w:pPr>
+            <w:r>
+              <w:rPr>
+                <w:color w:val="3D3B3B"/>
+                <w:sz w:val="17"/>
+              </w:rPr>
+              <w:t>30%</w:t>
+            </w:r>
+          </w:p>
+        </w:tc>
+        <w:tc>
+          <w:tcPr>
+            <w:tcW w:type="dxa" w:w="2268"/>
+          </w:tcPr>
+          <w:p>
+            <w:pPr>
+              <w:spacing w:before="60" w:after="60"/>
+            </w:pPr>
+            <w:r>
+              <w:rPr>
+                <w:color w:val="3D3B3B"/>
+                <w:sz w:val="17"/>
+              </w:rPr>
+              <w:t>{PAYMENT_2_AMOUNT}</w:t>
+            </w:r>
+          </w:p>
+        </w:tc>
+      </w:tr>
+      <w:tr>
+        <w:tc>
+          <w:tcPr>
+            <w:tcW w:type="dxa" w:w="2268"/>
+          </w:tcPr>
+          <w:p>
+            <w:pPr>
+              <w:spacing w:before="60" w:after="60"/>
+            </w:pPr>
+            <w:r>
+              <w:rPr>
+                <w:color w:val="3D3B3B"/>
+                <w:sz w:val="17"/>
+              </w:rPr>
+              <w:t>Go-Live Milestone</w:t>
+            </w:r>
+          </w:p>
+        </w:tc>
+        <w:tc>
+          <w:tcPr>
+            <w:tcW w:type="dxa" w:w="2268"/>
+          </w:tcPr>
+          <w:p>
+            <w:pPr>
+              <w:spacing w:before="60" w:after="60"/>
+            </w:pPr>
+            <w:r>
+              <w:rPr>
+                <w:color w:val="3D3B3B"/>
+                <w:sz w:val="17"/>
+              </w:rPr>
+              <w:t>Upon successful production launch</w:t>
+            </w:r>
+          </w:p>
+        </w:tc>
+        <w:tc>
+          <w:tcPr>
+            <w:tcW w:type="dxa" w:w="2268"/>
+          </w:tcPr>
+          <w:p>
+            <w:pPr>
+              <w:spacing w:before="60" w:after="60"/>
+            </w:pPr>
+            <w:r>
+              <w:rPr>
+                <w:color w:val="3D3B3B"/>
+                <w:sz w:val="17"/>
+              </w:rPr>
+              <w:t>30%</w:t>
+            </w:r>
+          </w:p>
+        </w:tc>
+        <w:tc>
+          <w:tcPr>
+            <w:tcW w:type="dxa" w:w="2268"/>
+          </w:tcPr>
+          <w:p>
+            <w:pPr>
+              <w:spacing w:before="60" w:after="60"/>
+            </w:pPr>
+            <w:r>
+              <w:rPr>
+                <w:color w:val="3D3B3B"/>
+                <w:sz w:val="17"/>
+              </w:rPr>
+              <w:t>{PAYMENT_3_AMOUNT}</w:t>
+            </w:r>
+          </w:p>
+        </w:tc>
+      </w:tr>
+      <w:tr>
+        <w:tc>
+          <w:tcPr>
+            <w:tcW w:type="dxa" w:w="2268"/>
+          </w:tcPr>
+          <w:p>
+            <w:pPr>
+              <w:spacing w:before="60" w:after="60"/>
+            </w:pPr>
+            <w:r>
+              <w:rPr>
+                <w:color w:val="3D3B3B"/>
+                <w:sz w:val="17"/>
+              </w:rPr>
+              <w:t>Post-Go-Live Review</w:t>
+            </w:r>
+          </w:p>
+        </w:tc>
+        <w:tc>
+          <w:tcPr>
+            <w:tcW w:type="dxa" w:w="2268"/>
+          </w:tcPr>
+          <w:p>
+            <w:pPr>
+              <w:spacing w:before="60" w:after="60"/>
+            </w:pPr>
+            <w:r>
+              <w:rPr>
+                <w:color w:val="3D3B3B"/>
+                <w:sz w:val="17"/>
+              </w:rPr>
+              <w:t>After 30-day warranty review</w:t>
+            </w:r>
+          </w:p>
+        </w:tc>
+        <w:tc>
+          <w:tcPr>
+            <w:tcW w:type="dxa" w:w="2268"/>
+          </w:tcPr>
+          <w:p>
+            <w:pPr>
+              <w:spacing w:before="60" w:after="60"/>
+            </w:pPr>
+            <w:r>
+              <w:rPr>
+                <w:color w:val="3D3B3B"/>
+                <w:sz w:val="17"/>
+              </w:rPr>
+              <w:t>10%</w:t>
+            </w:r>
+          </w:p>
+        </w:tc>
+        <w:tc>
+          <w:tcPr>
+            <w:tcW w:type="dxa" w:w="2268"/>
+          </w:tcPr>
+          <w:p>
+            <w:pPr>
+              <w:spacing w:before="60" w:after="60"/>
+            </w:pPr>
+            <w:r>
+              <w:rPr>
+                <w:color w:val="3D3B3B"/>
+                <w:sz w:val="17"/>
+              </w:rPr>
+              <w:t>{PAYMENT_4_AMOUNT}</w:t>
+            </w:r>
+          </w:p>
+        </w:tc>
+      </w:tr>
+    </w:tbl>
+    <w:p>
+      <w:pPr>
+        <w:spacing w:before="280" w:after="80"/>
+      </w:pPr>
+      <w:r>
+        <w:rPr>
+          <w:rFonts w:ascii="Calibri Light" w:hAnsi="Calibri Light"/>
+          <w:b/>
+          <w:color w:val="142444"/>
+          <w:sz w:val="26"/>
+        </w:rPr>
+        <w:t>11.  CHANGE REQUEST PROCESS</w:t>
+      </w:r>
+    </w:p>
+    <w:p>
+      <w:pPr>
+        <w:spacing w:before="40" w:after="40"/>
+        <w:pBdr>
+          <w:bottom w:val="single" w:sz="8" w:space="1" w:color="FCB900"/>
+        </w:pBdr>
+      </w:pPr>
+    </w:p>
+    <w:p>
+      <w:pPr>
+        <w:spacing w:after="120" w:line="276" w:lineRule="auto"/>
+      </w:pPr>
+      <w:r>
+        <w:rPr>
+          <w:b w:val="0"/>
+          <w:i w:val="0"/>
+          <w:color w:val="3D3B3B"/>
+          <w:sz w:val="20"/>
+        </w:rPr>
+        <w:t>After BRD approval and requirements freeze, any new requirement or material change must follow the process below. This keeps cost, delivery dates, and responsibilities clear for both parties.</w:t>
+      </w:r>
+    </w:p>
+    <w:tbl>
+      <w:tblPr>
+        <w:tblW w:type="auto" w:w="0"/>
+        <w:jc w:val="center"/>
+        <w:tblLook w:firstColumn="1" w:firstRow="1" w:lastColumn="0" w:lastRow="0" w:noHBand="0" w:noVBand="1" w:val="04A0"/>
+      </w:tblPr>
+      <w:tblGrid>
+        <w:gridCol w:w="3024"/>
+        <w:gridCol w:w="3024"/>
+        <w:gridCol w:w="3024"/>
+      </w:tblGrid>
+      <w:tr>
+        <w:tc>
+          <w:tcPr>
+            <w:tcW w:type="dxa" w:w="794"/>
+            <w:shd w:fill="171414"/>
+          </w:tcPr>
+          <w:p>
+            <w:pPr>
+              <w:spacing w:before="60" w:after="60"/>
+            </w:pPr>
+            <w:r>
+              <w:rPr>
+                <w:b/>
+                <w:color w:val="FFFFFF"/>
+                <w:sz w:val="16"/>
+              </w:rPr>
+              <w:t>Step</w:t>
+            </w:r>
+          </w:p>
+        </w:tc>
+        <w:tc>
+          <w:tcPr>
+            <w:tcW w:type="dxa" w:w="4535"/>
+            <w:shd w:fill="171414"/>
+          </w:tcPr>
+          <w:p>
+            <w:pPr>
+              <w:spacing w:before="60" w:after="60"/>
+            </w:pPr>
+            <w:r>
+              <w:rPr>
+                <w:b/>
+                <w:color w:val="FFFFFF"/>
+                <w:sz w:val="16"/>
+              </w:rPr>
+              <w:t>Action</w:t>
+            </w:r>
+          </w:p>
+        </w:tc>
+        <w:tc>
+          <w:tcPr>
+            <w:tcW w:type="dxa" w:w="3855"/>
+            <w:shd w:fill="171414"/>
+          </w:tcPr>
+          <w:p>
+            <w:pPr>
+              <w:spacing w:before="60" w:after="60"/>
+            </w:pPr>
+            <w:r>
+              <w:rPr>
+                <w:b/>
+                <w:color w:val="FFFFFF"/>
+                <w:sz w:val="16"/>
+              </w:rPr>
+              <w:t>Output</w:t>
+            </w:r>
+          </w:p>
+        </w:tc>
+      </w:tr>
+      <w:tr>
+        <w:tc>
+          <w:tcPr>
+            <w:tcW w:type="dxa" w:w="3024"/>
+          </w:tcPr>
+          <w:p>
+            <w:pPr>
+              <w:spacing w:before="60" w:after="60"/>
+            </w:pPr>
+            <w:r>
+              <w:rPr>
+                <w:color w:val="3D3B3B"/>
+                <w:sz w:val="17"/>
+              </w:rPr>
+              <w:t>1</w:t>
+            </w:r>
+          </w:p>
+        </w:tc>
+        <w:tc>
+          <w:tcPr>
+            <w:tcW w:type="dxa" w:w="3024"/>
+          </w:tcPr>
+          <w:p>
+            <w:pPr>
+              <w:spacing w:before="60" w:after="60"/>
+            </w:pPr>
+            <w:r>
+              <w:rPr>
+                <w:color w:val="3D3B3B"/>
+                <w:sz w:val="17"/>
+              </w:rPr>
+              <w:t>Client submits written change request</w:t>
+            </w:r>
+          </w:p>
+        </w:tc>
+        <w:tc>
+          <w:tcPr>
+            <w:tcW w:type="dxa" w:w="3024"/>
+          </w:tcPr>
+          <w:p>
+            <w:pPr>
+              <w:spacing w:before="60" w:after="60"/>
+            </w:pPr>
+            <w:r>
+              <w:rPr>
+                <w:color w:val="3D3B3B"/>
+                <w:sz w:val="17"/>
+              </w:rPr>
+              <w:t>Logged change request</w:t>
+            </w:r>
+          </w:p>
+        </w:tc>
+      </w:tr>
+      <w:tr>
+        <w:tc>
+          <w:tcPr>
+            <w:tcW w:type="dxa" w:w="3024"/>
+          </w:tcPr>
+          <w:p>
+            <w:pPr>
+              <w:spacing w:before="60" w:after="60"/>
+            </w:pPr>
+            <w:r>
+              <w:rPr>
+                <w:color w:val="3D3B3B"/>
+                <w:sz w:val="17"/>
+              </w:rPr>
+              <w:t>2</w:t>
+            </w:r>
+          </w:p>
+        </w:tc>
+        <w:tc>
+          <w:tcPr>
+            <w:tcW w:type="dxa" w:w="3024"/>
+          </w:tcPr>
+          <w:p>
+            <w:pPr>
+              <w:spacing w:before="60" w:after="60"/>
+            </w:pPr>
+            <w:r>
+              <w:rPr>
+                <w:color w:val="3D3B3B"/>
+                <w:sz w:val="17"/>
+              </w:rPr>
+              <w:t>Traffic Digital Solutions reviews business and technical impact</w:t>
+            </w:r>
+          </w:p>
+        </w:tc>
+        <w:tc>
+          <w:tcPr>
+            <w:tcW w:type="dxa" w:w="3024"/>
+          </w:tcPr>
+          <w:p>
+            <w:pPr>
+              <w:spacing w:before="60" w:after="60"/>
+            </w:pPr>
+            <w:r>
+              <w:rPr>
+                <w:color w:val="3D3B3B"/>
+                <w:sz w:val="17"/>
+              </w:rPr>
+              <w:t>Impact analysis</w:t>
+            </w:r>
+          </w:p>
+        </w:tc>
+      </w:tr>
+      <w:tr>
+        <w:tc>
+          <w:tcPr>
+            <w:tcW w:type="dxa" w:w="3024"/>
+          </w:tcPr>
+          <w:p>
+            <w:pPr>
+              <w:spacing w:before="60" w:after="60"/>
+            </w:pPr>
+            <w:r>
+              <w:rPr>
+                <w:color w:val="3D3B3B"/>
+                <w:sz w:val="17"/>
+              </w:rPr>
+              <w:t>3</w:t>
+            </w:r>
+          </w:p>
+        </w:tc>
+        <w:tc>
+          <w:tcPr>
+            <w:tcW w:type="dxa" w:w="3024"/>
+          </w:tcPr>
+          <w:p>
+            <w:pPr>
+              <w:spacing w:before="60" w:after="60"/>
+            </w:pPr>
+            <w:r>
+              <w:rPr>
+                <w:color w:val="3D3B3B"/>
+                <w:sz w:val="17"/>
+              </w:rPr>
+              <w:t>Cost, timeline, and dependency impact are estimated</w:t>
+            </w:r>
+          </w:p>
+        </w:tc>
+        <w:tc>
+          <w:tcPr>
+            <w:tcW w:type="dxa" w:w="3024"/>
+          </w:tcPr>
+          <w:p>
+            <w:pPr>
+              <w:spacing w:before="60" w:after="60"/>
+            </w:pPr>
+            <w:r>
+              <w:rPr>
+                <w:color w:val="3D3B3B"/>
+                <w:sz w:val="17"/>
+              </w:rPr>
+              <w:t>Change quotation</w:t>
+            </w:r>
+          </w:p>
+        </w:tc>
+      </w:tr>
+      <w:tr>
+        <w:tc>
+          <w:tcPr>
+            <w:tcW w:type="dxa" w:w="3024"/>
+          </w:tcPr>
+          <w:p>
+            <w:pPr>
+              <w:spacing w:before="60" w:after="60"/>
+            </w:pPr>
+            <w:r>
+              <w:rPr>
+                <w:color w:val="3D3B3B"/>
+                <w:sz w:val="17"/>
+              </w:rPr>
+              <w:t>4</w:t>
+            </w:r>
+          </w:p>
+        </w:tc>
+        <w:tc>
+          <w:tcPr>
+            <w:tcW w:type="dxa" w:w="3024"/>
+          </w:tcPr>
+          <w:p>
+            <w:pPr>
+              <w:spacing w:before="60" w:after="60"/>
+            </w:pPr>
+            <w:r>
+              <w:rPr>
+                <w:color w:val="3D3B3B"/>
+                <w:sz w:val="17"/>
+              </w:rPr>
+              <w:t>Client approves or rejects the change in writing</w:t>
+            </w:r>
+          </w:p>
+        </w:tc>
+        <w:tc>
+          <w:tcPr>
+            <w:tcW w:type="dxa" w:w="3024"/>
+          </w:tcPr>
+          <w:p>
+            <w:pPr>
+              <w:spacing w:before="60" w:after="60"/>
+            </w:pPr>
+            <w:r>
+              <w:rPr>
+                <w:color w:val="3D3B3B"/>
+                <w:sz w:val="17"/>
+              </w:rPr>
+              <w:t>Signed approval or rejection</w:t>
+            </w:r>
+          </w:p>
+        </w:tc>
+      </w:tr>
+      <w:tr>
+        <w:tc>
+          <w:tcPr>
+            <w:tcW w:type="dxa" w:w="3024"/>
+          </w:tcPr>
+          <w:p>
+            <w:pPr>
+              <w:spacing w:before="60" w:after="60"/>
+            </w:pPr>
+            <w:r>
+              <w:rPr>
+                <w:color w:val="3D3B3B"/>
+                <w:sz w:val="17"/>
+              </w:rPr>
+              <w:t>5</w:t>
+            </w:r>
+          </w:p>
+        </w:tc>
+        <w:tc>
+          <w:tcPr>
+            <w:tcW w:type="dxa" w:w="3024"/>
+          </w:tcPr>
+          <w:p>
+            <w:pPr>
+              <w:spacing w:before="60" w:after="60"/>
+            </w:pPr>
+            <w:r>
+              <w:rPr>
+                <w:color w:val="3D3B3B"/>
+                <w:sz w:val="17"/>
+              </w:rPr>
+              <w:t>Approved change is scheduled for delivery</w:t>
+            </w:r>
+          </w:p>
+        </w:tc>
+        <w:tc>
+          <w:tcPr>
+            <w:tcW w:type="dxa" w:w="3024"/>
+          </w:tcPr>
+          <w:p>
+            <w:pPr>
+              <w:spacing w:before="60" w:after="60"/>
+            </w:pPr>
+            <w:r>
+              <w:rPr>
+                <w:color w:val="3D3B3B"/>
+                <w:sz w:val="17"/>
+              </w:rPr>
+              <w:t>Updated project plan</w:t>
+            </w:r>
+          </w:p>
+        </w:tc>
+      </w:tr>
+    </w:tbl>
+    <w:p>
+      <w:pPr>
+        <w:spacing w:before="280" w:after="80"/>
+      </w:pPr>
+      <w:r>
+        <w:rPr>
+          <w:rFonts w:ascii="Calibri Light" w:hAnsi="Calibri Light"/>
+          <w:b/>
+          <w:color w:val="142444"/>
+          <w:sz w:val="26"/>
+        </w:rPr>
+        <w:t>12.  EXCLUSIONS AND REQUIREMENTS FREEZE</w:t>
+      </w:r>
+    </w:p>
+    <w:p>
+      <w:pPr>
+        <w:spacing w:before="40" w:after="40"/>
+        <w:pBdr>
+          <w:bottom w:val="single" w:sz="8" w:space="1" w:color="FCB900"/>
+        </w:pBdr>
+      </w:pPr>
+    </w:p>
+    <w:p>
+      <w:pPr>
+        <w:spacing w:after="120" w:line="276" w:lineRule="auto"/>
+      </w:pPr>
+      <w:r>
+        <w:rPr>
+          <w:b w:val="0"/>
+          <w:i w:val="0"/>
+          <w:color w:val="3D3B3B"/>
+          <w:sz w:val="20"/>
+        </w:rPr>
+        <w:t>The following are explicitly excluded from this quotation unless separately agreed in writing:</w:t>
+      </w:r>
+    </w:p>
+    <w:p>
+      <w:pPr>
+        <w:spacing w:after="40"/>
+        <w:ind w:left="283"/>
+      </w:pPr>
+      <w:r>
+        <w:rPr>
+          <w:color w:val="3D3B3B"/>
+          <w:sz w:val="19"/>
+        </w:rPr>
+        <w:t xml:space="preserve">  •  Any requirement, module, report, integration, or workflow not listed in the approved Business Requirements Document</w:t>
+      </w:r>
+    </w:p>
+    <w:p>
+      <w:pPr>
+        <w:spacing w:after="40"/>
+        <w:ind w:left="283"/>
+      </w:pPr>
+      <w:r>
+        <w:rPr>
+          <w:color w:val="3D3B3B"/>
+          <w:sz w:val="19"/>
+        </w:rPr>
+        <w:t xml:space="preserve">  •  Changes requested after BRD approval and requirements freeze, unless approved through a signed change request</w:t>
+      </w:r>
+    </w:p>
+    <w:p>
+      <w:pPr>
+        <w:spacing w:after="40"/>
+        <w:ind w:left="283"/>
+      </w:pPr>
+      <w:r>
+        <w:rPr>
+          <w:color w:val="3D3B3B"/>
+          <w:sz w:val="19"/>
+        </w:rPr>
+        <w:t xml:space="preserve">  •  Odoo Online subscription fees or Odoo Enterprise license costs (paid directly to Odoo S.A. by you)</w:t>
+      </w:r>
+    </w:p>
+    <w:p>
+      <w:pPr>
+        <w:spacing w:after="40"/>
+        <w:ind w:left="283"/>
+      </w:pPr>
+      <w:r>
+        <w:rPr>
+          <w:color w:val="3D3B3B"/>
+          <w:sz w:val="19"/>
+        </w:rPr>
+        <w:t xml:space="preserve">  •  Third-party Odoo apps or modules purchased from the Odoo App Store</w:t>
+      </w:r>
+    </w:p>
+    <w:p>
+      <w:pPr>
+        <w:spacing w:after="40"/>
+        <w:ind w:left="283"/>
+      </w:pPr>
+      <w:r>
+        <w:rPr>
+          <w:color w:val="3D3B3B"/>
+          <w:sz w:val="19"/>
+        </w:rPr>
+        <w:t xml:space="preserve">  •  Website content creation (copywriting, photography, videography)</w:t>
+      </w:r>
+    </w:p>
+    <w:p>
+      <w:pPr>
+        <w:spacing w:after="40"/>
+        <w:ind w:left="283"/>
+      </w:pPr>
+      <w:r>
+        <w:rPr>
+          <w:color w:val="3D3B3B"/>
+          <w:sz w:val="19"/>
+        </w:rPr>
+        <w:t xml:space="preserve">  •  Custom mobile or tablet application development</w:t>
+      </w:r>
+    </w:p>
+    <w:p>
+      <w:pPr>
+        <w:spacing w:after="40"/>
+        <w:ind w:left="283"/>
+      </w:pPr>
+      <w:r>
+        <w:rPr>
+          <w:color w:val="3D3B3B"/>
+          <w:sz w:val="19"/>
+        </w:rPr>
+        <w:t xml:space="preserve">  •  Ongoing support and maintenance beyond the 30-day warranty period, unless covered by a selected support plan</w:t>
+      </w:r>
+    </w:p>
+    <w:p>
+      <w:pPr>
+        <w:spacing w:after="40"/>
+        <w:ind w:left="283"/>
+      </w:pPr>
+      <w:r>
+        <w:rPr>
+          <w:color w:val="3D3B3B"/>
+          <w:sz w:val="19"/>
+        </w:rPr>
+        <w:t xml:space="preserve">  •  Hardware, server infrastructure, or IT equipment procurement</w:t>
+      </w:r>
+    </w:p>
+    <w:p>
+      <w:pPr>
+        <w:spacing w:after="40"/>
+        <w:ind w:left="283"/>
+      </w:pPr>
+      <w:r>
+        <w:rPr>
+          <w:color w:val="3D3B3B"/>
+          <w:sz w:val="19"/>
+        </w:rPr>
+        <w:t xml:space="preserve">  •  Graphic design, brand identity, or logo creation beyond Odoo website theme configuration</w:t>
+      </w:r>
+    </w:p>
+    <w:p>
+      <w:pPr>
+        <w:spacing w:after="40"/>
+        <w:ind w:left="283"/>
+      </w:pPr>
+      <w:r>
+        <w:rPr>
+          <w:color w:val="3D3B3B"/>
+          <w:sz w:val="19"/>
+        </w:rPr>
+        <w:t xml:space="preserve">  •  Integration with systems not explicitly listed in this quotation</w:t>
       </w:r>
     </w:p>
     <w:p>
@@ -2633,7 +5957,7 @@
           <w:color w:val="142444"/>
           <w:sz w:val="26"/>
         </w:rPr>
-        <w:t>9.  TERMS &amp; CONDITIONS</w:t>
+        <w:t>13.  TERMS &amp; CONDITIONS</w:t>
       </w:r>
     </w:p>
     <w:p>
@@ -2668,7 +5992,7 @@
           <w:color w:val="3D3B3B"/>
           <w:sz w:val="19"/>
         </w:rPr>
-        <w:t>The scope of work is defined exclusively in Section 3 of this Quotation. Any services, deliverables, or modifications not expressly listed are excluded unless subsequently agreed in a written change order signed by both parties. Additional work will be billed at {ADDITIONAL_WORK_RATE}/hour.</w:t>
+        <w:t>The scope of work is defined exclusively in Section 4 of this Quotation. Any services, deliverables, or modifications not expressly listed are excluded unless subsequently agreed in a written change order signed by both parties. Additional work will be billed at {ADDITIONAL_WORK_RATE}/hour.</w:t>
       </w:r>
     </w:p>
     <w:p>
@@ -2749,7 +6073,7 @@
           <w:color w:val="3D3B3B"/>
           <w:sz w:val="19"/>
         </w:rPr>
-        <w:t>4.1 Custom Developments: Upon full payment of all amounts due, you own all custom-developed code, configurations, reports, and workflows created specifically for this project. We grant you a perpetual, irrevocable, royalty-free license to use such developments. 4.2 Our IP: We retain all rights, title, and interest in our pre-existing methodologies, frameworks, tools, libraries, know-how, and Odoo modules not developed specifically for this project. 4.3 Odoo IP: Odoo S.A. retains all rights to the Odoo platform and its modules.</w:t>
+        <w:t>4.1 Client-Specific Work: Upon full payment of all amounts due, you own the custom code, configurations, reports, workflows, documents, and deliverables created specifically and exclusively for this project. 4.2 Traffic Digital Solutions Materials: We retain ownership of our pre-existing methods, templates, tools, libraries, reusable components, know-how, implementation accelerators, and generic Odoo modules that were not created exclusively for you. Where such materials are used in your project, we grant you a non-exclusive, perpetual license to use them as part of your implemented Odoo system. 4.3 Odoo Platform: Odoo S.A. retains all rights to the Odoo platform, standard modules, and licensed software.</w:t>
       </w:r>
     </w:p>
     <w:p>
@@ -3006,7 +6330,7 @@
           <w:color w:val="142444"/>
           <w:sz w:val="26"/>
         </w:rPr>
-        <w:t>10.  ACCEPTANCE &amp; SIGNATURE</w:t>
+        <w:t>14.  ACCEPTANCE &amp; SIGNATURE</w:t>
       </w:r>
     </w:p>
     <w:p>

</xml_diff>

<commit_message>
Add enterprise proof sections to Odoo proposal
</commit_message>
<xml_diff>
--- a/doc/quotation/TDS-GEO-Quotation.docx
+++ b/doc/quotation/TDS-GEO-Quotation.docx
@@ -51,7 +51,7 @@
                 <w:color w:val="838081"/>
                 <w:sz w:val="18"/>
               </w:rPr>
-              <w:t>Odoo Gold Implementation Partner</w:t>
+              <w:t>Odoo Implementation Services - {ODOO_PARTNER_STATUS}</w:t>
               <w:br/>
             </w:r>
             <w:r>
@@ -810,6 +810,1310 @@
     </w:tbl>
     <w:p>
       <w:pPr>
+        <w:spacing w:after="80" w:line="276" w:lineRule="auto"/>
+      </w:pPr>
+      <w:r>
+        <w:rPr>
+          <w:b/>
+          <w:i w:val="0"/>
+          <w:color w:val="142444"/>
+          <w:sz w:val="20"/>
+        </w:rPr>
+        <w:t>Why Traffic wins:</w:t>
+      </w:r>
+    </w:p>
+    <w:tbl>
+      <w:tblPr>
+        <w:tblW w:type="auto" w:w="0"/>
+        <w:jc w:val="center"/>
+        <w:tblLook w:firstColumn="1" w:firstRow="1" w:lastColumn="0" w:lastRow="0" w:noHBand="0" w:noVBand="1" w:val="04A0"/>
+      </w:tblPr>
+      <w:tblGrid>
+        <w:gridCol w:w="4536"/>
+        <w:gridCol w:w="4536"/>
+      </w:tblGrid>
+      <w:tr>
+        <w:tc>
+          <w:tcPr>
+            <w:tcW w:type="dxa" w:w="2948"/>
+            <w:shd w:fill="171414"/>
+          </w:tcPr>
+          <w:p>
+            <w:pPr>
+              <w:spacing w:before="60" w:after="60"/>
+            </w:pPr>
+            <w:r>
+              <w:rPr>
+                <w:b/>
+                <w:color w:val="FFFFFF"/>
+                <w:sz w:val="16"/>
+              </w:rPr>
+              <w:t>Proof Point</w:t>
+            </w:r>
+          </w:p>
+        </w:tc>
+        <w:tc>
+          <w:tcPr>
+            <w:tcW w:type="dxa" w:w="6690"/>
+            <w:shd w:fill="171414"/>
+          </w:tcPr>
+          <w:p>
+            <w:pPr>
+              <w:spacing w:before="60" w:after="60"/>
+            </w:pPr>
+            <w:r>
+              <w:rPr>
+                <w:b/>
+                <w:color w:val="FFFFFF"/>
+                <w:sz w:val="16"/>
+              </w:rPr>
+              <w:t>Proposal Value</w:t>
+            </w:r>
+          </w:p>
+        </w:tc>
+      </w:tr>
+      <w:tr>
+        <w:tc>
+          <w:tcPr>
+            <w:tcW w:type="dxa" w:w="4536"/>
+          </w:tcPr>
+          <w:p>
+            <w:pPr>
+              <w:spacing w:before="60" w:after="60"/>
+            </w:pPr>
+            <w:r>
+              <w:rPr>
+                <w:color w:val="3D3B3B"/>
+                <w:sz w:val="17"/>
+              </w:rPr>
+              <w:t>Completed Odoo implementations</w:t>
+            </w:r>
+          </w:p>
+        </w:tc>
+        <w:tc>
+          <w:tcPr>
+            <w:tcW w:type="dxa" w:w="4536"/>
+          </w:tcPr>
+          <w:p>
+            <w:pPr>
+              <w:spacing w:before="60" w:after="60"/>
+            </w:pPr>
+            <w:r>
+              <w:rPr>
+                <w:color w:val="3D3B3B"/>
+                <w:sz w:val="17"/>
+              </w:rPr>
+              <w:t>{COMPLETED_ODOO_IMPLEMENTATIONS}+ implementations across selected industries</w:t>
+            </w:r>
+          </w:p>
+        </w:tc>
+      </w:tr>
+      <w:tr>
+        <w:tc>
+          <w:tcPr>
+            <w:tcW w:type="dxa" w:w="4536"/>
+          </w:tcPr>
+          <w:p>
+            <w:pPr>
+              <w:spacing w:before="60" w:after="60"/>
+            </w:pPr>
+            <w:r>
+              <w:rPr>
+                <w:color w:val="3D3B3B"/>
+                <w:sz w:val="17"/>
+              </w:rPr>
+              <w:t>Average go-live time</w:t>
+            </w:r>
+          </w:p>
+        </w:tc>
+        <w:tc>
+          <w:tcPr>
+            <w:tcW w:type="dxa" w:w="4536"/>
+          </w:tcPr>
+          <w:p>
+            <w:pPr>
+              <w:spacing w:before="60" w:after="60"/>
+            </w:pPr>
+            <w:r>
+              <w:rPr>
+                <w:color w:val="3D3B3B"/>
+                <w:sz w:val="17"/>
+              </w:rPr>
+              <w:t>{AVERAGE_GO_LIVE_TIME} for projects of similar scope</w:t>
+            </w:r>
+          </w:p>
+        </w:tc>
+      </w:tr>
+      <w:tr>
+        <w:tc>
+          <w:tcPr>
+            <w:tcW w:type="dxa" w:w="4536"/>
+          </w:tcPr>
+          <w:p>
+            <w:pPr>
+              <w:spacing w:before="60" w:after="60"/>
+            </w:pPr>
+            <w:r>
+              <w:rPr>
+                <w:color w:val="3D3B3B"/>
+                <w:sz w:val="17"/>
+              </w:rPr>
+              <w:t>Client satisfaction</w:t>
+            </w:r>
+          </w:p>
+        </w:tc>
+        <w:tc>
+          <w:tcPr>
+            <w:tcW w:type="dxa" w:w="4536"/>
+          </w:tcPr>
+          <w:p>
+            <w:pPr>
+              <w:spacing w:before="60" w:after="60"/>
+            </w:pPr>
+            <w:r>
+              <w:rPr>
+                <w:color w:val="3D3B3B"/>
+                <w:sz w:val="17"/>
+              </w:rPr>
+              <w:t>{CLIENT_SATISFACTION_RATE}% satisfaction based on post-project feedback</w:t>
+            </w:r>
+          </w:p>
+        </w:tc>
+      </w:tr>
+      <w:tr>
+        <w:tc>
+          <w:tcPr>
+            <w:tcW w:type="dxa" w:w="4536"/>
+          </w:tcPr>
+          <w:p>
+            <w:pPr>
+              <w:spacing w:before="60" w:after="60"/>
+            </w:pPr>
+            <w:r>
+              <w:rPr>
+                <w:color w:val="3D3B3B"/>
+                <w:sz w:val="17"/>
+              </w:rPr>
+              <w:t>Certified capability</w:t>
+            </w:r>
+          </w:p>
+        </w:tc>
+        <w:tc>
+          <w:tcPr>
+            <w:tcW w:type="dxa" w:w="4536"/>
+          </w:tcPr>
+          <w:p>
+            <w:pPr>
+              <w:spacing w:before="60" w:after="60"/>
+            </w:pPr>
+            <w:r>
+              <w:rPr>
+                <w:color w:val="3D3B3B"/>
+                <w:sz w:val="17"/>
+              </w:rPr>
+              <w:t>{ODOO_CERTIFICATIONS} Odoo certifications and {ODOO_CONSULTANTS} active consultants</w:t>
+            </w:r>
+          </w:p>
+        </w:tc>
+      </w:tr>
+      <w:tr>
+        <w:tc>
+          <w:tcPr>
+            <w:tcW w:type="dxa" w:w="4536"/>
+          </w:tcPr>
+          <w:p>
+            <w:pPr>
+              <w:spacing w:before="60" w:after="60"/>
+            </w:pPr>
+            <w:r>
+              <w:rPr>
+                <w:color w:val="3D3B3B"/>
+                <w:sz w:val="17"/>
+              </w:rPr>
+              <w:t>Support desk</w:t>
+            </w:r>
+          </w:p>
+        </w:tc>
+        <w:tc>
+          <w:tcPr>
+            <w:tcW w:type="dxa" w:w="4536"/>
+          </w:tcPr>
+          <w:p>
+            <w:pPr>
+              <w:spacing w:before="60" w:after="60"/>
+            </w:pPr>
+            <w:r>
+              <w:rPr>
+                <w:color w:val="3D3B3B"/>
+                <w:sz w:val="17"/>
+              </w:rPr>
+              <w:t>{SUPPORT_TEAM_SIZE} support specialists with documented SLA and escalation process</w:t>
+            </w:r>
+          </w:p>
+        </w:tc>
+      </w:tr>
+      <w:tr>
+        <w:tc>
+          <w:tcPr>
+            <w:tcW w:type="dxa" w:w="4536"/>
+          </w:tcPr>
+          <w:p>
+            <w:pPr>
+              <w:spacing w:before="60" w:after="60"/>
+            </w:pPr>
+            <w:r>
+              <w:rPr>
+                <w:color w:val="3D3B3B"/>
+                <w:sz w:val="17"/>
+              </w:rPr>
+              <w:t>Local delivery</w:t>
+            </w:r>
+          </w:p>
+        </w:tc>
+        <w:tc>
+          <w:tcPr>
+            <w:tcW w:type="dxa" w:w="4536"/>
+          </w:tcPr>
+          <w:p>
+            <w:pPr>
+              <w:spacing w:before="60" w:after="60"/>
+            </w:pPr>
+            <w:r>
+              <w:rPr>
+                <w:color w:val="3D3B3B"/>
+                <w:sz w:val="17"/>
+              </w:rPr>
+              <w:t>Cairo-based team with on-site workshop and executive steering support when needed</w:t>
+            </w:r>
+          </w:p>
+        </w:tc>
+      </w:tr>
+    </w:tbl>
+    <w:p>
+      <w:pPr>
+        <w:spacing w:after="80" w:line="276" w:lineRule="auto"/>
+      </w:pPr>
+      <w:r>
+        <w:rPr>
+          <w:b/>
+          <w:i w:val="0"/>
+          <w:color w:val="142444"/>
+          <w:sz w:val="20"/>
+        </w:rPr>
+        <w:t>Our implementation approach:</w:t>
+      </w:r>
+    </w:p>
+    <w:tbl>
+      <w:tblPr>
+        <w:tblW w:type="auto" w:w="0"/>
+        <w:jc w:val="center"/>
+        <w:tblLook w:firstColumn="1" w:firstRow="1" w:lastColumn="0" w:lastRow="0" w:noHBand="0" w:noVBand="1" w:val="04A0"/>
+      </w:tblPr>
+      <w:tblGrid>
+        <w:gridCol w:w="4536"/>
+        <w:gridCol w:w="4536"/>
+      </w:tblGrid>
+      <w:tr>
+        <w:tc>
+          <w:tcPr>
+            <w:tcW w:type="dxa" w:w="2608"/>
+            <w:shd w:fill="171414"/>
+          </w:tcPr>
+          <w:p>
+            <w:pPr>
+              <w:spacing w:before="60" w:after="60"/>
+            </w:pPr>
+            <w:r>
+              <w:rPr>
+                <w:b/>
+                <w:color w:val="FFFFFF"/>
+                <w:sz w:val="16"/>
+              </w:rPr>
+              <w:t>Stage</w:t>
+            </w:r>
+          </w:p>
+        </w:tc>
+        <w:tc>
+          <w:tcPr>
+            <w:tcW w:type="dxa" w:w="7030"/>
+            <w:shd w:fill="171414"/>
+          </w:tcPr>
+          <w:p>
+            <w:pPr>
+              <w:spacing w:before="60" w:after="60"/>
+            </w:pPr>
+            <w:r>
+              <w:rPr>
+                <w:b/>
+                <w:color w:val="FFFFFF"/>
+                <w:sz w:val="16"/>
+              </w:rPr>
+              <w:t>Output</w:t>
+            </w:r>
+          </w:p>
+        </w:tc>
+      </w:tr>
+      <w:tr>
+        <w:tc>
+          <w:tcPr>
+            <w:tcW w:type="dxa" w:w="4536"/>
+          </w:tcPr>
+          <w:p>
+            <w:pPr>
+              <w:spacing w:before="60" w:after="60"/>
+            </w:pPr>
+            <w:r>
+              <w:rPr>
+                <w:color w:val="3D3B3B"/>
+                <w:sz w:val="17"/>
+              </w:rPr>
+              <w:t>1. Discovery</w:t>
+            </w:r>
+          </w:p>
+        </w:tc>
+        <w:tc>
+          <w:tcPr>
+            <w:tcW w:type="dxa" w:w="4536"/>
+          </w:tcPr>
+          <w:p>
+            <w:pPr>
+              <w:spacing w:before="60" w:after="60"/>
+            </w:pPr>
+            <w:r>
+              <w:rPr>
+                <w:color w:val="3D3B3B"/>
+                <w:sz w:val="17"/>
+              </w:rPr>
+              <w:t>Stakeholder interviews, current-state review, data audit</w:t>
+            </w:r>
+          </w:p>
+        </w:tc>
+      </w:tr>
+      <w:tr>
+        <w:tc>
+          <w:tcPr>
+            <w:tcW w:type="dxa" w:w="4536"/>
+          </w:tcPr>
+          <w:p>
+            <w:pPr>
+              <w:spacing w:before="60" w:after="60"/>
+            </w:pPr>
+            <w:r>
+              <w:rPr>
+                <w:color w:val="3D3B3B"/>
+                <w:sz w:val="17"/>
+              </w:rPr>
+              <w:t>2. Business Analysis</w:t>
+            </w:r>
+          </w:p>
+        </w:tc>
+        <w:tc>
+          <w:tcPr>
+            <w:tcW w:type="dxa" w:w="4536"/>
+          </w:tcPr>
+          <w:p>
+            <w:pPr>
+              <w:spacing w:before="60" w:after="60"/>
+            </w:pPr>
+            <w:r>
+              <w:rPr>
+                <w:color w:val="3D3B3B"/>
+                <w:sz w:val="17"/>
+              </w:rPr>
+              <w:t>Process maps, GAP Analysis, BRD, implementation priorities</w:t>
+            </w:r>
+          </w:p>
+        </w:tc>
+      </w:tr>
+      <w:tr>
+        <w:tc>
+          <w:tcPr>
+            <w:tcW w:type="dxa" w:w="4536"/>
+          </w:tcPr>
+          <w:p>
+            <w:pPr>
+              <w:spacing w:before="60" w:after="60"/>
+            </w:pPr>
+            <w:r>
+              <w:rPr>
+                <w:color w:val="3D3B3B"/>
+                <w:sz w:val="17"/>
+              </w:rPr>
+              <w:t>3. Solution Design</w:t>
+            </w:r>
+          </w:p>
+        </w:tc>
+        <w:tc>
+          <w:tcPr>
+            <w:tcW w:type="dxa" w:w="4536"/>
+          </w:tcPr>
+          <w:p>
+            <w:pPr>
+              <w:spacing w:before="60" w:after="60"/>
+            </w:pPr>
+            <w:r>
+              <w:rPr>
+                <w:color w:val="3D3B3B"/>
+                <w:sz w:val="17"/>
+              </w:rPr>
+              <w:t>Target workflows, roles, approvals, reports, integrations</w:t>
+            </w:r>
+          </w:p>
+        </w:tc>
+      </w:tr>
+      <w:tr>
+        <w:tc>
+          <w:tcPr>
+            <w:tcW w:type="dxa" w:w="4536"/>
+          </w:tcPr>
+          <w:p>
+            <w:pPr>
+              <w:spacing w:before="60" w:after="60"/>
+            </w:pPr>
+            <w:r>
+              <w:rPr>
+                <w:color w:val="3D3B3B"/>
+                <w:sz w:val="17"/>
+              </w:rPr>
+              <w:t>4. Configuration</w:t>
+            </w:r>
+          </w:p>
+        </w:tc>
+        <w:tc>
+          <w:tcPr>
+            <w:tcW w:type="dxa" w:w="4536"/>
+          </w:tcPr>
+          <w:p>
+            <w:pPr>
+              <w:spacing w:before="60" w:after="60"/>
+            </w:pPr>
+            <w:r>
+              <w:rPr>
+                <w:color w:val="3D3B3B"/>
+                <w:sz w:val="17"/>
+              </w:rPr>
+              <w:t>Odoo modules configured according to the approved BRD</w:t>
+            </w:r>
+          </w:p>
+        </w:tc>
+      </w:tr>
+      <w:tr>
+        <w:tc>
+          <w:tcPr>
+            <w:tcW w:type="dxa" w:w="4536"/>
+          </w:tcPr>
+          <w:p>
+            <w:pPr>
+              <w:spacing w:before="60" w:after="60"/>
+            </w:pPr>
+            <w:r>
+              <w:rPr>
+                <w:color w:val="3D3B3B"/>
+                <w:sz w:val="17"/>
+              </w:rPr>
+              <w:t>5. Development</w:t>
+            </w:r>
+          </w:p>
+        </w:tc>
+        <w:tc>
+          <w:tcPr>
+            <w:tcW w:type="dxa" w:w="4536"/>
+          </w:tcPr>
+          <w:p>
+            <w:pPr>
+              <w:spacing w:before="60" w:after="60"/>
+            </w:pPr>
+            <w:r>
+              <w:rPr>
+                <w:color w:val="3D3B3B"/>
+                <w:sz w:val="17"/>
+              </w:rPr>
+              <w:t>Approved custom fields, reports, automations, and integrations</w:t>
+            </w:r>
+          </w:p>
+        </w:tc>
+      </w:tr>
+      <w:tr>
+        <w:tc>
+          <w:tcPr>
+            <w:tcW w:type="dxa" w:w="4536"/>
+          </w:tcPr>
+          <w:p>
+            <w:pPr>
+              <w:spacing w:before="60" w:after="60"/>
+            </w:pPr>
+            <w:r>
+              <w:rPr>
+                <w:color w:val="3D3B3B"/>
+                <w:sz w:val="17"/>
+              </w:rPr>
+              <w:t>6. Testing</w:t>
+            </w:r>
+          </w:p>
+        </w:tc>
+        <w:tc>
+          <w:tcPr>
+            <w:tcW w:type="dxa" w:w="4536"/>
+          </w:tcPr>
+          <w:p>
+            <w:pPr>
+              <w:spacing w:before="60" w:after="60"/>
+            </w:pPr>
+            <w:r>
+              <w:rPr>
+                <w:color w:val="3D3B3B"/>
+                <w:sz w:val="17"/>
+              </w:rPr>
+              <w:t>Internal QA, UAT support, defect closure, acceptance evidence</w:t>
+            </w:r>
+          </w:p>
+        </w:tc>
+      </w:tr>
+      <w:tr>
+        <w:tc>
+          <w:tcPr>
+            <w:tcW w:type="dxa" w:w="4536"/>
+          </w:tcPr>
+          <w:p>
+            <w:pPr>
+              <w:spacing w:before="60" w:after="60"/>
+            </w:pPr>
+            <w:r>
+              <w:rPr>
+                <w:color w:val="3D3B3B"/>
+                <w:sz w:val="17"/>
+              </w:rPr>
+              <w:t>7. Training</w:t>
+            </w:r>
+          </w:p>
+        </w:tc>
+        <w:tc>
+          <w:tcPr>
+            <w:tcW w:type="dxa" w:w="4536"/>
+          </w:tcPr>
+          <w:p>
+            <w:pPr>
+              <w:spacing w:before="60" w:after="60"/>
+            </w:pPr>
+            <w:r>
+              <w:rPr>
+                <w:color w:val="3D3B3B"/>
+                <w:sz w:val="17"/>
+              </w:rPr>
+              <w:t>Role-based sessions, user manual, SOPs, admin guide</w:t>
+            </w:r>
+          </w:p>
+        </w:tc>
+      </w:tr>
+      <w:tr>
+        <w:tc>
+          <w:tcPr>
+            <w:tcW w:type="dxa" w:w="4536"/>
+          </w:tcPr>
+          <w:p>
+            <w:pPr>
+              <w:spacing w:before="60" w:after="60"/>
+            </w:pPr>
+            <w:r>
+              <w:rPr>
+                <w:color w:val="3D3B3B"/>
+                <w:sz w:val="17"/>
+              </w:rPr>
+              <w:t>8. Go-Live</w:t>
+            </w:r>
+          </w:p>
+        </w:tc>
+        <w:tc>
+          <w:tcPr>
+            <w:tcW w:type="dxa" w:w="4536"/>
+          </w:tcPr>
+          <w:p>
+            <w:pPr>
+              <w:spacing w:before="60" w:after="60"/>
+            </w:pPr>
+            <w:r>
+              <w:rPr>
+                <w:color w:val="3D3B3B"/>
+                <w:sz w:val="17"/>
+              </w:rPr>
+              <w:t>Production launch, checklist completion, stakeholder sign-off</w:t>
+            </w:r>
+          </w:p>
+        </w:tc>
+      </w:tr>
+      <w:tr>
+        <w:tc>
+          <w:tcPr>
+            <w:tcW w:type="dxa" w:w="4536"/>
+          </w:tcPr>
+          <w:p>
+            <w:pPr>
+              <w:spacing w:before="60" w:after="60"/>
+            </w:pPr>
+            <w:r>
+              <w:rPr>
+                <w:color w:val="3D3B3B"/>
+                <w:sz w:val="17"/>
+              </w:rPr>
+              <w:t>9. Hypercare</w:t>
+            </w:r>
+          </w:p>
+        </w:tc>
+        <w:tc>
+          <w:tcPr>
+            <w:tcW w:type="dxa" w:w="4536"/>
+          </w:tcPr>
+          <w:p>
+            <w:pPr>
+              <w:spacing w:before="60" w:after="60"/>
+            </w:pPr>
+            <w:r>
+              <w:rPr>
+                <w:color w:val="3D3B3B"/>
+                <w:sz w:val="17"/>
+              </w:rPr>
+              <w:t>Post-launch support, stabilization, adoption monitoring</w:t>
+            </w:r>
+          </w:p>
+        </w:tc>
+      </w:tr>
+      <w:tr>
+        <w:tc>
+          <w:tcPr>
+            <w:tcW w:type="dxa" w:w="4536"/>
+          </w:tcPr>
+          <w:p>
+            <w:pPr>
+              <w:spacing w:before="60" w:after="60"/>
+            </w:pPr>
+            <w:r>
+              <w:rPr>
+                <w:color w:val="3D3B3B"/>
+                <w:sz w:val="17"/>
+              </w:rPr>
+              <w:t>10. Continuous Support</w:t>
+            </w:r>
+          </w:p>
+        </w:tc>
+        <w:tc>
+          <w:tcPr>
+            <w:tcW w:type="dxa" w:w="4536"/>
+          </w:tcPr>
+          <w:p>
+            <w:pPr>
+              <w:spacing w:before="60" w:after="60"/>
+            </w:pPr>
+            <w:r>
+              <w:rPr>
+                <w:color w:val="3D3B3B"/>
+                <w:sz w:val="17"/>
+              </w:rPr>
+              <w:t>Ongoing SLA support, enhancements, and quarterly reviews if selected</w:t>
+            </w:r>
+          </w:p>
+        </w:tc>
+      </w:tr>
+    </w:tbl>
+    <w:p>
+      <w:pPr>
+        <w:spacing w:after="80" w:line="276" w:lineRule="auto"/>
+      </w:pPr>
+      <w:r>
+        <w:rPr>
+          <w:b/>
+          <w:i w:val="0"/>
+          <w:color w:val="142444"/>
+          <w:sz w:val="20"/>
+        </w:rPr>
+        <w:t>Representative case study:</w:t>
+      </w:r>
+    </w:p>
+    <w:tbl>
+      <w:tblPr>
+        <w:tblW w:type="auto" w:w="0"/>
+        <w:jc w:val="center"/>
+        <w:tblLook w:firstColumn="1" w:firstRow="1" w:lastColumn="0" w:lastRow="0" w:noHBand="0" w:noVBand="1" w:val="04A0"/>
+      </w:tblPr>
+      <w:tblGrid>
+        <w:gridCol w:w="4536"/>
+        <w:gridCol w:w="4536"/>
+      </w:tblGrid>
+      <w:tr>
+        <w:tc>
+          <w:tcPr>
+            <w:tcW w:type="dxa" w:w="2381"/>
+            <w:shd w:fill="171414"/>
+          </w:tcPr>
+          <w:p>
+            <w:pPr>
+              <w:spacing w:before="60" w:after="60"/>
+            </w:pPr>
+            <w:r>
+              <w:rPr>
+                <w:b/>
+                <w:color w:val="FFFFFF"/>
+                <w:sz w:val="16"/>
+              </w:rPr>
+              <w:t>Item</w:t>
+            </w:r>
+          </w:p>
+        </w:tc>
+        <w:tc>
+          <w:tcPr>
+            <w:tcW w:type="dxa" w:w="7257"/>
+            <w:shd w:fill="171414"/>
+          </w:tcPr>
+          <w:p>
+            <w:pPr>
+              <w:spacing w:before="60" w:after="60"/>
+            </w:pPr>
+            <w:r>
+              <w:rPr>
+                <w:b/>
+                <w:color w:val="FFFFFF"/>
+                <w:sz w:val="16"/>
+              </w:rPr>
+              <w:t>Details</w:t>
+            </w:r>
+          </w:p>
+        </w:tc>
+      </w:tr>
+      <w:tr>
+        <w:tc>
+          <w:tcPr>
+            <w:tcW w:type="dxa" w:w="4536"/>
+          </w:tcPr>
+          <w:p>
+            <w:pPr>
+              <w:spacing w:before="60" w:after="60"/>
+            </w:pPr>
+            <w:r>
+              <w:rPr>
+                <w:color w:val="3D3B3B"/>
+                <w:sz w:val="17"/>
+              </w:rPr>
+              <w:t>Client</w:t>
+            </w:r>
+          </w:p>
+        </w:tc>
+        <w:tc>
+          <w:tcPr>
+            <w:tcW w:type="dxa" w:w="4536"/>
+          </w:tcPr>
+          <w:p>
+            <w:pPr>
+              <w:spacing w:before="60" w:after="60"/>
+            </w:pPr>
+            <w:r>
+              <w:rPr>
+                <w:color w:val="3D3B3B"/>
+                <w:sz w:val="17"/>
+              </w:rPr>
+              <w:t>{CASE_STUDY_CLIENT_NAME} ({CASE_STUDY_CONFIDENTIAL_NAME})</w:t>
+            </w:r>
+          </w:p>
+        </w:tc>
+      </w:tr>
+      <w:tr>
+        <w:tc>
+          <w:tcPr>
+            <w:tcW w:type="dxa" w:w="4536"/>
+          </w:tcPr>
+          <w:p>
+            <w:pPr>
+              <w:spacing w:before="60" w:after="60"/>
+            </w:pPr>
+            <w:r>
+              <w:rPr>
+                <w:color w:val="3D3B3B"/>
+                <w:sz w:val="17"/>
+              </w:rPr>
+              <w:t>Industry</w:t>
+            </w:r>
+          </w:p>
+        </w:tc>
+        <w:tc>
+          <w:tcPr>
+            <w:tcW w:type="dxa" w:w="4536"/>
+          </w:tcPr>
+          <w:p>
+            <w:pPr>
+              <w:spacing w:before="60" w:after="60"/>
+            </w:pPr>
+            <w:r>
+              <w:rPr>
+                <w:color w:val="3D3B3B"/>
+                <w:sz w:val="17"/>
+              </w:rPr>
+              <w:t>{CASE_STUDY_INDUSTRY}</w:t>
+            </w:r>
+          </w:p>
+        </w:tc>
+      </w:tr>
+      <w:tr>
+        <w:tc>
+          <w:tcPr>
+            <w:tcW w:type="dxa" w:w="4536"/>
+          </w:tcPr>
+          <w:p>
+            <w:pPr>
+              <w:spacing w:before="60" w:after="60"/>
+            </w:pPr>
+            <w:r>
+              <w:rPr>
+                <w:color w:val="3D3B3B"/>
+                <w:sz w:val="17"/>
+              </w:rPr>
+              <w:t>Modules</w:t>
+            </w:r>
+          </w:p>
+        </w:tc>
+        <w:tc>
+          <w:tcPr>
+            <w:tcW w:type="dxa" w:w="4536"/>
+          </w:tcPr>
+          <w:p>
+            <w:pPr>
+              <w:spacing w:before="60" w:after="60"/>
+            </w:pPr>
+            <w:r>
+              <w:rPr>
+                <w:color w:val="3D3B3B"/>
+                <w:sz w:val="17"/>
+              </w:rPr>
+              <w:t>{CASE_STUDY_MODULES}</w:t>
+            </w:r>
+          </w:p>
+        </w:tc>
+      </w:tr>
+      <w:tr>
+        <w:tc>
+          <w:tcPr>
+            <w:tcW w:type="dxa" w:w="4536"/>
+          </w:tcPr>
+          <w:p>
+            <w:pPr>
+              <w:spacing w:before="60" w:after="60"/>
+            </w:pPr>
+            <w:r>
+              <w:rPr>
+                <w:color w:val="3D3B3B"/>
+                <w:sz w:val="17"/>
+              </w:rPr>
+              <w:t>Users</w:t>
+            </w:r>
+          </w:p>
+        </w:tc>
+        <w:tc>
+          <w:tcPr>
+            <w:tcW w:type="dxa" w:w="4536"/>
+          </w:tcPr>
+          <w:p>
+            <w:pPr>
+              <w:spacing w:before="60" w:after="60"/>
+            </w:pPr>
+            <w:r>
+              <w:rPr>
+                <w:color w:val="3D3B3B"/>
+                <w:sz w:val="17"/>
+              </w:rPr>
+              <w:t>{CASE_STUDY_USERS}</w:t>
+            </w:r>
+          </w:p>
+        </w:tc>
+      </w:tr>
+      <w:tr>
+        <w:tc>
+          <w:tcPr>
+            <w:tcW w:type="dxa" w:w="4536"/>
+          </w:tcPr>
+          <w:p>
+            <w:pPr>
+              <w:spacing w:before="60" w:after="60"/>
+            </w:pPr>
+            <w:r>
+              <w:rPr>
+                <w:color w:val="3D3B3B"/>
+                <w:sz w:val="17"/>
+              </w:rPr>
+              <w:t>Timeline</w:t>
+            </w:r>
+          </w:p>
+        </w:tc>
+        <w:tc>
+          <w:tcPr>
+            <w:tcW w:type="dxa" w:w="4536"/>
+          </w:tcPr>
+          <w:p>
+            <w:pPr>
+              <w:spacing w:before="60" w:after="60"/>
+            </w:pPr>
+            <w:r>
+              <w:rPr>
+                <w:color w:val="3D3B3B"/>
+                <w:sz w:val="17"/>
+              </w:rPr>
+              <w:t>{CASE_STUDY_TIMELINE}</w:t>
+            </w:r>
+          </w:p>
+        </w:tc>
+      </w:tr>
+      <w:tr>
+        <w:tc>
+          <w:tcPr>
+            <w:tcW w:type="dxa" w:w="4536"/>
+          </w:tcPr>
+          <w:p>
+            <w:pPr>
+              <w:spacing w:before="60" w:after="60"/>
+            </w:pPr>
+            <w:r>
+              <w:rPr>
+                <w:color w:val="3D3B3B"/>
+                <w:sz w:val="17"/>
+              </w:rPr>
+              <w:t>Results</w:t>
+            </w:r>
+          </w:p>
+        </w:tc>
+        <w:tc>
+          <w:tcPr>
+            <w:tcW w:type="dxa" w:w="4536"/>
+          </w:tcPr>
+          <w:p>
+            <w:pPr>
+              <w:spacing w:before="60" w:after="60"/>
+            </w:pPr>
+            <w:r>
+              <w:rPr>
+                <w:color w:val="3D3B3B"/>
+                <w:sz w:val="17"/>
+              </w:rPr>
+              <w:t>{CASE_STUDY_RESULTS}</w:t>
+            </w:r>
+          </w:p>
+        </w:tc>
+      </w:tr>
+    </w:tbl>
+    <w:p>
+      <w:pPr>
+        <w:spacing w:after="80" w:line="276" w:lineRule="auto"/>
+      </w:pPr>
+      <w:r>
+        <w:rPr>
+          <w:b/>
+          <w:i w:val="0"/>
+          <w:color w:val="142444"/>
+          <w:sz w:val="20"/>
+        </w:rPr>
+        <w:t>Proposed delivery team:</w:t>
+      </w:r>
+    </w:p>
+    <w:tbl>
+      <w:tblPr>
+        <w:tblW w:type="auto" w:w="0"/>
+        <w:jc w:val="center"/>
+        <w:tblLook w:firstColumn="1" w:firstRow="1" w:lastColumn="0" w:lastRow="0" w:noHBand="0" w:noVBand="1" w:val="04A0"/>
+      </w:tblPr>
+      <w:tblGrid>
+        <w:gridCol w:w="4536"/>
+        <w:gridCol w:w="4536"/>
+      </w:tblGrid>
+      <w:tr>
+        <w:tc>
+          <w:tcPr>
+            <w:tcW w:type="dxa" w:w="2381"/>
+            <w:shd w:fill="171414"/>
+          </w:tcPr>
+          <w:p>
+            <w:pPr>
+              <w:spacing w:before="60" w:after="60"/>
+            </w:pPr>
+            <w:r>
+              <w:rPr>
+                <w:b/>
+                <w:color w:val="FFFFFF"/>
+                <w:sz w:val="16"/>
+              </w:rPr>
+              <w:t>Role</w:t>
+            </w:r>
+          </w:p>
+        </w:tc>
+        <w:tc>
+          <w:tcPr>
+            <w:tcW w:type="dxa" w:w="7257"/>
+            <w:shd w:fill="171414"/>
+          </w:tcPr>
+          <w:p>
+            <w:pPr>
+              <w:spacing w:before="60" w:after="60"/>
+            </w:pPr>
+            <w:r>
+              <w:rPr>
+                <w:b/>
+                <w:color w:val="FFFFFF"/>
+                <w:sz w:val="16"/>
+              </w:rPr>
+              <w:t>Responsibility</w:t>
+            </w:r>
+          </w:p>
+        </w:tc>
+      </w:tr>
+      <w:tr>
+        <w:tc>
+          <w:tcPr>
+            <w:tcW w:type="dxa" w:w="4536"/>
+          </w:tcPr>
+          <w:p>
+            <w:pPr>
+              <w:spacing w:before="60" w:after="60"/>
+            </w:pPr>
+            <w:r>
+              <w:rPr>
+                <w:color w:val="3D3B3B"/>
+                <w:sz w:val="17"/>
+              </w:rPr>
+              <w:t>Project Manager</w:t>
+            </w:r>
+          </w:p>
+        </w:tc>
+        <w:tc>
+          <w:tcPr>
+            <w:tcW w:type="dxa" w:w="4536"/>
+          </w:tcPr>
+          <w:p>
+            <w:pPr>
+              <w:spacing w:before="60" w:after="60"/>
+            </w:pPr>
+            <w:r>
+              <w:rPr>
+                <w:color w:val="3D3B3B"/>
+                <w:sz w:val="17"/>
+              </w:rPr>
+              <w:t>Timeline, communication, risks, milestones, and steering updates</w:t>
+            </w:r>
+          </w:p>
+        </w:tc>
+      </w:tr>
+      <w:tr>
+        <w:tc>
+          <w:tcPr>
+            <w:tcW w:type="dxa" w:w="4536"/>
+          </w:tcPr>
+          <w:p>
+            <w:pPr>
+              <w:spacing w:before="60" w:after="60"/>
+            </w:pPr>
+            <w:r>
+              <w:rPr>
+                <w:color w:val="3D3B3B"/>
+                <w:sz w:val="17"/>
+              </w:rPr>
+              <w:t>Business Analyst</w:t>
+            </w:r>
+          </w:p>
+        </w:tc>
+        <w:tc>
+          <w:tcPr>
+            <w:tcW w:type="dxa" w:w="4536"/>
+          </w:tcPr>
+          <w:p>
+            <w:pPr>
+              <w:spacing w:before="60" w:after="60"/>
+            </w:pPr>
+            <w:r>
+              <w:rPr>
+                <w:color w:val="3D3B3B"/>
+                <w:sz w:val="17"/>
+              </w:rPr>
+              <w:t>Discovery workshops, BRD, process maps, acceptance criteria</w:t>
+            </w:r>
+          </w:p>
+        </w:tc>
+      </w:tr>
+      <w:tr>
+        <w:tc>
+          <w:tcPr>
+            <w:tcW w:type="dxa" w:w="4536"/>
+          </w:tcPr>
+          <w:p>
+            <w:pPr>
+              <w:spacing w:before="60" w:after="60"/>
+            </w:pPr>
+            <w:r>
+              <w:rPr>
+                <w:color w:val="3D3B3B"/>
+                <w:sz w:val="17"/>
+              </w:rPr>
+              <w:t>Functional Consultant</w:t>
+            </w:r>
+          </w:p>
+        </w:tc>
+        <w:tc>
+          <w:tcPr>
+            <w:tcW w:type="dxa" w:w="4536"/>
+          </w:tcPr>
+          <w:p>
+            <w:pPr>
+              <w:spacing w:before="60" w:after="60"/>
+            </w:pPr>
+            <w:r>
+              <w:rPr>
+                <w:color w:val="3D3B3B"/>
+                <w:sz w:val="17"/>
+              </w:rPr>
+              <w:t>Odoo configuration, business rules, workflows, user journeys</w:t>
+            </w:r>
+          </w:p>
+        </w:tc>
+      </w:tr>
+      <w:tr>
+        <w:tc>
+          <w:tcPr>
+            <w:tcW w:type="dxa" w:w="4536"/>
+          </w:tcPr>
+          <w:p>
+            <w:pPr>
+              <w:spacing w:before="60" w:after="60"/>
+            </w:pPr>
+            <w:r>
+              <w:rPr>
+                <w:color w:val="3D3B3B"/>
+                <w:sz w:val="17"/>
+              </w:rPr>
+              <w:t>Odoo Developer</w:t>
+            </w:r>
+          </w:p>
+        </w:tc>
+        <w:tc>
+          <w:tcPr>
+            <w:tcW w:type="dxa" w:w="4536"/>
+          </w:tcPr>
+          <w:p>
+            <w:pPr>
+              <w:spacing w:before="60" w:after="60"/>
+            </w:pPr>
+            <w:r>
+              <w:rPr>
+                <w:color w:val="3D3B3B"/>
+                <w:sz w:val="17"/>
+              </w:rPr>
+              <w:t>Custom fields, reports, automations, integrations, technical fixes</w:t>
+            </w:r>
+          </w:p>
+        </w:tc>
+      </w:tr>
+      <w:tr>
+        <w:tc>
+          <w:tcPr>
+            <w:tcW w:type="dxa" w:w="4536"/>
+          </w:tcPr>
+          <w:p>
+            <w:pPr>
+              <w:spacing w:before="60" w:after="60"/>
+            </w:pPr>
+            <w:r>
+              <w:rPr>
+                <w:color w:val="3D3B3B"/>
+                <w:sz w:val="17"/>
+              </w:rPr>
+              <w:t>QA Specialist</w:t>
+            </w:r>
+          </w:p>
+        </w:tc>
+        <w:tc>
+          <w:tcPr>
+            <w:tcW w:type="dxa" w:w="4536"/>
+          </w:tcPr>
+          <w:p>
+            <w:pPr>
+              <w:spacing w:before="60" w:after="60"/>
+            </w:pPr>
+            <w:r>
+              <w:rPr>
+                <w:color w:val="3D3B3B"/>
+                <w:sz w:val="17"/>
+              </w:rPr>
+              <w:t>Test scenarios, defect tracking, UAT support, release checks</w:t>
+            </w:r>
+          </w:p>
+        </w:tc>
+      </w:tr>
+      <w:tr>
+        <w:tc>
+          <w:tcPr>
+            <w:tcW w:type="dxa" w:w="4536"/>
+          </w:tcPr>
+          <w:p>
+            <w:pPr>
+              <w:spacing w:before="60" w:after="60"/>
+            </w:pPr>
+            <w:r>
+              <w:rPr>
+                <w:color w:val="3D3B3B"/>
+                <w:sz w:val="17"/>
+              </w:rPr>
+              <w:t>Trainer</w:t>
+            </w:r>
+          </w:p>
+        </w:tc>
+        <w:tc>
+          <w:tcPr>
+            <w:tcW w:type="dxa" w:w="4536"/>
+          </w:tcPr>
+          <w:p>
+            <w:pPr>
+              <w:spacing w:before="60" w:after="60"/>
+            </w:pPr>
+            <w:r>
+              <w:rPr>
+                <w:color w:val="3D3B3B"/>
+                <w:sz w:val="17"/>
+              </w:rPr>
+              <w:t>Role-based training, user manuals, SOPs, admin guide</w:t>
+            </w:r>
+          </w:p>
+        </w:tc>
+      </w:tr>
+      <w:tr>
+        <w:tc>
+          <w:tcPr>
+            <w:tcW w:type="dxa" w:w="4536"/>
+          </w:tcPr>
+          <w:p>
+            <w:pPr>
+              <w:spacing w:before="60" w:after="60"/>
+            </w:pPr>
+            <w:r>
+              <w:rPr>
+                <w:color w:val="3D3B3B"/>
+                <w:sz w:val="17"/>
+              </w:rPr>
+              <w:t>Support Lead</w:t>
+            </w:r>
+          </w:p>
+        </w:tc>
+        <w:tc>
+          <w:tcPr>
+            <w:tcW w:type="dxa" w:w="4536"/>
+          </w:tcPr>
+          <w:p>
+            <w:pPr>
+              <w:spacing w:before="60" w:after="60"/>
+            </w:pPr>
+            <w:r>
+              <w:rPr>
+                <w:color w:val="3D3B3B"/>
+                <w:sz w:val="17"/>
+              </w:rPr>
+              <w:t>Hypercare, SLA tracking, escalation, post-go-live stabilization</w:t>
+            </w:r>
+          </w:p>
+        </w:tc>
+      </w:tr>
+    </w:tbl>
+    <w:p>
+      <w:pPr>
         <w:spacing w:after="120" w:line="276" w:lineRule="auto"/>
       </w:pPr>
       <w:r>
@@ -819,7 +2123,7 @@
           <w:color w:val="838081"/>
           <w:sz w:val="17"/>
         </w:rPr>
-        <w:t>Relevant references and case studies can be shared upon request, subject to client confidentiality approvals.</w:t>
+        <w:t>Final references and live case studies can be shared subject to client confidentiality approvals.</w:t>
       </w:r>
     </w:p>
     <w:p>
@@ -2145,6 +3449,1400 @@
           <w:color w:val="142444"/>
           <w:sz w:val="20"/>
         </w:rPr>
+        <w:t>High-level implementation timeline:</w:t>
+      </w:r>
+    </w:p>
+    <w:tbl>
+      <w:tblPr>
+        <w:tblW w:type="auto" w:w="0"/>
+        <w:jc w:val="center"/>
+        <w:tblLook w:firstColumn="1" w:firstRow="1" w:lastColumn="0" w:lastRow="0" w:noHBand="0" w:noVBand="1" w:val="04A0"/>
+      </w:tblPr>
+      <w:tblGrid>
+        <w:gridCol w:w="1008"/>
+        <w:gridCol w:w="1008"/>
+        <w:gridCol w:w="1008"/>
+        <w:gridCol w:w="1008"/>
+        <w:gridCol w:w="1008"/>
+        <w:gridCol w:w="1008"/>
+        <w:gridCol w:w="1008"/>
+        <w:gridCol w:w="1008"/>
+        <w:gridCol w:w="1008"/>
+      </w:tblGrid>
+      <w:tr>
+        <w:tc>
+          <w:tcPr>
+            <w:tcW w:type="dxa" w:w="2268"/>
+            <w:shd w:fill="171414"/>
+          </w:tcPr>
+          <w:p>
+            <w:pPr>
+              <w:spacing w:before="60" w:after="60"/>
+            </w:pPr>
+            <w:r>
+              <w:rPr>
+                <w:b/>
+                <w:color w:val="FFFFFF"/>
+                <w:sz w:val="16"/>
+              </w:rPr>
+              <w:t>Workstream</w:t>
+            </w:r>
+          </w:p>
+        </w:tc>
+        <w:tc>
+          <w:tcPr>
+            <w:tcW w:type="dxa" w:w="737"/>
+            <w:shd w:fill="171414"/>
+          </w:tcPr>
+          <w:p>
+            <w:pPr>
+              <w:spacing w:before="60" w:after="60"/>
+            </w:pPr>
+            <w:r>
+              <w:rPr>
+                <w:b/>
+                <w:color w:val="FFFFFF"/>
+                <w:sz w:val="16"/>
+              </w:rPr>
+              <w:t>W1</w:t>
+            </w:r>
+          </w:p>
+        </w:tc>
+        <w:tc>
+          <w:tcPr>
+            <w:tcW w:type="dxa" w:w="737"/>
+            <w:shd w:fill="171414"/>
+          </w:tcPr>
+          <w:p>
+            <w:pPr>
+              <w:spacing w:before="60" w:after="60"/>
+            </w:pPr>
+            <w:r>
+              <w:rPr>
+                <w:b/>
+                <w:color w:val="FFFFFF"/>
+                <w:sz w:val="16"/>
+              </w:rPr>
+              <w:t>W2</w:t>
+            </w:r>
+          </w:p>
+        </w:tc>
+        <w:tc>
+          <w:tcPr>
+            <w:tcW w:type="dxa" w:w="737"/>
+            <w:shd w:fill="171414"/>
+          </w:tcPr>
+          <w:p>
+            <w:pPr>
+              <w:spacing w:before="60" w:after="60"/>
+            </w:pPr>
+            <w:r>
+              <w:rPr>
+                <w:b/>
+                <w:color w:val="FFFFFF"/>
+                <w:sz w:val="16"/>
+              </w:rPr>
+              <w:t>W3</w:t>
+            </w:r>
+          </w:p>
+        </w:tc>
+        <w:tc>
+          <w:tcPr>
+            <w:tcW w:type="dxa" w:w="737"/>
+            <w:shd w:fill="171414"/>
+          </w:tcPr>
+          <w:p>
+            <w:pPr>
+              <w:spacing w:before="60" w:after="60"/>
+            </w:pPr>
+            <w:r>
+              <w:rPr>
+                <w:b/>
+                <w:color w:val="FFFFFF"/>
+                <w:sz w:val="16"/>
+              </w:rPr>
+              <w:t>W4</w:t>
+            </w:r>
+          </w:p>
+        </w:tc>
+        <w:tc>
+          <w:tcPr>
+            <w:tcW w:type="dxa" w:w="737"/>
+            <w:shd w:fill="171414"/>
+          </w:tcPr>
+          <w:p>
+            <w:pPr>
+              <w:spacing w:before="60" w:after="60"/>
+            </w:pPr>
+            <w:r>
+              <w:rPr>
+                <w:b/>
+                <w:color w:val="FFFFFF"/>
+                <w:sz w:val="16"/>
+              </w:rPr>
+              <w:t>W5</w:t>
+            </w:r>
+          </w:p>
+        </w:tc>
+        <w:tc>
+          <w:tcPr>
+            <w:tcW w:type="dxa" w:w="737"/>
+            <w:shd w:fill="171414"/>
+          </w:tcPr>
+          <w:p>
+            <w:pPr>
+              <w:spacing w:before="60" w:after="60"/>
+            </w:pPr>
+            <w:r>
+              <w:rPr>
+                <w:b/>
+                <w:color w:val="FFFFFF"/>
+                <w:sz w:val="16"/>
+              </w:rPr>
+              <w:t>W6</w:t>
+            </w:r>
+          </w:p>
+        </w:tc>
+        <w:tc>
+          <w:tcPr>
+            <w:tcW w:type="dxa" w:w="737"/>
+            <w:shd w:fill="171414"/>
+          </w:tcPr>
+          <w:p>
+            <w:pPr>
+              <w:spacing w:before="60" w:after="60"/>
+            </w:pPr>
+            <w:r>
+              <w:rPr>
+                <w:b/>
+                <w:color w:val="FFFFFF"/>
+                <w:sz w:val="16"/>
+              </w:rPr>
+              <w:t>W7</w:t>
+            </w:r>
+          </w:p>
+        </w:tc>
+        <w:tc>
+          <w:tcPr>
+            <w:tcW w:type="dxa" w:w="737"/>
+            <w:shd w:fill="171414"/>
+          </w:tcPr>
+          <w:p>
+            <w:pPr>
+              <w:spacing w:before="60" w:after="60"/>
+            </w:pPr>
+            <w:r>
+              <w:rPr>
+                <w:b/>
+                <w:color w:val="FFFFFF"/>
+                <w:sz w:val="16"/>
+              </w:rPr>
+              <w:t>W8</w:t>
+            </w:r>
+          </w:p>
+        </w:tc>
+      </w:tr>
+      <w:tr>
+        <w:tc>
+          <w:tcPr>
+            <w:tcW w:type="dxa" w:w="1008"/>
+          </w:tcPr>
+          <w:p>
+            <w:pPr>
+              <w:spacing w:before="60" w:after="60"/>
+            </w:pPr>
+            <w:r>
+              <w:rPr>
+                <w:color w:val="3D3B3B"/>
+                <w:sz w:val="17"/>
+              </w:rPr>
+              <w:t>Discovery</w:t>
+            </w:r>
+          </w:p>
+        </w:tc>
+        <w:tc>
+          <w:tcPr>
+            <w:tcW w:type="dxa" w:w="1008"/>
+          </w:tcPr>
+          <w:p>
+            <w:pPr>
+              <w:spacing w:before="60" w:after="60"/>
+            </w:pPr>
+            <w:r>
+              <w:rPr>
+                <w:color w:val="3D3B3B"/>
+                <w:sz w:val="17"/>
+              </w:rPr>
+              <w:t>X</w:t>
+            </w:r>
+          </w:p>
+        </w:tc>
+        <w:tc>
+          <w:tcPr>
+            <w:tcW w:type="dxa" w:w="1008"/>
+          </w:tcPr>
+          <w:p>
+            <w:pPr>
+              <w:spacing w:before="60" w:after="60"/>
+            </w:pPr>
+            <w:r>
+              <w:rPr>
+                <w:color w:val="3D3B3B"/>
+                <w:sz w:val="17"/>
+              </w:rPr>
+            </w:r>
+          </w:p>
+        </w:tc>
+        <w:tc>
+          <w:tcPr>
+            <w:tcW w:type="dxa" w:w="1008"/>
+          </w:tcPr>
+          <w:p>
+            <w:pPr>
+              <w:spacing w:before="60" w:after="60"/>
+            </w:pPr>
+            <w:r>
+              <w:rPr>
+                <w:color w:val="3D3B3B"/>
+                <w:sz w:val="17"/>
+              </w:rPr>
+            </w:r>
+          </w:p>
+        </w:tc>
+        <w:tc>
+          <w:tcPr>
+            <w:tcW w:type="dxa" w:w="1008"/>
+          </w:tcPr>
+          <w:p>
+            <w:pPr>
+              <w:spacing w:before="60" w:after="60"/>
+            </w:pPr>
+            <w:r>
+              <w:rPr>
+                <w:color w:val="3D3B3B"/>
+                <w:sz w:val="17"/>
+              </w:rPr>
+            </w:r>
+          </w:p>
+        </w:tc>
+        <w:tc>
+          <w:tcPr>
+            <w:tcW w:type="dxa" w:w="1008"/>
+          </w:tcPr>
+          <w:p>
+            <w:pPr>
+              <w:spacing w:before="60" w:after="60"/>
+            </w:pPr>
+            <w:r>
+              <w:rPr>
+                <w:color w:val="3D3B3B"/>
+                <w:sz w:val="17"/>
+              </w:rPr>
+            </w:r>
+          </w:p>
+        </w:tc>
+        <w:tc>
+          <w:tcPr>
+            <w:tcW w:type="dxa" w:w="1008"/>
+          </w:tcPr>
+          <w:p>
+            <w:pPr>
+              <w:spacing w:before="60" w:after="60"/>
+            </w:pPr>
+            <w:r>
+              <w:rPr>
+                <w:color w:val="3D3B3B"/>
+                <w:sz w:val="17"/>
+              </w:rPr>
+            </w:r>
+          </w:p>
+        </w:tc>
+        <w:tc>
+          <w:tcPr>
+            <w:tcW w:type="dxa" w:w="1008"/>
+          </w:tcPr>
+          <w:p>
+            <w:pPr>
+              <w:spacing w:before="60" w:after="60"/>
+            </w:pPr>
+            <w:r>
+              <w:rPr>
+                <w:color w:val="3D3B3B"/>
+                <w:sz w:val="17"/>
+              </w:rPr>
+            </w:r>
+          </w:p>
+        </w:tc>
+        <w:tc>
+          <w:tcPr>
+            <w:tcW w:type="dxa" w:w="1008"/>
+          </w:tcPr>
+          <w:p>
+            <w:pPr>
+              <w:spacing w:before="60" w:after="60"/>
+            </w:pPr>
+            <w:r>
+              <w:rPr>
+                <w:color w:val="3D3B3B"/>
+                <w:sz w:val="17"/>
+              </w:rPr>
+            </w:r>
+          </w:p>
+        </w:tc>
+      </w:tr>
+      <w:tr>
+        <w:tc>
+          <w:tcPr>
+            <w:tcW w:type="dxa" w:w="1008"/>
+          </w:tcPr>
+          <w:p>
+            <w:pPr>
+              <w:spacing w:before="60" w:after="60"/>
+            </w:pPr>
+            <w:r>
+              <w:rPr>
+                <w:color w:val="3D3B3B"/>
+                <w:sz w:val="17"/>
+              </w:rPr>
+              <w:t>Configuration</w:t>
+            </w:r>
+          </w:p>
+        </w:tc>
+        <w:tc>
+          <w:tcPr>
+            <w:tcW w:type="dxa" w:w="1008"/>
+          </w:tcPr>
+          <w:p>
+            <w:pPr>
+              <w:spacing w:before="60" w:after="60"/>
+            </w:pPr>
+            <w:r>
+              <w:rPr>
+                <w:color w:val="3D3B3B"/>
+                <w:sz w:val="17"/>
+              </w:rPr>
+            </w:r>
+          </w:p>
+        </w:tc>
+        <w:tc>
+          <w:tcPr>
+            <w:tcW w:type="dxa" w:w="1008"/>
+          </w:tcPr>
+          <w:p>
+            <w:pPr>
+              <w:spacing w:before="60" w:after="60"/>
+            </w:pPr>
+            <w:r>
+              <w:rPr>
+                <w:color w:val="3D3B3B"/>
+                <w:sz w:val="17"/>
+              </w:rPr>
+              <w:t>X</w:t>
+            </w:r>
+          </w:p>
+        </w:tc>
+        <w:tc>
+          <w:tcPr>
+            <w:tcW w:type="dxa" w:w="1008"/>
+          </w:tcPr>
+          <w:p>
+            <w:pPr>
+              <w:spacing w:before="60" w:after="60"/>
+            </w:pPr>
+            <w:r>
+              <w:rPr>
+                <w:color w:val="3D3B3B"/>
+                <w:sz w:val="17"/>
+              </w:rPr>
+              <w:t>X</w:t>
+            </w:r>
+          </w:p>
+        </w:tc>
+        <w:tc>
+          <w:tcPr>
+            <w:tcW w:type="dxa" w:w="1008"/>
+          </w:tcPr>
+          <w:p>
+            <w:pPr>
+              <w:spacing w:before="60" w:after="60"/>
+            </w:pPr>
+            <w:r>
+              <w:rPr>
+                <w:color w:val="3D3B3B"/>
+                <w:sz w:val="17"/>
+              </w:rPr>
+            </w:r>
+          </w:p>
+        </w:tc>
+        <w:tc>
+          <w:tcPr>
+            <w:tcW w:type="dxa" w:w="1008"/>
+          </w:tcPr>
+          <w:p>
+            <w:pPr>
+              <w:spacing w:before="60" w:after="60"/>
+            </w:pPr>
+            <w:r>
+              <w:rPr>
+                <w:color w:val="3D3B3B"/>
+                <w:sz w:val="17"/>
+              </w:rPr>
+            </w:r>
+          </w:p>
+        </w:tc>
+        <w:tc>
+          <w:tcPr>
+            <w:tcW w:type="dxa" w:w="1008"/>
+          </w:tcPr>
+          <w:p>
+            <w:pPr>
+              <w:spacing w:before="60" w:after="60"/>
+            </w:pPr>
+            <w:r>
+              <w:rPr>
+                <w:color w:val="3D3B3B"/>
+                <w:sz w:val="17"/>
+              </w:rPr>
+            </w:r>
+          </w:p>
+        </w:tc>
+        <w:tc>
+          <w:tcPr>
+            <w:tcW w:type="dxa" w:w="1008"/>
+          </w:tcPr>
+          <w:p>
+            <w:pPr>
+              <w:spacing w:before="60" w:after="60"/>
+            </w:pPr>
+            <w:r>
+              <w:rPr>
+                <w:color w:val="3D3B3B"/>
+                <w:sz w:val="17"/>
+              </w:rPr>
+            </w:r>
+          </w:p>
+        </w:tc>
+        <w:tc>
+          <w:tcPr>
+            <w:tcW w:type="dxa" w:w="1008"/>
+          </w:tcPr>
+          <w:p>
+            <w:pPr>
+              <w:spacing w:before="60" w:after="60"/>
+            </w:pPr>
+            <w:r>
+              <w:rPr>
+                <w:color w:val="3D3B3B"/>
+                <w:sz w:val="17"/>
+              </w:rPr>
+            </w:r>
+          </w:p>
+        </w:tc>
+      </w:tr>
+      <w:tr>
+        <w:tc>
+          <w:tcPr>
+            <w:tcW w:type="dxa" w:w="1008"/>
+          </w:tcPr>
+          <w:p>
+            <w:pPr>
+              <w:spacing w:before="60" w:after="60"/>
+            </w:pPr>
+            <w:r>
+              <w:rPr>
+                <w:color w:val="3D3B3B"/>
+                <w:sz w:val="17"/>
+              </w:rPr>
+              <w:t>Data Migration</w:t>
+            </w:r>
+          </w:p>
+        </w:tc>
+        <w:tc>
+          <w:tcPr>
+            <w:tcW w:type="dxa" w:w="1008"/>
+          </w:tcPr>
+          <w:p>
+            <w:pPr>
+              <w:spacing w:before="60" w:after="60"/>
+            </w:pPr>
+            <w:r>
+              <w:rPr>
+                <w:color w:val="3D3B3B"/>
+                <w:sz w:val="17"/>
+              </w:rPr>
+            </w:r>
+          </w:p>
+        </w:tc>
+        <w:tc>
+          <w:tcPr>
+            <w:tcW w:type="dxa" w:w="1008"/>
+          </w:tcPr>
+          <w:p>
+            <w:pPr>
+              <w:spacing w:before="60" w:after="60"/>
+            </w:pPr>
+            <w:r>
+              <w:rPr>
+                <w:color w:val="3D3B3B"/>
+                <w:sz w:val="17"/>
+              </w:rPr>
+            </w:r>
+          </w:p>
+        </w:tc>
+        <w:tc>
+          <w:tcPr>
+            <w:tcW w:type="dxa" w:w="1008"/>
+          </w:tcPr>
+          <w:p>
+            <w:pPr>
+              <w:spacing w:before="60" w:after="60"/>
+            </w:pPr>
+            <w:r>
+              <w:rPr>
+                <w:color w:val="3D3B3B"/>
+                <w:sz w:val="17"/>
+              </w:rPr>
+              <w:t>X</w:t>
+            </w:r>
+          </w:p>
+        </w:tc>
+        <w:tc>
+          <w:tcPr>
+            <w:tcW w:type="dxa" w:w="1008"/>
+          </w:tcPr>
+          <w:p>
+            <w:pPr>
+              <w:spacing w:before="60" w:after="60"/>
+            </w:pPr>
+            <w:r>
+              <w:rPr>
+                <w:color w:val="3D3B3B"/>
+                <w:sz w:val="17"/>
+              </w:rPr>
+              <w:t>X</w:t>
+            </w:r>
+          </w:p>
+        </w:tc>
+        <w:tc>
+          <w:tcPr>
+            <w:tcW w:type="dxa" w:w="1008"/>
+          </w:tcPr>
+          <w:p>
+            <w:pPr>
+              <w:spacing w:before="60" w:after="60"/>
+            </w:pPr>
+            <w:r>
+              <w:rPr>
+                <w:color w:val="3D3B3B"/>
+                <w:sz w:val="17"/>
+              </w:rPr>
+            </w:r>
+          </w:p>
+        </w:tc>
+        <w:tc>
+          <w:tcPr>
+            <w:tcW w:type="dxa" w:w="1008"/>
+          </w:tcPr>
+          <w:p>
+            <w:pPr>
+              <w:spacing w:before="60" w:after="60"/>
+            </w:pPr>
+            <w:r>
+              <w:rPr>
+                <w:color w:val="3D3B3B"/>
+                <w:sz w:val="17"/>
+              </w:rPr>
+            </w:r>
+          </w:p>
+        </w:tc>
+        <w:tc>
+          <w:tcPr>
+            <w:tcW w:type="dxa" w:w="1008"/>
+          </w:tcPr>
+          <w:p>
+            <w:pPr>
+              <w:spacing w:before="60" w:after="60"/>
+            </w:pPr>
+            <w:r>
+              <w:rPr>
+                <w:color w:val="3D3B3B"/>
+                <w:sz w:val="17"/>
+              </w:rPr>
+            </w:r>
+          </w:p>
+        </w:tc>
+        <w:tc>
+          <w:tcPr>
+            <w:tcW w:type="dxa" w:w="1008"/>
+          </w:tcPr>
+          <w:p>
+            <w:pPr>
+              <w:spacing w:before="60" w:after="60"/>
+            </w:pPr>
+            <w:r>
+              <w:rPr>
+                <w:color w:val="3D3B3B"/>
+                <w:sz w:val="17"/>
+              </w:rPr>
+            </w:r>
+          </w:p>
+        </w:tc>
+      </w:tr>
+      <w:tr>
+        <w:tc>
+          <w:tcPr>
+            <w:tcW w:type="dxa" w:w="1008"/>
+          </w:tcPr>
+          <w:p>
+            <w:pPr>
+              <w:spacing w:before="60" w:after="60"/>
+            </w:pPr>
+            <w:r>
+              <w:rPr>
+                <w:color w:val="3D3B3B"/>
+                <w:sz w:val="17"/>
+              </w:rPr>
+              <w:t>Customization</w:t>
+            </w:r>
+          </w:p>
+        </w:tc>
+        <w:tc>
+          <w:tcPr>
+            <w:tcW w:type="dxa" w:w="1008"/>
+          </w:tcPr>
+          <w:p>
+            <w:pPr>
+              <w:spacing w:before="60" w:after="60"/>
+            </w:pPr>
+            <w:r>
+              <w:rPr>
+                <w:color w:val="3D3B3B"/>
+                <w:sz w:val="17"/>
+              </w:rPr>
+            </w:r>
+          </w:p>
+        </w:tc>
+        <w:tc>
+          <w:tcPr>
+            <w:tcW w:type="dxa" w:w="1008"/>
+          </w:tcPr>
+          <w:p>
+            <w:pPr>
+              <w:spacing w:before="60" w:after="60"/>
+            </w:pPr>
+            <w:r>
+              <w:rPr>
+                <w:color w:val="3D3B3B"/>
+                <w:sz w:val="17"/>
+              </w:rPr>
+            </w:r>
+          </w:p>
+        </w:tc>
+        <w:tc>
+          <w:tcPr>
+            <w:tcW w:type="dxa" w:w="1008"/>
+          </w:tcPr>
+          <w:p>
+            <w:pPr>
+              <w:spacing w:before="60" w:after="60"/>
+            </w:pPr>
+            <w:r>
+              <w:rPr>
+                <w:color w:val="3D3B3B"/>
+                <w:sz w:val="17"/>
+              </w:rPr>
+            </w:r>
+          </w:p>
+        </w:tc>
+        <w:tc>
+          <w:tcPr>
+            <w:tcW w:type="dxa" w:w="1008"/>
+          </w:tcPr>
+          <w:p>
+            <w:pPr>
+              <w:spacing w:before="60" w:after="60"/>
+            </w:pPr>
+            <w:r>
+              <w:rPr>
+                <w:color w:val="3D3B3B"/>
+                <w:sz w:val="17"/>
+              </w:rPr>
+              <w:t>X</w:t>
+            </w:r>
+          </w:p>
+        </w:tc>
+        <w:tc>
+          <w:tcPr>
+            <w:tcW w:type="dxa" w:w="1008"/>
+          </w:tcPr>
+          <w:p>
+            <w:pPr>
+              <w:spacing w:before="60" w:after="60"/>
+            </w:pPr>
+            <w:r>
+              <w:rPr>
+                <w:color w:val="3D3B3B"/>
+                <w:sz w:val="17"/>
+              </w:rPr>
+              <w:t>X</w:t>
+            </w:r>
+          </w:p>
+        </w:tc>
+        <w:tc>
+          <w:tcPr>
+            <w:tcW w:type="dxa" w:w="1008"/>
+          </w:tcPr>
+          <w:p>
+            <w:pPr>
+              <w:spacing w:before="60" w:after="60"/>
+            </w:pPr>
+            <w:r>
+              <w:rPr>
+                <w:color w:val="3D3B3B"/>
+                <w:sz w:val="17"/>
+              </w:rPr>
+              <w:t>X</w:t>
+            </w:r>
+          </w:p>
+        </w:tc>
+        <w:tc>
+          <w:tcPr>
+            <w:tcW w:type="dxa" w:w="1008"/>
+          </w:tcPr>
+          <w:p>
+            <w:pPr>
+              <w:spacing w:before="60" w:after="60"/>
+            </w:pPr>
+            <w:r>
+              <w:rPr>
+                <w:color w:val="3D3B3B"/>
+                <w:sz w:val="17"/>
+              </w:rPr>
+            </w:r>
+          </w:p>
+        </w:tc>
+        <w:tc>
+          <w:tcPr>
+            <w:tcW w:type="dxa" w:w="1008"/>
+          </w:tcPr>
+          <w:p>
+            <w:pPr>
+              <w:spacing w:before="60" w:after="60"/>
+            </w:pPr>
+            <w:r>
+              <w:rPr>
+                <w:color w:val="3D3B3B"/>
+                <w:sz w:val="17"/>
+              </w:rPr>
+            </w:r>
+          </w:p>
+        </w:tc>
+      </w:tr>
+      <w:tr>
+        <w:tc>
+          <w:tcPr>
+            <w:tcW w:type="dxa" w:w="1008"/>
+          </w:tcPr>
+          <w:p>
+            <w:pPr>
+              <w:spacing w:before="60" w:after="60"/>
+            </w:pPr>
+            <w:r>
+              <w:rPr>
+                <w:color w:val="3D3B3B"/>
+                <w:sz w:val="17"/>
+              </w:rPr>
+              <w:t>Testing and UAT</w:t>
+            </w:r>
+          </w:p>
+        </w:tc>
+        <w:tc>
+          <w:tcPr>
+            <w:tcW w:type="dxa" w:w="1008"/>
+          </w:tcPr>
+          <w:p>
+            <w:pPr>
+              <w:spacing w:before="60" w:after="60"/>
+            </w:pPr>
+            <w:r>
+              <w:rPr>
+                <w:color w:val="3D3B3B"/>
+                <w:sz w:val="17"/>
+              </w:rPr>
+            </w:r>
+          </w:p>
+        </w:tc>
+        <w:tc>
+          <w:tcPr>
+            <w:tcW w:type="dxa" w:w="1008"/>
+          </w:tcPr>
+          <w:p>
+            <w:pPr>
+              <w:spacing w:before="60" w:after="60"/>
+            </w:pPr>
+            <w:r>
+              <w:rPr>
+                <w:color w:val="3D3B3B"/>
+                <w:sz w:val="17"/>
+              </w:rPr>
+            </w:r>
+          </w:p>
+        </w:tc>
+        <w:tc>
+          <w:tcPr>
+            <w:tcW w:type="dxa" w:w="1008"/>
+          </w:tcPr>
+          <w:p>
+            <w:pPr>
+              <w:spacing w:before="60" w:after="60"/>
+            </w:pPr>
+            <w:r>
+              <w:rPr>
+                <w:color w:val="3D3B3B"/>
+                <w:sz w:val="17"/>
+              </w:rPr>
+            </w:r>
+          </w:p>
+        </w:tc>
+        <w:tc>
+          <w:tcPr>
+            <w:tcW w:type="dxa" w:w="1008"/>
+          </w:tcPr>
+          <w:p>
+            <w:pPr>
+              <w:spacing w:before="60" w:after="60"/>
+            </w:pPr>
+            <w:r>
+              <w:rPr>
+                <w:color w:val="3D3B3B"/>
+                <w:sz w:val="17"/>
+              </w:rPr>
+            </w:r>
+          </w:p>
+        </w:tc>
+        <w:tc>
+          <w:tcPr>
+            <w:tcW w:type="dxa" w:w="1008"/>
+          </w:tcPr>
+          <w:p>
+            <w:pPr>
+              <w:spacing w:before="60" w:after="60"/>
+            </w:pPr>
+            <w:r>
+              <w:rPr>
+                <w:color w:val="3D3B3B"/>
+                <w:sz w:val="17"/>
+              </w:rPr>
+            </w:r>
+          </w:p>
+        </w:tc>
+        <w:tc>
+          <w:tcPr>
+            <w:tcW w:type="dxa" w:w="1008"/>
+          </w:tcPr>
+          <w:p>
+            <w:pPr>
+              <w:spacing w:before="60" w:after="60"/>
+            </w:pPr>
+            <w:r>
+              <w:rPr>
+                <w:color w:val="3D3B3B"/>
+                <w:sz w:val="17"/>
+              </w:rPr>
+              <w:t>X</w:t>
+            </w:r>
+          </w:p>
+        </w:tc>
+        <w:tc>
+          <w:tcPr>
+            <w:tcW w:type="dxa" w:w="1008"/>
+          </w:tcPr>
+          <w:p>
+            <w:pPr>
+              <w:spacing w:before="60" w:after="60"/>
+            </w:pPr>
+            <w:r>
+              <w:rPr>
+                <w:color w:val="3D3B3B"/>
+                <w:sz w:val="17"/>
+              </w:rPr>
+              <w:t>X</w:t>
+            </w:r>
+          </w:p>
+        </w:tc>
+        <w:tc>
+          <w:tcPr>
+            <w:tcW w:type="dxa" w:w="1008"/>
+          </w:tcPr>
+          <w:p>
+            <w:pPr>
+              <w:spacing w:before="60" w:after="60"/>
+            </w:pPr>
+            <w:r>
+              <w:rPr>
+                <w:color w:val="3D3B3B"/>
+                <w:sz w:val="17"/>
+              </w:rPr>
+            </w:r>
+          </w:p>
+        </w:tc>
+      </w:tr>
+      <w:tr>
+        <w:tc>
+          <w:tcPr>
+            <w:tcW w:type="dxa" w:w="1008"/>
+          </w:tcPr>
+          <w:p>
+            <w:pPr>
+              <w:spacing w:before="60" w:after="60"/>
+            </w:pPr>
+            <w:r>
+              <w:rPr>
+                <w:color w:val="3D3B3B"/>
+                <w:sz w:val="17"/>
+              </w:rPr>
+              <w:t>Training</w:t>
+            </w:r>
+          </w:p>
+        </w:tc>
+        <w:tc>
+          <w:tcPr>
+            <w:tcW w:type="dxa" w:w="1008"/>
+          </w:tcPr>
+          <w:p>
+            <w:pPr>
+              <w:spacing w:before="60" w:after="60"/>
+            </w:pPr>
+            <w:r>
+              <w:rPr>
+                <w:color w:val="3D3B3B"/>
+                <w:sz w:val="17"/>
+              </w:rPr>
+            </w:r>
+          </w:p>
+        </w:tc>
+        <w:tc>
+          <w:tcPr>
+            <w:tcW w:type="dxa" w:w="1008"/>
+          </w:tcPr>
+          <w:p>
+            <w:pPr>
+              <w:spacing w:before="60" w:after="60"/>
+            </w:pPr>
+            <w:r>
+              <w:rPr>
+                <w:color w:val="3D3B3B"/>
+                <w:sz w:val="17"/>
+              </w:rPr>
+            </w:r>
+          </w:p>
+        </w:tc>
+        <w:tc>
+          <w:tcPr>
+            <w:tcW w:type="dxa" w:w="1008"/>
+          </w:tcPr>
+          <w:p>
+            <w:pPr>
+              <w:spacing w:before="60" w:after="60"/>
+            </w:pPr>
+            <w:r>
+              <w:rPr>
+                <w:color w:val="3D3B3B"/>
+                <w:sz w:val="17"/>
+              </w:rPr>
+            </w:r>
+          </w:p>
+        </w:tc>
+        <w:tc>
+          <w:tcPr>
+            <w:tcW w:type="dxa" w:w="1008"/>
+          </w:tcPr>
+          <w:p>
+            <w:pPr>
+              <w:spacing w:before="60" w:after="60"/>
+            </w:pPr>
+            <w:r>
+              <w:rPr>
+                <w:color w:val="3D3B3B"/>
+                <w:sz w:val="17"/>
+              </w:rPr>
+            </w:r>
+          </w:p>
+        </w:tc>
+        <w:tc>
+          <w:tcPr>
+            <w:tcW w:type="dxa" w:w="1008"/>
+          </w:tcPr>
+          <w:p>
+            <w:pPr>
+              <w:spacing w:before="60" w:after="60"/>
+            </w:pPr>
+            <w:r>
+              <w:rPr>
+                <w:color w:val="3D3B3B"/>
+                <w:sz w:val="17"/>
+              </w:rPr>
+            </w:r>
+          </w:p>
+        </w:tc>
+        <w:tc>
+          <w:tcPr>
+            <w:tcW w:type="dxa" w:w="1008"/>
+          </w:tcPr>
+          <w:p>
+            <w:pPr>
+              <w:spacing w:before="60" w:after="60"/>
+            </w:pPr>
+            <w:r>
+              <w:rPr>
+                <w:color w:val="3D3B3B"/>
+                <w:sz w:val="17"/>
+              </w:rPr>
+            </w:r>
+          </w:p>
+        </w:tc>
+        <w:tc>
+          <w:tcPr>
+            <w:tcW w:type="dxa" w:w="1008"/>
+          </w:tcPr>
+          <w:p>
+            <w:pPr>
+              <w:spacing w:before="60" w:after="60"/>
+            </w:pPr>
+            <w:r>
+              <w:rPr>
+                <w:color w:val="3D3B3B"/>
+                <w:sz w:val="17"/>
+              </w:rPr>
+              <w:t>X</w:t>
+            </w:r>
+          </w:p>
+        </w:tc>
+        <w:tc>
+          <w:tcPr>
+            <w:tcW w:type="dxa" w:w="1008"/>
+          </w:tcPr>
+          <w:p>
+            <w:pPr>
+              <w:spacing w:before="60" w:after="60"/>
+            </w:pPr>
+            <w:r>
+              <w:rPr>
+                <w:color w:val="3D3B3B"/>
+                <w:sz w:val="17"/>
+              </w:rPr>
+            </w:r>
+          </w:p>
+        </w:tc>
+      </w:tr>
+      <w:tr>
+        <w:tc>
+          <w:tcPr>
+            <w:tcW w:type="dxa" w:w="1008"/>
+          </w:tcPr>
+          <w:p>
+            <w:pPr>
+              <w:spacing w:before="60" w:after="60"/>
+            </w:pPr>
+            <w:r>
+              <w:rPr>
+                <w:color w:val="3D3B3B"/>
+                <w:sz w:val="17"/>
+              </w:rPr>
+              <w:t>Go-Live</w:t>
+            </w:r>
+          </w:p>
+        </w:tc>
+        <w:tc>
+          <w:tcPr>
+            <w:tcW w:type="dxa" w:w="1008"/>
+          </w:tcPr>
+          <w:p>
+            <w:pPr>
+              <w:spacing w:before="60" w:after="60"/>
+            </w:pPr>
+            <w:r>
+              <w:rPr>
+                <w:color w:val="3D3B3B"/>
+                <w:sz w:val="17"/>
+              </w:rPr>
+            </w:r>
+          </w:p>
+        </w:tc>
+        <w:tc>
+          <w:tcPr>
+            <w:tcW w:type="dxa" w:w="1008"/>
+          </w:tcPr>
+          <w:p>
+            <w:pPr>
+              <w:spacing w:before="60" w:after="60"/>
+            </w:pPr>
+            <w:r>
+              <w:rPr>
+                <w:color w:val="3D3B3B"/>
+                <w:sz w:val="17"/>
+              </w:rPr>
+            </w:r>
+          </w:p>
+        </w:tc>
+        <w:tc>
+          <w:tcPr>
+            <w:tcW w:type="dxa" w:w="1008"/>
+          </w:tcPr>
+          <w:p>
+            <w:pPr>
+              <w:spacing w:before="60" w:after="60"/>
+            </w:pPr>
+            <w:r>
+              <w:rPr>
+                <w:color w:val="3D3B3B"/>
+                <w:sz w:val="17"/>
+              </w:rPr>
+            </w:r>
+          </w:p>
+        </w:tc>
+        <w:tc>
+          <w:tcPr>
+            <w:tcW w:type="dxa" w:w="1008"/>
+          </w:tcPr>
+          <w:p>
+            <w:pPr>
+              <w:spacing w:before="60" w:after="60"/>
+            </w:pPr>
+            <w:r>
+              <w:rPr>
+                <w:color w:val="3D3B3B"/>
+                <w:sz w:val="17"/>
+              </w:rPr>
+            </w:r>
+          </w:p>
+        </w:tc>
+        <w:tc>
+          <w:tcPr>
+            <w:tcW w:type="dxa" w:w="1008"/>
+          </w:tcPr>
+          <w:p>
+            <w:pPr>
+              <w:spacing w:before="60" w:after="60"/>
+            </w:pPr>
+            <w:r>
+              <w:rPr>
+                <w:color w:val="3D3B3B"/>
+                <w:sz w:val="17"/>
+              </w:rPr>
+            </w:r>
+          </w:p>
+        </w:tc>
+        <w:tc>
+          <w:tcPr>
+            <w:tcW w:type="dxa" w:w="1008"/>
+          </w:tcPr>
+          <w:p>
+            <w:pPr>
+              <w:spacing w:before="60" w:after="60"/>
+            </w:pPr>
+            <w:r>
+              <w:rPr>
+                <w:color w:val="3D3B3B"/>
+                <w:sz w:val="17"/>
+              </w:rPr>
+            </w:r>
+          </w:p>
+        </w:tc>
+        <w:tc>
+          <w:tcPr>
+            <w:tcW w:type="dxa" w:w="1008"/>
+          </w:tcPr>
+          <w:p>
+            <w:pPr>
+              <w:spacing w:before="60" w:after="60"/>
+            </w:pPr>
+            <w:r>
+              <w:rPr>
+                <w:color w:val="3D3B3B"/>
+                <w:sz w:val="17"/>
+              </w:rPr>
+            </w:r>
+          </w:p>
+        </w:tc>
+        <w:tc>
+          <w:tcPr>
+            <w:tcW w:type="dxa" w:w="1008"/>
+          </w:tcPr>
+          <w:p>
+            <w:pPr>
+              <w:spacing w:before="60" w:after="60"/>
+            </w:pPr>
+            <w:r>
+              <w:rPr>
+                <w:color w:val="3D3B3B"/>
+                <w:sz w:val="17"/>
+              </w:rPr>
+              <w:t>X</w:t>
+            </w:r>
+          </w:p>
+        </w:tc>
+      </w:tr>
+      <w:tr>
+        <w:tc>
+          <w:tcPr>
+            <w:tcW w:type="dxa" w:w="1008"/>
+          </w:tcPr>
+          <w:p>
+            <w:pPr>
+              <w:spacing w:before="60" w:after="60"/>
+            </w:pPr>
+            <w:r>
+              <w:rPr>
+                <w:color w:val="3D3B3B"/>
+                <w:sz w:val="17"/>
+              </w:rPr>
+              <w:t>Hypercare</w:t>
+            </w:r>
+          </w:p>
+        </w:tc>
+        <w:tc>
+          <w:tcPr>
+            <w:tcW w:type="dxa" w:w="1008"/>
+          </w:tcPr>
+          <w:p>
+            <w:pPr>
+              <w:spacing w:before="60" w:after="60"/>
+            </w:pPr>
+            <w:r>
+              <w:rPr>
+                <w:color w:val="3D3B3B"/>
+                <w:sz w:val="17"/>
+              </w:rPr>
+            </w:r>
+          </w:p>
+        </w:tc>
+        <w:tc>
+          <w:tcPr>
+            <w:tcW w:type="dxa" w:w="1008"/>
+          </w:tcPr>
+          <w:p>
+            <w:pPr>
+              <w:spacing w:before="60" w:after="60"/>
+            </w:pPr>
+            <w:r>
+              <w:rPr>
+                <w:color w:val="3D3B3B"/>
+                <w:sz w:val="17"/>
+              </w:rPr>
+            </w:r>
+          </w:p>
+        </w:tc>
+        <w:tc>
+          <w:tcPr>
+            <w:tcW w:type="dxa" w:w="1008"/>
+          </w:tcPr>
+          <w:p>
+            <w:pPr>
+              <w:spacing w:before="60" w:after="60"/>
+            </w:pPr>
+            <w:r>
+              <w:rPr>
+                <w:color w:val="3D3B3B"/>
+                <w:sz w:val="17"/>
+              </w:rPr>
+            </w:r>
+          </w:p>
+        </w:tc>
+        <w:tc>
+          <w:tcPr>
+            <w:tcW w:type="dxa" w:w="1008"/>
+          </w:tcPr>
+          <w:p>
+            <w:pPr>
+              <w:spacing w:before="60" w:after="60"/>
+            </w:pPr>
+            <w:r>
+              <w:rPr>
+                <w:color w:val="3D3B3B"/>
+                <w:sz w:val="17"/>
+              </w:rPr>
+            </w:r>
+          </w:p>
+        </w:tc>
+        <w:tc>
+          <w:tcPr>
+            <w:tcW w:type="dxa" w:w="1008"/>
+          </w:tcPr>
+          <w:p>
+            <w:pPr>
+              <w:spacing w:before="60" w:after="60"/>
+            </w:pPr>
+            <w:r>
+              <w:rPr>
+                <w:color w:val="3D3B3B"/>
+                <w:sz w:val="17"/>
+              </w:rPr>
+            </w:r>
+          </w:p>
+        </w:tc>
+        <w:tc>
+          <w:tcPr>
+            <w:tcW w:type="dxa" w:w="1008"/>
+          </w:tcPr>
+          <w:p>
+            <w:pPr>
+              <w:spacing w:before="60" w:after="60"/>
+            </w:pPr>
+            <w:r>
+              <w:rPr>
+                <w:color w:val="3D3B3B"/>
+                <w:sz w:val="17"/>
+              </w:rPr>
+            </w:r>
+          </w:p>
+        </w:tc>
+        <w:tc>
+          <w:tcPr>
+            <w:tcW w:type="dxa" w:w="1008"/>
+          </w:tcPr>
+          <w:p>
+            <w:pPr>
+              <w:spacing w:before="60" w:after="60"/>
+            </w:pPr>
+            <w:r>
+              <w:rPr>
+                <w:color w:val="3D3B3B"/>
+                <w:sz w:val="17"/>
+              </w:rPr>
+            </w:r>
+          </w:p>
+        </w:tc>
+        <w:tc>
+          <w:tcPr>
+            <w:tcW w:type="dxa" w:w="1008"/>
+          </w:tcPr>
+          <w:p>
+            <w:pPr>
+              <w:spacing w:before="60" w:after="60"/>
+            </w:pPr>
+            <w:r>
+              <w:rPr>
+                <w:color w:val="3D3B3B"/>
+                <w:sz w:val="17"/>
+              </w:rPr>
+              <w:t>X</w:t>
+            </w:r>
+          </w:p>
+        </w:tc>
+      </w:tr>
+    </w:tbl>
+    <w:p>
+      <w:pPr>
+        <w:spacing w:after="80" w:line="276" w:lineRule="auto"/>
+      </w:pPr>
+      <w:r>
+        <w:rPr>
+          <w:b/>
+          <w:i w:val="0"/>
+          <w:color w:val="142444"/>
+          <w:sz w:val="20"/>
+        </w:rPr>
         <w:t>Milestone acceptance checkpoints:</w:t>
       </w:r>
     </w:p>
@@ -4912,6 +7610,391 @@
     </w:tbl>
     <w:p>
       <w:pPr>
+        <w:spacing w:after="80" w:line="276" w:lineRule="auto"/>
+      </w:pPr>
+      <w:r>
+        <w:rPr>
+          <w:b/>
+          <w:i w:val="0"/>
+          <w:color w:val="142444"/>
+          <w:sz w:val="20"/>
+        </w:rPr>
+        <w:t>Support priority matrix:</w:t>
+      </w:r>
+    </w:p>
+    <w:tbl>
+      <w:tblPr>
+        <w:tblW w:type="auto" w:w="0"/>
+        <w:jc w:val="center"/>
+        <w:tblLook w:firstColumn="1" w:firstRow="1" w:lastColumn="0" w:lastRow="0" w:noHBand="0" w:noVBand="1" w:val="04A0"/>
+      </w:tblPr>
+      <w:tblGrid>
+        <w:gridCol w:w="2268"/>
+        <w:gridCol w:w="2268"/>
+        <w:gridCol w:w="2268"/>
+        <w:gridCol w:w="2268"/>
+      </w:tblGrid>
+      <w:tr>
+        <w:tc>
+          <w:tcPr>
+            <w:tcW w:type="dxa" w:w="1361"/>
+            <w:shd w:fill="171414"/>
+          </w:tcPr>
+          <w:p>
+            <w:pPr>
+              <w:spacing w:before="60" w:after="60"/>
+            </w:pPr>
+            <w:r>
+              <w:rPr>
+                <w:b/>
+                <w:color w:val="FFFFFF"/>
+                <w:sz w:val="16"/>
+              </w:rPr>
+              <w:t>Severity</w:t>
+            </w:r>
+          </w:p>
+        </w:tc>
+        <w:tc>
+          <w:tcPr>
+            <w:tcW w:type="dxa" w:w="4082"/>
+            <w:shd w:fill="171414"/>
+          </w:tcPr>
+          <w:p>
+            <w:pPr>
+              <w:spacing w:before="60" w:after="60"/>
+            </w:pPr>
+            <w:r>
+              <w:rPr>
+                <w:b/>
+                <w:color w:val="FFFFFF"/>
+                <w:sz w:val="16"/>
+              </w:rPr>
+              <w:t>Definition</w:t>
+            </w:r>
+          </w:p>
+        </w:tc>
+        <w:tc>
+          <w:tcPr>
+            <w:tcW w:type="dxa" w:w="1701"/>
+            <w:shd w:fill="171414"/>
+          </w:tcPr>
+          <w:p>
+            <w:pPr>
+              <w:spacing w:before="60" w:after="60"/>
+            </w:pPr>
+            <w:r>
+              <w:rPr>
+                <w:b/>
+                <w:color w:val="FFFFFF"/>
+                <w:sz w:val="16"/>
+              </w:rPr>
+              <w:t>Response</w:t>
+            </w:r>
+          </w:p>
+        </w:tc>
+        <w:tc>
+          <w:tcPr>
+            <w:tcW w:type="dxa" w:w="2154"/>
+            <w:shd w:fill="171414"/>
+          </w:tcPr>
+          <w:p>
+            <w:pPr>
+              <w:spacing w:before="60" w:after="60"/>
+            </w:pPr>
+            <w:r>
+              <w:rPr>
+                <w:b/>
+                <w:color w:val="FFFFFF"/>
+                <w:sz w:val="16"/>
+              </w:rPr>
+              <w:t>Resolution Target</w:t>
+            </w:r>
+          </w:p>
+        </w:tc>
+      </w:tr>
+      <w:tr>
+        <w:tc>
+          <w:tcPr>
+            <w:tcW w:type="dxa" w:w="2268"/>
+          </w:tcPr>
+          <w:p>
+            <w:pPr>
+              <w:spacing w:before="60" w:after="60"/>
+            </w:pPr>
+            <w:r>
+              <w:rPr>
+                <w:color w:val="3D3B3B"/>
+                <w:sz w:val="17"/>
+              </w:rPr>
+              <w:t>Critical</w:t>
+            </w:r>
+          </w:p>
+        </w:tc>
+        <w:tc>
+          <w:tcPr>
+            <w:tcW w:type="dxa" w:w="2268"/>
+          </w:tcPr>
+          <w:p>
+            <w:pPr>
+              <w:spacing w:before="60" w:after="60"/>
+            </w:pPr>
+            <w:r>
+              <w:rPr>
+                <w:color w:val="3D3B3B"/>
+                <w:sz w:val="17"/>
+              </w:rPr>
+              <w:t>Production system unavailable or core transaction blocked</w:t>
+            </w:r>
+          </w:p>
+        </w:tc>
+        <w:tc>
+          <w:tcPr>
+            <w:tcW w:type="dxa" w:w="2268"/>
+          </w:tcPr>
+          <w:p>
+            <w:pPr>
+              <w:spacing w:before="60" w:after="60"/>
+            </w:pPr>
+            <w:r>
+              <w:rPr>
+                <w:color w:val="3D3B3B"/>
+                <w:sz w:val="17"/>
+              </w:rPr>
+              <w:t>2 hours</w:t>
+            </w:r>
+          </w:p>
+        </w:tc>
+        <w:tc>
+          <w:tcPr>
+            <w:tcW w:type="dxa" w:w="2268"/>
+          </w:tcPr>
+          <w:p>
+            <w:pPr>
+              <w:spacing w:before="60" w:after="60"/>
+            </w:pPr>
+            <w:r>
+              <w:rPr>
+                <w:color w:val="3D3B3B"/>
+                <w:sz w:val="17"/>
+              </w:rPr>
+              <w:t>8 business hours</w:t>
+            </w:r>
+          </w:p>
+        </w:tc>
+      </w:tr>
+      <w:tr>
+        <w:tc>
+          <w:tcPr>
+            <w:tcW w:type="dxa" w:w="2268"/>
+          </w:tcPr>
+          <w:p>
+            <w:pPr>
+              <w:spacing w:before="60" w:after="60"/>
+            </w:pPr>
+            <w:r>
+              <w:rPr>
+                <w:color w:val="3D3B3B"/>
+                <w:sz w:val="17"/>
+              </w:rPr>
+              <w:t>High</w:t>
+            </w:r>
+          </w:p>
+        </w:tc>
+        <w:tc>
+          <w:tcPr>
+            <w:tcW w:type="dxa" w:w="2268"/>
+          </w:tcPr>
+          <w:p>
+            <w:pPr>
+              <w:spacing w:before="60" w:after="60"/>
+            </w:pPr>
+            <w:r>
+              <w:rPr>
+                <w:color w:val="3D3B3B"/>
+                <w:sz w:val="17"/>
+              </w:rPr>
+              <w:t>Major business function impaired with no practical workaround</w:t>
+            </w:r>
+          </w:p>
+        </w:tc>
+        <w:tc>
+          <w:tcPr>
+            <w:tcW w:type="dxa" w:w="2268"/>
+          </w:tcPr>
+          <w:p>
+            <w:pPr>
+              <w:spacing w:before="60" w:after="60"/>
+            </w:pPr>
+            <w:r>
+              <w:rPr>
+                <w:color w:val="3D3B3B"/>
+                <w:sz w:val="17"/>
+              </w:rPr>
+              <w:t>4 hours</w:t>
+            </w:r>
+          </w:p>
+        </w:tc>
+        <w:tc>
+          <w:tcPr>
+            <w:tcW w:type="dxa" w:w="2268"/>
+          </w:tcPr>
+          <w:p>
+            <w:pPr>
+              <w:spacing w:before="60" w:after="60"/>
+            </w:pPr>
+            <w:r>
+              <w:rPr>
+                <w:color w:val="3D3B3B"/>
+                <w:sz w:val="17"/>
+              </w:rPr>
+              <w:t>24 business hours</w:t>
+            </w:r>
+          </w:p>
+        </w:tc>
+      </w:tr>
+      <w:tr>
+        <w:tc>
+          <w:tcPr>
+            <w:tcW w:type="dxa" w:w="2268"/>
+          </w:tcPr>
+          <w:p>
+            <w:pPr>
+              <w:spacing w:before="60" w:after="60"/>
+            </w:pPr>
+            <w:r>
+              <w:rPr>
+                <w:color w:val="3D3B3B"/>
+                <w:sz w:val="17"/>
+              </w:rPr>
+              <w:t>Medium</w:t>
+            </w:r>
+          </w:p>
+        </w:tc>
+        <w:tc>
+          <w:tcPr>
+            <w:tcW w:type="dxa" w:w="2268"/>
+          </w:tcPr>
+          <w:p>
+            <w:pPr>
+              <w:spacing w:before="60" w:after="60"/>
+            </w:pPr>
+            <w:r>
+              <w:rPr>
+                <w:color w:val="3D3B3B"/>
+                <w:sz w:val="17"/>
+              </w:rPr>
+              <w:t>Issue affects a limited process and workaround is available</w:t>
+            </w:r>
+          </w:p>
+        </w:tc>
+        <w:tc>
+          <w:tcPr>
+            <w:tcW w:type="dxa" w:w="2268"/>
+          </w:tcPr>
+          <w:p>
+            <w:pPr>
+              <w:spacing w:before="60" w:after="60"/>
+            </w:pPr>
+            <w:r>
+              <w:rPr>
+                <w:color w:val="3D3B3B"/>
+                <w:sz w:val="17"/>
+              </w:rPr>
+              <w:t>1 business day</w:t>
+            </w:r>
+          </w:p>
+        </w:tc>
+        <w:tc>
+          <w:tcPr>
+            <w:tcW w:type="dxa" w:w="2268"/>
+          </w:tcPr>
+          <w:p>
+            <w:pPr>
+              <w:spacing w:before="60" w:after="60"/>
+            </w:pPr>
+            <w:r>
+              <w:rPr>
+                <w:color w:val="3D3B3B"/>
+                <w:sz w:val="17"/>
+              </w:rPr>
+              <w:t>3 business days</w:t>
+            </w:r>
+          </w:p>
+        </w:tc>
+      </w:tr>
+      <w:tr>
+        <w:tc>
+          <w:tcPr>
+            <w:tcW w:type="dxa" w:w="2268"/>
+          </w:tcPr>
+          <w:p>
+            <w:pPr>
+              <w:spacing w:before="60" w:after="60"/>
+            </w:pPr>
+            <w:r>
+              <w:rPr>
+                <w:color w:val="3D3B3B"/>
+                <w:sz w:val="17"/>
+              </w:rPr>
+              <w:t>Low</w:t>
+            </w:r>
+          </w:p>
+        </w:tc>
+        <w:tc>
+          <w:tcPr>
+            <w:tcW w:type="dxa" w:w="2268"/>
+          </w:tcPr>
+          <w:p>
+            <w:pPr>
+              <w:spacing w:before="60" w:after="60"/>
+            </w:pPr>
+            <w:r>
+              <w:rPr>
+                <w:color w:val="3D3B3B"/>
+                <w:sz w:val="17"/>
+              </w:rPr>
+              <w:t>Minor issue, question, cosmetic defect, or enhancement request</w:t>
+            </w:r>
+          </w:p>
+        </w:tc>
+        <w:tc>
+          <w:tcPr>
+            <w:tcW w:type="dxa" w:w="2268"/>
+          </w:tcPr>
+          <w:p>
+            <w:pPr>
+              <w:spacing w:before="60" w:after="60"/>
+            </w:pPr>
+            <w:r>
+              <w:rPr>
+                <w:color w:val="3D3B3B"/>
+                <w:sz w:val="17"/>
+              </w:rPr>
+              <w:t>2 business days</w:t>
+            </w:r>
+          </w:p>
+        </w:tc>
+        <w:tc>
+          <w:tcPr>
+            <w:tcW w:type="dxa" w:w="2268"/>
+          </w:tcPr>
+          <w:p>
+            <w:pPr>
+              <w:spacing w:before="60" w:after="60"/>
+            </w:pPr>
+            <w:r>
+              <w:rPr>
+                <w:color w:val="3D3B3B"/>
+                <w:sz w:val="17"/>
+              </w:rPr>
+              <w:t>Next agreed release</w:t>
+            </w:r>
+          </w:p>
+        </w:tc>
+      </w:tr>
+    </w:tbl>
+    <w:p>
+      <w:pPr>
         <w:spacing w:after="120" w:line="276" w:lineRule="auto"/>
       </w:pPr>
       <w:r>
@@ -4922,6 +8005,343 @@
           <w:sz w:val="17"/>
         </w:rPr>
         <w:t>Emergency support for production-blocking issues can be added as a separate paid add-on if required.</w:t>
+      </w:r>
+    </w:p>
+    <w:p>
+      <w:pPr>
+        <w:spacing w:after="80" w:line="276" w:lineRule="auto"/>
+      </w:pPr>
+      <w:r>
+        <w:rPr>
+          <w:b/>
+          <w:i w:val="0"/>
+          <w:color w:val="142444"/>
+          <w:sz w:val="20"/>
+        </w:rPr>
+        <w:t>Warranty scope:</w:t>
+      </w:r>
+    </w:p>
+    <w:tbl>
+      <w:tblPr>
+        <w:tblW w:type="auto" w:w="0"/>
+        <w:jc w:val="center"/>
+        <w:tblLook w:firstColumn="1" w:firstRow="1" w:lastColumn="0" w:lastRow="0" w:noHBand="0" w:noVBand="1" w:val="04A0"/>
+      </w:tblPr>
+      <w:tblGrid>
+        <w:gridCol w:w="4536"/>
+        <w:gridCol w:w="4536"/>
+      </w:tblGrid>
+      <w:tr>
+        <w:tc>
+          <w:tcPr>
+            <w:tcW w:type="dxa" w:w="4649"/>
+            <w:shd w:fill="171414"/>
+          </w:tcPr>
+          <w:p>
+            <w:pPr>
+              <w:spacing w:before="60" w:after="60"/>
+            </w:pPr>
+            <w:r>
+              <w:rPr>
+                <w:b/>
+                <w:color w:val="FFFFFF"/>
+                <w:sz w:val="16"/>
+              </w:rPr>
+              <w:t>Included During Warranty</w:t>
+            </w:r>
+          </w:p>
+        </w:tc>
+        <w:tc>
+          <w:tcPr>
+            <w:tcW w:type="dxa" w:w="4649"/>
+            <w:shd w:fill="171414"/>
+          </w:tcPr>
+          <w:p>
+            <w:pPr>
+              <w:spacing w:before="60" w:after="60"/>
+            </w:pPr>
+            <w:r>
+              <w:rPr>
+                <w:b/>
+                <w:color w:val="FFFFFF"/>
+                <w:sz w:val="16"/>
+              </w:rPr>
+              <w:t>Excluded From Warranty</w:t>
+            </w:r>
+          </w:p>
+        </w:tc>
+      </w:tr>
+      <w:tr>
+        <w:tc>
+          <w:tcPr>
+            <w:tcW w:type="dxa" w:w="4536"/>
+          </w:tcPr>
+          <w:p>
+            <w:pPr>
+              <w:spacing w:before="60" w:after="60"/>
+            </w:pPr>
+            <w:r>
+              <w:rPr>
+                <w:color w:val="3D3B3B"/>
+                <w:sz w:val="17"/>
+              </w:rPr>
+              <w:t>Bug fixes for approved deliverables that do not match the signed BRD</w:t>
+            </w:r>
+          </w:p>
+        </w:tc>
+        <w:tc>
+          <w:tcPr>
+            <w:tcW w:type="dxa" w:w="4536"/>
+          </w:tcPr>
+          <w:p>
+            <w:pPr>
+              <w:spacing w:before="60" w:after="60"/>
+            </w:pPr>
+            <w:r>
+              <w:rPr>
+                <w:color w:val="3D3B3B"/>
+                <w:sz w:val="17"/>
+              </w:rPr>
+              <w:t>New requirements or changes after requirements freeze</w:t>
+            </w:r>
+          </w:p>
+        </w:tc>
+      </w:tr>
+      <w:tr>
+        <w:tc>
+          <w:tcPr>
+            <w:tcW w:type="dxa" w:w="4536"/>
+          </w:tcPr>
+          <w:p>
+            <w:pPr>
+              <w:spacing w:before="60" w:after="60"/>
+            </w:pPr>
+            <w:r>
+              <w:rPr>
+                <w:color w:val="3D3B3B"/>
+                <w:sz w:val="17"/>
+              </w:rPr>
+              <w:t>Configuration corrections for agreed workflows</w:t>
+            </w:r>
+          </w:p>
+        </w:tc>
+        <w:tc>
+          <w:tcPr>
+            <w:tcW w:type="dxa" w:w="4536"/>
+          </w:tcPr>
+          <w:p>
+            <w:pPr>
+              <w:spacing w:before="60" w:after="60"/>
+            </w:pPr>
+            <w:r>
+              <w:rPr>
+                <w:color w:val="3D3B3B"/>
+                <w:sz w:val="17"/>
+              </w:rPr>
+              <w:t>Odoo license fees, hosting, infrastructure, or third-party service fees</w:t>
+            </w:r>
+          </w:p>
+        </w:tc>
+      </w:tr>
+      <w:tr>
+        <w:tc>
+          <w:tcPr>
+            <w:tcW w:type="dxa" w:w="4536"/>
+          </w:tcPr>
+          <w:p>
+            <w:pPr>
+              <w:spacing w:before="60" w:after="60"/>
+            </w:pPr>
+            <w:r>
+              <w:rPr>
+                <w:color w:val="3D3B3B"/>
+                <w:sz w:val="17"/>
+              </w:rPr>
+              <w:t>Integration fixes for integrations explicitly included in scope</w:t>
+            </w:r>
+          </w:p>
+        </w:tc>
+        <w:tc>
+          <w:tcPr>
+            <w:tcW w:type="dxa" w:w="4536"/>
+          </w:tcPr>
+          <w:p>
+            <w:pPr>
+              <w:spacing w:before="60" w:after="60"/>
+            </w:pPr>
+            <w:r>
+              <w:rPr>
+                <w:color w:val="3D3B3B"/>
+                <w:sz w:val="17"/>
+              </w:rPr>
+              <w:t>Third-party API changes, downtime, or vendor-side defects</w:t>
+            </w:r>
+          </w:p>
+        </w:tc>
+      </w:tr>
+      <w:tr>
+        <w:tc>
+          <w:tcPr>
+            <w:tcW w:type="dxa" w:w="4536"/>
+          </w:tcPr>
+          <w:p>
+            <w:pPr>
+              <w:spacing w:before="60" w:after="60"/>
+            </w:pPr>
+            <w:r>
+              <w:rPr>
+                <w:color w:val="3D3B3B"/>
+                <w:sz w:val="17"/>
+              </w:rPr>
+              <w:t>Data import corrections caused by implementation error</w:t>
+            </w:r>
+          </w:p>
+        </w:tc>
+        <w:tc>
+          <w:tcPr>
+            <w:tcW w:type="dxa" w:w="4536"/>
+          </w:tcPr>
+          <w:p>
+            <w:pPr>
+              <w:spacing w:before="60" w:after="60"/>
+            </w:pPr>
+            <w:r>
+              <w:rPr>
+                <w:color w:val="3D3B3B"/>
+                <w:sz w:val="17"/>
+              </w:rPr>
+              <w:t>Incorrect, incomplete, or late client-provided data</w:t>
+            </w:r>
+          </w:p>
+        </w:tc>
+      </w:tr>
+      <w:tr>
+        <w:tc>
+          <w:tcPr>
+            <w:tcW w:type="dxa" w:w="4536"/>
+          </w:tcPr>
+          <w:p>
+            <w:pPr>
+              <w:spacing w:before="60" w:after="60"/>
+            </w:pPr>
+            <w:r>
+              <w:rPr>
+                <w:color w:val="3D3B3B"/>
+                <w:sz w:val="17"/>
+              </w:rPr>
+              <w:t>Clarification support for trained users during hypercare</w:t>
+            </w:r>
+          </w:p>
+        </w:tc>
+        <w:tc>
+          <w:tcPr>
+            <w:tcW w:type="dxa" w:w="4536"/>
+          </w:tcPr>
+          <w:p>
+            <w:pPr>
+              <w:spacing w:before="60" w:after="60"/>
+            </w:pPr>
+            <w:r>
+              <w:rPr>
+                <w:color w:val="3D3B3B"/>
+                <w:sz w:val="17"/>
+              </w:rPr>
+              <w:t>New training sessions outside the agreed training plan</w:t>
+            </w:r>
+          </w:p>
+        </w:tc>
+      </w:tr>
+    </w:tbl>
+    <w:p>
+      <w:pPr>
+        <w:spacing w:after="80" w:line="276" w:lineRule="auto"/>
+      </w:pPr>
+      <w:r>
+        <w:rPr>
+          <w:b/>
+          <w:i w:val="0"/>
+          <w:color w:val="142444"/>
+          <w:sz w:val="20"/>
+        </w:rPr>
+        <w:t>Definition of done:</w:t>
+      </w:r>
+    </w:p>
+    <w:p>
+      <w:pPr>
+        <w:spacing w:after="40"/>
+        <w:ind w:left="283"/>
+      </w:pPr>
+      <w:r>
+        <w:rPr>
+          <w:color w:val="3D3B3B"/>
+          <w:sz w:val="19"/>
+        </w:rPr>
+        <w:t xml:space="preserve">  •  The module or deliverable matches the approved BRD and agreed acceptance criteria</w:t>
+      </w:r>
+    </w:p>
+    <w:p>
+      <w:pPr>
+        <w:spacing w:after="40"/>
+        <w:ind w:left="283"/>
+      </w:pPr>
+      <w:r>
+        <w:rPr>
+          <w:color w:val="3D3B3B"/>
+          <w:sz w:val="19"/>
+        </w:rPr>
+        <w:t xml:space="preserve">  •  Configuration or development has passed internal QA checks</w:t>
+      </w:r>
+    </w:p>
+    <w:p>
+      <w:pPr>
+        <w:spacing w:after="40"/>
+        <w:ind w:left="283"/>
+      </w:pPr>
+      <w:r>
+        <w:rPr>
+          <w:color w:val="3D3B3B"/>
+          <w:sz w:val="19"/>
+        </w:rPr>
+        <w:t xml:space="preserve">  •  Client UAT has been completed with no unresolved critical or high-priority issues</w:t>
+      </w:r>
+    </w:p>
+    <w:p>
+      <w:pPr>
+        <w:spacing w:after="40"/>
+        <w:ind w:left="283"/>
+      </w:pPr>
+      <w:r>
+        <w:rPr>
+          <w:color w:val="3D3B3B"/>
+          <w:sz w:val="19"/>
+        </w:rPr>
+        <w:t xml:space="preserve">  •  Documentation, SOPs, or user guidance has been delivered where applicable</w:t>
+      </w:r>
+    </w:p>
+    <w:p>
+      <w:pPr>
+        <w:spacing w:after="40"/>
+        <w:ind w:left="283"/>
+      </w:pPr>
+      <w:r>
+        <w:rPr>
+          <w:color w:val="3D3B3B"/>
+          <w:sz w:val="19"/>
+        </w:rPr>
+        <w:t xml:space="preserve">  •  Training has been completed for the agreed user groups where applicable</w:t>
+      </w:r>
+    </w:p>
+    <w:p>
+      <w:pPr>
+        <w:spacing w:after="40"/>
+        <w:ind w:left="283"/>
+      </w:pPr>
+      <w:r>
+        <w:rPr>
+          <w:color w:val="3D3B3B"/>
+          <w:sz w:val="19"/>
+        </w:rPr>
+        <w:t xml:space="preserve">  •  The nominated client approver has provided written sign-off or accepted go-live approval</w:t>
       </w:r>
     </w:p>
     <w:p>
@@ -6235,7 +9655,7 @@
           <w:color w:val="3D3B3B"/>
           <w:sz w:val="19"/>
         </w:rPr>
-        <w:t>10.1 Either party may terminate this agreement immediately by written notice if the other party materially breaches any provision and fails to cure the breach within 15 days of receiving written notice. 10.2 If you terminate without cause before the project is complete, you will pay for all work satisfactorily completed up to the termination date, plus any non-cancellable commitments made on your behalf. 10.3 Upon termination for any reason, you must pay all amounts due for work completed.</w:t>
+        <w:t>10.1 Either party may terminate this agreement immediately by written notice if the other party materially breaches any provision and fails to cure the breach within 15 days of receiving written notice. 10.2 If you terminate without cause before the project is complete, you will pay for all work satisfactorily completed up to the termination date, plus any non-cancellable commitments made on your behalf. 10.3 Client delays exceeding 30 calendar days may require project rescheduling and revised delivery dates, subject to Traffic Digital Solutions resource availability. 10.4 Upon termination for any reason, you must pay all amounts due for work completed.</w:t>
       </w:r>
     </w:p>
     <w:p>

</xml_diff>